<commit_message>
Update Assessment 2 JavaScript
</commit_message>
<xml_diff>
--- a/javascript/Assessment Two/Javascript_Portfolio(LV)_V1.docx
+++ b/javascript/Assessment Two/Javascript_Portfolio(LV)_V1.docx
@@ -1,6 +1,6 @@
 
 <file path=word/document.xml><?xml version="1.0" encoding="utf-8"?>
-<w:document xmlns:wpc="http://schemas.microsoft.com/office/word/2010/wordprocessingCanvas" xmlns:cx="http://schemas.microsoft.com/office/drawing/2014/chartex" xmlns:cx1="http://schemas.microsoft.com/office/drawing/2015/9/8/chartex" xmlns:cx2="http://schemas.microsoft.com/office/drawing/2015/10/21/chartex" xmlns:cx3="http://schemas.microsoft.com/office/drawing/2016/5/9/chartex" xmlns:cx4="http://schemas.microsoft.com/office/drawing/2016/5/10/chartex" xmlns:cx5="http://schemas.microsoft.com/office/drawing/2016/5/11/chartex" xmlns:cx6="http://schemas.microsoft.com/office/drawing/2016/5/12/chartex" xmlns:cx7="http://schemas.microsoft.com/office/drawing/2016/5/13/chartex" xmlns:cx8="http://schemas.microsoft.com/office/drawing/2016/5/14/chartex" xmlns:mc="http://schemas.openxmlformats.org/markup-compatibility/2006" xmlns:aink="http://schemas.microsoft.com/office/drawing/2016/ink" xmlns:am3d="http://schemas.microsoft.com/office/drawing/2017/model3d" xmlns:o="urn:schemas-microsoft-com:office:office" xmlns:r="http://schemas.openxmlformats.org/officeDocument/2006/relationships" xmlns:m="http://schemas.openxmlformats.org/officeDocument/2006/math" xmlns:v="urn:schemas-microsoft-com:vml" xmlns:wp14="http://schemas.microsoft.com/office/word/2010/wordprocessingDrawing" xmlns:wp="http://schemas.openxmlformats.org/drawingml/2006/wordprocessingDrawing" xmlns:w10="urn:schemas-microsoft-com:office:word" xmlns:w="http://schemas.openxmlformats.org/wordprocessingml/2006/main" xmlns:w14="http://schemas.microsoft.com/office/word/2010/wordml" xmlns:w15="http://schemas.microsoft.com/office/word/2012/wordml" xmlns:w16cid="http://schemas.microsoft.com/office/word/2016/wordml/cid" xmlns:w16se="http://schemas.microsoft.com/office/word/2015/wordml/symex" xmlns:wpg="http://schemas.microsoft.com/office/word/2010/wordprocessingGroup" xmlns:wpi="http://schemas.microsoft.com/office/word/2010/wordprocessingInk" xmlns:wne="http://schemas.microsoft.com/office/word/2006/wordml" xmlns:wps="http://schemas.microsoft.com/office/word/2010/wordprocessingShape" mc:Ignorable="w14 w15 w16se w16cid wp14">
+<w:document xmlns:wpc="http://schemas.microsoft.com/office/word/2010/wordprocessingCanvas" xmlns:cx="http://schemas.microsoft.com/office/drawing/2014/chartex" xmlns:cx1="http://schemas.microsoft.com/office/drawing/2015/9/8/chartex" xmlns:cx2="http://schemas.microsoft.com/office/drawing/2015/10/21/chartex" xmlns:cx3="http://schemas.microsoft.com/office/drawing/2016/5/9/chartex" xmlns:cx4="http://schemas.microsoft.com/office/drawing/2016/5/10/chartex" xmlns:cx5="http://schemas.microsoft.com/office/drawing/2016/5/11/chartex" xmlns:cx6="http://schemas.microsoft.com/office/drawing/2016/5/12/chartex" xmlns:cx7="http://schemas.microsoft.com/office/drawing/2016/5/13/chartex" xmlns:cx8="http://schemas.microsoft.com/office/drawing/2016/5/14/chartex" xmlns:mc="http://schemas.openxmlformats.org/markup-compatibility/2006" xmlns:aink="http://schemas.microsoft.com/office/drawing/2016/ink" xmlns:am3d="http://schemas.microsoft.com/office/drawing/2017/model3d" xmlns:o="urn:schemas-microsoft-com:office:office" xmlns:oel="http://schemas.microsoft.com/office/2019/extlst" xmlns:r="http://schemas.openxmlformats.org/officeDocument/2006/relationships" xmlns:m="http://schemas.openxmlformats.org/officeDocument/2006/math" xmlns:v="urn:schemas-microsoft-com:vml" xmlns:wp14="http://schemas.microsoft.com/office/word/2010/wordprocessingDrawing" xmlns:wp="http://schemas.openxmlformats.org/drawingml/2006/wordprocessingDrawing" xmlns:w10="urn:schemas-microsoft-com:office:word" xmlns:w="http://schemas.openxmlformats.org/wordprocessingml/2006/main" xmlns:w14="http://schemas.microsoft.com/office/word/2010/wordml" xmlns:w15="http://schemas.microsoft.com/office/word/2012/wordml" xmlns:w16cex="http://schemas.microsoft.com/office/word/2018/wordml/cex" xmlns:w16cid="http://schemas.microsoft.com/office/word/2016/wordml/cid" xmlns:w16="http://schemas.microsoft.com/office/word/2018/wordml" xmlns:w16du="http://schemas.microsoft.com/office/word/2023/wordml/word16du" xmlns:w16sdtdh="http://schemas.microsoft.com/office/word/2020/wordml/sdtdatahash" xmlns:w16sdtfl="http://schemas.microsoft.com/office/word/2024/wordml/sdtformatlock" xmlns:w16se="http://schemas.microsoft.com/office/word/2015/wordml/symex" xmlns:wpg="http://schemas.microsoft.com/office/word/2010/wordprocessingGroup" xmlns:wpi="http://schemas.microsoft.com/office/word/2010/wordprocessingInk" xmlns:wne="http://schemas.microsoft.com/office/word/2006/wordml" xmlns:wps="http://schemas.microsoft.com/office/word/2010/wordprocessingShape" mc:Ignorable="w14 w15 w16se w16cid w16 w16cex w16sdtdh w16sdtfl w16du wp14">
   <w:body>
     <w:p>
       <w:pPr>
@@ -640,7 +640,6 @@
           <w:p>
             <w:pPr>
               <w:pStyle w:val="Heading3"/>
-              <w:outlineLvl w:val="2"/>
             </w:pPr>
             <w:r>
               <w:t>Learner</w:t>
@@ -762,7 +761,6 @@
           <w:p>
             <w:pPr>
               <w:pStyle w:val="Heading3"/>
-              <w:outlineLvl w:val="2"/>
             </w:pPr>
             <w:r>
               <w:t xml:space="preserve">Section A – </w:t>
@@ -881,78 +879,74 @@
             <w:pPr>
               <w:rPr>
                 <w:rFonts w:cs="Arial"/>
+                <w:lang w:val="fr-FR"/>
               </w:rPr>
             </w:pPr>
             <w:r>
               <w:rPr>
                 <w:rStyle w:val="Strong"/>
-              </w:rPr>
-              <w:t>Unit code:</w:t>
-            </w:r>
-            <w:r>
+                <w:lang w:val="fr-FR"/>
+              </w:rPr>
+              <w:t xml:space="preserve">Unit code: </w:t>
+            </w:r>
+          </w:p>
+          <w:p>
+            <w:pPr>
+              <w:rPr>
+                <w:rFonts w:cs="Arial"/>
+                <w:lang w:val="fr-FR"/>
+              </w:rPr>
+            </w:pPr>
+          </w:p>
+          <w:p>
+            <w:pPr>
               <w:rPr>
                 <w:rStyle w:val="Strong"/>
-              </w:rPr>
-              <w:t xml:space="preserve"> </w:t>
-            </w:r>
+                <w:lang w:val="fr-FR"/>
+              </w:rPr>
+            </w:pPr>
+            <w:r>
+              <w:rPr>
+                <w:rStyle w:val="Strong"/>
+                <w:lang w:val="fr-FR"/>
+              </w:rPr>
+              <w:t>CPRO1 - Javascript</w:t>
+            </w:r>
+          </w:p>
+          <w:p>
+            <w:pPr>
+              <w:rPr>
+                <w:rStyle w:val="Strong"/>
+                <w:lang w:val="fr-FR"/>
+              </w:rPr>
+            </w:pPr>
           </w:p>
           <w:p>
             <w:pPr>
               <w:rPr>
                 <w:rFonts w:cs="Arial"/>
-              </w:rPr>
-            </w:pPr>
-          </w:p>
-          <w:p>
-            <w:pPr>
-              <w:rPr>
-                <w:rStyle w:val="Strong"/>
-              </w:rPr>
-            </w:pPr>
-            <w:r>
-              <w:rPr>
-                <w:rStyle w:val="Strong"/>
-              </w:rPr>
-              <w:t xml:space="preserve">CPRO1 - </w:t>
-            </w:r>
-            <w:proofErr w:type="spellStart"/>
-            <w:r>
-              <w:rPr>
-                <w:rStyle w:val="Strong"/>
-              </w:rPr>
-              <w:t>Javascript</w:t>
-            </w:r>
-            <w:proofErr w:type="spellEnd"/>
-          </w:p>
-          <w:p>
-            <w:pPr>
-              <w:rPr>
-                <w:rStyle w:val="Strong"/>
-              </w:rPr>
-            </w:pPr>
-          </w:p>
-          <w:p>
-            <w:pPr>
+                <w:lang w:val="fr-FR"/>
+              </w:rPr>
+            </w:pPr>
+            <w:r>
               <w:rPr>
                 <w:rFonts w:cs="Arial"/>
-              </w:rPr>
-            </w:pPr>
-            <w:r>
+                <w:lang w:val="fr-FR"/>
+              </w:rPr>
+              <w:t>ICTICT449</w:t>
+            </w:r>
+          </w:p>
+          <w:p>
+            <w:pPr>
               <w:rPr>
                 <w:rFonts w:cs="Arial"/>
-              </w:rPr>
-              <w:t>ICTICT449</w:t>
-            </w:r>
-          </w:p>
-          <w:p>
-            <w:pPr>
+                <w:lang w:val="fr-FR"/>
+              </w:rPr>
+            </w:pPr>
+            <w:r>
               <w:rPr>
                 <w:rFonts w:cs="Arial"/>
-              </w:rPr>
-            </w:pPr>
-            <w:r>
-              <w:rPr>
-                <w:rFonts w:cs="Arial"/>
+                <w:lang w:val="fr-FR"/>
               </w:rPr>
               <w:t>ICTPRG437</w:t>
             </w:r>
@@ -1170,7 +1164,6 @@
           <w:p>
             <w:pPr>
               <w:pStyle w:val="Heading3"/>
-              <w:outlineLvl w:val="2"/>
             </w:pPr>
             <w:r>
               <w:t>Section B – Assessment task details</w:t>
@@ -1490,7 +1483,6 @@
           <w:p>
             <w:pPr>
               <w:pStyle w:val="Heading3"/>
-              <w:outlineLvl w:val="2"/>
             </w:pPr>
             <w:r>
               <w:t>Section C</w:t>
@@ -2190,7 +2182,6 @@
           <w:p>
             <w:pPr>
               <w:pStyle w:val="Heading3"/>
-              <w:outlineLvl w:val="2"/>
             </w:pPr>
             <w:r>
               <w:t>Section D</w:t>
@@ -2560,7 +2551,6 @@
           <w:p>
             <w:pPr>
               <w:pStyle w:val="Heading4"/>
-              <w:outlineLvl w:val="3"/>
             </w:pPr>
             <w:r>
               <w:t xml:space="preserve">Equipment/resources </w:t>
@@ -2583,7 +2573,6 @@
           <w:p>
             <w:pPr>
               <w:pStyle w:val="Heading4"/>
-              <w:outlineLvl w:val="3"/>
             </w:pPr>
             <w:r>
               <w:t>Equipment/resources to be provided by the RTO:</w:t>
@@ -2755,23 +2744,7 @@
               <w:ind w:left="-21"/>
             </w:pPr>
             <w:r>
-              <w:t xml:space="preserve">Applications are available through Holmesglen </w:t>
-            </w:r>
-            <w:proofErr w:type="spellStart"/>
-            <w:r>
-              <w:t>MyHorizon</w:t>
-            </w:r>
-            <w:proofErr w:type="spellEnd"/>
-            <w:r>
-              <w:t xml:space="preserve"> and some have free licences which can be downloaded via </w:t>
-            </w:r>
-            <w:proofErr w:type="spellStart"/>
-            <w:r>
-              <w:t>url</w:t>
-            </w:r>
-            <w:proofErr w:type="spellEnd"/>
-            <w:r>
-              <w:t xml:space="preserve"> below:</w:t>
+              <w:t>Applications are available through Holmesglen MyHorizon and some have free licences which can be downloaded via url below:</w:t>
             </w:r>
           </w:p>
           <w:p>
@@ -2795,15 +2768,7 @@
               <w:ind w:left="-21"/>
             </w:pPr>
             <w:r>
-              <w:t xml:space="preserve">•      </w:t>
-            </w:r>
-            <w:proofErr w:type="spellStart"/>
-            <w:r>
-              <w:t>MyHorizon</w:t>
-            </w:r>
-            <w:proofErr w:type="spellEnd"/>
-            <w:r>
-              <w:t xml:space="preserve"> - https://myHorizon.holmesglen.edu.au - free to download</w:t>
+              <w:t>•      MyHorizon - https://myHorizon.holmesglen.edu.au - free to download</w:t>
             </w:r>
           </w:p>
           <w:p>
@@ -2899,15 +2864,7 @@
               <w:ind w:left="-21"/>
             </w:pPr>
             <w:r>
-              <w:t xml:space="preserve">•      </w:t>
-            </w:r>
-            <w:proofErr w:type="spellStart"/>
-            <w:r>
-              <w:t>ZBrush</w:t>
-            </w:r>
-            <w:proofErr w:type="spellEnd"/>
-            <w:r>
-              <w:t xml:space="preserve"> – https://pixologic.com/</w:t>
+              <w:t>•      ZBrush – https://pixologic.com/</w:t>
             </w:r>
           </w:p>
           <w:p>
@@ -2963,16 +2920,11 @@
               <w:pStyle w:val="BodyContentIndent1"/>
             </w:pPr>
             <w:r>
-              <w:t xml:space="preserve">•      OneDrive - https://www.microsoft.com/en-ww/microsoft-365/onedrive/online-cloud-storage - free to </w:t>
-            </w:r>
-            <w:proofErr w:type="spellStart"/>
-            <w:r>
-              <w:t>download</w:t>
+              <w:t>•      OneDrive - https://www.microsoft.com/en-ww/microsoft-365/onedrive/online-cloud-storage - free to download</w:t>
             </w:r>
             <w:r>
               <w:t>e</w:t>
             </w:r>
-            <w:proofErr w:type="spellEnd"/>
           </w:p>
         </w:tc>
         <w:tc>
@@ -3109,23 +3061,7 @@
             </w:pPr>
             <w:r>
               <w:lastRenderedPageBreak/>
-              <w:t xml:space="preserve">Applications available at ZENworks and Holmesglen </w:t>
-            </w:r>
-            <w:proofErr w:type="spellStart"/>
-            <w:r>
-              <w:t>MyHorizon</w:t>
-            </w:r>
-            <w:proofErr w:type="spellEnd"/>
-            <w:r>
-              <w:t xml:space="preserve"> and free to download via </w:t>
-            </w:r>
-            <w:proofErr w:type="spellStart"/>
-            <w:r>
-              <w:t>url</w:t>
-            </w:r>
-            <w:proofErr w:type="spellEnd"/>
-            <w:r>
-              <w:t xml:space="preserve"> below:</w:t>
+              <w:t>Applications available at ZENworks and Holmesglen MyHorizon and free to download via url below:</w:t>
             </w:r>
           </w:p>
           <w:p>
@@ -3165,13 +3101,8 @@
               <w:pStyle w:val="BodyContentIndent1"/>
             </w:pPr>
             <w:r>
-              <w:t xml:space="preserve">•      Unity - https://unity.com/ - student license free to </w:t>
-            </w:r>
-            <w:proofErr w:type="spellStart"/>
-            <w:r>
-              <w:t>donwload</w:t>
-            </w:r>
-            <w:proofErr w:type="spellEnd"/>
+              <w:t>•      Unity - https://unity.com/ - student license free to donwload</w:t>
+            </w:r>
           </w:p>
           <w:p>
             <w:pPr>
@@ -3202,15 +3133,7 @@
               <w:pStyle w:val="BodyContentIndent1"/>
             </w:pPr>
             <w:r>
-              <w:t xml:space="preserve">•      </w:t>
-            </w:r>
-            <w:proofErr w:type="spellStart"/>
-            <w:r>
-              <w:t>ZBrush</w:t>
-            </w:r>
-            <w:proofErr w:type="spellEnd"/>
-            <w:r>
-              <w:t xml:space="preserve"> – https://pixologic.com/</w:t>
+              <w:t>•      ZBrush – https://pixologic.com/</w:t>
             </w:r>
           </w:p>
           <w:p>
@@ -3290,7 +3213,6 @@
           <w:p>
             <w:pPr>
               <w:pStyle w:val="Heading3"/>
-              <w:outlineLvl w:val="2"/>
             </w:pPr>
             <w:r>
               <w:t>Section E</w:t>
@@ -3463,78 +3385,74 @@
             <w:pPr>
               <w:rPr>
                 <w:rFonts w:cs="Arial"/>
+                <w:lang w:val="fr-FR"/>
               </w:rPr>
             </w:pPr>
             <w:r>
               <w:rPr>
                 <w:rStyle w:val="Strong"/>
-              </w:rPr>
-              <w:t>Unit code:</w:t>
-            </w:r>
-            <w:r>
+                <w:lang w:val="fr-FR"/>
+              </w:rPr>
+              <w:t xml:space="preserve">Unit code: </w:t>
+            </w:r>
+          </w:p>
+          <w:p>
+            <w:pPr>
+              <w:rPr>
+                <w:rFonts w:cs="Arial"/>
+                <w:lang w:val="fr-FR"/>
+              </w:rPr>
+            </w:pPr>
+          </w:p>
+          <w:p>
+            <w:pPr>
               <w:rPr>
                 <w:rStyle w:val="Strong"/>
-              </w:rPr>
-              <w:t xml:space="preserve"> </w:t>
-            </w:r>
+                <w:lang w:val="fr-FR"/>
+              </w:rPr>
+            </w:pPr>
+            <w:r>
+              <w:rPr>
+                <w:rStyle w:val="Strong"/>
+                <w:lang w:val="fr-FR"/>
+              </w:rPr>
+              <w:t>CPRO1 - Javascript</w:t>
+            </w:r>
+          </w:p>
+          <w:p>
+            <w:pPr>
+              <w:rPr>
+                <w:rStyle w:val="Strong"/>
+                <w:lang w:val="fr-FR"/>
+              </w:rPr>
+            </w:pPr>
           </w:p>
           <w:p>
             <w:pPr>
               <w:rPr>
                 <w:rFonts w:cs="Arial"/>
-              </w:rPr>
-            </w:pPr>
-          </w:p>
-          <w:p>
-            <w:pPr>
-              <w:rPr>
-                <w:rStyle w:val="Strong"/>
-              </w:rPr>
-            </w:pPr>
-            <w:r>
-              <w:rPr>
-                <w:rStyle w:val="Strong"/>
-              </w:rPr>
-              <w:t xml:space="preserve">CPRO1 - </w:t>
-            </w:r>
-            <w:proofErr w:type="spellStart"/>
-            <w:r>
-              <w:rPr>
-                <w:rStyle w:val="Strong"/>
-              </w:rPr>
-              <w:t>Javascript</w:t>
-            </w:r>
-            <w:proofErr w:type="spellEnd"/>
-          </w:p>
-          <w:p>
-            <w:pPr>
-              <w:rPr>
-                <w:rStyle w:val="Strong"/>
-              </w:rPr>
-            </w:pPr>
-          </w:p>
-          <w:p>
-            <w:pPr>
+                <w:lang w:val="fr-FR"/>
+              </w:rPr>
+            </w:pPr>
+            <w:r>
               <w:rPr>
                 <w:rFonts w:cs="Arial"/>
-              </w:rPr>
-            </w:pPr>
-            <w:r>
+                <w:lang w:val="fr-FR"/>
+              </w:rPr>
+              <w:t>ICTICT449</w:t>
+            </w:r>
+          </w:p>
+          <w:p>
+            <w:pPr>
               <w:rPr>
                 <w:rFonts w:cs="Arial"/>
-              </w:rPr>
-              <w:t>ICTICT449</w:t>
-            </w:r>
-          </w:p>
-          <w:p>
-            <w:pPr>
+                <w:lang w:val="fr-FR"/>
+              </w:rPr>
+            </w:pPr>
+            <w:r>
               <w:rPr>
                 <w:rFonts w:cs="Arial"/>
-              </w:rPr>
-            </w:pPr>
-            <w:r>
-              <w:rPr>
-                <w:rFonts w:cs="Arial"/>
+                <w:lang w:val="fr-FR"/>
               </w:rPr>
               <w:t>ICTPRG437</w:t>
             </w:r>
@@ -5838,9 +5756,92 @@
           <w:p>
             <w:pPr>
               <w:pStyle w:val="Answer"/>
-            </w:pPr>
-            <w:r>
-              <w:t>Creating repositories and branch workflows</w:t>
+              <w:rPr>
+                <w:lang w:val="en-US"/>
+              </w:rPr>
+            </w:pPr>
+            <w:r>
+              <w:rPr>
+                <w:bCs/>
+                <w:lang w:val="en-US"/>
+              </w:rPr>
+              <w:t>Branch Workflows:</w:t>
+            </w:r>
+          </w:p>
+          <w:p>
+            <w:pPr>
+              <w:pStyle w:val="Answer"/>
+              <w:numPr>
+                <w:ilvl w:val="1"/>
+                <w:numId w:val="41"/>
+              </w:numPr>
+              <w:rPr>
+                <w:b w:val="0"/>
+                <w:lang w:val="en-US"/>
+              </w:rPr>
+            </w:pPr>
+            <w:r>
+              <w:rPr>
+                <w:b w:val="0"/>
+                <w:lang w:val="en-US"/>
+              </w:rPr>
+              <w:t>Feature Branching: Each feature has its branch, merged once completed.</w:t>
+            </w:r>
+          </w:p>
+          <w:p>
+            <w:pPr>
+              <w:pStyle w:val="Answer"/>
+              <w:numPr>
+                <w:ilvl w:val="1"/>
+                <w:numId w:val="41"/>
+              </w:numPr>
+              <w:rPr>
+                <w:b w:val="0"/>
+                <w:lang w:val="en-US"/>
+              </w:rPr>
+            </w:pPr>
+            <w:r>
+              <w:rPr>
+                <w:b w:val="0"/>
+                <w:lang w:val="en-US"/>
+              </w:rPr>
+              <w:t>Git Flow: A structured approach using main, develop, feature, release, and hotfix branches.</w:t>
+            </w:r>
+          </w:p>
+          <w:p>
+            <w:pPr>
+              <w:pStyle w:val="Answer"/>
+              <w:numPr>
+                <w:ilvl w:val="1"/>
+                <w:numId w:val="41"/>
+              </w:numPr>
+              <w:rPr>
+                <w:b w:val="0"/>
+                <w:lang w:val="en-US"/>
+              </w:rPr>
+            </w:pPr>
+            <w:r>
+              <w:rPr>
+                <w:b w:val="0"/>
+                <w:lang w:val="en-US"/>
+              </w:rPr>
+              <w:t>Forking Workflow: Used in open-source projects where developers fork the main repository, make changes, and submit pull requests.</w:t>
+            </w:r>
+          </w:p>
+          <w:p>
+            <w:pPr>
+              <w:pStyle w:val="Answer"/>
+              <w:rPr>
+                <w:lang w:val="en-US"/>
+              </w:rPr>
+            </w:pPr>
+            <w:r>
+              <w:rPr>
+                <w:lang w:val="en-US"/>
+              </w:rPr>
+              <w:pict w14:anchorId="26BE6884">
+                <v:rect id="_x0000_i1057" style="width:0;height:1.5pt" o:hralign="center" o:hrstd="t" o:hr="t" fillcolor="#a0a0a0" stroked="f"/>
+              </w:pict>
             </w:r>
           </w:p>
           <w:p>
@@ -5908,6 +5909,7 @@
               <w:rPr>
                 <w:color w:val="FEFFFF" w:themeColor="background1"/>
               </w:rPr>
+              <w:lastRenderedPageBreak/>
               <w:t xml:space="preserve">Question </w:t>
             </w:r>
             <w:r>
@@ -6118,7 +6120,6 @@
               <w:rPr>
                 <w:color w:val="FEFFFF" w:themeColor="background1"/>
               </w:rPr>
-              <w:lastRenderedPageBreak/>
               <w:t xml:space="preserve">Question </w:t>
             </w:r>
             <w:r>
@@ -6826,8 +6827,6 @@
                       <w:color w:val="000000"/>
                     </w:rPr>
                   </w:pPr>
-                  <w:bookmarkStart w:id="0" w:name="_GoBack"/>
-                  <w:bookmarkEnd w:id="0"/>
                 </w:p>
               </w:tc>
             </w:tr>
@@ -7252,6 +7251,7 @@
               <w:pStyle w:val="QuestionLearnerResponse"/>
             </w:pPr>
             <w:r>
+              <w:lastRenderedPageBreak/>
               <w:t>HTML</w:t>
             </w:r>
           </w:p>
@@ -7294,6 +7294,7 @@
               <w:pStyle w:val="Answer"/>
             </w:pPr>
             <w:r>
+              <w:lastRenderedPageBreak/>
               <w:t>Comment:</w:t>
             </w:r>
           </w:p>
@@ -7336,7 +7337,6 @@
               <w:rPr>
                 <w:color w:val="FEFFFF" w:themeColor="background1"/>
               </w:rPr>
-              <w:lastRenderedPageBreak/>
               <w:t xml:space="preserve">Question </w:t>
             </w:r>
             <w:r>
@@ -8601,6 +8601,7 @@
               <w:pStyle w:val="Answer"/>
             </w:pPr>
             <w:r>
+              <w:lastRenderedPageBreak/>
               <w:t>Comment:</w:t>
             </w:r>
           </w:p>
@@ -8804,7 +8805,6 @@
               <w:rPr>
                 <w:bCs/>
               </w:rPr>
-              <w:lastRenderedPageBreak/>
               <w:t>What is UI style guide?</w:t>
             </w:r>
           </w:p>
@@ -8869,7 +8869,6 @@
               <w:pStyle w:val="Answer"/>
             </w:pPr>
             <w:r>
-              <w:lastRenderedPageBreak/>
               <w:t>Comment:</w:t>
             </w:r>
           </w:p>
@@ -10086,6 +10085,7 @@
               <w:pStyle w:val="Answer"/>
             </w:pPr>
             <w:r>
+              <w:lastRenderedPageBreak/>
               <w:t>Answer:</w:t>
             </w:r>
           </w:p>
@@ -10370,7 +10370,6 @@
               <w:pStyle w:val="Answer"/>
             </w:pPr>
             <w:r>
-              <w:lastRenderedPageBreak/>
               <w:t>Comment:</w:t>
             </w:r>
           </w:p>
@@ -11714,6 +11713,7 @@
               <w:pStyle w:val="Answer"/>
             </w:pPr>
             <w:r>
+              <w:lastRenderedPageBreak/>
               <w:t>Comment:</w:t>
             </w:r>
           </w:p>
@@ -12140,7 +12140,6 @@
               <w:pStyle w:val="Answer"/>
             </w:pPr>
             <w:r>
-              <w:lastRenderedPageBreak/>
               <w:t>Comment:</w:t>
             </w:r>
           </w:p>
@@ -12920,6 +12919,7 @@
               <w:rPr>
                 <w:color w:val="FEFFFF" w:themeColor="background1"/>
               </w:rPr>
+              <w:lastRenderedPageBreak/>
               <w:t xml:space="preserve">Question </w:t>
             </w:r>
             <w:r>
@@ -13108,7 +13108,6 @@
               <w:pStyle w:val="QuestionLearnerResponse"/>
             </w:pPr>
             <w:r>
-              <w:lastRenderedPageBreak/>
               <w:t>Copy here.</w:t>
             </w:r>
           </w:p>
@@ -13125,7 +13124,6 @@
               <w:pStyle w:val="Answer"/>
             </w:pPr>
             <w:r>
-              <w:lastRenderedPageBreak/>
               <w:t>Comment:</w:t>
             </w:r>
           </w:p>
@@ -13840,7 +13838,6 @@
           <w:p>
             <w:pPr>
               <w:pStyle w:val="Heading4"/>
-              <w:outlineLvl w:val="3"/>
             </w:pPr>
             <w:r>
               <w:t>Criteria for assessment</w:t>
@@ -13855,7 +13852,6 @@
             <w:pPr>
               <w:pStyle w:val="Heading4"/>
               <w:spacing w:after="40"/>
-              <w:outlineLvl w:val="3"/>
             </w:pPr>
             <w:r>
               <w:t>Satisfactory</w:t>
@@ -13864,7 +13860,6 @@
           <w:p>
             <w:pPr>
               <w:pStyle w:val="Heading4"/>
-              <w:outlineLvl w:val="3"/>
             </w:pPr>
             <w:r>
               <w:t>Yes</w:t>
@@ -13882,7 +13877,6 @@
           <w:p>
             <w:pPr>
               <w:pStyle w:val="Heading4"/>
-              <w:outlineLvl w:val="3"/>
             </w:pPr>
             <w:r>
               <w:t>Comment</w:t>
@@ -14668,6 +14662,7 @@
               <w:ind w:left="567" w:hanging="567"/>
             </w:pPr>
             <w:r>
+              <w:lastRenderedPageBreak/>
               <w:t>1.5 Learner has implemented sequential search algorithm</w:t>
             </w:r>
           </w:p>
@@ -15024,7 +15019,6 @@
               <w:ind w:left="567" w:hanging="567"/>
             </w:pPr>
             <w:r>
-              <w:lastRenderedPageBreak/>
               <w:t>1.8 Learner has conducted and recorded the results of the tests created in 1.7</w:t>
             </w:r>
           </w:p>
@@ -16598,15 +16592,7 @@
               <w:ind w:left="567" w:hanging="567"/>
             </w:pPr>
             <w:r>
-              <w:t xml:space="preserve">3.2 Learner has used length and </w:t>
-            </w:r>
-            <w:proofErr w:type="spellStart"/>
-            <w:r>
-              <w:t>charAt</w:t>
-            </w:r>
-            <w:proofErr w:type="spellEnd"/>
-            <w:r>
-              <w:t xml:space="preserve"> to get the required information</w:t>
+              <w:t>3.2 Learner has used length and charAt to get the required information</w:t>
             </w:r>
           </w:p>
         </w:tc>
@@ -16846,21 +16832,8 @@
               <w:ind w:left="567" w:hanging="567"/>
             </w:pPr>
             <w:r>
-              <w:t xml:space="preserve">3.4 Learner has used </w:t>
-            </w:r>
-            <w:proofErr w:type="spellStart"/>
-            <w:r>
-              <w:t>toUpperCase</w:t>
-            </w:r>
-            <w:proofErr w:type="spellEnd"/>
-            <w:r>
-              <w:t xml:space="preserve"> and </w:t>
-            </w:r>
-            <w:proofErr w:type="spellStart"/>
-            <w:r>
-              <w:t>toLowerCase</w:t>
-            </w:r>
-            <w:proofErr w:type="spellEnd"/>
+              <w:t>3.4 Learner has used toUpperCase and toLowerCase</w:t>
+            </w:r>
           </w:p>
         </w:tc>
         <w:tc>
@@ -16979,15 +16952,7 @@
               <w:ind w:left="567" w:hanging="567"/>
             </w:pPr>
             <w:r>
-              <w:t xml:space="preserve">3.5 Learner has used </w:t>
-            </w:r>
-            <w:proofErr w:type="spellStart"/>
-            <w:r>
-              <w:t>concat</w:t>
-            </w:r>
-            <w:proofErr w:type="spellEnd"/>
-            <w:r>
-              <w:t>, trim, replace and split as required</w:t>
+              <w:t>3.5 Learner has used concat, trim, replace and split as required</w:t>
             </w:r>
           </w:p>
         </w:tc>
@@ -18073,15 +18038,7 @@
               <w:ind w:left="567" w:hanging="567"/>
             </w:pPr>
             <w:r>
-              <w:t xml:space="preserve">4.4 Learner has </w:t>
-            </w:r>
-            <w:proofErr w:type="gramStart"/>
-            <w:r>
-              <w:t>implement</w:t>
-            </w:r>
-            <w:proofErr w:type="gramEnd"/>
-            <w:r>
-              <w:t xml:space="preserve"> either sequential or binary search algorithm</w:t>
+              <w:t>4.4 Learner has implement either sequential or binary search algorithm</w:t>
             </w:r>
           </w:p>
         </w:tc>
@@ -18327,6 +18284,7 @@
               <w:ind w:left="567" w:hanging="567"/>
             </w:pPr>
             <w:r>
+              <w:lastRenderedPageBreak/>
               <w:t>5.1 Learner has listed repository details and initial commit</w:t>
             </w:r>
           </w:p>
@@ -18567,16 +18525,7 @@
               <w:ind w:left="567" w:hanging="567"/>
             </w:pPr>
             <w:r>
-              <w:lastRenderedPageBreak/>
-              <w:t xml:space="preserve">5.3 Learner has listed the HTML guidelines </w:t>
-            </w:r>
-            <w:proofErr w:type="spellStart"/>
-            <w:r>
-              <w:t>the</w:t>
-            </w:r>
-            <w:proofErr w:type="spellEnd"/>
-            <w:r>
-              <w:t xml:space="preserve"> are following and described them</w:t>
+              <w:t>5.3 Learner has listed the HTML guidelines the are following and described them</w:t>
             </w:r>
           </w:p>
         </w:tc>
@@ -20740,6 +20689,7 @@
               <w:ind w:left="567" w:hanging="567"/>
             </w:pPr>
             <w:r>
+              <w:lastRenderedPageBreak/>
               <w:t>6.5 The learner has updated the myscript.js file to add in their details.</w:t>
             </w:r>
           </w:p>
@@ -20985,10 +20935,8 @@
           <w:p>
             <w:pPr>
               <w:pStyle w:val="Heading3"/>
-              <w:outlineLvl w:val="2"/>
-            </w:pPr>
-            <w:r>
-              <w:lastRenderedPageBreak/>
+            </w:pPr>
+            <w:r>
               <w:t>Section F – Feedback to Learner</w:t>
             </w:r>
           </w:p>
@@ -21420,7 +21368,6 @@
           <w:p>
             <w:pPr>
               <w:pStyle w:val="Heading3"/>
-              <w:outlineLvl w:val="2"/>
             </w:pPr>
             <w:r>
               <w:t>Learner acknowledgement:</w:t>
@@ -21710,15 +21657,7 @@
               </w:numPr>
             </w:pPr>
             <w:r>
-              <w:t>Create a JavaScript function called “</w:t>
-            </w:r>
-            <w:proofErr w:type="spellStart"/>
-            <w:r>
-              <w:t>sequentialSearch</w:t>
-            </w:r>
-            <w:proofErr w:type="spellEnd"/>
-            <w:r>
-              <w:t>”</w:t>
+              <w:t>Create a JavaScript function called “sequentialSearch”</w:t>
             </w:r>
           </w:p>
           <w:p>
@@ -21773,15 +21712,7 @@
               </w:numPr>
             </w:pPr>
             <w:r>
-              <w:t>Create a JavaScript function called “</w:t>
-            </w:r>
-            <w:proofErr w:type="spellStart"/>
-            <w:r>
-              <w:t>binarySearch</w:t>
-            </w:r>
-            <w:proofErr w:type="spellEnd"/>
-            <w:r>
-              <w:t>”</w:t>
+              <w:t>Create a JavaScript function called “binarySearch”</w:t>
             </w:r>
           </w:p>
           <w:p>
@@ -22102,23 +22033,7 @@
               </w:numPr>
             </w:pPr>
             <w:r>
-              <w:t>The test case shall have a full coverage of function “</w:t>
-            </w:r>
-            <w:proofErr w:type="spellStart"/>
-            <w:r>
-              <w:t>sequentialSearch</w:t>
-            </w:r>
-            <w:proofErr w:type="spellEnd"/>
-            <w:r>
-              <w:t>” and “</w:t>
-            </w:r>
-            <w:proofErr w:type="spellStart"/>
-            <w:r>
-              <w:t>binarySearch</w:t>
-            </w:r>
-            <w:proofErr w:type="spellEnd"/>
-            <w:r>
-              <w:t>”</w:t>
+              <w:t>The test case shall have a full coverage of function “sequentialSearch” and “binarySearch”</w:t>
             </w:r>
           </w:p>
           <w:p>
@@ -22284,19 +22199,18 @@
                 <w:bCs/>
               </w:rPr>
             </w:pPr>
-            <w:bookmarkStart w:id="1" w:name="_Hlk189033027"/>
-            <w:r>
-              <w:rPr>
-                <w:b/>
-                <w:bCs/>
-              </w:rPr>
-              <w:lastRenderedPageBreak/>
+            <w:bookmarkStart w:id="0" w:name="_Hlk189033027"/>
+            <w:r>
+              <w:rPr>
+                <w:b/>
+                <w:bCs/>
+              </w:rPr>
               <w:t>Q1A Record GitHub repository details for this part:</w:t>
             </w:r>
           </w:p>
         </w:tc>
       </w:tr>
-      <w:bookmarkEnd w:id="1"/>
+      <w:bookmarkEnd w:id="0"/>
       <w:tr>
         <w:tc>
           <w:tcPr>
@@ -22851,23 +22765,7 @@
                 <w:b/>
                 <w:bCs/>
               </w:rPr>
-              <w:t>Implement the function “</w:t>
-            </w:r>
-            <w:proofErr w:type="spellStart"/>
-            <w:r>
-              <w:rPr>
-                <w:b/>
-                <w:bCs/>
-              </w:rPr>
-              <w:t>seqentialSearch</w:t>
-            </w:r>
-            <w:proofErr w:type="spellEnd"/>
-            <w:r>
-              <w:rPr>
-                <w:b/>
-                <w:bCs/>
-              </w:rPr>
-              <w:t>” as per part 5 of the task description</w:t>
+              <w:t>Implement the function “seqentialSearch” as per part 5 of the task description</w:t>
             </w:r>
           </w:p>
           <w:p/>
@@ -22881,15 +22779,7 @@
           </w:tcPr>
           <w:p>
             <w:r>
-              <w:t>&lt;Insert a screenshot of the JavaScript code of the function “</w:t>
-            </w:r>
-            <w:proofErr w:type="spellStart"/>
-            <w:r>
-              <w:t>sequentialSearch</w:t>
-            </w:r>
-            <w:proofErr w:type="spellEnd"/>
-            <w:r>
-              <w:t>”&gt;</w:t>
+              <w:t>&lt;Insert a screenshot of the JavaScript code of the function “sequentialSearch”&gt;</w:t>
             </w:r>
           </w:p>
           <w:p/>
@@ -23008,7 +22898,6 @@
               </w:rPr>
               <w:t>“</w:t>
             </w:r>
-            <w:proofErr w:type="spellStart"/>
             <w:r>
               <w:rPr>
                 <w:b/>
@@ -23016,7 +22905,6 @@
               </w:rPr>
               <w:t>binarySearch</w:t>
             </w:r>
-            <w:proofErr w:type="spellEnd"/>
             <w:r>
               <w:rPr>
                 <w:b/>
@@ -23043,15 +22931,7 @@
           </w:tcPr>
           <w:p>
             <w:r>
-              <w:t>&lt;Insert a screenshot of the JavaScript code of the function “</w:t>
-            </w:r>
-            <w:proofErr w:type="spellStart"/>
-            <w:r>
-              <w:t>binarySearch</w:t>
-            </w:r>
-            <w:proofErr w:type="spellEnd"/>
-            <w:r>
-              <w:t>”&gt;</w:t>
+              <w:t>&lt;Insert a screenshot of the JavaScript code of the function “binarySearch”&gt;</w:t>
             </w:r>
           </w:p>
           <w:p/>
@@ -23141,39 +23021,7 @@
                 <w:b/>
                 <w:bCs/>
               </w:rPr>
-              <w:t>You are required to develop a test plan that covers the functions “</w:t>
-            </w:r>
-            <w:proofErr w:type="spellStart"/>
-            <w:r>
-              <w:rPr>
-                <w:b/>
-                <w:bCs/>
-              </w:rPr>
-              <w:t>sequentialSearch</w:t>
-            </w:r>
-            <w:proofErr w:type="spellEnd"/>
-            <w:r>
-              <w:rPr>
-                <w:b/>
-                <w:bCs/>
-              </w:rPr>
-              <w:t>” and “</w:t>
-            </w:r>
-            <w:proofErr w:type="spellStart"/>
-            <w:r>
-              <w:rPr>
-                <w:b/>
-                <w:bCs/>
-              </w:rPr>
-              <w:t>binarySearch</w:t>
-            </w:r>
-            <w:proofErr w:type="spellEnd"/>
-            <w:r>
-              <w:rPr>
-                <w:b/>
-                <w:bCs/>
-              </w:rPr>
-              <w:t>” The test plan should be in the submission for review.</w:t>
+              <w:t>You are required to develop a test plan that covers the functions “sequentialSearch” and “binarySearch” The test plan should be in the submission for review.</w:t>
             </w:r>
           </w:p>
         </w:tc>
@@ -23553,7 +23401,7 @@
             <w:tcW w:w="1555" w:type="dxa"/>
           </w:tcPr>
           <w:p>
-            <w:bookmarkStart w:id="2" w:name="_Hlk189033611"/>
+            <w:bookmarkStart w:id="1" w:name="_Hlk189033611"/>
             <w:r>
               <w:t>Branch name</w:t>
             </w:r>
@@ -23582,7 +23430,7 @@
           <w:p/>
         </w:tc>
       </w:tr>
-      <w:bookmarkEnd w:id="2"/>
+      <w:bookmarkEnd w:id="1"/>
     </w:tbl>
     <w:p/>
     <w:tbl>
@@ -23613,7 +23461,7 @@
                 <w:bCs/>
               </w:rPr>
             </w:pPr>
-            <w:bookmarkStart w:id="3" w:name="_Hlk189034118"/>
+            <w:bookmarkStart w:id="2" w:name="_Hlk189034118"/>
             <w:r>
               <w:rPr>
                 <w:b/>
@@ -23624,7 +23472,7 @@
           </w:p>
         </w:tc>
       </w:tr>
-      <w:bookmarkEnd w:id="3"/>
+      <w:bookmarkEnd w:id="2"/>
       <w:tr>
         <w:tc>
           <w:tcPr>
@@ -23676,15 +23524,7 @@
               <w:t xml:space="preserve"> </w:t>
             </w:r>
             <w:r>
-              <w:t>called “</w:t>
-            </w:r>
-            <w:proofErr w:type="spellStart"/>
-            <w:r>
-              <w:t>myMovie</w:t>
-            </w:r>
-            <w:proofErr w:type="spellEnd"/>
-            <w:r>
-              <w:t xml:space="preserve">” </w:t>
+              <w:t xml:space="preserve">called “myMovie” </w:t>
             </w:r>
             <w:r>
               <w:t xml:space="preserve">with the following </w:t>
@@ -23803,8 +23643,8 @@
                 <w:bCs/>
               </w:rPr>
             </w:pPr>
-            <w:bookmarkStart w:id="4" w:name="_Hlk189033504"/>
-            <w:bookmarkStart w:id="5" w:name="_Hlk189034715"/>
+            <w:bookmarkStart w:id="3" w:name="_Hlk189033504"/>
+            <w:bookmarkStart w:id="4" w:name="_Hlk189034715"/>
             <w:r>
               <w:rPr>
                 <w:b/>
@@ -23831,7 +23671,7 @@
           </w:p>
         </w:tc>
       </w:tr>
-      <w:bookmarkEnd w:id="4"/>
+      <w:bookmarkEnd w:id="3"/>
       <w:tr>
         <w:tc>
           <w:tcPr>
@@ -23902,8 +23742,8 @@
                 <w:bCs/>
               </w:rPr>
             </w:pPr>
-            <w:bookmarkStart w:id="6" w:name="_Hlk189034851"/>
-            <w:bookmarkEnd w:id="5"/>
+            <w:bookmarkStart w:id="5" w:name="_Hlk189034851"/>
+            <w:bookmarkEnd w:id="4"/>
             <w:r>
               <w:rPr>
                 <w:b/>
@@ -23916,23 +23756,7 @@
                 <w:b/>
                 <w:bCs/>
               </w:rPr>
-              <w:t>object called “</w:t>
-            </w:r>
-            <w:proofErr w:type="spellStart"/>
-            <w:r>
-              <w:rPr>
-                <w:b/>
-                <w:bCs/>
-              </w:rPr>
-              <w:t>myMovie</w:t>
-            </w:r>
-            <w:proofErr w:type="spellEnd"/>
-            <w:r>
-              <w:rPr>
-                <w:b/>
-                <w:bCs/>
-              </w:rPr>
-              <w:t>”</w:t>
+              <w:t>object called “myMovie”</w:t>
             </w:r>
             <w:r>
               <w:rPr>
@@ -23995,7 +23819,6 @@
           </w:tcPr>
           <w:p>
             <w:r>
-              <w:lastRenderedPageBreak/>
               <w:t>&lt;Insert the screenshot JavaScript code that built the object&gt;</w:t>
             </w:r>
           </w:p>
@@ -24059,7 +23882,7 @@
           <w:p/>
         </w:tc>
       </w:tr>
-      <w:bookmarkEnd w:id="6"/>
+      <w:bookmarkEnd w:id="5"/>
       <w:tr>
         <w:tc>
           <w:tcPr>
@@ -24094,23 +23917,7 @@
                 <w:b/>
                 <w:bCs/>
               </w:rPr>
-              <w:t xml:space="preserve"> Add the following properties and data to the “</w:t>
-            </w:r>
-            <w:proofErr w:type="spellStart"/>
-            <w:r>
-              <w:rPr>
-                <w:b/>
-                <w:bCs/>
-              </w:rPr>
-              <w:t>myMovie</w:t>
-            </w:r>
-            <w:proofErr w:type="spellEnd"/>
-            <w:r>
-              <w:rPr>
-                <w:b/>
-                <w:bCs/>
-              </w:rPr>
-              <w:t>” object:</w:t>
+              <w:t xml:space="preserve"> Add the following properties and data to the “myMovie” object:</w:t>
             </w:r>
           </w:p>
           <w:p>
@@ -24415,7 +24222,7 @@
                 <w:bCs/>
               </w:rPr>
             </w:pPr>
-            <w:bookmarkStart w:id="7" w:name="_Hlk189035027"/>
+            <w:bookmarkStart w:id="6" w:name="_Hlk189035027"/>
             <w:r>
               <w:rPr>
                 <w:b/>
@@ -24442,23 +24249,7 @@
                 <w:b/>
                 <w:bCs/>
               </w:rPr>
-              <w:t>Remove the summary property from “</w:t>
-            </w:r>
-            <w:proofErr w:type="spellStart"/>
-            <w:r>
-              <w:rPr>
-                <w:b/>
-                <w:bCs/>
-              </w:rPr>
-              <w:t>myMovie</w:t>
-            </w:r>
-            <w:proofErr w:type="spellEnd"/>
-            <w:r>
-              <w:rPr>
-                <w:b/>
-                <w:bCs/>
-              </w:rPr>
-              <w:t>”</w:t>
+              <w:t>Remove the summary property from “myMovie”</w:t>
             </w:r>
             <w:r>
               <w:rPr>
@@ -24583,7 +24374,7 @@
           <w:p/>
         </w:tc>
       </w:tr>
-      <w:bookmarkEnd w:id="7"/>
+      <w:bookmarkEnd w:id="6"/>
       <w:tr>
         <w:tc>
           <w:tcPr>
@@ -24742,13 +24533,8 @@
               </w:numPr>
               <w:spacing w:after="160" w:line="259" w:lineRule="auto"/>
             </w:pPr>
-            <w:proofErr w:type="spellStart"/>
-            <w:r>
-              <w:t>myString</w:t>
-            </w:r>
-            <w:proofErr w:type="spellEnd"/>
-            <w:r>
-              <w:t xml:space="preserve"> = “This is a string”</w:t>
+            <w:r>
+              <w:t>myString = “This is a string”</w:t>
             </w:r>
           </w:p>
           <w:p>
@@ -24759,21 +24545,8 @@
               </w:numPr>
               <w:spacing w:after="160" w:line="259" w:lineRule="auto"/>
             </w:pPr>
-            <w:proofErr w:type="spellStart"/>
-            <w:r>
-              <w:t>anotherString</w:t>
-            </w:r>
-            <w:proofErr w:type="spellEnd"/>
-            <w:r>
-              <w:t xml:space="preserve"> = </w:t>
-            </w:r>
-            <w:proofErr w:type="gramStart"/>
-            <w:r>
-              <w:t xml:space="preserve">“  </w:t>
-            </w:r>
-            <w:proofErr w:type="gramEnd"/>
-            <w:r>
-              <w:t xml:space="preserve"> Another string” (note there are 3 blank spaces at the beginning)</w:t>
+            <w:r>
+              <w:t>anotherString = “   Another string” (note there are 3 blank spaces at the beginning)</w:t>
             </w:r>
           </w:p>
           <w:p>
@@ -24796,13 +24569,8 @@
               </w:numPr>
               <w:spacing w:after="160" w:line="259" w:lineRule="auto"/>
             </w:pPr>
-            <w:proofErr w:type="spellStart"/>
-            <w:r>
-              <w:t>myName</w:t>
-            </w:r>
-            <w:proofErr w:type="spellEnd"/>
-            <w:r>
-              <w:t xml:space="preserve"> = your first name</w:t>
+            <w:r>
+              <w:t>myName = your first name</w:t>
             </w:r>
           </w:p>
           <w:p>
@@ -24828,13 +24596,8 @@
               <w:spacing w:after="160" w:line="259" w:lineRule="auto"/>
             </w:pPr>
             <w:r>
-              <w:t xml:space="preserve">Find out the length of </w:t>
-            </w:r>
-            <w:proofErr w:type="spellStart"/>
-            <w:r>
-              <w:t>myString</w:t>
-            </w:r>
-            <w:proofErr w:type="spellEnd"/>
+              <w:t>Find out the length of myString</w:t>
+            </w:r>
           </w:p>
           <w:p>
             <w:pPr>
@@ -24846,13 +24609,8 @@
               <w:spacing w:after="160" w:line="259" w:lineRule="auto"/>
             </w:pPr>
             <w:r>
-              <w:t xml:space="preserve">Find out the first character of </w:t>
-            </w:r>
-            <w:proofErr w:type="spellStart"/>
-            <w:r>
-              <w:t>myString</w:t>
-            </w:r>
-            <w:proofErr w:type="spellEnd"/>
+              <w:t>Find out the first character of myString</w:t>
+            </w:r>
           </w:p>
           <w:p>
             <w:pPr>
@@ -24873,13 +24631,8 @@
               <w:t>th</w:t>
             </w:r>
             <w:r>
-              <w:t xml:space="preserve"> character of </w:t>
-            </w:r>
-            <w:proofErr w:type="spellStart"/>
-            <w:r>
-              <w:t>myString</w:t>
-            </w:r>
-            <w:proofErr w:type="spellEnd"/>
+              <w:t xml:space="preserve"> character of myString</w:t>
+            </w:r>
           </w:p>
           <w:p>
             <w:pPr>
@@ -24902,13 +24655,8 @@
               <w:spacing w:after="160" w:line="259" w:lineRule="auto"/>
             </w:pPr>
             <w:r>
-              <w:t xml:space="preserve">Slice “is a” from </w:t>
-            </w:r>
-            <w:proofErr w:type="spellStart"/>
-            <w:r>
-              <w:t>myString</w:t>
-            </w:r>
-            <w:proofErr w:type="spellEnd"/>
+              <w:t>Slice “is a” from myString</w:t>
+            </w:r>
           </w:p>
           <w:p>
             <w:pPr>
@@ -24919,13 +24667,8 @@
               <w:spacing w:after="160" w:line="259" w:lineRule="auto"/>
             </w:pPr>
             <w:r>
-              <w:t xml:space="preserve">Use substring to get “the” from </w:t>
-            </w:r>
-            <w:proofErr w:type="spellStart"/>
-            <w:r>
-              <w:t>anotherString</w:t>
-            </w:r>
-            <w:proofErr w:type="spellEnd"/>
+              <w:t>Use substring to get “the” from anotherString</w:t>
+            </w:r>
           </w:p>
           <w:p>
             <w:pPr>
@@ -24936,15 +24679,7 @@
               <w:spacing w:after="160" w:line="259" w:lineRule="auto"/>
             </w:pPr>
             <w:r>
-              <w:t xml:space="preserve">Change the case of the </w:t>
-            </w:r>
-            <w:proofErr w:type="spellStart"/>
-            <w:r>
-              <w:t>myName</w:t>
-            </w:r>
-            <w:proofErr w:type="spellEnd"/>
-            <w:r>
-              <w:t xml:space="preserve"> string</w:t>
+              <w:t>Change the case of the myName string</w:t>
             </w:r>
           </w:p>
           <w:p>
@@ -24956,15 +24691,7 @@
               <w:spacing w:after="160" w:line="259" w:lineRule="auto"/>
             </w:pPr>
             <w:r>
-              <w:t xml:space="preserve">Print out the </w:t>
-            </w:r>
-            <w:proofErr w:type="spellStart"/>
-            <w:r>
-              <w:t>myName</w:t>
-            </w:r>
-            <w:proofErr w:type="spellEnd"/>
-            <w:r>
-              <w:t xml:space="preserve"> string in all upper case</w:t>
+              <w:t>Print out the myName string in all upper case</w:t>
             </w:r>
           </w:p>
           <w:p>
@@ -24976,15 +24703,7 @@
               <w:spacing w:after="160" w:line="259" w:lineRule="auto"/>
             </w:pPr>
             <w:r>
-              <w:t xml:space="preserve">Print out the </w:t>
-            </w:r>
-            <w:proofErr w:type="spellStart"/>
-            <w:r>
-              <w:t>myName</w:t>
-            </w:r>
-            <w:proofErr w:type="spellEnd"/>
-            <w:r>
-              <w:t xml:space="preserve"> string in all lower case</w:t>
+              <w:t>Print out the myName string in all lower case</w:t>
             </w:r>
           </w:p>
           <w:p>
@@ -25001,15 +24720,7 @@
               <w:spacing w:after="160" w:line="259" w:lineRule="auto"/>
             </w:pPr>
             <w:r>
-              <w:t xml:space="preserve">Use </w:t>
-            </w:r>
-            <w:proofErr w:type="spellStart"/>
-            <w:r>
-              <w:t>concat</w:t>
-            </w:r>
-            <w:proofErr w:type="spellEnd"/>
-            <w:r>
-              <w:t xml:space="preserve">, trim, replace and split to create new strings </w:t>
+              <w:t xml:space="preserve">Use concat, trim, replace and split to create new strings </w:t>
             </w:r>
           </w:p>
           <w:p>
@@ -25020,21 +24731,8 @@
               </w:numPr>
               <w:spacing w:after="160" w:line="259" w:lineRule="auto"/>
             </w:pPr>
-            <w:proofErr w:type="spellStart"/>
-            <w:r>
-              <w:t>Concat</w:t>
-            </w:r>
-            <w:proofErr w:type="spellEnd"/>
-            <w:r>
-              <w:t xml:space="preserve"> hello and </w:t>
-            </w:r>
-            <w:proofErr w:type="spellStart"/>
-            <w:r>
-              <w:t>myName</w:t>
-            </w:r>
-            <w:proofErr w:type="spellEnd"/>
-            <w:r>
-              <w:t xml:space="preserve"> together</w:t>
+            <w:r>
+              <w:t>Concat hello and myName together</w:t>
             </w:r>
           </w:p>
           <w:p>
@@ -25046,13 +24744,8 @@
               <w:spacing w:after="160" w:line="259" w:lineRule="auto"/>
             </w:pPr>
             <w:r>
-              <w:t xml:space="preserve">Use the trim function to remove the spaces in </w:t>
-            </w:r>
-            <w:proofErr w:type="spellStart"/>
-            <w:r>
-              <w:t>anotherString</w:t>
-            </w:r>
-            <w:proofErr w:type="spellEnd"/>
+              <w:t>Use the trim function to remove the spaces in anotherString</w:t>
+            </w:r>
           </w:p>
           <w:p>
             <w:pPr>
@@ -25063,13 +24756,8 @@
               <w:spacing w:after="160" w:line="259" w:lineRule="auto"/>
             </w:pPr>
             <w:r>
-              <w:t xml:space="preserve">Use the replace function to change “is a” to an empty space in </w:t>
-            </w:r>
-            <w:proofErr w:type="spellStart"/>
-            <w:r>
-              <w:t>myString</w:t>
-            </w:r>
-            <w:proofErr w:type="spellEnd"/>
+              <w:t>Use the replace function to change “is a” to an empty space in myString</w:t>
+            </w:r>
           </w:p>
           <w:p>
             <w:pPr>
@@ -25080,15 +24768,7 @@
               <w:spacing w:after="160" w:line="259" w:lineRule="auto"/>
             </w:pPr>
             <w:r>
-              <w:t xml:space="preserve">Split </w:t>
-            </w:r>
-            <w:proofErr w:type="spellStart"/>
-            <w:r>
-              <w:t>myString</w:t>
-            </w:r>
-            <w:proofErr w:type="spellEnd"/>
-            <w:r>
-              <w:t xml:space="preserve"> on the spaces.</w:t>
+              <w:t>Split myString on the spaces.</w:t>
             </w:r>
           </w:p>
           <w:p>
@@ -25100,7 +24780,7 @@
               </w:numPr>
               <w:spacing w:after="160" w:line="259" w:lineRule="auto"/>
             </w:pPr>
-            <w:bookmarkStart w:id="8" w:name="_Hlk189036656"/>
+            <w:bookmarkStart w:id="7" w:name="_Hlk189036656"/>
             <w:r>
               <w:t xml:space="preserve">Create algorithms </w:t>
             </w:r>
@@ -25131,7 +24811,7 @@
               <w:t>Create algorithm for reading in the text file</w:t>
             </w:r>
           </w:p>
-          <w:bookmarkEnd w:id="8"/>
+          <w:bookmarkEnd w:id="7"/>
           <w:p>
             <w:pPr>
               <w:pStyle w:val="ListParagraph"/>
@@ -25316,7 +24996,6 @@
                 <w:b/>
                 <w:bCs/>
               </w:rPr>
-              <w:lastRenderedPageBreak/>
               <w:t>Q3A Record GitHub repository details for this part:</w:t>
             </w:r>
           </w:p>
@@ -25392,7 +25071,7 @@
                 <w:bCs/>
               </w:rPr>
             </w:pPr>
-            <w:bookmarkStart w:id="9" w:name="_Hlk189035121"/>
+            <w:bookmarkStart w:id="8" w:name="_Hlk189035121"/>
             <w:r>
               <w:rPr>
                 <w:b/>
@@ -25456,21 +25135,12 @@
                 <w:bCs/>
               </w:rPr>
             </w:pPr>
-            <w:proofErr w:type="spellStart"/>
-            <w:r>
-              <w:rPr>
-                <w:b/>
-                <w:bCs/>
-              </w:rPr>
-              <w:t>myString</w:t>
-            </w:r>
-            <w:proofErr w:type="spellEnd"/>
-            <w:r>
-              <w:rPr>
-                <w:b/>
-                <w:bCs/>
-              </w:rPr>
-              <w:t xml:space="preserve"> = “This is a string”</w:t>
+            <w:r>
+              <w:rPr>
+                <w:b/>
+                <w:bCs/>
+              </w:rPr>
+              <w:t>myString = “This is a string”</w:t>
             </w:r>
           </w:p>
           <w:p>
@@ -25486,37 +25156,12 @@
                 <w:bCs/>
               </w:rPr>
             </w:pPr>
-            <w:proofErr w:type="spellStart"/>
-            <w:r>
-              <w:rPr>
-                <w:b/>
-                <w:bCs/>
-              </w:rPr>
-              <w:t>anotherString</w:t>
-            </w:r>
-            <w:proofErr w:type="spellEnd"/>
-            <w:r>
-              <w:rPr>
-                <w:b/>
-                <w:bCs/>
-              </w:rPr>
-              <w:t xml:space="preserve"> = </w:t>
-            </w:r>
-            <w:proofErr w:type="gramStart"/>
-            <w:r>
-              <w:rPr>
-                <w:b/>
-                <w:bCs/>
-              </w:rPr>
-              <w:t xml:space="preserve">“  </w:t>
-            </w:r>
-            <w:proofErr w:type="gramEnd"/>
-            <w:r>
-              <w:rPr>
-                <w:b/>
-                <w:bCs/>
-              </w:rPr>
-              <w:t xml:space="preserve"> Another string” (note there are 3 blank spaces at the beginning)</w:t>
+            <w:r>
+              <w:rPr>
+                <w:b/>
+                <w:bCs/>
+              </w:rPr>
+              <w:t>anotherString = “   Another string” (note there are 3 blank spaces at the beginning)</w:t>
             </w:r>
           </w:p>
           <w:p>
@@ -25553,21 +25198,12 @@
                 <w:bCs/>
               </w:rPr>
             </w:pPr>
-            <w:proofErr w:type="spellStart"/>
-            <w:r>
-              <w:rPr>
-                <w:b/>
-                <w:bCs/>
-              </w:rPr>
-              <w:t>myName</w:t>
-            </w:r>
-            <w:proofErr w:type="spellEnd"/>
-            <w:r>
-              <w:rPr>
-                <w:b/>
-                <w:bCs/>
-              </w:rPr>
-              <w:t xml:space="preserve"> = your first name</w:t>
+            <w:r>
+              <w:rPr>
+                <w:b/>
+                <w:bCs/>
+              </w:rPr>
+              <w:t>myName = your first name</w:t>
             </w:r>
           </w:p>
         </w:tc>
@@ -25658,8 +25294,8 @@
                 <w:bCs/>
               </w:rPr>
             </w:pPr>
-            <w:bookmarkStart w:id="10" w:name="_Hlk189035303"/>
-            <w:bookmarkEnd w:id="9"/>
+            <w:bookmarkStart w:id="9" w:name="_Hlk189035303"/>
+            <w:bookmarkEnd w:id="8"/>
             <w:r>
               <w:rPr>
                 <w:b/>
@@ -25721,17 +25357,8 @@
                 <w:b/>
                 <w:bCs/>
               </w:rPr>
-              <w:t xml:space="preserve">Find out the length of </w:t>
-            </w:r>
-            <w:proofErr w:type="spellStart"/>
-            <w:r>
-              <w:rPr>
-                <w:b/>
-                <w:bCs/>
-              </w:rPr>
-              <w:t>myString</w:t>
-            </w:r>
-            <w:proofErr w:type="spellEnd"/>
+              <w:t>Find out the length of myString</w:t>
+            </w:r>
           </w:p>
           <w:p>
             <w:pPr>
@@ -25751,17 +25378,8 @@
                 <w:b/>
                 <w:bCs/>
               </w:rPr>
-              <w:t xml:space="preserve">Find out the first character of </w:t>
-            </w:r>
-            <w:proofErr w:type="spellStart"/>
-            <w:r>
-              <w:rPr>
-                <w:b/>
-                <w:bCs/>
-              </w:rPr>
-              <w:t>myString</w:t>
-            </w:r>
-            <w:proofErr w:type="spellEnd"/>
+              <w:t>Find out the first character of myString</w:t>
+            </w:r>
           </w:p>
           <w:p>
             <w:pPr>
@@ -25796,17 +25414,8 @@
                 <w:b/>
                 <w:bCs/>
               </w:rPr>
-              <w:t xml:space="preserve"> character of </w:t>
-            </w:r>
-            <w:proofErr w:type="spellStart"/>
-            <w:r>
-              <w:rPr>
-                <w:b/>
-                <w:bCs/>
-              </w:rPr>
-              <w:t>myString</w:t>
-            </w:r>
-            <w:proofErr w:type="spellEnd"/>
+              <w:t xml:space="preserve"> character of myString</w:t>
+            </w:r>
           </w:p>
         </w:tc>
       </w:tr>
@@ -25893,7 +25502,6 @@
           </w:tcPr>
           <w:p>
             <w:r>
-              <w:lastRenderedPageBreak/>
               <w:t>Branch name</w:t>
             </w:r>
           </w:p>
@@ -25936,8 +25544,8 @@
                 <w:bCs/>
               </w:rPr>
             </w:pPr>
-            <w:bookmarkStart w:id="11" w:name="_Hlk189035552"/>
-            <w:bookmarkEnd w:id="10"/>
+            <w:bookmarkStart w:id="10" w:name="_Hlk189035552"/>
+            <w:bookmarkEnd w:id="9"/>
             <w:r>
               <w:rPr>
                 <w:b/>
@@ -26006,17 +25614,8 @@
                 <w:b/>
                 <w:bCs/>
               </w:rPr>
-              <w:t xml:space="preserve">Slice “is a” from </w:t>
-            </w:r>
-            <w:proofErr w:type="spellStart"/>
-            <w:r>
-              <w:rPr>
-                <w:b/>
-                <w:bCs/>
-              </w:rPr>
-              <w:t>myString</w:t>
-            </w:r>
-            <w:proofErr w:type="spellEnd"/>
+              <w:t>Slice “is a” from myString</w:t>
+            </w:r>
           </w:p>
           <w:p>
             <w:pPr>
@@ -26036,17 +25635,8 @@
                 <w:b/>
                 <w:bCs/>
               </w:rPr>
-              <w:t>Use substring to get “the” from “</w:t>
-            </w:r>
-            <w:proofErr w:type="spellStart"/>
-            <w:r>
-              <w:rPr>
-                <w:b/>
-                <w:bCs/>
-              </w:rPr>
-              <w:t>notherString</w:t>
-            </w:r>
-            <w:proofErr w:type="spellEnd"/>
+              <w:t>Use substring to get “the” from “notherString</w:t>
+            </w:r>
           </w:p>
         </w:tc>
       </w:tr>
@@ -26137,7 +25727,7 @@
           <w:p/>
         </w:tc>
       </w:tr>
-      <w:bookmarkEnd w:id="11"/>
+      <w:bookmarkEnd w:id="10"/>
       <w:tr>
         <w:tc>
           <w:tcPr>
@@ -26193,23 +25783,7 @@
                 <w:b/>
                 <w:bCs/>
               </w:rPr>
-              <w:t xml:space="preserve">Change the case of the </w:t>
-            </w:r>
-            <w:proofErr w:type="spellStart"/>
-            <w:r>
-              <w:rPr>
-                <w:b/>
-                <w:bCs/>
-              </w:rPr>
-              <w:t>myName</w:t>
-            </w:r>
-            <w:proofErr w:type="spellEnd"/>
-            <w:r>
-              <w:rPr>
-                <w:b/>
-                <w:bCs/>
-              </w:rPr>
-              <w:t xml:space="preserve"> string</w:t>
+              <w:t>Change the case of the myName string</w:t>
             </w:r>
           </w:p>
           <w:p>
@@ -26230,23 +25804,7 @@
                 <w:b/>
                 <w:bCs/>
               </w:rPr>
-              <w:t xml:space="preserve">Change </w:t>
-            </w:r>
-            <w:proofErr w:type="spellStart"/>
-            <w:r>
-              <w:rPr>
-                <w:b/>
-                <w:bCs/>
-              </w:rPr>
-              <w:t>myName</w:t>
-            </w:r>
-            <w:proofErr w:type="spellEnd"/>
-            <w:r>
-              <w:rPr>
-                <w:b/>
-                <w:bCs/>
-              </w:rPr>
-              <w:t xml:space="preserve"> string to upper case</w:t>
+              <w:t>Change myName string to upper case</w:t>
             </w:r>
           </w:p>
           <w:p>
@@ -26267,23 +25825,7 @@
                 <w:b/>
                 <w:bCs/>
               </w:rPr>
-              <w:t xml:space="preserve">Change </w:t>
-            </w:r>
-            <w:proofErr w:type="spellStart"/>
-            <w:r>
-              <w:rPr>
-                <w:b/>
-                <w:bCs/>
-              </w:rPr>
-              <w:t>myName</w:t>
-            </w:r>
-            <w:proofErr w:type="spellEnd"/>
-            <w:r>
-              <w:rPr>
-                <w:b/>
-                <w:bCs/>
-              </w:rPr>
-              <w:t xml:space="preserve"> string to lower case</w:t>
+              <w:t>Change myName string to lower case</w:t>
             </w:r>
           </w:p>
         </w:tc>
@@ -26304,15 +25846,7 @@
           <w:p/>
           <w:p>
             <w:r>
-              <w:t xml:space="preserve">&lt;Insert a screenshot of the console showing </w:t>
-            </w:r>
-            <w:proofErr w:type="spellStart"/>
-            <w:r>
-              <w:t>myName</w:t>
-            </w:r>
-            <w:proofErr w:type="spellEnd"/>
-            <w:r>
-              <w:t xml:space="preserve"> in upper case and in lower case&gt;</w:t>
+              <w:t>&lt;Insert a screenshot of the console showing myName in upper case and in lower case&gt;</w:t>
             </w:r>
           </w:p>
           <w:p/>
@@ -26444,39 +25978,7 @@
                 <w:b/>
                 <w:bCs/>
               </w:rPr>
-              <w:t xml:space="preserve">Use the </w:t>
-            </w:r>
-            <w:proofErr w:type="spellStart"/>
-            <w:r>
-              <w:rPr>
-                <w:b/>
-                <w:bCs/>
-              </w:rPr>
-              <w:t>concat</w:t>
-            </w:r>
-            <w:proofErr w:type="spellEnd"/>
-            <w:r>
-              <w:rPr>
-                <w:b/>
-                <w:bCs/>
-              </w:rPr>
-              <w:t xml:space="preserve"> method to join the hello string and </w:t>
-            </w:r>
-            <w:proofErr w:type="spellStart"/>
-            <w:r>
-              <w:rPr>
-                <w:b/>
-                <w:bCs/>
-              </w:rPr>
-              <w:t>myName</w:t>
-            </w:r>
-            <w:proofErr w:type="spellEnd"/>
-            <w:r>
-              <w:rPr>
-                <w:b/>
-                <w:bCs/>
-              </w:rPr>
-              <w:t xml:space="preserve"> string</w:t>
+              <w:t>Use the concat method to join the hello string and myName string</w:t>
             </w:r>
           </w:p>
           <w:p>
@@ -26497,17 +25999,8 @@
                 <w:b/>
                 <w:bCs/>
               </w:rPr>
-              <w:t xml:space="preserve">Use the trim method to remove the spaces in </w:t>
-            </w:r>
-            <w:proofErr w:type="spellStart"/>
-            <w:r>
-              <w:rPr>
-                <w:b/>
-                <w:bCs/>
-              </w:rPr>
-              <w:t>anotherString</w:t>
-            </w:r>
-            <w:proofErr w:type="spellEnd"/>
+              <w:t>Use the trim method to remove the spaces in anotherString</w:t>
+            </w:r>
           </w:p>
           <w:p>
             <w:pPr>
@@ -26527,17 +26020,8 @@
                 <w:b/>
                 <w:bCs/>
               </w:rPr>
-              <w:t xml:space="preserve">Use the replace method to change “is a” to an empty space in </w:t>
-            </w:r>
-            <w:proofErr w:type="spellStart"/>
-            <w:r>
-              <w:rPr>
-                <w:b/>
-                <w:bCs/>
-              </w:rPr>
-              <w:t>myString</w:t>
-            </w:r>
-            <w:proofErr w:type="spellEnd"/>
+              <w:t>Use the replace method to change “is a” to an empty space in myString</w:t>
+            </w:r>
           </w:p>
           <w:p>
             <w:pPr>
@@ -26557,23 +26041,7 @@
                 <w:b/>
                 <w:bCs/>
               </w:rPr>
-              <w:t xml:space="preserve">Use the split method on </w:t>
-            </w:r>
-            <w:proofErr w:type="spellStart"/>
-            <w:r>
-              <w:rPr>
-                <w:b/>
-                <w:bCs/>
-              </w:rPr>
-              <w:t>myString</w:t>
-            </w:r>
-            <w:proofErr w:type="spellEnd"/>
-            <w:r>
-              <w:rPr>
-                <w:b/>
-                <w:bCs/>
-              </w:rPr>
-              <w:t xml:space="preserve"> using the spaces to break the string</w:t>
+              <w:t>Use the split method on myString using the spaces to break the string</w:t>
             </w:r>
           </w:p>
         </w:tc>
@@ -26598,15 +26066,7 @@
           </w:p>
           <w:p>
             <w:r>
-              <w:t>&lt;</w:t>
-            </w:r>
-            <w:proofErr w:type="spellStart"/>
-            <w:r>
-              <w:t>concat</w:t>
-            </w:r>
-            <w:proofErr w:type="spellEnd"/>
-            <w:r>
-              <w:t>&gt;</w:t>
+              <w:t>&lt;concat&gt;</w:t>
             </w:r>
           </w:p>
           <w:p/>
@@ -26654,7 +26114,6 @@
           </w:tcPr>
           <w:p>
             <w:r>
-              <w:lastRenderedPageBreak/>
               <w:t>Branch name</w:t>
             </w:r>
           </w:p>
@@ -27238,7 +26697,7 @@
             <w:tcW w:w="1555" w:type="dxa"/>
           </w:tcPr>
           <w:p>
-            <w:bookmarkStart w:id="12" w:name="_Hlk189048890"/>
+            <w:bookmarkStart w:id="11" w:name="_Hlk189048890"/>
             <w:r>
               <w:t>Branch name</w:t>
             </w:r>
@@ -27267,7 +26726,7 @@
           <w:p/>
         </w:tc>
       </w:tr>
-      <w:bookmarkEnd w:id="12"/>
+      <w:bookmarkEnd w:id="11"/>
     </w:tbl>
     <w:p/>
     <w:tbl>
@@ -27366,15 +26825,7 @@
           <w:p/>
           <w:p>
             <w:r>
-              <w:t xml:space="preserve">You will be required to create a GitHub repository for this part. As per the previous parts, branch names </w:t>
-            </w:r>
-            <w:proofErr w:type="gramStart"/>
-            <w:r>
-              <w:t>an</w:t>
-            </w:r>
-            <w:proofErr w:type="gramEnd"/>
-            <w:r>
-              <w:t xml:space="preserve"> commit numbers can be recorded in each question below.</w:t>
+              <w:t>You will be required to create a GitHub repository for this part. As per the previous parts, branch names an commit numbers can be recorded in each question below.</w:t>
             </w:r>
           </w:p>
           <w:p/>
@@ -27839,7 +27290,6 @@
           </w:tcPr>
           <w:p>
             <w:r>
-              <w:lastRenderedPageBreak/>
               <w:t>Branch name</w:t>
             </w:r>
           </w:p>
@@ -29123,14 +28573,21 @@
               <w:tabs>
                 <w:tab w:val="left" w:pos="510"/>
               </w:tabs>
-            </w:pPr>
-            <w:r>
+              <w:rPr>
+                <w:lang w:val="fr-FR"/>
+              </w:rPr>
+            </w:pPr>
+            <w:r>
+              <w:rPr>
+                <w:lang w:val="fr-FR"/>
+              </w:rPr>
               <w:t xml:space="preserve">JavaScript - </w:t>
             </w:r>
             <w:hyperlink r:id="rId22" w:history="1">
               <w:r>
                 <w:rPr>
                   <w:rStyle w:val="Hyperlink"/>
+                  <w:lang w:val="fr-FR"/>
                 </w:rPr>
                 <w:t>https://www.w3schools.com/js/js_conventions.asp</w:t>
               </w:r>
@@ -29141,6 +28598,9 @@
               <w:tabs>
                 <w:tab w:val="left" w:pos="510"/>
               </w:tabs>
+              <w:rPr>
+                <w:lang w:val="fr-FR"/>
+              </w:rPr>
             </w:pPr>
           </w:p>
           <w:p>
@@ -29171,13 +28631,8 @@
                 <w:tab w:val="left" w:pos="510"/>
               </w:tabs>
             </w:pPr>
-            <w:proofErr w:type="spellStart"/>
-            <w:r>
-              <w:t>Mockaroo</w:t>
-            </w:r>
-            <w:proofErr w:type="spellEnd"/>
-            <w:r>
-              <w:t xml:space="preserve">: </w:t>
+            <w:r>
+              <w:t xml:space="preserve">Mockaroo: </w:t>
             </w:r>
             <w:hyperlink r:id="rId23" w:history="1">
               <w:r>
@@ -29253,15 +28708,7 @@
               </w:numPr>
             </w:pPr>
             <w:r>
-              <w:t>Wireframes in .</w:t>
-            </w:r>
-            <w:proofErr w:type="spellStart"/>
-            <w:r>
-              <w:t>png</w:t>
-            </w:r>
-            <w:proofErr w:type="spellEnd"/>
-            <w:r>
-              <w:t xml:space="preserve"> or .jpg format</w:t>
+              <w:t>Wireframes in .png or .jpg format</w:t>
             </w:r>
           </w:p>
           <w:p/>
@@ -29859,7 +29306,7 @@
                 <w:bCs/>
               </w:rPr>
             </w:pPr>
-            <w:bookmarkStart w:id="13" w:name="_Hlk189054098"/>
+            <w:bookmarkStart w:id="12" w:name="_Hlk189054098"/>
             <w:r>
               <w:rPr>
                 <w:b/>
@@ -29883,7 +29330,7 @@
             <w:vMerge w:val="restart"/>
           </w:tcPr>
           <w:p>
-            <w:bookmarkStart w:id="14" w:name="_Hlk189051323"/>
+            <w:bookmarkStart w:id="13" w:name="_Hlk189051323"/>
             <w:r>
               <w:rPr>
                 <w:b/>
@@ -29983,7 +29430,7 @@
           <w:p/>
         </w:tc>
       </w:tr>
-      <w:bookmarkEnd w:id="14"/>
+      <w:bookmarkEnd w:id="13"/>
       <w:tr>
         <w:trPr>
           <w:gridAfter w:val="1"/>
@@ -30667,7 +30114,7 @@
           </w:p>
         </w:tc>
       </w:tr>
-      <w:bookmarkEnd w:id="13"/>
+      <w:bookmarkEnd w:id="12"/>
       <w:tr>
         <w:trPr>
           <w:gridAfter w:val="1"/>
@@ -31573,7 +31020,6 @@
           </w:tcPr>
           <w:p>
             <w:r>
-              <w:lastRenderedPageBreak/>
               <w:t>Branch name</w:t>
             </w:r>
           </w:p>
@@ -32231,15 +31677,7 @@
                 </w:p>
                 <w:p>
                   <w:r>
-                    <w:t xml:space="preserve">Action 2: list view area </w:t>
-                  </w:r>
-                  <w:proofErr w:type="gramStart"/>
-                  <w:r>
-                    <w:t>display</w:t>
-                  </w:r>
-                  <w:proofErr w:type="gramEnd"/>
-                  <w:r>
-                    <w:t xml:space="preserve"> all movies</w:t>
+                    <w:t>Action 2: list view area display all movies</w:t>
                   </w:r>
                 </w:p>
               </w:tc>
@@ -32822,7 +32260,6 @@
           </w:tcPr>
           <w:p>
             <w:r>
-              <w:lastRenderedPageBreak/>
               <w:t>Branch name</w:t>
             </w:r>
           </w:p>
@@ -34062,15 +33499,7 @@
           <w:p/>
           <w:p>
             <w:r>
-              <w:t>Each grid in the home page links to the page of a team member. The link has been defined in the home page (e.g., /team/</w:t>
-            </w:r>
-            <w:proofErr w:type="spellStart"/>
-            <w:r>
-              <w:t>amberle</w:t>
-            </w:r>
-            <w:proofErr w:type="spellEnd"/>
-            <w:r>
-              <w:t>/index.html), but the member’s page has not been created yet. You need to join the team to get your page created, tested locally and then merge your changes to the project.</w:t>
+              <w:t>Each grid in the home page links to the page of a team member. The link has been defined in the home page (e.g., /team/amberle/index.html), but the member’s page has not been created yet. You need to join the team to get your page created, tested locally and then merge your changes to the project.</w:t>
             </w:r>
           </w:p>
           <w:p>
@@ -34407,17 +33836,8 @@
                 <w:b/>
                 <w:bCs/>
               </w:rPr>
-              <w:t xml:space="preserve">5, Upload your pages and this document to </w:t>
-            </w:r>
-            <w:proofErr w:type="spellStart"/>
-            <w:r>
-              <w:rPr>
-                <w:b/>
-                <w:bCs/>
-              </w:rPr>
-              <w:t>Brightpspace</w:t>
-            </w:r>
-            <w:proofErr w:type="spellEnd"/>
+              <w:t>5, Upload your pages and this document to Brightpspace</w:t>
+            </w:r>
           </w:p>
           <w:p/>
         </w:tc>
@@ -35241,7 +34661,7 @@
 </file>
 
 <file path=word/endnotes.xml><?xml version="1.0" encoding="utf-8"?>
-<w:endnotes xmlns:wpc="http://schemas.microsoft.com/office/word/2010/wordprocessingCanvas" xmlns:cx="http://schemas.microsoft.com/office/drawing/2014/chartex" xmlns:cx1="http://schemas.microsoft.com/office/drawing/2015/9/8/chartex" xmlns:cx2="http://schemas.microsoft.com/office/drawing/2015/10/21/chartex" xmlns:cx3="http://schemas.microsoft.com/office/drawing/2016/5/9/chartex" xmlns:cx4="http://schemas.microsoft.com/office/drawing/2016/5/10/chartex" xmlns:cx5="http://schemas.microsoft.com/office/drawing/2016/5/11/chartex" xmlns:cx6="http://schemas.microsoft.com/office/drawing/2016/5/12/chartex" xmlns:cx7="http://schemas.microsoft.com/office/drawing/2016/5/13/chartex" xmlns:cx8="http://schemas.microsoft.com/office/drawing/2016/5/14/chartex" xmlns:mc="http://schemas.openxmlformats.org/markup-compatibility/2006" xmlns:aink="http://schemas.microsoft.com/office/drawing/2016/ink" xmlns:am3d="http://schemas.microsoft.com/office/drawing/2017/model3d" xmlns:o="urn:schemas-microsoft-com:office:office" xmlns:r="http://schemas.openxmlformats.org/officeDocument/2006/relationships" xmlns:m="http://schemas.openxmlformats.org/officeDocument/2006/math" xmlns:v="urn:schemas-microsoft-com:vml" xmlns:wp14="http://schemas.microsoft.com/office/word/2010/wordprocessingDrawing" xmlns:wp="http://schemas.openxmlformats.org/drawingml/2006/wordprocessingDrawing" xmlns:w10="urn:schemas-microsoft-com:office:word" xmlns:w="http://schemas.openxmlformats.org/wordprocessingml/2006/main" xmlns:w14="http://schemas.microsoft.com/office/word/2010/wordml" xmlns:w15="http://schemas.microsoft.com/office/word/2012/wordml" xmlns:w16cid="http://schemas.microsoft.com/office/word/2016/wordml/cid" xmlns:w16se="http://schemas.microsoft.com/office/word/2015/wordml/symex" xmlns:wpg="http://schemas.microsoft.com/office/word/2010/wordprocessingGroup" xmlns:wpi="http://schemas.microsoft.com/office/word/2010/wordprocessingInk" xmlns:wne="http://schemas.microsoft.com/office/word/2006/wordml" xmlns:wps="http://schemas.microsoft.com/office/word/2010/wordprocessingShape" mc:Ignorable="w14 w15 w16se w16cid wp14">
+<w:endnotes xmlns:wpc="http://schemas.microsoft.com/office/word/2010/wordprocessingCanvas" xmlns:cx="http://schemas.microsoft.com/office/drawing/2014/chartex" xmlns:cx1="http://schemas.microsoft.com/office/drawing/2015/9/8/chartex" xmlns:cx2="http://schemas.microsoft.com/office/drawing/2015/10/21/chartex" xmlns:cx3="http://schemas.microsoft.com/office/drawing/2016/5/9/chartex" xmlns:cx4="http://schemas.microsoft.com/office/drawing/2016/5/10/chartex" xmlns:cx5="http://schemas.microsoft.com/office/drawing/2016/5/11/chartex" xmlns:cx6="http://schemas.microsoft.com/office/drawing/2016/5/12/chartex" xmlns:cx7="http://schemas.microsoft.com/office/drawing/2016/5/13/chartex" xmlns:cx8="http://schemas.microsoft.com/office/drawing/2016/5/14/chartex" xmlns:mc="http://schemas.openxmlformats.org/markup-compatibility/2006" xmlns:aink="http://schemas.microsoft.com/office/drawing/2016/ink" xmlns:am3d="http://schemas.microsoft.com/office/drawing/2017/model3d" xmlns:o="urn:schemas-microsoft-com:office:office" xmlns:oel="http://schemas.microsoft.com/office/2019/extlst" xmlns:r="http://schemas.openxmlformats.org/officeDocument/2006/relationships" xmlns:m="http://schemas.openxmlformats.org/officeDocument/2006/math" xmlns:v="urn:schemas-microsoft-com:vml" xmlns:wp14="http://schemas.microsoft.com/office/word/2010/wordprocessingDrawing" xmlns:wp="http://schemas.openxmlformats.org/drawingml/2006/wordprocessingDrawing" xmlns:w10="urn:schemas-microsoft-com:office:word" xmlns:w="http://schemas.openxmlformats.org/wordprocessingml/2006/main" xmlns:w14="http://schemas.microsoft.com/office/word/2010/wordml" xmlns:w15="http://schemas.microsoft.com/office/word/2012/wordml" xmlns:w16cex="http://schemas.microsoft.com/office/word/2018/wordml/cex" xmlns:w16cid="http://schemas.microsoft.com/office/word/2016/wordml/cid" xmlns:w16="http://schemas.microsoft.com/office/word/2018/wordml" xmlns:w16du="http://schemas.microsoft.com/office/word/2023/wordml/word16du" xmlns:w16sdtdh="http://schemas.microsoft.com/office/word/2020/wordml/sdtdatahash" xmlns:w16sdtfl="http://schemas.microsoft.com/office/word/2024/wordml/sdtformatlock" xmlns:w16se="http://schemas.microsoft.com/office/word/2015/wordml/symex" xmlns:wpg="http://schemas.microsoft.com/office/word/2010/wordprocessingGroup" xmlns:wpi="http://schemas.microsoft.com/office/word/2010/wordprocessingInk" xmlns:wne="http://schemas.microsoft.com/office/word/2006/wordml" xmlns:wps="http://schemas.microsoft.com/office/word/2010/wordprocessingShape" mc:Ignorable="w14 w15 w16se w16cid w16 w16cex w16sdtdh w16sdtfl w16du wp14">
   <w:endnote w:type="separator" w:id="-1">
     <w:p>
       <w:r>
@@ -35262,7 +34682,7 @@
 </file>
 
 <file path=word/footer1.xml><?xml version="1.0" encoding="utf-8"?>
-<w:ftr xmlns:wpc="http://schemas.microsoft.com/office/word/2010/wordprocessingCanvas" xmlns:cx="http://schemas.microsoft.com/office/drawing/2014/chartex" xmlns:cx1="http://schemas.microsoft.com/office/drawing/2015/9/8/chartex" xmlns:cx2="http://schemas.microsoft.com/office/drawing/2015/10/21/chartex" xmlns:cx3="http://schemas.microsoft.com/office/drawing/2016/5/9/chartex" xmlns:cx4="http://schemas.microsoft.com/office/drawing/2016/5/10/chartex" xmlns:cx5="http://schemas.microsoft.com/office/drawing/2016/5/11/chartex" xmlns:cx6="http://schemas.microsoft.com/office/drawing/2016/5/12/chartex" xmlns:cx7="http://schemas.microsoft.com/office/drawing/2016/5/13/chartex" xmlns:cx8="http://schemas.microsoft.com/office/drawing/2016/5/14/chartex" xmlns:mc="http://schemas.openxmlformats.org/markup-compatibility/2006" xmlns:aink="http://schemas.microsoft.com/office/drawing/2016/ink" xmlns:am3d="http://schemas.microsoft.com/office/drawing/2017/model3d" xmlns:o="urn:schemas-microsoft-com:office:office" xmlns:r="http://schemas.openxmlformats.org/officeDocument/2006/relationships" xmlns:m="http://schemas.openxmlformats.org/officeDocument/2006/math" xmlns:v="urn:schemas-microsoft-com:vml" xmlns:wp14="http://schemas.microsoft.com/office/word/2010/wordprocessingDrawing" xmlns:wp="http://schemas.openxmlformats.org/drawingml/2006/wordprocessingDrawing" xmlns:w10="urn:schemas-microsoft-com:office:word" xmlns:w="http://schemas.openxmlformats.org/wordprocessingml/2006/main" xmlns:w14="http://schemas.microsoft.com/office/word/2010/wordml" xmlns:w15="http://schemas.microsoft.com/office/word/2012/wordml" xmlns:w16cid="http://schemas.microsoft.com/office/word/2016/wordml/cid" xmlns:w16se="http://schemas.microsoft.com/office/word/2015/wordml/symex" xmlns:wpg="http://schemas.microsoft.com/office/word/2010/wordprocessingGroup" xmlns:wpi="http://schemas.microsoft.com/office/word/2010/wordprocessingInk" xmlns:wne="http://schemas.microsoft.com/office/word/2006/wordml" xmlns:wps="http://schemas.microsoft.com/office/word/2010/wordprocessingShape" mc:Ignorable="w14 w15 w16se w16cid wp14">
+<w:ftr xmlns:wpc="http://schemas.microsoft.com/office/word/2010/wordprocessingCanvas" xmlns:cx="http://schemas.microsoft.com/office/drawing/2014/chartex" xmlns:cx1="http://schemas.microsoft.com/office/drawing/2015/9/8/chartex" xmlns:cx2="http://schemas.microsoft.com/office/drawing/2015/10/21/chartex" xmlns:cx3="http://schemas.microsoft.com/office/drawing/2016/5/9/chartex" xmlns:cx4="http://schemas.microsoft.com/office/drawing/2016/5/10/chartex" xmlns:cx5="http://schemas.microsoft.com/office/drawing/2016/5/11/chartex" xmlns:cx6="http://schemas.microsoft.com/office/drawing/2016/5/12/chartex" xmlns:cx7="http://schemas.microsoft.com/office/drawing/2016/5/13/chartex" xmlns:cx8="http://schemas.microsoft.com/office/drawing/2016/5/14/chartex" xmlns:mc="http://schemas.openxmlformats.org/markup-compatibility/2006" xmlns:aink="http://schemas.microsoft.com/office/drawing/2016/ink" xmlns:am3d="http://schemas.microsoft.com/office/drawing/2017/model3d" xmlns:o="urn:schemas-microsoft-com:office:office" xmlns:oel="http://schemas.microsoft.com/office/2019/extlst" xmlns:r="http://schemas.openxmlformats.org/officeDocument/2006/relationships" xmlns:m="http://schemas.openxmlformats.org/officeDocument/2006/math" xmlns:v="urn:schemas-microsoft-com:vml" xmlns:wp14="http://schemas.microsoft.com/office/word/2010/wordprocessingDrawing" xmlns:wp="http://schemas.openxmlformats.org/drawingml/2006/wordprocessingDrawing" xmlns:w10="urn:schemas-microsoft-com:office:word" xmlns:w="http://schemas.openxmlformats.org/wordprocessingml/2006/main" xmlns:w14="http://schemas.microsoft.com/office/word/2010/wordml" xmlns:w15="http://schemas.microsoft.com/office/word/2012/wordml" xmlns:w16cex="http://schemas.microsoft.com/office/word/2018/wordml/cex" xmlns:w16cid="http://schemas.microsoft.com/office/word/2016/wordml/cid" xmlns:w16="http://schemas.microsoft.com/office/word/2018/wordml" xmlns:w16du="http://schemas.microsoft.com/office/word/2023/wordml/word16du" xmlns:w16sdtdh="http://schemas.microsoft.com/office/word/2020/wordml/sdtdatahash" xmlns:w16sdtfl="http://schemas.microsoft.com/office/word/2024/wordml/sdtformatlock" xmlns:w16se="http://schemas.microsoft.com/office/word/2015/wordml/symex" xmlns:wpg="http://schemas.microsoft.com/office/word/2010/wordprocessingGroup" xmlns:wpi="http://schemas.microsoft.com/office/word/2010/wordprocessingInk" xmlns:wne="http://schemas.microsoft.com/office/word/2006/wordml" xmlns:wps="http://schemas.microsoft.com/office/word/2010/wordprocessingShape" mc:Ignorable="w14 w15 w16se w16cid w16 w16cex w16sdtdh w16sdtfl w16du wp14">
   <w:p>
     <w:pPr>
       <w:pStyle w:val="Footer"/>
@@ -35291,7 +34711,7 @@
                     <adec:decorative xmlns:adec="http://schemas.microsoft.com/office/drawing/2017/decorative" val="1"/>
                   </a:ext>
                   <a:ext uri="{5AE41FA2-C0FF-4470-9BD4-5FADCA87CBE2}">
-                    <aclsh:classification xmlns:aclsh="http://schemas.microsoft.com/office/drawing/2020/classificationShape" xmlns:w16sdtfl="http://schemas.microsoft.com/office/word/2024/wordml/sdtformatlock" xmlns:w16sdtdh="http://schemas.microsoft.com/office/word/2020/wordml/sdtdatahash" xmlns:w16du="http://schemas.microsoft.com/office/word/2023/wordml/word16du" xmlns:w16="http://schemas.microsoft.com/office/word/2018/wordml" xmlns:w16cex="http://schemas.microsoft.com/office/word/2018/wordml/cex" xmlns:w="http://schemas.openxmlformats.org/wordprocessingml/2006/main" xmlns:w10="urn:schemas-microsoft-com:office:word" xmlns:v="urn:schemas-microsoft-com:vml" xmlns:oel="http://schemas.microsoft.com/office/2019/extlst" xmlns:o="urn:schemas-microsoft-com:office:office" xmlns="" classificationOutcomeType="ftr"/>
+                    <aclsh:classification xmlns:aclsh="http://schemas.microsoft.com/office/drawing/2020/classificationShape" classificationOutcomeType="ftr"/>
                   </a:ext>
                 </a:extLst>
               </wp:docPr>
@@ -35354,7 +34774,7 @@
               <v:stroke joinstyle="miter"/>
               <v:path gradientshapeok="t" o:connecttype="rect"/>
             </v:shapetype>
-            <v:shape id="Text Box 3" o:spid="_x0000_s1026" type="#_x0000_t202" style="position:absolute;margin-left:0;margin-top:0;width:34.95pt;height:34.95pt;z-index:251659264;visibility:visible;mso-wrap-style:none;mso-wrap-distance-left:0;mso-wrap-distance-top:0;mso-wrap-distance-right:0;mso-wrap-distance-bottom:0;mso-position-horizontal:center;mso-position-horizontal-relative:page;mso-position-vertical:bottom;mso-position-vertical-relative:page;v-text-anchor:bottom" o:gfxdata="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" filled="f" stroked="f">
+            <v:shape id="Text Box 3" o:spid="_x0000_s1026" type="#_x0000_t202" alt="&quot;&quot;" style="position:absolute;margin-left:0;margin-top:0;width:34.95pt;height:34.95pt;z-index:251659264;visibility:visible;mso-wrap-style:none;mso-wrap-distance-left:0;mso-wrap-distance-top:0;mso-wrap-distance-right:0;mso-wrap-distance-bottom:0;mso-position-horizontal:center;mso-position-horizontal-relative:page;mso-position-vertical:bottom;mso-position-vertical-relative:page;v-text-anchor:bottom" o:gfxdata="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" filled="f" stroked="f">
               <v:textbox style="mso-fit-shape-to-text:t" inset="0,0,0,15pt">
                 <w:txbxContent>
                   <w:p>
@@ -35389,7 +34809,7 @@
 </file>
 
 <file path=word/footer2.xml><?xml version="1.0" encoding="utf-8"?>
-<w:ftr xmlns:wpc="http://schemas.microsoft.com/office/word/2010/wordprocessingCanvas" xmlns:cx="http://schemas.microsoft.com/office/drawing/2014/chartex" xmlns:cx1="http://schemas.microsoft.com/office/drawing/2015/9/8/chartex" xmlns:cx2="http://schemas.microsoft.com/office/drawing/2015/10/21/chartex" xmlns:cx3="http://schemas.microsoft.com/office/drawing/2016/5/9/chartex" xmlns:cx4="http://schemas.microsoft.com/office/drawing/2016/5/10/chartex" xmlns:cx5="http://schemas.microsoft.com/office/drawing/2016/5/11/chartex" xmlns:cx6="http://schemas.microsoft.com/office/drawing/2016/5/12/chartex" xmlns:cx7="http://schemas.microsoft.com/office/drawing/2016/5/13/chartex" xmlns:cx8="http://schemas.microsoft.com/office/drawing/2016/5/14/chartex" xmlns:mc="http://schemas.openxmlformats.org/markup-compatibility/2006" xmlns:aink="http://schemas.microsoft.com/office/drawing/2016/ink" xmlns:am3d="http://schemas.microsoft.com/office/drawing/2017/model3d" xmlns:o="urn:schemas-microsoft-com:office:office" xmlns:r="http://schemas.openxmlformats.org/officeDocument/2006/relationships" xmlns:m="http://schemas.openxmlformats.org/officeDocument/2006/math" xmlns:v="urn:schemas-microsoft-com:vml" xmlns:wp14="http://schemas.microsoft.com/office/word/2010/wordprocessingDrawing" xmlns:wp="http://schemas.openxmlformats.org/drawingml/2006/wordprocessingDrawing" xmlns:w10="urn:schemas-microsoft-com:office:word" xmlns:w="http://schemas.openxmlformats.org/wordprocessingml/2006/main" xmlns:w14="http://schemas.microsoft.com/office/word/2010/wordml" xmlns:w15="http://schemas.microsoft.com/office/word/2012/wordml" xmlns:w16cid="http://schemas.microsoft.com/office/word/2016/wordml/cid" xmlns:w16se="http://schemas.microsoft.com/office/word/2015/wordml/symex" xmlns:wpg="http://schemas.microsoft.com/office/word/2010/wordprocessingGroup" xmlns:wpi="http://schemas.microsoft.com/office/word/2010/wordprocessingInk" xmlns:wne="http://schemas.microsoft.com/office/word/2006/wordml" xmlns:wps="http://schemas.microsoft.com/office/word/2010/wordprocessingShape" mc:Ignorable="w14 w15 w16se w16cid wp14">
+<w:ftr xmlns:wpc="http://schemas.microsoft.com/office/word/2010/wordprocessingCanvas" xmlns:cx="http://schemas.microsoft.com/office/drawing/2014/chartex" xmlns:cx1="http://schemas.microsoft.com/office/drawing/2015/9/8/chartex" xmlns:cx2="http://schemas.microsoft.com/office/drawing/2015/10/21/chartex" xmlns:cx3="http://schemas.microsoft.com/office/drawing/2016/5/9/chartex" xmlns:cx4="http://schemas.microsoft.com/office/drawing/2016/5/10/chartex" xmlns:cx5="http://schemas.microsoft.com/office/drawing/2016/5/11/chartex" xmlns:cx6="http://schemas.microsoft.com/office/drawing/2016/5/12/chartex" xmlns:cx7="http://schemas.microsoft.com/office/drawing/2016/5/13/chartex" xmlns:cx8="http://schemas.microsoft.com/office/drawing/2016/5/14/chartex" xmlns:mc="http://schemas.openxmlformats.org/markup-compatibility/2006" xmlns:aink="http://schemas.microsoft.com/office/drawing/2016/ink" xmlns:am3d="http://schemas.microsoft.com/office/drawing/2017/model3d" xmlns:o="urn:schemas-microsoft-com:office:office" xmlns:oel="http://schemas.microsoft.com/office/2019/extlst" xmlns:r="http://schemas.openxmlformats.org/officeDocument/2006/relationships" xmlns:m="http://schemas.openxmlformats.org/officeDocument/2006/math" xmlns:v="urn:schemas-microsoft-com:vml" xmlns:wp14="http://schemas.microsoft.com/office/word/2010/wordprocessingDrawing" xmlns:wp="http://schemas.openxmlformats.org/drawingml/2006/wordprocessingDrawing" xmlns:w10="urn:schemas-microsoft-com:office:word" xmlns:w="http://schemas.openxmlformats.org/wordprocessingml/2006/main" xmlns:w14="http://schemas.microsoft.com/office/word/2010/wordml" xmlns:w15="http://schemas.microsoft.com/office/word/2012/wordml" xmlns:w16cex="http://schemas.microsoft.com/office/word/2018/wordml/cex" xmlns:w16cid="http://schemas.microsoft.com/office/word/2016/wordml/cid" xmlns:w16="http://schemas.microsoft.com/office/word/2018/wordml" xmlns:w16du="http://schemas.microsoft.com/office/word/2023/wordml/word16du" xmlns:w16sdtdh="http://schemas.microsoft.com/office/word/2020/wordml/sdtdatahash" xmlns:w16sdtfl="http://schemas.microsoft.com/office/word/2024/wordml/sdtformatlock" xmlns:w16se="http://schemas.microsoft.com/office/word/2015/wordml/symex" xmlns:wpg="http://schemas.microsoft.com/office/word/2010/wordprocessingGroup" xmlns:wpi="http://schemas.microsoft.com/office/word/2010/wordprocessingInk" xmlns:wne="http://schemas.microsoft.com/office/word/2006/wordml" xmlns:wps="http://schemas.microsoft.com/office/word/2010/wordprocessingShape" mc:Ignorable="w14 w15 w16se w16cid w16 w16cex w16sdtdh w16sdtfl w16du wp14">
   <w:p>
     <w:pPr>
       <w:pStyle w:val="Footer"/>
@@ -35568,7 +34988,7 @@
 </file>
 
 <file path=word/footer3.xml><?xml version="1.0" encoding="utf-8"?>
-<w:ftr xmlns:wpc="http://schemas.microsoft.com/office/word/2010/wordprocessingCanvas" xmlns:cx="http://schemas.microsoft.com/office/drawing/2014/chartex" xmlns:cx1="http://schemas.microsoft.com/office/drawing/2015/9/8/chartex" xmlns:cx2="http://schemas.microsoft.com/office/drawing/2015/10/21/chartex" xmlns:cx3="http://schemas.microsoft.com/office/drawing/2016/5/9/chartex" xmlns:cx4="http://schemas.microsoft.com/office/drawing/2016/5/10/chartex" xmlns:cx5="http://schemas.microsoft.com/office/drawing/2016/5/11/chartex" xmlns:cx6="http://schemas.microsoft.com/office/drawing/2016/5/12/chartex" xmlns:cx7="http://schemas.microsoft.com/office/drawing/2016/5/13/chartex" xmlns:cx8="http://schemas.microsoft.com/office/drawing/2016/5/14/chartex" xmlns:mc="http://schemas.openxmlformats.org/markup-compatibility/2006" xmlns:aink="http://schemas.microsoft.com/office/drawing/2016/ink" xmlns:am3d="http://schemas.microsoft.com/office/drawing/2017/model3d" xmlns:o="urn:schemas-microsoft-com:office:office" xmlns:r="http://schemas.openxmlformats.org/officeDocument/2006/relationships" xmlns:m="http://schemas.openxmlformats.org/officeDocument/2006/math" xmlns:v="urn:schemas-microsoft-com:vml" xmlns:wp14="http://schemas.microsoft.com/office/word/2010/wordprocessingDrawing" xmlns:wp="http://schemas.openxmlformats.org/drawingml/2006/wordprocessingDrawing" xmlns:w10="urn:schemas-microsoft-com:office:word" xmlns:w="http://schemas.openxmlformats.org/wordprocessingml/2006/main" xmlns:w14="http://schemas.microsoft.com/office/word/2010/wordml" xmlns:w15="http://schemas.microsoft.com/office/word/2012/wordml" xmlns:w16cid="http://schemas.microsoft.com/office/word/2016/wordml/cid" xmlns:w16se="http://schemas.microsoft.com/office/word/2015/wordml/symex" xmlns:wpg="http://schemas.microsoft.com/office/word/2010/wordprocessingGroup" xmlns:wpi="http://schemas.microsoft.com/office/word/2010/wordprocessingInk" xmlns:wne="http://schemas.microsoft.com/office/word/2006/wordml" xmlns:wps="http://schemas.microsoft.com/office/word/2010/wordprocessingShape" mc:Ignorable="w14 w15 w16se w16cid wp14">
+<w:ftr xmlns:wpc="http://schemas.microsoft.com/office/word/2010/wordprocessingCanvas" xmlns:cx="http://schemas.microsoft.com/office/drawing/2014/chartex" xmlns:cx1="http://schemas.microsoft.com/office/drawing/2015/9/8/chartex" xmlns:cx2="http://schemas.microsoft.com/office/drawing/2015/10/21/chartex" xmlns:cx3="http://schemas.microsoft.com/office/drawing/2016/5/9/chartex" xmlns:cx4="http://schemas.microsoft.com/office/drawing/2016/5/10/chartex" xmlns:cx5="http://schemas.microsoft.com/office/drawing/2016/5/11/chartex" xmlns:cx6="http://schemas.microsoft.com/office/drawing/2016/5/12/chartex" xmlns:cx7="http://schemas.microsoft.com/office/drawing/2016/5/13/chartex" xmlns:cx8="http://schemas.microsoft.com/office/drawing/2016/5/14/chartex" xmlns:mc="http://schemas.openxmlformats.org/markup-compatibility/2006" xmlns:aink="http://schemas.microsoft.com/office/drawing/2016/ink" xmlns:am3d="http://schemas.microsoft.com/office/drawing/2017/model3d" xmlns:o="urn:schemas-microsoft-com:office:office" xmlns:oel="http://schemas.microsoft.com/office/2019/extlst" xmlns:r="http://schemas.openxmlformats.org/officeDocument/2006/relationships" xmlns:m="http://schemas.openxmlformats.org/officeDocument/2006/math" xmlns:v="urn:schemas-microsoft-com:vml" xmlns:wp14="http://schemas.microsoft.com/office/word/2010/wordprocessingDrawing" xmlns:wp="http://schemas.openxmlformats.org/drawingml/2006/wordprocessingDrawing" xmlns:w10="urn:schemas-microsoft-com:office:word" xmlns:w="http://schemas.openxmlformats.org/wordprocessingml/2006/main" xmlns:w14="http://schemas.microsoft.com/office/word/2010/wordml" xmlns:w15="http://schemas.microsoft.com/office/word/2012/wordml" xmlns:w16cex="http://schemas.microsoft.com/office/word/2018/wordml/cex" xmlns:w16cid="http://schemas.microsoft.com/office/word/2016/wordml/cid" xmlns:w16="http://schemas.microsoft.com/office/word/2018/wordml" xmlns:w16du="http://schemas.microsoft.com/office/word/2023/wordml/word16du" xmlns:w16sdtdh="http://schemas.microsoft.com/office/word/2020/wordml/sdtdatahash" xmlns:w16sdtfl="http://schemas.microsoft.com/office/word/2024/wordml/sdtformatlock" xmlns:w16se="http://schemas.microsoft.com/office/word/2015/wordml/symex" xmlns:wpg="http://schemas.microsoft.com/office/word/2010/wordprocessingGroup" xmlns:wpi="http://schemas.microsoft.com/office/word/2010/wordprocessingInk" xmlns:wne="http://schemas.microsoft.com/office/word/2006/wordml" xmlns:wps="http://schemas.microsoft.com/office/word/2010/wordprocessingShape" mc:Ignorable="w14 w15 w16se w16cid w16 w16cex w16sdtdh w16sdtfl w16du wp14">
   <w:p>
     <w:pPr>
       <w:pStyle w:val="Footer"/>
@@ -35597,7 +35017,7 @@
                     <adec:decorative xmlns:adec="http://schemas.microsoft.com/office/drawing/2017/decorative" val="1"/>
                   </a:ext>
                   <a:ext uri="{5AE41FA2-C0FF-4470-9BD4-5FADCA87CBE2}">
-                    <aclsh:classification xmlns:aclsh="http://schemas.microsoft.com/office/drawing/2020/classificationShape" xmlns:w16sdtfl="http://schemas.microsoft.com/office/word/2024/wordml/sdtformatlock" xmlns:w16sdtdh="http://schemas.microsoft.com/office/word/2020/wordml/sdtdatahash" xmlns:w16du="http://schemas.microsoft.com/office/word/2023/wordml/word16du" xmlns:w16="http://schemas.microsoft.com/office/word/2018/wordml" xmlns:w16cex="http://schemas.microsoft.com/office/word/2018/wordml/cex" xmlns:w="http://schemas.openxmlformats.org/wordprocessingml/2006/main" xmlns:w10="urn:schemas-microsoft-com:office:word" xmlns:v="urn:schemas-microsoft-com:vml" xmlns:oel="http://schemas.microsoft.com/office/2019/extlst" xmlns:o="urn:schemas-microsoft-com:office:office" xmlns="" classificationOutcomeType="ftr"/>
+                    <aclsh:classification xmlns:aclsh="http://schemas.microsoft.com/office/drawing/2020/classificationShape" classificationOutcomeType="ftr"/>
                   </a:ext>
                 </a:extLst>
               </wp:docPr>
@@ -35660,7 +35080,7 @@
               <v:stroke joinstyle="miter"/>
               <v:path gradientshapeok="t" o:connecttype="rect"/>
             </v:shapetype>
-            <v:shape id="Text Box 2" o:spid="_x0000_s1027" type="#_x0000_t202" style="position:absolute;margin-left:0;margin-top:0;width:34.95pt;height:34.95pt;z-index:251658240;visibility:visible;mso-wrap-style:none;mso-wrap-distance-left:0;mso-wrap-distance-top:0;mso-wrap-distance-right:0;mso-wrap-distance-bottom:0;mso-position-horizontal:center;mso-position-horizontal-relative:page;mso-position-vertical:bottom;mso-position-vertical-relative:page;v-text-anchor:bottom" o:gfxdata="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" filled="f" stroked="f">
+            <v:shape id="Text Box 2" o:spid="_x0000_s1027" type="#_x0000_t202" alt="&quot;&quot;" style="position:absolute;margin-left:0;margin-top:0;width:34.95pt;height:34.95pt;z-index:251658240;visibility:visible;mso-wrap-style:none;mso-wrap-distance-left:0;mso-wrap-distance-top:0;mso-wrap-distance-right:0;mso-wrap-distance-bottom:0;mso-position-horizontal:center;mso-position-horizontal-relative:page;mso-position-vertical:bottom;mso-position-vertical-relative:page;v-text-anchor:bottom" o:gfxdata="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" filled="f" stroked="f">
               <v:textbox style="mso-fit-shape-to-text:t" inset="0,0,0,15pt">
                 <w:txbxContent>
                   <w:p>
@@ -35730,7 +35150,7 @@
 </file>
 
 <file path=word/footer4.xml><?xml version="1.0" encoding="utf-8"?>
-<w:ftr xmlns:wpc="http://schemas.microsoft.com/office/word/2010/wordprocessingCanvas" xmlns:cx="http://schemas.microsoft.com/office/drawing/2014/chartex" xmlns:cx1="http://schemas.microsoft.com/office/drawing/2015/9/8/chartex" xmlns:cx2="http://schemas.microsoft.com/office/drawing/2015/10/21/chartex" xmlns:cx3="http://schemas.microsoft.com/office/drawing/2016/5/9/chartex" xmlns:cx4="http://schemas.microsoft.com/office/drawing/2016/5/10/chartex" xmlns:cx5="http://schemas.microsoft.com/office/drawing/2016/5/11/chartex" xmlns:cx6="http://schemas.microsoft.com/office/drawing/2016/5/12/chartex" xmlns:cx7="http://schemas.microsoft.com/office/drawing/2016/5/13/chartex" xmlns:cx8="http://schemas.microsoft.com/office/drawing/2016/5/14/chartex" xmlns:mc="http://schemas.openxmlformats.org/markup-compatibility/2006" xmlns:aink="http://schemas.microsoft.com/office/drawing/2016/ink" xmlns:am3d="http://schemas.microsoft.com/office/drawing/2017/model3d" xmlns:o="urn:schemas-microsoft-com:office:office" xmlns:r="http://schemas.openxmlformats.org/officeDocument/2006/relationships" xmlns:m="http://schemas.openxmlformats.org/officeDocument/2006/math" xmlns:v="urn:schemas-microsoft-com:vml" xmlns:wp14="http://schemas.microsoft.com/office/word/2010/wordprocessingDrawing" xmlns:wp="http://schemas.openxmlformats.org/drawingml/2006/wordprocessingDrawing" xmlns:w10="urn:schemas-microsoft-com:office:word" xmlns:w="http://schemas.openxmlformats.org/wordprocessingml/2006/main" xmlns:w14="http://schemas.microsoft.com/office/word/2010/wordml" xmlns:w15="http://schemas.microsoft.com/office/word/2012/wordml" xmlns:w16cid="http://schemas.microsoft.com/office/word/2016/wordml/cid" xmlns:w16se="http://schemas.microsoft.com/office/word/2015/wordml/symex" xmlns:wpg="http://schemas.microsoft.com/office/word/2010/wordprocessingGroup" xmlns:wpi="http://schemas.microsoft.com/office/word/2010/wordprocessingInk" xmlns:wne="http://schemas.microsoft.com/office/word/2006/wordml" xmlns:wps="http://schemas.microsoft.com/office/word/2010/wordprocessingShape" mc:Ignorable="w14 w15 w16se w16cid wp14">
+<w:ftr xmlns:wpc="http://schemas.microsoft.com/office/word/2010/wordprocessingCanvas" xmlns:cx="http://schemas.microsoft.com/office/drawing/2014/chartex" xmlns:cx1="http://schemas.microsoft.com/office/drawing/2015/9/8/chartex" xmlns:cx2="http://schemas.microsoft.com/office/drawing/2015/10/21/chartex" xmlns:cx3="http://schemas.microsoft.com/office/drawing/2016/5/9/chartex" xmlns:cx4="http://schemas.microsoft.com/office/drawing/2016/5/10/chartex" xmlns:cx5="http://schemas.microsoft.com/office/drawing/2016/5/11/chartex" xmlns:cx6="http://schemas.microsoft.com/office/drawing/2016/5/12/chartex" xmlns:cx7="http://schemas.microsoft.com/office/drawing/2016/5/13/chartex" xmlns:cx8="http://schemas.microsoft.com/office/drawing/2016/5/14/chartex" xmlns:mc="http://schemas.openxmlformats.org/markup-compatibility/2006" xmlns:aink="http://schemas.microsoft.com/office/drawing/2016/ink" xmlns:am3d="http://schemas.microsoft.com/office/drawing/2017/model3d" xmlns:o="urn:schemas-microsoft-com:office:office" xmlns:oel="http://schemas.microsoft.com/office/2019/extlst" xmlns:r="http://schemas.openxmlformats.org/officeDocument/2006/relationships" xmlns:m="http://schemas.openxmlformats.org/officeDocument/2006/math" xmlns:v="urn:schemas-microsoft-com:vml" xmlns:wp14="http://schemas.microsoft.com/office/word/2010/wordprocessingDrawing" xmlns:wp="http://schemas.openxmlformats.org/drawingml/2006/wordprocessingDrawing" xmlns:w10="urn:schemas-microsoft-com:office:word" xmlns:w="http://schemas.openxmlformats.org/wordprocessingml/2006/main" xmlns:w14="http://schemas.microsoft.com/office/word/2010/wordml" xmlns:w15="http://schemas.microsoft.com/office/word/2012/wordml" xmlns:w16cex="http://schemas.microsoft.com/office/word/2018/wordml/cex" xmlns:w16cid="http://schemas.microsoft.com/office/word/2016/wordml/cid" xmlns:w16="http://schemas.microsoft.com/office/word/2018/wordml" xmlns:w16du="http://schemas.microsoft.com/office/word/2023/wordml/word16du" xmlns:w16sdtdh="http://schemas.microsoft.com/office/word/2020/wordml/sdtdatahash" xmlns:w16sdtfl="http://schemas.microsoft.com/office/word/2024/wordml/sdtformatlock" xmlns:w16se="http://schemas.microsoft.com/office/word/2015/wordml/symex" xmlns:wpg="http://schemas.microsoft.com/office/word/2010/wordprocessingGroup" xmlns:wpi="http://schemas.microsoft.com/office/word/2010/wordprocessingInk" xmlns:wne="http://schemas.microsoft.com/office/word/2006/wordml" xmlns:wps="http://schemas.microsoft.com/office/word/2010/wordprocessingShape" mc:Ignorable="w14 w15 w16se w16cid w16 w16cex w16sdtdh w16sdtfl w16du wp14">
   <w:p>
     <w:pPr>
       <w:pStyle w:val="Footer"/>
@@ -35881,7 +35301,7 @@
 </file>
 
 <file path=word/footnotes.xml><?xml version="1.0" encoding="utf-8"?>
-<w:footnotes xmlns:wpc="http://schemas.microsoft.com/office/word/2010/wordprocessingCanvas" xmlns:cx="http://schemas.microsoft.com/office/drawing/2014/chartex" xmlns:cx1="http://schemas.microsoft.com/office/drawing/2015/9/8/chartex" xmlns:cx2="http://schemas.microsoft.com/office/drawing/2015/10/21/chartex" xmlns:cx3="http://schemas.microsoft.com/office/drawing/2016/5/9/chartex" xmlns:cx4="http://schemas.microsoft.com/office/drawing/2016/5/10/chartex" xmlns:cx5="http://schemas.microsoft.com/office/drawing/2016/5/11/chartex" xmlns:cx6="http://schemas.microsoft.com/office/drawing/2016/5/12/chartex" xmlns:cx7="http://schemas.microsoft.com/office/drawing/2016/5/13/chartex" xmlns:cx8="http://schemas.microsoft.com/office/drawing/2016/5/14/chartex" xmlns:mc="http://schemas.openxmlformats.org/markup-compatibility/2006" xmlns:aink="http://schemas.microsoft.com/office/drawing/2016/ink" xmlns:am3d="http://schemas.microsoft.com/office/drawing/2017/model3d" xmlns:o="urn:schemas-microsoft-com:office:office" xmlns:r="http://schemas.openxmlformats.org/officeDocument/2006/relationships" xmlns:m="http://schemas.openxmlformats.org/officeDocument/2006/math" xmlns:v="urn:schemas-microsoft-com:vml" xmlns:wp14="http://schemas.microsoft.com/office/word/2010/wordprocessingDrawing" xmlns:wp="http://schemas.openxmlformats.org/drawingml/2006/wordprocessingDrawing" xmlns:w10="urn:schemas-microsoft-com:office:word" xmlns:w="http://schemas.openxmlformats.org/wordprocessingml/2006/main" xmlns:w14="http://schemas.microsoft.com/office/word/2010/wordml" xmlns:w15="http://schemas.microsoft.com/office/word/2012/wordml" xmlns:w16cid="http://schemas.microsoft.com/office/word/2016/wordml/cid" xmlns:w16se="http://schemas.microsoft.com/office/word/2015/wordml/symex" xmlns:wpg="http://schemas.microsoft.com/office/word/2010/wordprocessingGroup" xmlns:wpi="http://schemas.microsoft.com/office/word/2010/wordprocessingInk" xmlns:wne="http://schemas.microsoft.com/office/word/2006/wordml" xmlns:wps="http://schemas.microsoft.com/office/word/2010/wordprocessingShape" mc:Ignorable="w14 w15 w16se w16cid wp14">
+<w:footnotes xmlns:wpc="http://schemas.microsoft.com/office/word/2010/wordprocessingCanvas" xmlns:cx="http://schemas.microsoft.com/office/drawing/2014/chartex" xmlns:cx1="http://schemas.microsoft.com/office/drawing/2015/9/8/chartex" xmlns:cx2="http://schemas.microsoft.com/office/drawing/2015/10/21/chartex" xmlns:cx3="http://schemas.microsoft.com/office/drawing/2016/5/9/chartex" xmlns:cx4="http://schemas.microsoft.com/office/drawing/2016/5/10/chartex" xmlns:cx5="http://schemas.microsoft.com/office/drawing/2016/5/11/chartex" xmlns:cx6="http://schemas.microsoft.com/office/drawing/2016/5/12/chartex" xmlns:cx7="http://schemas.microsoft.com/office/drawing/2016/5/13/chartex" xmlns:cx8="http://schemas.microsoft.com/office/drawing/2016/5/14/chartex" xmlns:mc="http://schemas.openxmlformats.org/markup-compatibility/2006" xmlns:aink="http://schemas.microsoft.com/office/drawing/2016/ink" xmlns:am3d="http://schemas.microsoft.com/office/drawing/2017/model3d" xmlns:o="urn:schemas-microsoft-com:office:office" xmlns:oel="http://schemas.microsoft.com/office/2019/extlst" xmlns:r="http://schemas.openxmlformats.org/officeDocument/2006/relationships" xmlns:m="http://schemas.openxmlformats.org/officeDocument/2006/math" xmlns:v="urn:schemas-microsoft-com:vml" xmlns:wp14="http://schemas.microsoft.com/office/word/2010/wordprocessingDrawing" xmlns:wp="http://schemas.openxmlformats.org/drawingml/2006/wordprocessingDrawing" xmlns:w10="urn:schemas-microsoft-com:office:word" xmlns:w="http://schemas.openxmlformats.org/wordprocessingml/2006/main" xmlns:w14="http://schemas.microsoft.com/office/word/2010/wordml" xmlns:w15="http://schemas.microsoft.com/office/word/2012/wordml" xmlns:w16cex="http://schemas.microsoft.com/office/word/2018/wordml/cex" xmlns:w16cid="http://schemas.microsoft.com/office/word/2016/wordml/cid" xmlns:w16="http://schemas.microsoft.com/office/word/2018/wordml" xmlns:w16du="http://schemas.microsoft.com/office/word/2023/wordml/word16du" xmlns:w16sdtdh="http://schemas.microsoft.com/office/word/2020/wordml/sdtdatahash" xmlns:w16sdtfl="http://schemas.microsoft.com/office/word/2024/wordml/sdtformatlock" xmlns:w16se="http://schemas.microsoft.com/office/word/2015/wordml/symex" xmlns:wpg="http://schemas.microsoft.com/office/word/2010/wordprocessingGroup" xmlns:wpi="http://schemas.microsoft.com/office/word/2010/wordprocessingInk" xmlns:wne="http://schemas.microsoft.com/office/word/2006/wordml" xmlns:wps="http://schemas.microsoft.com/office/word/2010/wordprocessingShape" mc:Ignorable="w14 w15 w16se w16cid w16 w16cex w16sdtdh w16sdtfl w16du wp14">
   <w:footnote w:type="separator" w:id="-1">
     <w:p>
       <w:r>
@@ -35902,7 +35322,7 @@
 </file>
 
 <file path=word/header1.xml><?xml version="1.0" encoding="utf-8"?>
-<w:hdr xmlns:wpc="http://schemas.microsoft.com/office/word/2010/wordprocessingCanvas" xmlns:cx="http://schemas.microsoft.com/office/drawing/2014/chartex" xmlns:cx1="http://schemas.microsoft.com/office/drawing/2015/9/8/chartex" xmlns:cx2="http://schemas.microsoft.com/office/drawing/2015/10/21/chartex" xmlns:cx3="http://schemas.microsoft.com/office/drawing/2016/5/9/chartex" xmlns:cx4="http://schemas.microsoft.com/office/drawing/2016/5/10/chartex" xmlns:cx5="http://schemas.microsoft.com/office/drawing/2016/5/11/chartex" xmlns:cx6="http://schemas.microsoft.com/office/drawing/2016/5/12/chartex" xmlns:cx7="http://schemas.microsoft.com/office/drawing/2016/5/13/chartex" xmlns:cx8="http://schemas.microsoft.com/office/drawing/2016/5/14/chartex" xmlns:mc="http://schemas.openxmlformats.org/markup-compatibility/2006" xmlns:aink="http://schemas.microsoft.com/office/drawing/2016/ink" xmlns:am3d="http://schemas.microsoft.com/office/drawing/2017/model3d" xmlns:o="urn:schemas-microsoft-com:office:office" xmlns:r="http://schemas.openxmlformats.org/officeDocument/2006/relationships" xmlns:m="http://schemas.openxmlformats.org/officeDocument/2006/math" xmlns:v="urn:schemas-microsoft-com:vml" xmlns:wp14="http://schemas.microsoft.com/office/word/2010/wordprocessingDrawing" xmlns:wp="http://schemas.openxmlformats.org/drawingml/2006/wordprocessingDrawing" xmlns:w10="urn:schemas-microsoft-com:office:word" xmlns:w="http://schemas.openxmlformats.org/wordprocessingml/2006/main" xmlns:w14="http://schemas.microsoft.com/office/word/2010/wordml" xmlns:w15="http://schemas.microsoft.com/office/word/2012/wordml" xmlns:w16cid="http://schemas.microsoft.com/office/word/2016/wordml/cid" xmlns:w16se="http://schemas.microsoft.com/office/word/2015/wordml/symex" xmlns:wpg="http://schemas.microsoft.com/office/word/2010/wordprocessingGroup" xmlns:wpi="http://schemas.microsoft.com/office/word/2010/wordprocessingInk" xmlns:wne="http://schemas.microsoft.com/office/word/2006/wordml" xmlns:wps="http://schemas.microsoft.com/office/word/2010/wordprocessingShape" mc:Ignorable="w14 w15 w16se w16cid wp14">
+<w:hdr xmlns:wpc="http://schemas.microsoft.com/office/word/2010/wordprocessingCanvas" xmlns:cx="http://schemas.microsoft.com/office/drawing/2014/chartex" xmlns:cx1="http://schemas.microsoft.com/office/drawing/2015/9/8/chartex" xmlns:cx2="http://schemas.microsoft.com/office/drawing/2015/10/21/chartex" xmlns:cx3="http://schemas.microsoft.com/office/drawing/2016/5/9/chartex" xmlns:cx4="http://schemas.microsoft.com/office/drawing/2016/5/10/chartex" xmlns:cx5="http://schemas.microsoft.com/office/drawing/2016/5/11/chartex" xmlns:cx6="http://schemas.microsoft.com/office/drawing/2016/5/12/chartex" xmlns:cx7="http://schemas.microsoft.com/office/drawing/2016/5/13/chartex" xmlns:cx8="http://schemas.microsoft.com/office/drawing/2016/5/14/chartex" xmlns:mc="http://schemas.openxmlformats.org/markup-compatibility/2006" xmlns:aink="http://schemas.microsoft.com/office/drawing/2016/ink" xmlns:am3d="http://schemas.microsoft.com/office/drawing/2017/model3d" xmlns:o="urn:schemas-microsoft-com:office:office" xmlns:oel="http://schemas.microsoft.com/office/2019/extlst" xmlns:r="http://schemas.openxmlformats.org/officeDocument/2006/relationships" xmlns:m="http://schemas.openxmlformats.org/officeDocument/2006/math" xmlns:v="urn:schemas-microsoft-com:vml" xmlns:wp14="http://schemas.microsoft.com/office/word/2010/wordprocessingDrawing" xmlns:wp="http://schemas.openxmlformats.org/drawingml/2006/wordprocessingDrawing" xmlns:w10="urn:schemas-microsoft-com:office:word" xmlns:w="http://schemas.openxmlformats.org/wordprocessingml/2006/main" xmlns:w14="http://schemas.microsoft.com/office/word/2010/wordml" xmlns:w15="http://schemas.microsoft.com/office/word/2012/wordml" xmlns:w16cex="http://schemas.microsoft.com/office/word/2018/wordml/cex" xmlns:w16cid="http://schemas.microsoft.com/office/word/2016/wordml/cid" xmlns:w16="http://schemas.microsoft.com/office/word/2018/wordml" xmlns:w16du="http://schemas.microsoft.com/office/word/2023/wordml/word16du" xmlns:w16sdtdh="http://schemas.microsoft.com/office/word/2020/wordml/sdtdatahash" xmlns:w16sdtfl="http://schemas.microsoft.com/office/word/2024/wordml/sdtformatlock" xmlns:w16se="http://schemas.microsoft.com/office/word/2015/wordml/symex" xmlns:wpg="http://schemas.microsoft.com/office/word/2010/wordprocessingGroup" xmlns:wpi="http://schemas.microsoft.com/office/word/2010/wordprocessingInk" xmlns:wne="http://schemas.microsoft.com/office/word/2006/wordml" xmlns:wps="http://schemas.microsoft.com/office/word/2010/wordprocessingShape" mc:Ignorable="w14 w15 w16se w16cid w16 w16cex w16sdtdh w16sdtfl w16du wp14">
   <w:p>
     <w:pPr>
       <w:pStyle w:val="Supportingdocument"/>
@@ -35931,7 +35351,7 @@
 </file>
 
 <file path=word/header2.xml><?xml version="1.0" encoding="utf-8"?>
-<w:hdr xmlns:wpc="http://schemas.microsoft.com/office/word/2010/wordprocessingCanvas" xmlns:cx="http://schemas.microsoft.com/office/drawing/2014/chartex" xmlns:cx1="http://schemas.microsoft.com/office/drawing/2015/9/8/chartex" xmlns:cx2="http://schemas.microsoft.com/office/drawing/2015/10/21/chartex" xmlns:cx3="http://schemas.microsoft.com/office/drawing/2016/5/9/chartex" xmlns:cx4="http://schemas.microsoft.com/office/drawing/2016/5/10/chartex" xmlns:cx5="http://schemas.microsoft.com/office/drawing/2016/5/11/chartex" xmlns:cx6="http://schemas.microsoft.com/office/drawing/2016/5/12/chartex" xmlns:cx7="http://schemas.microsoft.com/office/drawing/2016/5/13/chartex" xmlns:cx8="http://schemas.microsoft.com/office/drawing/2016/5/14/chartex" xmlns:mc="http://schemas.openxmlformats.org/markup-compatibility/2006" xmlns:aink="http://schemas.microsoft.com/office/drawing/2016/ink" xmlns:am3d="http://schemas.microsoft.com/office/drawing/2017/model3d" xmlns:o="urn:schemas-microsoft-com:office:office" xmlns:r="http://schemas.openxmlformats.org/officeDocument/2006/relationships" xmlns:m="http://schemas.openxmlformats.org/officeDocument/2006/math" xmlns:v="urn:schemas-microsoft-com:vml" xmlns:wp14="http://schemas.microsoft.com/office/word/2010/wordprocessingDrawing" xmlns:wp="http://schemas.openxmlformats.org/drawingml/2006/wordprocessingDrawing" xmlns:w10="urn:schemas-microsoft-com:office:word" xmlns:w="http://schemas.openxmlformats.org/wordprocessingml/2006/main" xmlns:w14="http://schemas.microsoft.com/office/word/2010/wordml" xmlns:w15="http://schemas.microsoft.com/office/word/2012/wordml" xmlns:w16cid="http://schemas.microsoft.com/office/word/2016/wordml/cid" xmlns:w16se="http://schemas.microsoft.com/office/word/2015/wordml/symex" xmlns:wpg="http://schemas.microsoft.com/office/word/2010/wordprocessingGroup" xmlns:wpi="http://schemas.microsoft.com/office/word/2010/wordprocessingInk" xmlns:wne="http://schemas.microsoft.com/office/word/2006/wordml" xmlns:wps="http://schemas.microsoft.com/office/word/2010/wordprocessingShape" mc:Ignorable="w14 w15 w16se w16cid wp14">
+<w:hdr xmlns:wpc="http://schemas.microsoft.com/office/word/2010/wordprocessingCanvas" xmlns:cx="http://schemas.microsoft.com/office/drawing/2014/chartex" xmlns:cx1="http://schemas.microsoft.com/office/drawing/2015/9/8/chartex" xmlns:cx2="http://schemas.microsoft.com/office/drawing/2015/10/21/chartex" xmlns:cx3="http://schemas.microsoft.com/office/drawing/2016/5/9/chartex" xmlns:cx4="http://schemas.microsoft.com/office/drawing/2016/5/10/chartex" xmlns:cx5="http://schemas.microsoft.com/office/drawing/2016/5/11/chartex" xmlns:cx6="http://schemas.microsoft.com/office/drawing/2016/5/12/chartex" xmlns:cx7="http://schemas.microsoft.com/office/drawing/2016/5/13/chartex" xmlns:cx8="http://schemas.microsoft.com/office/drawing/2016/5/14/chartex" xmlns:mc="http://schemas.openxmlformats.org/markup-compatibility/2006" xmlns:aink="http://schemas.microsoft.com/office/drawing/2016/ink" xmlns:am3d="http://schemas.microsoft.com/office/drawing/2017/model3d" xmlns:o="urn:schemas-microsoft-com:office:office" xmlns:oel="http://schemas.microsoft.com/office/2019/extlst" xmlns:r="http://schemas.openxmlformats.org/officeDocument/2006/relationships" xmlns:m="http://schemas.openxmlformats.org/officeDocument/2006/math" xmlns:v="urn:schemas-microsoft-com:vml" xmlns:wp14="http://schemas.microsoft.com/office/word/2010/wordprocessingDrawing" xmlns:wp="http://schemas.openxmlformats.org/drawingml/2006/wordprocessingDrawing" xmlns:w10="urn:schemas-microsoft-com:office:word" xmlns:w="http://schemas.openxmlformats.org/wordprocessingml/2006/main" xmlns:w14="http://schemas.microsoft.com/office/word/2010/wordml" xmlns:w15="http://schemas.microsoft.com/office/word/2012/wordml" xmlns:w16cex="http://schemas.microsoft.com/office/word/2018/wordml/cex" xmlns:w16cid="http://schemas.microsoft.com/office/word/2016/wordml/cid" xmlns:w16="http://schemas.microsoft.com/office/word/2018/wordml" xmlns:w16du="http://schemas.microsoft.com/office/word/2023/wordml/word16du" xmlns:w16sdtdh="http://schemas.microsoft.com/office/word/2020/wordml/sdtdatahash" xmlns:w16sdtfl="http://schemas.microsoft.com/office/word/2024/wordml/sdtformatlock" xmlns:w16se="http://schemas.microsoft.com/office/word/2015/wordml/symex" xmlns:wpg="http://schemas.microsoft.com/office/word/2010/wordprocessingGroup" xmlns:wpi="http://schemas.microsoft.com/office/word/2010/wordprocessingInk" xmlns:wne="http://schemas.microsoft.com/office/word/2006/wordml" xmlns:wps="http://schemas.microsoft.com/office/word/2010/wordprocessingShape" mc:Ignorable="w14 w15 w16se w16cid w16 w16cex w16sdtdh w16sdtfl w16du wp14">
   <w:p>
     <w:pPr>
       <w:pStyle w:val="Supportingdocument"/>
@@ -35960,7 +35380,7 @@
 </file>
 
 <file path=word/numbering.xml><?xml version="1.0" encoding="utf-8"?>
-<w:numbering xmlns:wpc="http://schemas.microsoft.com/office/word/2010/wordprocessingCanvas" xmlns:cx="http://schemas.microsoft.com/office/drawing/2014/chartex" xmlns:cx1="http://schemas.microsoft.com/office/drawing/2015/9/8/chartex" xmlns:cx2="http://schemas.microsoft.com/office/drawing/2015/10/21/chartex" xmlns:cx3="http://schemas.microsoft.com/office/drawing/2016/5/9/chartex" xmlns:cx4="http://schemas.microsoft.com/office/drawing/2016/5/10/chartex" xmlns:cx5="http://schemas.microsoft.com/office/drawing/2016/5/11/chartex" xmlns:cx6="http://schemas.microsoft.com/office/drawing/2016/5/12/chartex" xmlns:cx7="http://schemas.microsoft.com/office/drawing/2016/5/13/chartex" xmlns:cx8="http://schemas.microsoft.com/office/drawing/2016/5/14/chartex" xmlns:mc="http://schemas.openxmlformats.org/markup-compatibility/2006" xmlns:aink="http://schemas.microsoft.com/office/drawing/2016/ink" xmlns:am3d="http://schemas.microsoft.com/office/drawing/2017/model3d" xmlns:o="urn:schemas-microsoft-com:office:office" xmlns:r="http://schemas.openxmlformats.org/officeDocument/2006/relationships" xmlns:m="http://schemas.openxmlformats.org/officeDocument/2006/math" xmlns:v="urn:schemas-microsoft-com:vml" xmlns:wp14="http://schemas.microsoft.com/office/word/2010/wordprocessingDrawing" xmlns:wp="http://schemas.openxmlformats.org/drawingml/2006/wordprocessingDrawing" xmlns:w10="urn:schemas-microsoft-com:office:word" xmlns:w="http://schemas.openxmlformats.org/wordprocessingml/2006/main" xmlns:w14="http://schemas.microsoft.com/office/word/2010/wordml" xmlns:w15="http://schemas.microsoft.com/office/word/2012/wordml" xmlns:w16cid="http://schemas.microsoft.com/office/word/2016/wordml/cid" xmlns:w16se="http://schemas.microsoft.com/office/word/2015/wordml/symex" xmlns:wpg="http://schemas.microsoft.com/office/word/2010/wordprocessingGroup" xmlns:wpi="http://schemas.microsoft.com/office/word/2010/wordprocessingInk" xmlns:wne="http://schemas.microsoft.com/office/word/2006/wordml" xmlns:wps="http://schemas.microsoft.com/office/word/2010/wordprocessingShape" mc:Ignorable="w14 w15 w16se w16cid wp14">
+<w:numbering xmlns:wpc="http://schemas.microsoft.com/office/word/2010/wordprocessingCanvas" xmlns:cx="http://schemas.microsoft.com/office/drawing/2014/chartex" xmlns:cx1="http://schemas.microsoft.com/office/drawing/2015/9/8/chartex" xmlns:cx2="http://schemas.microsoft.com/office/drawing/2015/10/21/chartex" xmlns:cx3="http://schemas.microsoft.com/office/drawing/2016/5/9/chartex" xmlns:cx4="http://schemas.microsoft.com/office/drawing/2016/5/10/chartex" xmlns:cx5="http://schemas.microsoft.com/office/drawing/2016/5/11/chartex" xmlns:cx6="http://schemas.microsoft.com/office/drawing/2016/5/12/chartex" xmlns:cx7="http://schemas.microsoft.com/office/drawing/2016/5/13/chartex" xmlns:cx8="http://schemas.microsoft.com/office/drawing/2016/5/14/chartex" xmlns:mc="http://schemas.openxmlformats.org/markup-compatibility/2006" xmlns:aink="http://schemas.microsoft.com/office/drawing/2016/ink" xmlns:am3d="http://schemas.microsoft.com/office/drawing/2017/model3d" xmlns:o="urn:schemas-microsoft-com:office:office" xmlns:oel="http://schemas.microsoft.com/office/2019/extlst" xmlns:r="http://schemas.openxmlformats.org/officeDocument/2006/relationships" xmlns:m="http://schemas.openxmlformats.org/officeDocument/2006/math" xmlns:v="urn:schemas-microsoft-com:vml" xmlns:wp14="http://schemas.microsoft.com/office/word/2010/wordprocessingDrawing" xmlns:wp="http://schemas.openxmlformats.org/drawingml/2006/wordprocessingDrawing" xmlns:w10="urn:schemas-microsoft-com:office:word" xmlns:w="http://schemas.openxmlformats.org/wordprocessingml/2006/main" xmlns:w14="http://schemas.microsoft.com/office/word/2010/wordml" xmlns:w15="http://schemas.microsoft.com/office/word/2012/wordml" xmlns:w16cex="http://schemas.microsoft.com/office/word/2018/wordml/cex" xmlns:w16cid="http://schemas.microsoft.com/office/word/2016/wordml/cid" xmlns:w16="http://schemas.microsoft.com/office/word/2018/wordml" xmlns:w16du="http://schemas.microsoft.com/office/word/2023/wordml/word16du" xmlns:w16sdtdh="http://schemas.microsoft.com/office/word/2020/wordml/sdtdatahash" xmlns:w16sdtfl="http://schemas.microsoft.com/office/word/2024/wordml/sdtformatlock" xmlns:w16se="http://schemas.microsoft.com/office/word/2015/wordml/symex" xmlns:wpg="http://schemas.microsoft.com/office/word/2010/wordprocessingGroup" xmlns:wpi="http://schemas.microsoft.com/office/word/2010/wordprocessingInk" xmlns:wne="http://schemas.microsoft.com/office/word/2006/wordml" xmlns:wps="http://schemas.microsoft.com/office/word/2010/wordprocessingShape" mc:Ignorable="w14 w15 w16se w16cid w16 w16cex w16sdtdh w16sdtfl w16du wp14">
   <w:abstractNum w:abstractNumId="0" w15:restartNumberingAfterBreak="0">
     <w:nsid w:val="0262213B"/>
     <w:multiLevelType w:val="hybridMultilevel"/>
@@ -39632,6 +39052,155 @@
     </w:lvl>
   </w:abstractNum>
   <w:abstractNum w:abstractNumId="36" w15:restartNumberingAfterBreak="0">
+    <w:nsid w:val="6F962FA6"/>
+    <w:multiLevelType w:val="multilevel"/>
+    <w:tmpl w:val="50983F6E"/>
+    <w:lvl w:ilvl="0">
+      <w:start w:val="1"/>
+      <w:numFmt w:val="bullet"/>
+      <w:lvlText w:val=""/>
+      <w:lvlJc w:val="left"/>
+      <w:pPr>
+        <w:tabs>
+          <w:tab w:val="num" w:pos="720"/>
+        </w:tabs>
+        <w:ind w:left="720" w:hanging="360"/>
+      </w:pPr>
+      <w:rPr>
+        <w:rFonts w:ascii="Symbol" w:hAnsi="Symbol" w:hint="default"/>
+        <w:sz w:val="20"/>
+      </w:rPr>
+    </w:lvl>
+    <w:lvl w:ilvl="1">
+      <w:start w:val="1"/>
+      <w:numFmt w:val="bullet"/>
+      <w:lvlText w:val="o"/>
+      <w:lvlJc w:val="left"/>
+      <w:pPr>
+        <w:tabs>
+          <w:tab w:val="num" w:pos="1440"/>
+        </w:tabs>
+        <w:ind w:left="1440" w:hanging="360"/>
+      </w:pPr>
+      <w:rPr>
+        <w:rFonts w:ascii="Courier New" w:hAnsi="Courier New" w:hint="default"/>
+        <w:sz w:val="20"/>
+      </w:rPr>
+    </w:lvl>
+    <w:lvl w:ilvl="2" w:tentative="1">
+      <w:start w:val="1"/>
+      <w:numFmt w:val="bullet"/>
+      <w:lvlText w:val=""/>
+      <w:lvlJc w:val="left"/>
+      <w:pPr>
+        <w:tabs>
+          <w:tab w:val="num" w:pos="2160"/>
+        </w:tabs>
+        <w:ind w:left="2160" w:hanging="360"/>
+      </w:pPr>
+      <w:rPr>
+        <w:rFonts w:ascii="Wingdings" w:hAnsi="Wingdings" w:hint="default"/>
+        <w:sz w:val="20"/>
+      </w:rPr>
+    </w:lvl>
+    <w:lvl w:ilvl="3" w:tentative="1">
+      <w:start w:val="1"/>
+      <w:numFmt w:val="bullet"/>
+      <w:lvlText w:val=""/>
+      <w:lvlJc w:val="left"/>
+      <w:pPr>
+        <w:tabs>
+          <w:tab w:val="num" w:pos="2880"/>
+        </w:tabs>
+        <w:ind w:left="2880" w:hanging="360"/>
+      </w:pPr>
+      <w:rPr>
+        <w:rFonts w:ascii="Wingdings" w:hAnsi="Wingdings" w:hint="default"/>
+        <w:sz w:val="20"/>
+      </w:rPr>
+    </w:lvl>
+    <w:lvl w:ilvl="4" w:tentative="1">
+      <w:start w:val="1"/>
+      <w:numFmt w:val="bullet"/>
+      <w:lvlText w:val=""/>
+      <w:lvlJc w:val="left"/>
+      <w:pPr>
+        <w:tabs>
+          <w:tab w:val="num" w:pos="3600"/>
+        </w:tabs>
+        <w:ind w:left="3600" w:hanging="360"/>
+      </w:pPr>
+      <w:rPr>
+        <w:rFonts w:ascii="Wingdings" w:hAnsi="Wingdings" w:hint="default"/>
+        <w:sz w:val="20"/>
+      </w:rPr>
+    </w:lvl>
+    <w:lvl w:ilvl="5" w:tentative="1">
+      <w:start w:val="1"/>
+      <w:numFmt w:val="bullet"/>
+      <w:lvlText w:val=""/>
+      <w:lvlJc w:val="left"/>
+      <w:pPr>
+        <w:tabs>
+          <w:tab w:val="num" w:pos="4320"/>
+        </w:tabs>
+        <w:ind w:left="4320" w:hanging="360"/>
+      </w:pPr>
+      <w:rPr>
+        <w:rFonts w:ascii="Wingdings" w:hAnsi="Wingdings" w:hint="default"/>
+        <w:sz w:val="20"/>
+      </w:rPr>
+    </w:lvl>
+    <w:lvl w:ilvl="6" w:tentative="1">
+      <w:start w:val="1"/>
+      <w:numFmt w:val="bullet"/>
+      <w:lvlText w:val=""/>
+      <w:lvlJc w:val="left"/>
+      <w:pPr>
+        <w:tabs>
+          <w:tab w:val="num" w:pos="5040"/>
+        </w:tabs>
+        <w:ind w:left="5040" w:hanging="360"/>
+      </w:pPr>
+      <w:rPr>
+        <w:rFonts w:ascii="Wingdings" w:hAnsi="Wingdings" w:hint="default"/>
+        <w:sz w:val="20"/>
+      </w:rPr>
+    </w:lvl>
+    <w:lvl w:ilvl="7" w:tentative="1">
+      <w:start w:val="1"/>
+      <w:numFmt w:val="bullet"/>
+      <w:lvlText w:val=""/>
+      <w:lvlJc w:val="left"/>
+      <w:pPr>
+        <w:tabs>
+          <w:tab w:val="num" w:pos="5760"/>
+        </w:tabs>
+        <w:ind w:left="5760" w:hanging="360"/>
+      </w:pPr>
+      <w:rPr>
+        <w:rFonts w:ascii="Wingdings" w:hAnsi="Wingdings" w:hint="default"/>
+        <w:sz w:val="20"/>
+      </w:rPr>
+    </w:lvl>
+    <w:lvl w:ilvl="8" w:tentative="1">
+      <w:start w:val="1"/>
+      <w:numFmt w:val="bullet"/>
+      <w:lvlText w:val=""/>
+      <w:lvlJc w:val="left"/>
+      <w:pPr>
+        <w:tabs>
+          <w:tab w:val="num" w:pos="6480"/>
+        </w:tabs>
+        <w:ind w:left="6480" w:hanging="360"/>
+      </w:pPr>
+      <w:rPr>
+        <w:rFonts w:ascii="Wingdings" w:hAnsi="Wingdings" w:hint="default"/>
+        <w:sz w:val="20"/>
+      </w:rPr>
+    </w:lvl>
+  </w:abstractNum>
+  <w:abstractNum w:abstractNumId="37" w15:restartNumberingAfterBreak="0">
     <w:nsid w:val="750D332F"/>
     <w:multiLevelType w:val="multilevel"/>
     <w:tmpl w:val="0809001D"/>
@@ -39718,7 +39287,7 @@
       </w:pPr>
     </w:lvl>
   </w:abstractNum>
-  <w:abstractNum w:abstractNumId="37" w15:restartNumberingAfterBreak="0">
+  <w:abstractNum w:abstractNumId="38" w15:restartNumberingAfterBreak="0">
     <w:nsid w:val="751333D2"/>
     <w:multiLevelType w:val="hybridMultilevel"/>
     <w:tmpl w:val="73E2167C"/>
@@ -39804,7 +39373,7 @@
       </w:pPr>
     </w:lvl>
   </w:abstractNum>
-  <w:abstractNum w:abstractNumId="38" w15:restartNumberingAfterBreak="0">
+  <w:abstractNum w:abstractNumId="39" w15:restartNumberingAfterBreak="0">
     <w:nsid w:val="79BC6F75"/>
     <w:multiLevelType w:val="hybridMultilevel"/>
     <w:tmpl w:val="5F6C47C8"/>
@@ -39917,7 +39486,7 @@
       </w:rPr>
     </w:lvl>
   </w:abstractNum>
-  <w:abstractNum w:abstractNumId="39" w15:restartNumberingAfterBreak="0">
+  <w:abstractNum w:abstractNumId="40" w15:restartNumberingAfterBreak="0">
     <w:nsid w:val="7C70271A"/>
     <w:multiLevelType w:val="hybridMultilevel"/>
     <w:tmpl w:val="9FCA86E4"/>
@@ -40030,67 +39599,67 @@
       </w:rPr>
     </w:lvl>
   </w:abstractNum>
-  <w:num w:numId="1">
+  <w:num w:numId="1" w16cid:durableId="1076393960">
     <w:abstractNumId w:val="28"/>
   </w:num>
-  <w:num w:numId="2">
+  <w:num w:numId="2" w16cid:durableId="977803242">
     <w:abstractNumId w:val="10"/>
   </w:num>
-  <w:num w:numId="3">
+  <w:num w:numId="3" w16cid:durableId="1375697105">
     <w:abstractNumId w:val="2"/>
   </w:num>
-  <w:num w:numId="4">
+  <w:num w:numId="4" w16cid:durableId="2044206134">
     <w:abstractNumId w:val="22"/>
   </w:num>
-  <w:num w:numId="5">
+  <w:num w:numId="5" w16cid:durableId="330333225">
     <w:abstractNumId w:val="16"/>
   </w:num>
-  <w:num w:numId="6">
+  <w:num w:numId="6" w16cid:durableId="1908806452">
     <w:abstractNumId w:val="12"/>
   </w:num>
-  <w:num w:numId="7">
+  <w:num w:numId="7" w16cid:durableId="1939022375">
     <w:abstractNumId w:val="31"/>
   </w:num>
-  <w:num w:numId="8">
+  <w:num w:numId="8" w16cid:durableId="1852403491">
     <w:abstractNumId w:val="14"/>
   </w:num>
-  <w:num w:numId="9">
+  <w:num w:numId="9" w16cid:durableId="1986858048">
     <w:abstractNumId w:val="21"/>
   </w:num>
-  <w:num w:numId="10">
+  <w:num w:numId="10" w16cid:durableId="2141340919">
     <w:abstractNumId w:val="33"/>
   </w:num>
-  <w:num w:numId="11">
+  <w:num w:numId="11" w16cid:durableId="1968733629">
     <w:abstractNumId w:val="9"/>
   </w:num>
-  <w:num w:numId="12">
+  <w:num w:numId="12" w16cid:durableId="70003015">
     <w:abstractNumId w:val="27"/>
   </w:num>
-  <w:num w:numId="13">
+  <w:num w:numId="13" w16cid:durableId="1874923666">
     <w:abstractNumId w:val="11"/>
   </w:num>
-  <w:num w:numId="14">
+  <w:num w:numId="14" w16cid:durableId="965887608">
     <w:abstractNumId w:val="3"/>
   </w:num>
-  <w:num w:numId="15">
+  <w:num w:numId="15" w16cid:durableId="2043168596">
     <w:abstractNumId w:val="25"/>
   </w:num>
-  <w:num w:numId="16">
+  <w:num w:numId="16" w16cid:durableId="1648240745">
     <w:abstractNumId w:val="7"/>
   </w:num>
-  <w:num w:numId="17">
-    <w:abstractNumId w:val="36"/>
+  <w:num w:numId="17" w16cid:durableId="212159220">
+    <w:abstractNumId w:val="37"/>
   </w:num>
-  <w:num w:numId="18">
+  <w:num w:numId="18" w16cid:durableId="1459955084">
     <w:abstractNumId w:val="19"/>
   </w:num>
-  <w:num w:numId="19">
+  <w:num w:numId="19" w16cid:durableId="1394353681">
     <w:abstractNumId w:val="24"/>
   </w:num>
-  <w:num w:numId="20">
-    <w:abstractNumId w:val="38"/>
+  <w:num w:numId="20" w16cid:durableId="1284775186">
+    <w:abstractNumId w:val="39"/>
   </w:num>
-  <w:num w:numId="21">
+  <w:num w:numId="21" w16cid:durableId="515772644">
     <w:abstractNumId w:val="5"/>
     <w:lvlOverride w:ilvl="0">
       <w:startOverride w:val="1"/>
@@ -40118,8 +39687,8 @@
       <w:startOverride w:val="1"/>
     </w:lvlOverride>
   </w:num>
-  <w:num w:numId="22">
-    <w:abstractNumId w:val="37"/>
+  <w:num w:numId="22" w16cid:durableId="1010835371">
+    <w:abstractNumId w:val="38"/>
     <w:lvlOverride w:ilvl="0">
       <w:startOverride w:val="1"/>
     </w:lvlOverride>
@@ -40148,7 +39717,7 @@
       <w:startOverride w:val="1"/>
     </w:lvlOverride>
   </w:num>
-  <w:num w:numId="23">
+  <w:num w:numId="23" w16cid:durableId="460541466">
     <w:abstractNumId w:val="1"/>
     <w:lvlOverride w:ilvl="0">
       <w:startOverride w:val="1"/>
@@ -40178,13 +39747,13 @@
       <w:startOverride w:val="1"/>
     </w:lvlOverride>
   </w:num>
-  <w:num w:numId="24">
+  <w:num w:numId="24" w16cid:durableId="1140810588">
     <w:abstractNumId w:val="29"/>
   </w:num>
-  <w:num w:numId="25">
+  <w:num w:numId="25" w16cid:durableId="2138142620">
     <w:abstractNumId w:val="13"/>
   </w:num>
-  <w:num w:numId="26">
+  <w:num w:numId="26" w16cid:durableId="958804603">
     <w:abstractNumId w:val="15"/>
     <w:lvlOverride w:ilvl="0">
       <w:startOverride w:val="1"/>
@@ -40214,10 +39783,10 @@
       <w:startOverride w:val="1"/>
     </w:lvlOverride>
   </w:num>
-  <w:num w:numId="27">
+  <w:num w:numId="27" w16cid:durableId="2052806217">
     <w:abstractNumId w:val="26"/>
   </w:num>
-  <w:num w:numId="28">
+  <w:num w:numId="28" w16cid:durableId="1913586717">
     <w:abstractNumId w:val="23"/>
     <w:lvlOverride w:ilvl="0">
       <w:startOverride w:val="1"/>
@@ -40245,7 +39814,7 @@
       <w:startOverride w:val="1"/>
     </w:lvlOverride>
   </w:num>
-  <w:num w:numId="29">
+  <w:num w:numId="29" w16cid:durableId="177089258">
     <w:abstractNumId w:val="35"/>
     <w:lvlOverride w:ilvl="0">
       <w:startOverride w:val="1"/>
@@ -40275,7 +39844,7 @@
       <w:startOverride w:val="1"/>
     </w:lvlOverride>
   </w:num>
-  <w:num w:numId="30">
+  <w:num w:numId="30" w16cid:durableId="922379220">
     <w:abstractNumId w:val="32"/>
     <w:lvlOverride w:ilvl="0">
       <w:startOverride w:val="1"/>
@@ -40301,10 +39870,10 @@
       <w:startOverride w:val="1"/>
     </w:lvlOverride>
   </w:num>
-  <w:num w:numId="31">
-    <w:abstractNumId w:val="39"/>
+  <w:num w:numId="31" w16cid:durableId="1773014894">
+    <w:abstractNumId w:val="40"/>
   </w:num>
-  <w:num w:numId="32">
+  <w:num w:numId="32" w16cid:durableId="741953376">
     <w:abstractNumId w:val="8"/>
     <w:lvlOverride w:ilvl="0">
       <w:startOverride w:val="1"/>
@@ -40334,7 +39903,7 @@
       <w:startOverride w:val="1"/>
     </w:lvlOverride>
   </w:num>
-  <w:num w:numId="33">
+  <w:num w:numId="33" w16cid:durableId="8071133">
     <w:abstractNumId w:val="20"/>
     <w:lvlOverride w:ilvl="0">
       <w:startOverride w:val="1"/>
@@ -40364,33 +39933,36 @@
       <w:startOverride w:val="1"/>
     </w:lvlOverride>
   </w:num>
-  <w:num w:numId="34">
+  <w:num w:numId="34" w16cid:durableId="1985307431">
     <w:abstractNumId w:val="18"/>
   </w:num>
-  <w:num w:numId="35">
+  <w:num w:numId="35" w16cid:durableId="170485587">
     <w:abstractNumId w:val="0"/>
   </w:num>
-  <w:num w:numId="36">
+  <w:num w:numId="36" w16cid:durableId="2038189287">
     <w:abstractNumId w:val="6"/>
   </w:num>
-  <w:num w:numId="37">
+  <w:num w:numId="37" w16cid:durableId="521356235">
     <w:abstractNumId w:val="17"/>
   </w:num>
-  <w:num w:numId="38">
+  <w:num w:numId="38" w16cid:durableId="207911403">
     <w:abstractNumId w:val="4"/>
   </w:num>
-  <w:num w:numId="39">
+  <w:num w:numId="39" w16cid:durableId="300505243">
     <w:abstractNumId w:val="30"/>
   </w:num>
-  <w:num w:numId="40">
+  <w:num w:numId="40" w16cid:durableId="611400692">
     <w:abstractNumId w:val="34"/>
+  </w:num>
+  <w:num w:numId="41" w16cid:durableId="1990866103">
+    <w:abstractNumId w:val="36"/>
   </w:num>
   <w:numIdMacAtCleanup w:val="40"/>
 </w:numbering>
 </file>
 
 <file path=word/styles.xml><?xml version="1.0" encoding="utf-8"?>
-<w:styles xmlns:mc="http://schemas.openxmlformats.org/markup-compatibility/2006" xmlns:r="http://schemas.openxmlformats.org/officeDocument/2006/relationships" xmlns:w="http://schemas.openxmlformats.org/wordprocessingml/2006/main" xmlns:w14="http://schemas.microsoft.com/office/word/2010/wordml" xmlns:w15="http://schemas.microsoft.com/office/word/2012/wordml" xmlns:w16cid="http://schemas.microsoft.com/office/word/2016/wordml/cid" xmlns:w16se="http://schemas.microsoft.com/office/word/2015/wordml/symex" mc:Ignorable="w14 w15 w16se w16cid">
+<w:styles xmlns:mc="http://schemas.openxmlformats.org/markup-compatibility/2006" xmlns:r="http://schemas.openxmlformats.org/officeDocument/2006/relationships" xmlns:w="http://schemas.openxmlformats.org/wordprocessingml/2006/main" xmlns:w14="http://schemas.microsoft.com/office/word/2010/wordml" xmlns:w15="http://schemas.microsoft.com/office/word/2012/wordml" xmlns:w16cex="http://schemas.microsoft.com/office/word/2018/wordml/cex" xmlns:w16cid="http://schemas.microsoft.com/office/word/2016/wordml/cid" xmlns:w16="http://schemas.microsoft.com/office/word/2018/wordml" xmlns:w16du="http://schemas.microsoft.com/office/word/2023/wordml/word16du" xmlns:w16sdtdh="http://schemas.microsoft.com/office/word/2020/wordml/sdtdatahash" xmlns:w16sdtfl="http://schemas.microsoft.com/office/word/2024/wordml/sdtformatlock" xmlns:w16se="http://schemas.microsoft.com/office/word/2015/wordml/symex" mc:Ignorable="w14 w15 w16se w16cid w16 w16cex w16sdtdh w16sdtfl w16du">
   <w:docDefaults>
     <w:rPrDefault>
       <w:rPr>
@@ -40400,7 +39972,7 @@
     </w:rPrDefault>
     <w:pPrDefault/>
   </w:docDefaults>
-  <w:latentStyles w:defLockedState="0" w:defUIPriority="99" w:defSemiHidden="0" w:defUnhideWhenUsed="0" w:defQFormat="0" w:count="375">
+  <w:latentStyles w:defLockedState="0" w:defUIPriority="99" w:defSemiHidden="0" w:defUnhideWhenUsed="0" w:defQFormat="0" w:count="376">
     <w:lsdException w:name="Normal" w:uiPriority="0" w:qFormat="1"/>
     <w:lsdException w:name="heading 1" w:uiPriority="9" w:qFormat="1"/>
     <w:lsdException w:name="heading 2" w:uiPriority="9" w:qFormat="1"/>
@@ -40776,6 +40348,7 @@
     <w:lsdException w:name="Smart Hyperlink" w:semiHidden="1" w:unhideWhenUsed="1"/>
     <w:lsdException w:name="Hashtag" w:semiHidden="1" w:unhideWhenUsed="1"/>
     <w:lsdException w:name="Unresolved Mention" w:semiHidden="1" w:unhideWhenUsed="1"/>
+    <w:lsdException w:name="Smart Link" w:semiHidden="1" w:unhideWhenUsed="1"/>
   </w:latentStyles>
   <w:style w:type="paragraph" w:default="1" w:styleId="Normal">
     <w:name w:val="Normal"/>
@@ -40911,7 +40484,6 @@
   <w:style w:type="character" w:default="1" w:styleId="DefaultParagraphFont">
     <w:name w:val="Default Paragraph Font"/>
     <w:uiPriority w:val="1"/>
-    <w:semiHidden/>
     <w:unhideWhenUsed/>
   </w:style>
   <w:style w:type="table" w:default="1" w:styleId="TableNormal">
@@ -42655,7 +42227,7 @@
 </file>
 
 <file path=word/glossary/document.xml><?xml version="1.0" encoding="utf-8"?>
-<w:glossaryDocument xmlns:wpc="http://schemas.microsoft.com/office/word/2010/wordprocessingCanvas" xmlns:cx="http://schemas.microsoft.com/office/drawing/2014/chartex" xmlns:cx1="http://schemas.microsoft.com/office/drawing/2015/9/8/chartex" xmlns:cx2="http://schemas.microsoft.com/office/drawing/2015/10/21/chartex" xmlns:cx3="http://schemas.microsoft.com/office/drawing/2016/5/9/chartex" xmlns:cx4="http://schemas.microsoft.com/office/drawing/2016/5/10/chartex" xmlns:cx5="http://schemas.microsoft.com/office/drawing/2016/5/11/chartex" xmlns:cx6="http://schemas.microsoft.com/office/drawing/2016/5/12/chartex" xmlns:cx7="http://schemas.microsoft.com/office/drawing/2016/5/13/chartex" xmlns:cx8="http://schemas.microsoft.com/office/drawing/2016/5/14/chartex" xmlns:mc="http://schemas.openxmlformats.org/markup-compatibility/2006" xmlns:aink="http://schemas.microsoft.com/office/drawing/2016/ink" xmlns:am3d="http://schemas.microsoft.com/office/drawing/2017/model3d" xmlns:o="urn:schemas-microsoft-com:office:office" xmlns:r="http://schemas.openxmlformats.org/officeDocument/2006/relationships" xmlns:m="http://schemas.openxmlformats.org/officeDocument/2006/math" xmlns:v="urn:schemas-microsoft-com:vml" xmlns:wp14="http://schemas.microsoft.com/office/word/2010/wordprocessingDrawing" xmlns:wp="http://schemas.openxmlformats.org/drawingml/2006/wordprocessingDrawing" xmlns:w10="urn:schemas-microsoft-com:office:word" xmlns:w="http://schemas.openxmlformats.org/wordprocessingml/2006/main" xmlns:w14="http://schemas.microsoft.com/office/word/2010/wordml" xmlns:w15="http://schemas.microsoft.com/office/word/2012/wordml" xmlns:w16cid="http://schemas.microsoft.com/office/word/2016/wordml/cid" xmlns:w16se="http://schemas.microsoft.com/office/word/2015/wordml/symex" xmlns:wpg="http://schemas.microsoft.com/office/word/2010/wordprocessingGroup" xmlns:wpi="http://schemas.microsoft.com/office/word/2010/wordprocessingInk" xmlns:wne="http://schemas.microsoft.com/office/word/2006/wordml" xmlns:wps="http://schemas.microsoft.com/office/word/2010/wordprocessingShape" mc:Ignorable="w14 w15 w16se w16cid wp14">
+<w:glossaryDocument xmlns:wpc="http://schemas.microsoft.com/office/word/2010/wordprocessingCanvas" xmlns:cx="http://schemas.microsoft.com/office/drawing/2014/chartex" xmlns:cx1="http://schemas.microsoft.com/office/drawing/2015/9/8/chartex" xmlns:cx2="http://schemas.microsoft.com/office/drawing/2015/10/21/chartex" xmlns:cx3="http://schemas.microsoft.com/office/drawing/2016/5/9/chartex" xmlns:cx4="http://schemas.microsoft.com/office/drawing/2016/5/10/chartex" xmlns:cx5="http://schemas.microsoft.com/office/drawing/2016/5/11/chartex" xmlns:cx6="http://schemas.microsoft.com/office/drawing/2016/5/12/chartex" xmlns:cx7="http://schemas.microsoft.com/office/drawing/2016/5/13/chartex" xmlns:cx8="http://schemas.microsoft.com/office/drawing/2016/5/14/chartex" xmlns:mc="http://schemas.openxmlformats.org/markup-compatibility/2006" xmlns:aink="http://schemas.microsoft.com/office/drawing/2016/ink" xmlns:am3d="http://schemas.microsoft.com/office/drawing/2017/model3d" xmlns:o="urn:schemas-microsoft-com:office:office" xmlns:oel="http://schemas.microsoft.com/office/2019/extlst" xmlns:r="http://schemas.openxmlformats.org/officeDocument/2006/relationships" xmlns:m="http://schemas.openxmlformats.org/officeDocument/2006/math" xmlns:v="urn:schemas-microsoft-com:vml" xmlns:wp14="http://schemas.microsoft.com/office/word/2010/wordprocessingDrawing" xmlns:wp="http://schemas.openxmlformats.org/drawingml/2006/wordprocessingDrawing" xmlns:w10="urn:schemas-microsoft-com:office:word" xmlns:w="http://schemas.openxmlformats.org/wordprocessingml/2006/main" xmlns:w14="http://schemas.microsoft.com/office/word/2010/wordml" xmlns:w15="http://schemas.microsoft.com/office/word/2012/wordml" xmlns:w16cex="http://schemas.microsoft.com/office/word/2018/wordml/cex" xmlns:w16cid="http://schemas.microsoft.com/office/word/2016/wordml/cid" xmlns:w16="http://schemas.microsoft.com/office/word/2018/wordml" xmlns:w16du="http://schemas.microsoft.com/office/word/2023/wordml/word16du" xmlns:w16sdtdh="http://schemas.microsoft.com/office/word/2020/wordml/sdtdatahash" xmlns:w16sdtfl="http://schemas.microsoft.com/office/word/2024/wordml/sdtformatlock" xmlns:w16se="http://schemas.microsoft.com/office/word/2015/wordml/symex" xmlns:wpg="http://schemas.microsoft.com/office/word/2010/wordprocessingGroup" xmlns:wpi="http://schemas.microsoft.com/office/word/2010/wordprocessingInk" xmlns:wne="http://schemas.microsoft.com/office/word/2006/wordml" xmlns:wps="http://schemas.microsoft.com/office/word/2010/wordprocessingShape" mc:Ignorable="w14 w15 w16se w16cid w16 w16cex w16sdtdh w16sdtfl w16du wp14">
   <w:docParts>
     <w:docPart>
       <w:docPartPr>
@@ -42888,7 +42460,7 @@
 </file>
 
 <file path=word/glossary/fontTable.xml><?xml version="1.0" encoding="utf-8"?>
-<w:fonts xmlns:mc="http://schemas.openxmlformats.org/markup-compatibility/2006" xmlns:r="http://schemas.openxmlformats.org/officeDocument/2006/relationships" xmlns:w="http://schemas.openxmlformats.org/wordprocessingml/2006/main" xmlns:w14="http://schemas.microsoft.com/office/word/2010/wordml" xmlns:w15="http://schemas.microsoft.com/office/word/2012/wordml" xmlns:w16cid="http://schemas.microsoft.com/office/word/2016/wordml/cid" xmlns:w16se="http://schemas.microsoft.com/office/word/2015/wordml/symex" mc:Ignorable="w14 w15 w16se w16cid">
+<w:fonts xmlns:mc="http://schemas.openxmlformats.org/markup-compatibility/2006" xmlns:r="http://schemas.openxmlformats.org/officeDocument/2006/relationships" xmlns:w="http://schemas.openxmlformats.org/wordprocessingml/2006/main" xmlns:w14="http://schemas.microsoft.com/office/word/2010/wordml" xmlns:w15="http://schemas.microsoft.com/office/word/2012/wordml" xmlns:w16cex="http://schemas.microsoft.com/office/word/2018/wordml/cex" xmlns:w16cid="http://schemas.microsoft.com/office/word/2016/wordml/cid" xmlns:w16="http://schemas.microsoft.com/office/word/2018/wordml" xmlns:w16du="http://schemas.microsoft.com/office/word/2023/wordml/word16du" xmlns:w16sdtdh="http://schemas.microsoft.com/office/word/2020/wordml/sdtdatahash" xmlns:w16sdtfl="http://schemas.microsoft.com/office/word/2024/wordml/sdtformatlock" xmlns:w16se="http://schemas.microsoft.com/office/word/2015/wordml/symex" mc:Ignorable="w14 w15 w16se w16cid w16 w16cex w16sdtdh w16sdtfl w16du">
   <w:font w:name="Symbol">
     <w:panose1 w:val="05050102010706020507"/>
     <w:charset w:val="02"/>
@@ -42898,14 +42470,14 @@
   </w:font>
   <w:font w:name="Times New Roman">
     <w:panose1 w:val="02020603050405020304"/>
-    <w:charset w:val="00"/>
+    <w:charset w:val="A3"/>
     <w:family w:val="roman"/>
     <w:pitch w:val="variable"/>
     <w:sig w:usb0="E0002EFF" w:usb1="C000785B" w:usb2="00000009" w:usb3="00000000" w:csb0="000001FF" w:csb1="00000000"/>
   </w:font>
   <w:font w:name="Courier New">
     <w:panose1 w:val="02070309020205020404"/>
-    <w:charset w:val="00"/>
+    <w:charset w:val="A3"/>
     <w:family w:val="modern"/>
     <w:pitch w:val="fixed"/>
     <w:sig w:usb0="E0002EFF" w:usb1="C0007843" w:usb2="00000009" w:usb3="00000000" w:csb0="000001FF" w:csb1="00000000"/>
@@ -42919,14 +42491,14 @@
   </w:font>
   <w:font w:name="Arial">
     <w:panose1 w:val="020B0604020202020204"/>
-    <w:charset w:val="00"/>
+    <w:charset w:val="A3"/>
     <w:family w:val="swiss"/>
     <w:pitch w:val="variable"/>
     <w:sig w:usb0="E0002EFF" w:usb1="C000785B" w:usb2="00000009" w:usb3="00000000" w:csb0="000001FF" w:csb1="00000000"/>
   </w:font>
   <w:font w:name="Calibri">
     <w:panose1 w:val="020F0502020204030204"/>
-    <w:charset w:val="00"/>
+    <w:charset w:val="A3"/>
     <w:family w:val="swiss"/>
     <w:pitch w:val="variable"/>
     <w:sig w:usb0="E4002EFF" w:usb1="C200247B" w:usb2="00000009" w:usb3="00000000" w:csb0="000001FF" w:csb1="00000000"/>
@@ -42942,14 +42514,14 @@
   </w:font>
   <w:font w:name="Cambria">
     <w:panose1 w:val="02040503050406030204"/>
-    <w:charset w:val="00"/>
+    <w:charset w:val="A3"/>
     <w:family w:val="roman"/>
     <w:pitch w:val="variable"/>
     <w:sig w:usb0="E00006FF" w:usb1="420024FF" w:usb2="02000000" w:usb3="00000000" w:csb0="0000019F" w:csb1="00000000"/>
   </w:font>
   <w:font w:name="Segoe UI">
     <w:panose1 w:val="020B0502040204020203"/>
-    <w:charset w:val="00"/>
+    <w:charset w:val="A3"/>
     <w:family w:val="swiss"/>
     <w:pitch w:val="variable"/>
     <w:sig w:usb0="E4002EFF" w:usb1="C000E47F" w:usb2="00000009" w:usb3="00000000" w:csb0="000001FF" w:csb1="00000000"/>
@@ -42964,23 +42536,28 @@
   </w:font>
   <w:font w:name="Palatino Linotype">
     <w:panose1 w:val="02040502050505030304"/>
-    <w:charset w:val="00"/>
+    <w:charset w:val="A3"/>
     <w:family w:val="roman"/>
     <w:pitch w:val="variable"/>
     <w:sig w:usb0="E0000287" w:usb1="40000013" w:usb2="00000000" w:usb3="00000000" w:csb0="0000019F" w:csb1="00000000"/>
   </w:font>
-  <w:font w:name="Calibri Light">
-    <w:panose1 w:val="020F0302020204030204"/>
+  <w:font w:name="Aptos">
     <w:charset w:val="00"/>
     <w:family w:val="swiss"/>
     <w:pitch w:val="variable"/>
-    <w:sig w:usb0="E4002EFF" w:usb1="C200247B" w:usb2="00000009" w:usb3="00000000" w:csb0="000001FF" w:csb1="00000000"/>
+    <w:sig w:usb0="20000287" w:usb1="00000003" w:usb2="00000000" w:usb3="00000000" w:csb0="0000019F" w:csb1="00000000"/>
+  </w:font>
+  <w:font w:name="Aptos Display">
+    <w:charset w:val="00"/>
+    <w:family w:val="swiss"/>
+    <w:pitch w:val="variable"/>
+    <w:sig w:usb0="20000287" w:usb1="00000003" w:usb2="00000000" w:usb3="00000000" w:csb0="0000019F" w:csb1="00000000"/>
   </w:font>
 </w:fonts>
 </file>
 
 <file path=word/glossary/settings.xml><?xml version="1.0" encoding="utf-8"?>
-<w:settings xmlns:mc="http://schemas.openxmlformats.org/markup-compatibility/2006" xmlns:o="urn:schemas-microsoft-com:office:office" xmlns:r="http://schemas.openxmlformats.org/officeDocument/2006/relationships" xmlns:m="http://schemas.openxmlformats.org/officeDocument/2006/math" xmlns:v="urn:schemas-microsoft-com:vml" xmlns:w10="urn:schemas-microsoft-com:office:word" xmlns:w="http://schemas.openxmlformats.org/wordprocessingml/2006/main" xmlns:w14="http://schemas.microsoft.com/office/word/2010/wordml" xmlns:w15="http://schemas.microsoft.com/office/word/2012/wordml" xmlns:w16cid="http://schemas.microsoft.com/office/word/2016/wordml/cid" xmlns:w16se="http://schemas.microsoft.com/office/word/2015/wordml/symex" xmlns:sl="http://schemas.openxmlformats.org/schemaLibrary/2006/main" mc:Ignorable="w14 w15 w16se w16cid">
+<w:settings xmlns:mc="http://schemas.openxmlformats.org/markup-compatibility/2006" xmlns:o="urn:schemas-microsoft-com:office:office" xmlns:r="http://schemas.openxmlformats.org/officeDocument/2006/relationships" xmlns:m="http://schemas.openxmlformats.org/officeDocument/2006/math" xmlns:v="urn:schemas-microsoft-com:vml" xmlns:w10="urn:schemas-microsoft-com:office:word" xmlns:w="http://schemas.openxmlformats.org/wordprocessingml/2006/main" xmlns:w14="http://schemas.microsoft.com/office/word/2010/wordml" xmlns:w15="http://schemas.microsoft.com/office/word/2012/wordml" xmlns:w16cex="http://schemas.microsoft.com/office/word/2018/wordml/cex" xmlns:w16cid="http://schemas.microsoft.com/office/word/2016/wordml/cid" xmlns:w16="http://schemas.microsoft.com/office/word/2018/wordml" xmlns:w16du="http://schemas.microsoft.com/office/word/2023/wordml/word16du" xmlns:w16sdtdh="http://schemas.microsoft.com/office/word/2020/wordml/sdtdatahash" xmlns:w16sdtfl="http://schemas.microsoft.com/office/word/2024/wordml/sdtformatlock" xmlns:w16se="http://schemas.microsoft.com/office/word/2015/wordml/symex" xmlns:sl="http://schemas.openxmlformats.org/schemaLibrary/2006/main" mc:Ignorable="w14 w15 w16se w16cid w16 w16cex w16sdtdh w16sdtfl w16du">
   <w:view w:val="normal"/>
   <w:defaultTabStop w:val="720"/>
   <w:characterSpacingControl w:val="doNotCompress"/>
@@ -42998,10 +42575,13 @@
     <w:rsid w:val="00041EC6"/>
     <w:rsid w:val="002400ED"/>
     <w:rsid w:val="003F4644"/>
+    <w:rsid w:val="00474035"/>
     <w:rsid w:val="004805F8"/>
     <w:rsid w:val="00685BA4"/>
+    <w:rsid w:val="00994716"/>
     <w:rsid w:val="00A77CE4"/>
     <w:rsid w:val="00B96677"/>
+    <w:rsid w:val="00C02992"/>
     <w:rsid w:val="00C07005"/>
     <w:rsid w:val="00DE6AFD"/>
     <w:rsid w:val="00E1053A"/>
@@ -43030,7 +42610,7 @@
 </file>
 
 <file path=word/glossary/styles.xml><?xml version="1.0" encoding="utf-8"?>
-<w:styles xmlns:mc="http://schemas.openxmlformats.org/markup-compatibility/2006" xmlns:r="http://schemas.openxmlformats.org/officeDocument/2006/relationships" xmlns:w="http://schemas.openxmlformats.org/wordprocessingml/2006/main" xmlns:w14="http://schemas.microsoft.com/office/word/2010/wordml" xmlns:w15="http://schemas.microsoft.com/office/word/2012/wordml" xmlns:w16cid="http://schemas.microsoft.com/office/word/2016/wordml/cid" xmlns:w16se="http://schemas.microsoft.com/office/word/2015/wordml/symex" mc:Ignorable="w14 w15 w16se w16cid">
+<w:styles xmlns:mc="http://schemas.openxmlformats.org/markup-compatibility/2006" xmlns:r="http://schemas.openxmlformats.org/officeDocument/2006/relationships" xmlns:w="http://schemas.openxmlformats.org/wordprocessingml/2006/main" xmlns:w14="http://schemas.microsoft.com/office/word/2010/wordml" xmlns:w15="http://schemas.microsoft.com/office/word/2012/wordml" xmlns:w16cex="http://schemas.microsoft.com/office/word/2018/wordml/cex" xmlns:w16cid="http://schemas.microsoft.com/office/word/2016/wordml/cid" xmlns:w16="http://schemas.microsoft.com/office/word/2018/wordml" xmlns:w16du="http://schemas.microsoft.com/office/word/2023/wordml/word16du" xmlns:w16sdtdh="http://schemas.microsoft.com/office/word/2020/wordml/sdtdatahash" xmlns:w16sdtfl="http://schemas.microsoft.com/office/word/2024/wordml/sdtformatlock" xmlns:w16se="http://schemas.microsoft.com/office/word/2015/wordml/symex" mc:Ignorable="w14 w15 w16se w16cid w16 w16cex w16sdtdh w16sdtfl w16du">
   <w:docDefaults>
     <w:rPrDefault>
       <w:rPr>
@@ -43048,7 +42628,7 @@
       </w:pPr>
     </w:pPrDefault>
   </w:docDefaults>
-  <w:latentStyles w:defLockedState="0" w:defUIPriority="99" w:defSemiHidden="0" w:defUnhideWhenUsed="0" w:defQFormat="0" w:count="375">
+  <w:latentStyles w:defLockedState="0" w:defUIPriority="99" w:defSemiHidden="0" w:defUnhideWhenUsed="0" w:defQFormat="0" w:count="376">
     <w:lsdException w:name="Normal" w:uiPriority="0" w:qFormat="1"/>
     <w:lsdException w:name="heading 1" w:uiPriority="9" w:qFormat="1"/>
     <w:lsdException w:name="heading 2" w:semiHidden="1" w:uiPriority="9" w:unhideWhenUsed="1" w:qFormat="1"/>
@@ -43424,6 +43004,7 @@
     <w:lsdException w:name="Smart Hyperlink" w:semiHidden="1" w:unhideWhenUsed="1"/>
     <w:lsdException w:name="Hashtag" w:semiHidden="1" w:unhideWhenUsed="1"/>
     <w:lsdException w:name="Unresolved Mention" w:semiHidden="1" w:unhideWhenUsed="1"/>
+    <w:lsdException w:name="Smart Link" w:semiHidden="1" w:unhideWhenUsed="1"/>
   </w:latentStyles>
   <w:style w:type="paragraph" w:default="1" w:styleId="Normal">
     <w:name w:val="Normal"/>
@@ -43456,23 +43037,11 @@
     <w:semiHidden/>
     <w:unhideWhenUsed/>
   </w:style>
-  <w:style w:type="paragraph" w:customStyle="1" w:styleId="1AED4CE419634409A4DE22308F25DFFF">
-    <w:name w:val="1AED4CE419634409A4DE22308F25DFFF"/>
-  </w:style>
-  <w:style w:type="paragraph" w:customStyle="1" w:styleId="B74775F5CEEB4AA8AA997E9C4E225814">
-    <w:name w:val="B74775F5CEEB4AA8AA997E9C4E225814"/>
-  </w:style>
   <w:style w:type="paragraph" w:customStyle="1" w:styleId="9FCAF8BA89D64C7B97AB3C571758D813">
     <w:name w:val="9FCAF8BA89D64C7B97AB3C571758D813"/>
   </w:style>
   <w:style w:type="paragraph" w:customStyle="1" w:styleId="5730B4E544AC4733B12FED77333C9B09">
     <w:name w:val="5730B4E544AC4733B12FED77333C9B09"/>
-  </w:style>
-  <w:style w:type="paragraph" w:customStyle="1" w:styleId="C3F9223DA456430A8AF7C38CE474A2BA">
-    <w:name w:val="C3F9223DA456430A8AF7C38CE474A2BA"/>
-  </w:style>
-  <w:style w:type="paragraph" w:customStyle="1" w:styleId="1B673336D57545ADAC05FC101C1570B4">
-    <w:name w:val="1B673336D57545ADAC05FC101C1570B4"/>
   </w:style>
   <w:style w:type="paragraph" w:customStyle="1" w:styleId="24A5DD797AA0401880C94A8720123519">
     <w:name w:val="24A5DD797AA0401880C94A8720123519"/>
@@ -43493,7 +43062,7 @@
 </file>
 
 <file path=word/glossary/webSettings.xml><?xml version="1.0" encoding="utf-8"?>
-<w:webSettings xmlns:mc="http://schemas.openxmlformats.org/markup-compatibility/2006" xmlns:r="http://schemas.openxmlformats.org/officeDocument/2006/relationships" xmlns:w="http://schemas.openxmlformats.org/wordprocessingml/2006/main" xmlns:w14="http://schemas.microsoft.com/office/word/2010/wordml" xmlns:w15="http://schemas.microsoft.com/office/word/2012/wordml" xmlns:w16cid="http://schemas.microsoft.com/office/word/2016/wordml/cid" xmlns:w16se="http://schemas.microsoft.com/office/word/2015/wordml/symex" mc:Ignorable="w14 w15 w16se w16cid">
+<w:webSettings xmlns:mc="http://schemas.openxmlformats.org/markup-compatibility/2006" xmlns:r="http://schemas.openxmlformats.org/officeDocument/2006/relationships" xmlns:w="http://schemas.openxmlformats.org/wordprocessingml/2006/main" xmlns:w14="http://schemas.microsoft.com/office/word/2010/wordml" xmlns:w15="http://schemas.microsoft.com/office/word/2012/wordml" xmlns:w16cex="http://schemas.microsoft.com/office/word/2018/wordml/cex" xmlns:w16cid="http://schemas.microsoft.com/office/word/2016/wordml/cid" xmlns:w16="http://schemas.microsoft.com/office/word/2018/wordml" xmlns:w16du="http://schemas.microsoft.com/office/word/2023/wordml/word16du" xmlns:w16sdtdh="http://schemas.microsoft.com/office/word/2020/wordml/sdtdatahash" xmlns:w16sdtfl="http://schemas.microsoft.com/office/word/2024/wordml/sdtformatlock" xmlns:w16se="http://schemas.microsoft.com/office/word/2015/wordml/symex" mc:Ignorable="w14 w15 w16se w16cid w16 w16cex w16sdtdh w16sdtfl w16du">
   <w:optimizeForBrowser/>
   <w:allowPNG/>
 </w:webSettings>
@@ -43794,6 +43363,18 @@
 </file>
 
 <file path=customXml/item2.xml><?xml version="1.0" encoding="utf-8"?>
+<b:Sources xmlns:b="http://schemas.openxmlformats.org/officeDocument/2006/bibliography" xmlns="http://schemas.openxmlformats.org/officeDocument/2006/bibliography" SelectedStyle="\APASixthEditionOfficeOnline.xsl" StyleName="APA" Version="6"/>
+</file>
+
+<file path=customXml/item3.xml><?xml version="1.0" encoding="utf-8"?>
+<p:properties xmlns:p="http://schemas.microsoft.com/office/2006/metadata/properties" xmlns:xsi="http://www.w3.org/2001/XMLSchema-instance" xmlns:pc="http://schemas.microsoft.com/office/infopath/2007/PartnerControls">
+  <documentManagement>
+    <_activity xmlns="fc400f29-8ae2-4f02-aa36-8354319d8dd0" xsi:nil="true"/>
+  </documentManagement>
+</p:properties>
+</file>
+
+<file path=customXml/item4.xml><?xml version="1.0" encoding="utf-8"?>
 <ct:contentTypeSchema xmlns:ct="http://schemas.microsoft.com/office/2006/metadata/contentType" xmlns:ma="http://schemas.microsoft.com/office/2006/metadata/properties/metaAttributes" ct:_="" ma:_="" ma:contentTypeName="Document" ma:contentTypeID="0x0101002FED5117B94A0C43BE657CFE95077C6E" ma:contentTypeVersion="17" ma:contentTypeDescription="Create a new document." ma:contentTypeScope="" ma:versionID="1b61ef74c0cf3f1787575cceeb5049c4">
   <xsd:schema xmlns:xsd="http://www.w3.org/2001/XMLSchema" xmlns:xs="http://www.w3.org/2001/XMLSchema" xmlns:p="http://schemas.microsoft.com/office/2006/metadata/properties" xmlns:ns3="fc400f29-8ae2-4f02-aa36-8354319d8dd0" xmlns:ns4="a53e46f7-009c-4700-bfb1-03be8983c549" targetNamespace="http://schemas.microsoft.com/office/2006/metadata/properties" ma:root="true" ma:fieldsID="a097de4b958cf184ce63d565c2177212" ns3:_="" ns4:_="">
     <xsd:import namespace="fc400f29-8ae2-4f02-aa36-8354319d8dd0"/>
@@ -44040,18 +43621,6 @@
 </ct:contentTypeSchema>
 </file>
 
-<file path=customXml/item3.xml><?xml version="1.0" encoding="utf-8"?>
-<p:properties xmlns:p="http://schemas.microsoft.com/office/2006/metadata/properties" xmlns:xsi="http://www.w3.org/2001/XMLSchema-instance" xmlns:pc="http://schemas.microsoft.com/office/infopath/2007/PartnerControls">
-  <documentManagement>
-    <_activity xmlns="fc400f29-8ae2-4f02-aa36-8354319d8dd0" xsi:nil="true"/>
-  </documentManagement>
-</p:properties>
-</file>
-
-<file path=customXml/item4.xml><?xml version="1.0" encoding="utf-8"?>
-<b:Sources xmlns:b="http://schemas.openxmlformats.org/officeDocument/2006/bibliography" xmlns="http://schemas.openxmlformats.org/officeDocument/2006/bibliography" SelectedStyle="\APASixthEditionOfficeOnline.xsl" StyleName="APA" Version="6"/>
-</file>
-
 <file path=customXml/itemProps1.xml><?xml version="1.0" encoding="utf-8"?>
 <ds:datastoreItem xmlns:ds="http://schemas.openxmlformats.org/officeDocument/2006/customXml" ds:itemID="{E3499DD3-E433-4477-A8FE-2A9B10275570}">
   <ds:schemaRefs>
@@ -44061,6 +43630,24 @@
 </file>
 
 <file path=customXml/itemProps2.xml><?xml version="1.0" encoding="utf-8"?>
+<ds:datastoreItem xmlns:ds="http://schemas.openxmlformats.org/officeDocument/2006/customXml" ds:itemID="{9679E33D-CEC4-4AA5-B8D2-DA1D33852BED}">
+  <ds:schemaRefs>
+    <ds:schemaRef ds:uri="http://schemas.openxmlformats.org/officeDocument/2006/bibliography"/>
+  </ds:schemaRefs>
+</ds:datastoreItem>
+</file>
+
+<file path=customXml/itemProps3.xml><?xml version="1.0" encoding="utf-8"?>
+<ds:datastoreItem xmlns:ds="http://schemas.openxmlformats.org/officeDocument/2006/customXml" ds:itemID="{3A0AC818-964C-4D39-B25F-D98F3F83829C}">
+  <ds:schemaRefs>
+    <ds:schemaRef ds:uri="http://schemas.microsoft.com/office/2006/metadata/properties"/>
+    <ds:schemaRef ds:uri="http://schemas.microsoft.com/office/infopath/2007/PartnerControls"/>
+    <ds:schemaRef ds:uri="fc400f29-8ae2-4f02-aa36-8354319d8dd0"/>
+  </ds:schemaRefs>
+</ds:datastoreItem>
+</file>
+
+<file path=customXml/itemProps4.xml><?xml version="1.0" encoding="utf-8"?>
 <ds:datastoreItem xmlns:ds="http://schemas.openxmlformats.org/officeDocument/2006/customXml" ds:itemID="{B6942B79-D663-4AEC-A309-D8E420D7B2CD}">
   <ds:schemaRefs>
     <ds:schemaRef ds:uri="http://schemas.microsoft.com/office/2006/metadata/contentType"/>
@@ -44077,22 +43664,4 @@
     <ds:schemaRef ds:uri="http://schemas.microsoft.com/internal/obd"/>
   </ds:schemaRefs>
 </ds:datastoreItem>
-</file>
-
-<file path=customXml/itemProps3.xml><?xml version="1.0" encoding="utf-8"?>
-<ds:datastoreItem xmlns:ds="http://schemas.openxmlformats.org/officeDocument/2006/customXml" ds:itemID="{3A0AC818-964C-4D39-B25F-D98F3F83829C}">
-  <ds:schemaRefs>
-    <ds:schemaRef ds:uri="http://schemas.microsoft.com/office/2006/metadata/properties"/>
-    <ds:schemaRef ds:uri="http://schemas.microsoft.com/office/infopath/2007/PartnerControls"/>
-    <ds:schemaRef ds:uri="fc400f29-8ae2-4f02-aa36-8354319d8dd0"/>
-  </ds:schemaRefs>
-</ds:datastoreItem>
-</file>
-
-<file path=customXml/itemProps4.xml><?xml version="1.0" encoding="utf-8"?>
-<ds:datastoreItem xmlns:ds="http://schemas.openxmlformats.org/officeDocument/2006/customXml" ds:itemID="{9679E33D-CEC4-4AA5-B8D2-DA1D33852BED}">
-  <ds:schemaRefs>
-    <ds:schemaRef ds:uri="http://schemas.openxmlformats.org/officeDocument/2006/bibliography"/>
-  </ds:schemaRefs>
-</ds:datastoreItem>
 </file>
</xml_diff>

<commit_message>
Modify HueDiscovery website and update JavaScript assessment 2
</commit_message>
<xml_diff>
--- a/javascript/Assessment Two/Javascript_Portfolio(LV)_V1.docx
+++ b/javascript/Assessment Two/Javascript_Portfolio(LV)_V1.docx
@@ -5756,103 +5756,321 @@
           <w:p>
             <w:pPr>
               <w:pStyle w:val="Answer"/>
-              <w:rPr>
-                <w:lang w:val="en-US"/>
-              </w:rPr>
-            </w:pPr>
-            <w:r>
-              <w:rPr>
-                <w:bCs/>
-                <w:lang w:val="en-US"/>
-              </w:rPr>
-              <w:t>Branch Workflows:</w:t>
-            </w:r>
+            </w:pPr>
           </w:p>
           <w:p>
             <w:pPr>
               <w:pStyle w:val="Answer"/>
               <w:numPr>
-                <w:ilvl w:val="1"/>
-                <w:numId w:val="41"/>
+                <w:ilvl w:val="3"/>
+                <w:numId w:val="23"/>
               </w:numPr>
-              <w:rPr>
-                <w:b w:val="0"/>
+              <w:ind w:left="399"/>
+              <w:rPr>
                 <w:lang w:val="en-US"/>
               </w:rPr>
             </w:pPr>
             <w:r>
               <w:rPr>
-                <w:b w:val="0"/>
                 <w:lang w:val="en-US"/>
               </w:rPr>
-              <w:t>Feature Branching: Each feature has its branch, merged once completed.</w:t>
+              <w:t>Principles of creating repositories:</w:t>
             </w:r>
           </w:p>
           <w:p>
             <w:pPr>
               <w:pStyle w:val="Answer"/>
               <w:numPr>
-                <w:ilvl w:val="1"/>
-                <w:numId w:val="41"/>
+                <w:ilvl w:val="0"/>
+                <w:numId w:val="43"/>
               </w:numPr>
               <w:rPr>
                 <w:b w:val="0"/>
+                <w:bCs/>
                 <w:lang w:val="en-US"/>
               </w:rPr>
             </w:pPr>
             <w:r>
               <w:rPr>
                 <w:b w:val="0"/>
+                <w:bCs/>
                 <w:lang w:val="en-US"/>
               </w:rPr>
-              <w:t>Git Flow: A structured approach using main, develop, feature, release, and hotfix branches.</w:t>
+              <w:t>Create a main repository to store the source code.</w:t>
             </w:r>
           </w:p>
           <w:p>
             <w:pPr>
               <w:pStyle w:val="Answer"/>
               <w:numPr>
-                <w:ilvl w:val="1"/>
-                <w:numId w:val="41"/>
+                <w:ilvl w:val="0"/>
+                <w:numId w:val="43"/>
               </w:numPr>
               <w:rPr>
                 <w:b w:val="0"/>
+                <w:bCs/>
                 <w:lang w:val="en-US"/>
               </w:rPr>
             </w:pPr>
             <w:r>
               <w:rPr>
                 <w:b w:val="0"/>
+                <w:bCs/>
                 <w:lang w:val="en-US"/>
               </w:rPr>
-              <w:t>Forking Workflow: Used in open-source projects where developers fork the main repository, make changes, and submit pull requests.</w:t>
+              <w:t>The repository structure should be well-organized, clear, and easy to understand.</w:t>
             </w:r>
           </w:p>
           <w:p>
             <w:pPr>
               <w:pStyle w:val="Answer"/>
-              <w:rPr>
+              <w:numPr>
+                <w:ilvl w:val="0"/>
+                <w:numId w:val="43"/>
+              </w:numPr>
+              <w:rPr>
+                <w:b w:val="0"/>
+                <w:bCs/>
                 <w:lang w:val="en-US"/>
               </w:rPr>
             </w:pPr>
             <w:r>
               <w:rPr>
+                <w:b w:val="0"/>
+                <w:bCs/>
                 <w:lang w:val="en-US"/>
               </w:rPr>
-              <w:pict w14:anchorId="26BE6884">
-                <v:rect id="_x0000_i1057" style="width:0;height:1.5pt" o:hralign="center" o:hrstd="t" o:hr="t" fillcolor="#a0a0a0" stroked="f"/>
-              </w:pict>
+              <w:t xml:space="preserve">Use a </w:t>
+            </w:r>
+            <w:r>
+              <w:rPr>
+                <w:b w:val="0"/>
+                <w:bCs/>
+                <w:lang w:val="en-US"/>
+              </w:rPr>
+              <w:t>‘</w:t>
+            </w:r>
+            <w:r>
+              <w:rPr>
+                <w:b w:val="0"/>
+                <w:bCs/>
+                <w:i/>
+                <w:iCs w:val="0"/>
+                <w:lang w:val="en-US"/>
+              </w:rPr>
+              <w:t>.gitignore</w:t>
+            </w:r>
+            <w:r>
+              <w:rPr>
+                <w:b w:val="0"/>
+                <w:bCs/>
+                <w:i/>
+                <w:iCs w:val="0"/>
+                <w:lang w:val="en-US"/>
+              </w:rPr>
+              <w:t>’</w:t>
+            </w:r>
+            <w:r>
+              <w:rPr>
+                <w:b w:val="0"/>
+                <w:bCs/>
+                <w:lang w:val="en-US"/>
+              </w:rPr>
+              <w:t xml:space="preserve"> file to prevent unnecessary files from being added.</w:t>
             </w:r>
           </w:p>
           <w:p>
             <w:pPr>
               <w:pStyle w:val="Answer"/>
-            </w:pPr>
-          </w:p>
-          <w:p>
-            <w:pPr>
-              <w:pStyle w:val="QuestionLearnerResponse"/>
-            </w:pPr>
+              <w:numPr>
+                <w:ilvl w:val="3"/>
+                <w:numId w:val="23"/>
+              </w:numPr>
+              <w:ind w:left="399"/>
+              <w:rPr>
+                <w:lang w:val="en-US"/>
+              </w:rPr>
+            </w:pPr>
+            <w:r>
+              <w:rPr>
+                <w:lang w:val="en-US"/>
+              </w:rPr>
+              <w:t>Principles of creating branch workflows:</w:t>
+            </w:r>
+          </w:p>
+          <w:p>
+            <w:pPr>
+              <w:pStyle w:val="Answer"/>
+              <w:numPr>
+                <w:ilvl w:val="0"/>
+                <w:numId w:val="43"/>
+              </w:numPr>
+              <w:rPr>
+                <w:b w:val="0"/>
+                <w:bCs/>
+                <w:lang w:val="en-US"/>
+              </w:rPr>
+            </w:pPr>
+            <w:r>
+              <w:rPr>
+                <w:b w:val="0"/>
+                <w:bCs/>
+                <w:lang w:val="en-US"/>
+              </w:rPr>
+              <w:t>Use the main branch (main/master), which should always contain a stable version of the application.</w:t>
+            </w:r>
+          </w:p>
+          <w:p>
+            <w:pPr>
+              <w:pStyle w:val="Answer"/>
+              <w:numPr>
+                <w:ilvl w:val="0"/>
+                <w:numId w:val="43"/>
+              </w:numPr>
+              <w:rPr>
+                <w:b w:val="0"/>
+                <w:bCs/>
+                <w:lang w:val="en-US"/>
+              </w:rPr>
+            </w:pPr>
+            <w:r>
+              <w:rPr>
+                <w:b w:val="0"/>
+                <w:bCs/>
+                <w:lang w:val="en-US"/>
+              </w:rPr>
+              <w:t>Create feature branches: New features, bug fixes, or improvements should be developed in separate branches to avoid affecting the main codebase.</w:t>
+            </w:r>
+          </w:p>
+          <w:p>
+            <w:pPr>
+              <w:pStyle w:val="Answer"/>
+              <w:numPr>
+                <w:ilvl w:val="0"/>
+                <w:numId w:val="43"/>
+              </w:numPr>
+              <w:rPr>
+                <w:b w:val="0"/>
+                <w:bCs/>
+                <w:lang w:val="en-US"/>
+              </w:rPr>
+            </w:pPr>
+            <w:r>
+              <w:rPr>
+                <w:b w:val="0"/>
+                <w:bCs/>
+                <w:lang w:val="en-US"/>
+              </w:rPr>
+              <w:t>Pull Request (PR) process: Pull requests should be used to merge changes from feature branches into the main branch after code review and testing.</w:t>
+            </w:r>
+          </w:p>
+          <w:p>
+            <w:pPr>
+              <w:pStyle w:val="Answer"/>
+              <w:numPr>
+                <w:ilvl w:val="0"/>
+                <w:numId w:val="43"/>
+              </w:numPr>
+              <w:rPr>
+                <w:b w:val="0"/>
+                <w:bCs/>
+                <w:lang w:val="en-US"/>
+              </w:rPr>
+            </w:pPr>
+            <w:r>
+              <w:rPr>
+                <w:b w:val="0"/>
+                <w:bCs/>
+                <w:lang w:val="en-US"/>
+              </w:rPr>
+              <w:lastRenderedPageBreak/>
+              <w:t>Development branch: Some workflows use a develop branch, where new changes are combined before merging into the main branch.</w:t>
+            </w:r>
+          </w:p>
+          <w:p>
+            <w:pPr>
+              <w:pStyle w:val="Answer"/>
+              <w:numPr>
+                <w:ilvl w:val="3"/>
+                <w:numId w:val="23"/>
+              </w:numPr>
+              <w:ind w:left="399"/>
+              <w:rPr>
+                <w:lang w:val="en-US"/>
+              </w:rPr>
+            </w:pPr>
+            <w:r>
+              <w:rPr>
+                <w:lang w:val="en-US"/>
+              </w:rPr>
+              <w:t>Techniques for Git branch workflows:</w:t>
+            </w:r>
+          </w:p>
+          <w:p>
+            <w:pPr>
+              <w:pStyle w:val="Answer"/>
+              <w:numPr>
+                <w:ilvl w:val="0"/>
+                <w:numId w:val="43"/>
+              </w:numPr>
+              <w:rPr>
+                <w:b w:val="0"/>
+                <w:bCs/>
+                <w:lang w:val="en-US"/>
+              </w:rPr>
+            </w:pPr>
+            <w:r>
+              <w:rPr>
+                <w:b w:val="0"/>
+                <w:bCs/>
+                <w:lang w:val="en-US"/>
+              </w:rPr>
+              <w:t>Git Flow: A popular branching model that uses branches like master, develop, feature, release, and hotfix.</w:t>
+            </w:r>
+          </w:p>
+          <w:p>
+            <w:pPr>
+              <w:pStyle w:val="Answer"/>
+              <w:numPr>
+                <w:ilvl w:val="0"/>
+                <w:numId w:val="43"/>
+              </w:numPr>
+              <w:rPr>
+                <w:b w:val="0"/>
+                <w:bCs/>
+                <w:lang w:val="en-US"/>
+              </w:rPr>
+            </w:pPr>
+            <w:r>
+              <w:rPr>
+                <w:b w:val="0"/>
+                <w:bCs/>
+                <w:lang w:val="en-US"/>
+              </w:rPr>
+              <w:t>GitHub Flow: A simpler workflow that uses only the main branch and feature branches, ideal for continuous delivery projects.</w:t>
+            </w:r>
+          </w:p>
+          <w:p>
+            <w:pPr>
+              <w:pStyle w:val="Answer"/>
+              <w:numPr>
+                <w:ilvl w:val="0"/>
+                <w:numId w:val="43"/>
+              </w:numPr>
+              <w:rPr>
+                <w:b w:val="0"/>
+                <w:bCs/>
+                <w:lang w:val="en-US"/>
+              </w:rPr>
+            </w:pPr>
+            <w:r>
+              <w:rPr>
+                <w:b w:val="0"/>
+                <w:bCs/>
+                <w:lang w:val="en-US"/>
+              </w:rPr>
+              <w:t>Rebasing vs. Merging: Use rebase to keep the commit history clean or merge to combine branches without altering the commit history.</w:t>
+            </w:r>
           </w:p>
         </w:tc>
         <w:tc>
@@ -5867,6 +6085,7 @@
               <w:pStyle w:val="Answer"/>
             </w:pPr>
             <w:r>
+              <w:lastRenderedPageBreak/>
               <w:t>Comment:</w:t>
             </w:r>
           </w:p>
@@ -5909,7 +6128,6 @@
               <w:rPr>
                 <w:color w:val="FEFFFF" w:themeColor="background1"/>
               </w:rPr>
-              <w:lastRenderedPageBreak/>
               <w:t xml:space="preserve">Question </w:t>
             </w:r>
             <w:r>
@@ -7005,6 +7223,7 @@
                       <w:rFonts w:cs="Arial"/>
                       <w:color w:val="000000"/>
                     </w:rPr>
+                    <w:lastRenderedPageBreak/>
                     <w:t>Set colour using RGB values and HEX values</w:t>
                   </w:r>
                 </w:p>
@@ -7054,6 +7273,7 @@
               <w:pStyle w:val="Answer"/>
             </w:pPr>
             <w:r>
+              <w:lastRenderedPageBreak/>
               <w:t>Comment:</w:t>
             </w:r>
           </w:p>
@@ -7251,7 +7471,6 @@
               <w:pStyle w:val="QuestionLearnerResponse"/>
             </w:pPr>
             <w:r>
-              <w:lastRenderedPageBreak/>
               <w:t>HTML</w:t>
             </w:r>
           </w:p>
@@ -7294,7 +7513,6 @@
               <w:pStyle w:val="Answer"/>
             </w:pPr>
             <w:r>
-              <w:lastRenderedPageBreak/>
               <w:t>Comment:</w:t>
             </w:r>
           </w:p>
@@ -8265,6 +8483,7 @@
               <w:rPr>
                 <w:color w:val="FEFFFF" w:themeColor="background1"/>
               </w:rPr>
+              <w:lastRenderedPageBreak/>
               <w:t xml:space="preserve">Question </w:t>
             </w:r>
             <w:r>
@@ -8601,7 +8820,6 @@
               <w:pStyle w:val="Answer"/>
             </w:pPr>
             <w:r>
-              <w:lastRenderedPageBreak/>
               <w:t>Comment:</w:t>
             </w:r>
           </w:p>
@@ -9669,6 +9887,7 @@
                       <w:bCs/>
                       <w:color w:val="000000"/>
                     </w:rPr>
+                    <w:lastRenderedPageBreak/>
                     <w:t>Language</w:t>
                   </w:r>
                 </w:p>
@@ -9896,6 +10115,7 @@
               <w:pStyle w:val="Answer"/>
             </w:pPr>
             <w:r>
+              <w:lastRenderedPageBreak/>
               <w:t>Comment:</w:t>
             </w:r>
           </w:p>
@@ -10085,7 +10305,6 @@
               <w:pStyle w:val="Answer"/>
             </w:pPr>
             <w:r>
-              <w:lastRenderedPageBreak/>
               <w:t>Answer:</w:t>
             </w:r>
           </w:p>
@@ -11255,6 +11474,7 @@
               <w:rPr>
                 <w:color w:val="FEFFFF" w:themeColor="background1"/>
               </w:rPr>
+              <w:lastRenderedPageBreak/>
               <w:t xml:space="preserve">Question </w:t>
             </w:r>
             <w:r>
@@ -11713,7 +11933,6 @@
               <w:pStyle w:val="Answer"/>
             </w:pPr>
             <w:r>
-              <w:lastRenderedPageBreak/>
               <w:t>Comment:</w:t>
             </w:r>
           </w:p>
@@ -12729,6 +12948,7 @@
               <w:jc w:val="center"/>
             </w:pPr>
             <w:r>
+              <w:lastRenderedPageBreak/>
               <w:t xml:space="preserve">Yes </w:t>
             </w:r>
             <w:sdt>
@@ -12919,7 +13139,6 @@
               <w:rPr>
                 <w:color w:val="FEFFFF" w:themeColor="background1"/>
               </w:rPr>
-              <w:lastRenderedPageBreak/>
               <w:t xml:space="preserve">Question </w:t>
             </w:r>
             <w:r>
@@ -14662,7 +14881,6 @@
               <w:ind w:left="567" w:hanging="567"/>
             </w:pPr>
             <w:r>
-              <w:lastRenderedPageBreak/>
               <w:t>1.5 Learner has implemented sequential search algorithm</w:t>
             </w:r>
           </w:p>
@@ -17312,6 +17530,7 @@
               <w:ind w:left="567" w:hanging="567"/>
             </w:pPr>
             <w:r>
+              <w:lastRenderedPageBreak/>
               <w:t>3.8 Learner has read text from a text file</w:t>
             </w:r>
           </w:p>
@@ -18284,7 +18503,6 @@
               <w:ind w:left="567" w:hanging="567"/>
             </w:pPr>
             <w:r>
-              <w:lastRenderedPageBreak/>
               <w:t>5.1 Learner has listed repository details and initial commit</w:t>
             </w:r>
           </w:p>
@@ -20210,6 +20428,7 @@
               <w:ind w:left="567" w:hanging="567"/>
             </w:pPr>
             <w:r>
+              <w:lastRenderedPageBreak/>
               <w:t>6.1 Learner has created the GitHub account and communicated any difficulties or disruptions while completing this task</w:t>
             </w:r>
           </w:p>
@@ -20689,7 +20908,6 @@
               <w:ind w:left="567" w:hanging="567"/>
             </w:pPr>
             <w:r>
-              <w:lastRenderedPageBreak/>
               <w:t>6.5 The learner has updated the myscript.js file to add in their details.</w:t>
             </w:r>
           </w:p>
@@ -22205,6 +22423,7 @@
                 <w:b/>
                 <w:bCs/>
               </w:rPr>
+              <w:lastRenderedPageBreak/>
               <w:t>Q1A Record GitHub repository details for this part:</w:t>
             </w:r>
           </w:p>
@@ -23819,6 +24038,7 @@
           </w:tcPr>
           <w:p>
             <w:r>
+              <w:lastRenderedPageBreak/>
               <w:t>&lt;Insert the screenshot JavaScript code that built the object&gt;</w:t>
             </w:r>
           </w:p>
@@ -24996,6 +25216,7 @@
                 <w:b/>
                 <w:bCs/>
               </w:rPr>
+              <w:lastRenderedPageBreak/>
               <w:t>Q3A Record GitHub repository details for this part:</w:t>
             </w:r>
           </w:p>
@@ -25502,6 +25723,7 @@
           </w:tcPr>
           <w:p>
             <w:r>
+              <w:lastRenderedPageBreak/>
               <w:t>Branch name</w:t>
             </w:r>
           </w:p>
@@ -26114,6 +26336,7 @@
           </w:tcPr>
           <w:p>
             <w:r>
+              <w:lastRenderedPageBreak/>
               <w:t>Branch name</w:t>
             </w:r>
           </w:p>
@@ -27290,6 +27513,7 @@
           </w:tcPr>
           <w:p>
             <w:r>
+              <w:lastRenderedPageBreak/>
               <w:t>Branch name</w:t>
             </w:r>
           </w:p>
@@ -31020,6 +31244,7 @@
           </w:tcPr>
           <w:p>
             <w:r>
+              <w:lastRenderedPageBreak/>
               <w:t>Branch name</w:t>
             </w:r>
           </w:p>
@@ -32260,6 +32485,7 @@
           </w:tcPr>
           <w:p>
             <w:r>
+              <w:lastRenderedPageBreak/>
               <w:t>Branch name</w:t>
             </w:r>
           </w:p>
@@ -36627,6 +36853,119 @@
     </w:lvl>
   </w:abstractNum>
   <w:abstractNum w:abstractNumId="12" w15:restartNumberingAfterBreak="0">
+    <w:nsid w:val="2CC37A7B"/>
+    <w:multiLevelType w:val="hybridMultilevel"/>
+    <w:tmpl w:val="A79EE5A4"/>
+    <w:lvl w:ilvl="0" w:tplc="42BC9774">
+      <w:start w:val="1"/>
+      <w:numFmt w:val="bullet"/>
+      <w:lvlText w:val="-"/>
+      <w:lvlJc w:val="left"/>
+      <w:pPr>
+        <w:ind w:left="759" w:hanging="360"/>
+      </w:pPr>
+      <w:rPr>
+        <w:rFonts w:ascii="Arial" w:eastAsia="Times New Roman" w:hAnsi="Arial" w:cs="Arial" w:hint="default"/>
+      </w:rPr>
+    </w:lvl>
+    <w:lvl w:ilvl="1" w:tplc="04090003" w:tentative="1">
+      <w:start w:val="1"/>
+      <w:numFmt w:val="bullet"/>
+      <w:lvlText w:val="o"/>
+      <w:lvlJc w:val="left"/>
+      <w:pPr>
+        <w:ind w:left="1479" w:hanging="360"/>
+      </w:pPr>
+      <w:rPr>
+        <w:rFonts w:ascii="Courier New" w:hAnsi="Courier New" w:cs="Courier New" w:hint="default"/>
+      </w:rPr>
+    </w:lvl>
+    <w:lvl w:ilvl="2" w:tplc="04090005" w:tentative="1">
+      <w:start w:val="1"/>
+      <w:numFmt w:val="bullet"/>
+      <w:lvlText w:val=""/>
+      <w:lvlJc w:val="left"/>
+      <w:pPr>
+        <w:ind w:left="2199" w:hanging="360"/>
+      </w:pPr>
+      <w:rPr>
+        <w:rFonts w:ascii="Wingdings" w:hAnsi="Wingdings" w:hint="default"/>
+      </w:rPr>
+    </w:lvl>
+    <w:lvl w:ilvl="3" w:tplc="04090001" w:tentative="1">
+      <w:start w:val="1"/>
+      <w:numFmt w:val="bullet"/>
+      <w:lvlText w:val=""/>
+      <w:lvlJc w:val="left"/>
+      <w:pPr>
+        <w:ind w:left="2919" w:hanging="360"/>
+      </w:pPr>
+      <w:rPr>
+        <w:rFonts w:ascii="Symbol" w:hAnsi="Symbol" w:hint="default"/>
+      </w:rPr>
+    </w:lvl>
+    <w:lvl w:ilvl="4" w:tplc="04090003" w:tentative="1">
+      <w:start w:val="1"/>
+      <w:numFmt w:val="bullet"/>
+      <w:lvlText w:val="o"/>
+      <w:lvlJc w:val="left"/>
+      <w:pPr>
+        <w:ind w:left="3639" w:hanging="360"/>
+      </w:pPr>
+      <w:rPr>
+        <w:rFonts w:ascii="Courier New" w:hAnsi="Courier New" w:cs="Courier New" w:hint="default"/>
+      </w:rPr>
+    </w:lvl>
+    <w:lvl w:ilvl="5" w:tplc="04090005" w:tentative="1">
+      <w:start w:val="1"/>
+      <w:numFmt w:val="bullet"/>
+      <w:lvlText w:val=""/>
+      <w:lvlJc w:val="left"/>
+      <w:pPr>
+        <w:ind w:left="4359" w:hanging="360"/>
+      </w:pPr>
+      <w:rPr>
+        <w:rFonts w:ascii="Wingdings" w:hAnsi="Wingdings" w:hint="default"/>
+      </w:rPr>
+    </w:lvl>
+    <w:lvl w:ilvl="6" w:tplc="04090001" w:tentative="1">
+      <w:start w:val="1"/>
+      <w:numFmt w:val="bullet"/>
+      <w:lvlText w:val=""/>
+      <w:lvlJc w:val="left"/>
+      <w:pPr>
+        <w:ind w:left="5079" w:hanging="360"/>
+      </w:pPr>
+      <w:rPr>
+        <w:rFonts w:ascii="Symbol" w:hAnsi="Symbol" w:hint="default"/>
+      </w:rPr>
+    </w:lvl>
+    <w:lvl w:ilvl="7" w:tplc="04090003" w:tentative="1">
+      <w:start w:val="1"/>
+      <w:numFmt w:val="bullet"/>
+      <w:lvlText w:val="o"/>
+      <w:lvlJc w:val="left"/>
+      <w:pPr>
+        <w:ind w:left="5799" w:hanging="360"/>
+      </w:pPr>
+      <w:rPr>
+        <w:rFonts w:ascii="Courier New" w:hAnsi="Courier New" w:cs="Courier New" w:hint="default"/>
+      </w:rPr>
+    </w:lvl>
+    <w:lvl w:ilvl="8" w:tplc="04090005" w:tentative="1">
+      <w:start w:val="1"/>
+      <w:numFmt w:val="bullet"/>
+      <w:lvlText w:val=""/>
+      <w:lvlJc w:val="left"/>
+      <w:pPr>
+        <w:ind w:left="6519" w:hanging="360"/>
+      </w:pPr>
+      <w:rPr>
+        <w:rFonts w:ascii="Wingdings" w:hAnsi="Wingdings" w:hint="default"/>
+      </w:rPr>
+    </w:lvl>
+  </w:abstractNum>
+  <w:abstractNum w:abstractNumId="13" w15:restartNumberingAfterBreak="0">
     <w:nsid w:val="323024FC"/>
     <w:multiLevelType w:val="multilevel"/>
     <w:tmpl w:val="0CBAADA6"/>
@@ -36743,7 +37082,7 @@
       </w:rPr>
     </w:lvl>
   </w:abstractNum>
-  <w:abstractNum w:abstractNumId="13" w15:restartNumberingAfterBreak="0">
+  <w:abstractNum w:abstractNumId="14" w15:restartNumberingAfterBreak="0">
     <w:nsid w:val="33283432"/>
     <w:multiLevelType w:val="hybridMultilevel"/>
     <w:tmpl w:val="54AA62B0"/>
@@ -36856,7 +37195,7 @@
       </w:rPr>
     </w:lvl>
   </w:abstractNum>
-  <w:abstractNum w:abstractNumId="14" w15:restartNumberingAfterBreak="0">
+  <w:abstractNum w:abstractNumId="15" w15:restartNumberingAfterBreak="0">
     <w:nsid w:val="39082113"/>
     <w:multiLevelType w:val="multilevel"/>
     <w:tmpl w:val="F85C8D5A"/>
@@ -36973,7 +37312,7 @@
       </w:rPr>
     </w:lvl>
   </w:abstractNum>
-  <w:abstractNum w:abstractNumId="15" w15:restartNumberingAfterBreak="0">
+  <w:abstractNum w:abstractNumId="16" w15:restartNumberingAfterBreak="0">
     <w:nsid w:val="3E481BA3"/>
     <w:multiLevelType w:val="hybridMultilevel"/>
     <w:tmpl w:val="97BA59CC"/>
@@ -37059,7 +37398,7 @@
       </w:pPr>
     </w:lvl>
   </w:abstractNum>
-  <w:abstractNum w:abstractNumId="16" w15:restartNumberingAfterBreak="0">
+  <w:abstractNum w:abstractNumId="17" w15:restartNumberingAfterBreak="0">
     <w:nsid w:val="42782765"/>
     <w:multiLevelType w:val="hybridMultilevel"/>
     <w:tmpl w:val="90884394"/>
@@ -37176,7 +37515,7 @@
       </w:rPr>
     </w:lvl>
   </w:abstractNum>
-  <w:abstractNum w:abstractNumId="17" w15:restartNumberingAfterBreak="0">
+  <w:abstractNum w:abstractNumId="18" w15:restartNumberingAfterBreak="0">
     <w:nsid w:val="456330DF"/>
     <w:multiLevelType w:val="hybridMultilevel"/>
     <w:tmpl w:val="97BA59CC"/>
@@ -37262,7 +37601,7 @@
       </w:pPr>
     </w:lvl>
   </w:abstractNum>
-  <w:abstractNum w:abstractNumId="18" w15:restartNumberingAfterBreak="0">
+  <w:abstractNum w:abstractNumId="19" w15:restartNumberingAfterBreak="0">
     <w:nsid w:val="4E3755AB"/>
     <w:multiLevelType w:val="singleLevel"/>
     <w:tmpl w:val="40964F6C"/>
@@ -37282,7 +37621,7 @@
       </w:rPr>
     </w:lvl>
   </w:abstractNum>
-  <w:abstractNum w:abstractNumId="19" w15:restartNumberingAfterBreak="0">
+  <w:abstractNum w:abstractNumId="20" w15:restartNumberingAfterBreak="0">
     <w:nsid w:val="4E5B4457"/>
     <w:multiLevelType w:val="hybridMultilevel"/>
     <w:tmpl w:val="B16E5072"/>
@@ -37395,7 +37734,7 @@
       </w:rPr>
     </w:lvl>
   </w:abstractNum>
-  <w:abstractNum w:abstractNumId="20" w15:restartNumberingAfterBreak="0">
+  <w:abstractNum w:abstractNumId="21" w15:restartNumberingAfterBreak="0">
     <w:nsid w:val="50C67B93"/>
     <w:multiLevelType w:val="hybridMultilevel"/>
     <w:tmpl w:val="97BA59CC"/>
@@ -37481,7 +37820,7 @@
       </w:pPr>
     </w:lvl>
   </w:abstractNum>
-  <w:abstractNum w:abstractNumId="21" w15:restartNumberingAfterBreak="0">
+  <w:abstractNum w:abstractNumId="22" w15:restartNumberingAfterBreak="0">
     <w:nsid w:val="536179CA"/>
     <w:multiLevelType w:val="hybridMultilevel"/>
     <w:tmpl w:val="8ADC7E04"/>
@@ -37571,7 +37910,7 @@
       </w:pPr>
     </w:lvl>
   </w:abstractNum>
-  <w:abstractNum w:abstractNumId="22" w15:restartNumberingAfterBreak="0">
+  <w:abstractNum w:abstractNumId="23" w15:restartNumberingAfterBreak="0">
     <w:nsid w:val="53BE6AB0"/>
     <w:multiLevelType w:val="multilevel"/>
     <w:tmpl w:val="33C444A6"/>
@@ -37688,7 +38027,7 @@
       </w:rPr>
     </w:lvl>
   </w:abstractNum>
-  <w:abstractNum w:abstractNumId="23" w15:restartNumberingAfterBreak="0">
+  <w:abstractNum w:abstractNumId="24" w15:restartNumberingAfterBreak="0">
     <w:nsid w:val="561B05EC"/>
     <w:multiLevelType w:val="hybridMultilevel"/>
     <w:tmpl w:val="A44462CE"/>
@@ -37777,7 +38116,7 @@
       </w:pPr>
     </w:lvl>
   </w:abstractNum>
-  <w:abstractNum w:abstractNumId="24" w15:restartNumberingAfterBreak="0">
+  <w:abstractNum w:abstractNumId="25" w15:restartNumberingAfterBreak="0">
     <w:nsid w:val="5718738F"/>
     <w:multiLevelType w:val="hybridMultilevel"/>
     <w:tmpl w:val="0870EDA8"/>
@@ -37890,7 +38229,7 @@
       </w:rPr>
     </w:lvl>
   </w:abstractNum>
-  <w:abstractNum w:abstractNumId="25" w15:restartNumberingAfterBreak="0">
+  <w:abstractNum w:abstractNumId="26" w15:restartNumberingAfterBreak="0">
     <w:nsid w:val="5754766F"/>
     <w:multiLevelType w:val="multilevel"/>
     <w:tmpl w:val="72DAA2BE"/>
@@ -38010,7 +38349,7 @@
       </w:rPr>
     </w:lvl>
   </w:abstractNum>
-  <w:abstractNum w:abstractNumId="26" w15:restartNumberingAfterBreak="0">
+  <w:abstractNum w:abstractNumId="27" w15:restartNumberingAfterBreak="0">
     <w:nsid w:val="58126709"/>
     <w:multiLevelType w:val="hybridMultilevel"/>
     <w:tmpl w:val="A44462CE"/>
@@ -38099,7 +38438,7 @@
       </w:pPr>
     </w:lvl>
   </w:abstractNum>
-  <w:abstractNum w:abstractNumId="27" w15:restartNumberingAfterBreak="0">
+  <w:abstractNum w:abstractNumId="28" w15:restartNumberingAfterBreak="0">
     <w:nsid w:val="593C0AE7"/>
     <w:multiLevelType w:val="multilevel"/>
     <w:tmpl w:val="0DCCB346"/>
@@ -38216,7 +38555,7 @@
       </w:rPr>
     </w:lvl>
   </w:abstractNum>
-  <w:abstractNum w:abstractNumId="28" w15:restartNumberingAfterBreak="0">
+  <w:abstractNum w:abstractNumId="29" w15:restartNumberingAfterBreak="0">
     <w:nsid w:val="593E7447"/>
     <w:multiLevelType w:val="hybridMultilevel"/>
     <w:tmpl w:val="8C4809A0"/>
@@ -38330,7 +38669,7 @@
       </w:rPr>
     </w:lvl>
   </w:abstractNum>
-  <w:abstractNum w:abstractNumId="29" w15:restartNumberingAfterBreak="0">
+  <w:abstractNum w:abstractNumId="30" w15:restartNumberingAfterBreak="0">
     <w:nsid w:val="5AD31FDD"/>
     <w:multiLevelType w:val="hybridMultilevel"/>
     <w:tmpl w:val="48F438E0"/>
@@ -38443,7 +38782,7 @@
       </w:rPr>
     </w:lvl>
   </w:abstractNum>
-  <w:abstractNum w:abstractNumId="30" w15:restartNumberingAfterBreak="0">
+  <w:abstractNum w:abstractNumId="31" w15:restartNumberingAfterBreak="0">
     <w:nsid w:val="5B337F45"/>
     <w:multiLevelType w:val="hybridMultilevel"/>
     <w:tmpl w:val="A43E67FA"/>
@@ -38556,7 +38895,7 @@
       </w:rPr>
     </w:lvl>
   </w:abstractNum>
-  <w:abstractNum w:abstractNumId="31" w15:restartNumberingAfterBreak="0">
+  <w:abstractNum w:abstractNumId="32" w15:restartNumberingAfterBreak="0">
     <w:nsid w:val="5B6F6927"/>
     <w:multiLevelType w:val="multilevel"/>
     <w:tmpl w:val="BA2480B2"/>
@@ -38670,7 +39009,7 @@
       </w:rPr>
     </w:lvl>
   </w:abstractNum>
-  <w:abstractNum w:abstractNumId="32" w15:restartNumberingAfterBreak="0">
+  <w:abstractNum w:abstractNumId="33" w15:restartNumberingAfterBreak="0">
     <w:nsid w:val="5C212029"/>
     <w:multiLevelType w:val="hybridMultilevel"/>
     <w:tmpl w:val="D7183B98"/>
@@ -38762,7 +39101,7 @@
       </w:pPr>
     </w:lvl>
   </w:abstractNum>
-  <w:abstractNum w:abstractNumId="33" w15:restartNumberingAfterBreak="0">
+  <w:abstractNum w:abstractNumId="34" w15:restartNumberingAfterBreak="0">
     <w:nsid w:val="640F6508"/>
     <w:multiLevelType w:val="multilevel"/>
     <w:tmpl w:val="40848AA0"/>
@@ -38852,7 +39191,7 @@
       </w:pPr>
     </w:lvl>
   </w:abstractNum>
-  <w:abstractNum w:abstractNumId="34" w15:restartNumberingAfterBreak="0">
+  <w:abstractNum w:abstractNumId="35" w15:restartNumberingAfterBreak="0">
     <w:nsid w:val="6C136FC9"/>
     <w:multiLevelType w:val="hybridMultilevel"/>
     <w:tmpl w:val="8A9609CA"/>
@@ -38965,7 +39304,120 @@
       </w:rPr>
     </w:lvl>
   </w:abstractNum>
-  <w:abstractNum w:abstractNumId="35" w15:restartNumberingAfterBreak="0">
+  <w:abstractNum w:abstractNumId="36" w15:restartNumberingAfterBreak="0">
+    <w:nsid w:val="6C344C43"/>
+    <w:multiLevelType w:val="hybridMultilevel"/>
+    <w:tmpl w:val="EB6E744A"/>
+    <w:lvl w:ilvl="0" w:tplc="CA7C7696">
+      <w:start w:val="1"/>
+      <w:numFmt w:val="bullet"/>
+      <w:lvlText w:val="-"/>
+      <w:lvlJc w:val="left"/>
+      <w:pPr>
+        <w:ind w:left="720" w:hanging="360"/>
+      </w:pPr>
+      <w:rPr>
+        <w:rFonts w:ascii="Arial" w:eastAsia="Times New Roman" w:hAnsi="Arial" w:cs="Arial" w:hint="default"/>
+      </w:rPr>
+    </w:lvl>
+    <w:lvl w:ilvl="1" w:tplc="04090003" w:tentative="1">
+      <w:start w:val="1"/>
+      <w:numFmt w:val="bullet"/>
+      <w:lvlText w:val="o"/>
+      <w:lvlJc w:val="left"/>
+      <w:pPr>
+        <w:ind w:left="1440" w:hanging="360"/>
+      </w:pPr>
+      <w:rPr>
+        <w:rFonts w:ascii="Courier New" w:hAnsi="Courier New" w:cs="Courier New" w:hint="default"/>
+      </w:rPr>
+    </w:lvl>
+    <w:lvl w:ilvl="2" w:tplc="04090005" w:tentative="1">
+      <w:start w:val="1"/>
+      <w:numFmt w:val="bullet"/>
+      <w:lvlText w:val=""/>
+      <w:lvlJc w:val="left"/>
+      <w:pPr>
+        <w:ind w:left="2160" w:hanging="360"/>
+      </w:pPr>
+      <w:rPr>
+        <w:rFonts w:ascii="Wingdings" w:hAnsi="Wingdings" w:hint="default"/>
+      </w:rPr>
+    </w:lvl>
+    <w:lvl w:ilvl="3" w:tplc="04090001" w:tentative="1">
+      <w:start w:val="1"/>
+      <w:numFmt w:val="bullet"/>
+      <w:lvlText w:val=""/>
+      <w:lvlJc w:val="left"/>
+      <w:pPr>
+        <w:ind w:left="2880" w:hanging="360"/>
+      </w:pPr>
+      <w:rPr>
+        <w:rFonts w:ascii="Symbol" w:hAnsi="Symbol" w:hint="default"/>
+      </w:rPr>
+    </w:lvl>
+    <w:lvl w:ilvl="4" w:tplc="04090003" w:tentative="1">
+      <w:start w:val="1"/>
+      <w:numFmt w:val="bullet"/>
+      <w:lvlText w:val="o"/>
+      <w:lvlJc w:val="left"/>
+      <w:pPr>
+        <w:ind w:left="3600" w:hanging="360"/>
+      </w:pPr>
+      <w:rPr>
+        <w:rFonts w:ascii="Courier New" w:hAnsi="Courier New" w:cs="Courier New" w:hint="default"/>
+      </w:rPr>
+    </w:lvl>
+    <w:lvl w:ilvl="5" w:tplc="04090005" w:tentative="1">
+      <w:start w:val="1"/>
+      <w:numFmt w:val="bullet"/>
+      <w:lvlText w:val=""/>
+      <w:lvlJc w:val="left"/>
+      <w:pPr>
+        <w:ind w:left="4320" w:hanging="360"/>
+      </w:pPr>
+      <w:rPr>
+        <w:rFonts w:ascii="Wingdings" w:hAnsi="Wingdings" w:hint="default"/>
+      </w:rPr>
+    </w:lvl>
+    <w:lvl w:ilvl="6" w:tplc="04090001" w:tentative="1">
+      <w:start w:val="1"/>
+      <w:numFmt w:val="bullet"/>
+      <w:lvlText w:val=""/>
+      <w:lvlJc w:val="left"/>
+      <w:pPr>
+        <w:ind w:left="5040" w:hanging="360"/>
+      </w:pPr>
+      <w:rPr>
+        <w:rFonts w:ascii="Symbol" w:hAnsi="Symbol" w:hint="default"/>
+      </w:rPr>
+    </w:lvl>
+    <w:lvl w:ilvl="7" w:tplc="04090003" w:tentative="1">
+      <w:start w:val="1"/>
+      <w:numFmt w:val="bullet"/>
+      <w:lvlText w:val="o"/>
+      <w:lvlJc w:val="left"/>
+      <w:pPr>
+        <w:ind w:left="5760" w:hanging="360"/>
+      </w:pPr>
+      <w:rPr>
+        <w:rFonts w:ascii="Courier New" w:hAnsi="Courier New" w:cs="Courier New" w:hint="default"/>
+      </w:rPr>
+    </w:lvl>
+    <w:lvl w:ilvl="8" w:tplc="04090005" w:tentative="1">
+      <w:start w:val="1"/>
+      <w:numFmt w:val="bullet"/>
+      <w:lvlText w:val=""/>
+      <w:lvlJc w:val="left"/>
+      <w:pPr>
+        <w:ind w:left="6480" w:hanging="360"/>
+      </w:pPr>
+      <w:rPr>
+        <w:rFonts w:ascii="Wingdings" w:hAnsi="Wingdings" w:hint="default"/>
+      </w:rPr>
+    </w:lvl>
+  </w:abstractNum>
+  <w:abstractNum w:abstractNumId="37" w15:restartNumberingAfterBreak="0">
     <w:nsid w:val="6ED077D8"/>
     <w:multiLevelType w:val="hybridMultilevel"/>
     <w:tmpl w:val="97BA59CC"/>
@@ -39051,7 +39503,7 @@
       </w:pPr>
     </w:lvl>
   </w:abstractNum>
-  <w:abstractNum w:abstractNumId="36" w15:restartNumberingAfterBreak="0">
+  <w:abstractNum w:abstractNumId="38" w15:restartNumberingAfterBreak="0">
     <w:nsid w:val="6F962FA6"/>
     <w:multiLevelType w:val="multilevel"/>
     <w:tmpl w:val="50983F6E"/>
@@ -39200,7 +39652,7 @@
       </w:rPr>
     </w:lvl>
   </w:abstractNum>
-  <w:abstractNum w:abstractNumId="37" w15:restartNumberingAfterBreak="0">
+  <w:abstractNum w:abstractNumId="39" w15:restartNumberingAfterBreak="0">
     <w:nsid w:val="750D332F"/>
     <w:multiLevelType w:val="multilevel"/>
     <w:tmpl w:val="0809001D"/>
@@ -39287,7 +39739,7 @@
       </w:pPr>
     </w:lvl>
   </w:abstractNum>
-  <w:abstractNum w:abstractNumId="38" w15:restartNumberingAfterBreak="0">
+  <w:abstractNum w:abstractNumId="40" w15:restartNumberingAfterBreak="0">
     <w:nsid w:val="751333D2"/>
     <w:multiLevelType w:val="hybridMultilevel"/>
     <w:tmpl w:val="73E2167C"/>
@@ -39373,7 +39825,7 @@
       </w:pPr>
     </w:lvl>
   </w:abstractNum>
-  <w:abstractNum w:abstractNumId="39" w15:restartNumberingAfterBreak="0">
+  <w:abstractNum w:abstractNumId="41" w15:restartNumberingAfterBreak="0">
     <w:nsid w:val="79BC6F75"/>
     <w:multiLevelType w:val="hybridMultilevel"/>
     <w:tmpl w:val="5F6C47C8"/>
@@ -39486,7 +39938,7 @@
       </w:rPr>
     </w:lvl>
   </w:abstractNum>
-  <w:abstractNum w:abstractNumId="40" w15:restartNumberingAfterBreak="0">
+  <w:abstractNum w:abstractNumId="42" w15:restartNumberingAfterBreak="0">
     <w:nsid w:val="7C70271A"/>
     <w:multiLevelType w:val="hybridMultilevel"/>
     <w:tmpl w:val="9FCA86E4"/>
@@ -39600,7 +40052,7 @@
     </w:lvl>
   </w:abstractNum>
   <w:num w:numId="1" w16cid:durableId="1076393960">
-    <w:abstractNumId w:val="28"/>
+    <w:abstractNumId w:val="29"/>
   </w:num>
   <w:num w:numId="2" w16cid:durableId="977803242">
     <w:abstractNumId w:val="10"/>
@@ -39609,31 +40061,31 @@
     <w:abstractNumId w:val="2"/>
   </w:num>
   <w:num w:numId="4" w16cid:durableId="2044206134">
+    <w:abstractNumId w:val="23"/>
+  </w:num>
+  <w:num w:numId="5" w16cid:durableId="330333225">
+    <w:abstractNumId w:val="17"/>
+  </w:num>
+  <w:num w:numId="6" w16cid:durableId="1908806452">
+    <w:abstractNumId w:val="13"/>
+  </w:num>
+  <w:num w:numId="7" w16cid:durableId="1939022375">
+    <w:abstractNumId w:val="32"/>
+  </w:num>
+  <w:num w:numId="8" w16cid:durableId="1852403491">
+    <w:abstractNumId w:val="15"/>
+  </w:num>
+  <w:num w:numId="9" w16cid:durableId="1986858048">
     <w:abstractNumId w:val="22"/>
   </w:num>
-  <w:num w:numId="5" w16cid:durableId="330333225">
-    <w:abstractNumId w:val="16"/>
-  </w:num>
-  <w:num w:numId="6" w16cid:durableId="1908806452">
-    <w:abstractNumId w:val="12"/>
-  </w:num>
-  <w:num w:numId="7" w16cid:durableId="1939022375">
-    <w:abstractNumId w:val="31"/>
-  </w:num>
-  <w:num w:numId="8" w16cid:durableId="1852403491">
-    <w:abstractNumId w:val="14"/>
-  </w:num>
-  <w:num w:numId="9" w16cid:durableId="1986858048">
-    <w:abstractNumId w:val="21"/>
-  </w:num>
   <w:num w:numId="10" w16cid:durableId="2141340919">
-    <w:abstractNumId w:val="33"/>
+    <w:abstractNumId w:val="34"/>
   </w:num>
   <w:num w:numId="11" w16cid:durableId="1968733629">
     <w:abstractNumId w:val="9"/>
   </w:num>
   <w:num w:numId="12" w16cid:durableId="70003015">
-    <w:abstractNumId w:val="27"/>
+    <w:abstractNumId w:val="28"/>
   </w:num>
   <w:num w:numId="13" w16cid:durableId="1874923666">
     <w:abstractNumId w:val="11"/>
@@ -39642,22 +40094,22 @@
     <w:abstractNumId w:val="3"/>
   </w:num>
   <w:num w:numId="15" w16cid:durableId="2043168596">
-    <w:abstractNumId w:val="25"/>
+    <w:abstractNumId w:val="26"/>
   </w:num>
   <w:num w:numId="16" w16cid:durableId="1648240745">
     <w:abstractNumId w:val="7"/>
   </w:num>
   <w:num w:numId="17" w16cid:durableId="212159220">
-    <w:abstractNumId w:val="37"/>
+    <w:abstractNumId w:val="39"/>
   </w:num>
   <w:num w:numId="18" w16cid:durableId="1459955084">
-    <w:abstractNumId w:val="19"/>
+    <w:abstractNumId w:val="20"/>
   </w:num>
   <w:num w:numId="19" w16cid:durableId="1394353681">
-    <w:abstractNumId w:val="24"/>
+    <w:abstractNumId w:val="25"/>
   </w:num>
   <w:num w:numId="20" w16cid:durableId="1284775186">
-    <w:abstractNumId w:val="39"/>
+    <w:abstractNumId w:val="41"/>
   </w:num>
   <w:num w:numId="21" w16cid:durableId="515772644">
     <w:abstractNumId w:val="5"/>
@@ -39688,7 +40140,7 @@
     </w:lvlOverride>
   </w:num>
   <w:num w:numId="22" w16cid:durableId="1010835371">
-    <w:abstractNumId w:val="38"/>
+    <w:abstractNumId w:val="40"/>
     <w:lvlOverride w:ilvl="0">
       <w:startOverride w:val="1"/>
     </w:lvlOverride>
@@ -39748,13 +40200,13 @@
     </w:lvlOverride>
   </w:num>
   <w:num w:numId="24" w16cid:durableId="1140810588">
-    <w:abstractNumId w:val="29"/>
+    <w:abstractNumId w:val="30"/>
   </w:num>
   <w:num w:numId="25" w16cid:durableId="2138142620">
-    <w:abstractNumId w:val="13"/>
+    <w:abstractNumId w:val="14"/>
   </w:num>
   <w:num w:numId="26" w16cid:durableId="958804603">
-    <w:abstractNumId w:val="15"/>
+    <w:abstractNumId w:val="16"/>
     <w:lvlOverride w:ilvl="0">
       <w:startOverride w:val="1"/>
     </w:lvlOverride>
@@ -39784,10 +40236,10 @@
     </w:lvlOverride>
   </w:num>
   <w:num w:numId="27" w16cid:durableId="2052806217">
-    <w:abstractNumId w:val="26"/>
+    <w:abstractNumId w:val="27"/>
   </w:num>
   <w:num w:numId="28" w16cid:durableId="1913586717">
-    <w:abstractNumId w:val="23"/>
+    <w:abstractNumId w:val="24"/>
     <w:lvlOverride w:ilvl="0">
       <w:startOverride w:val="1"/>
     </w:lvlOverride>
@@ -39815,7 +40267,7 @@
     </w:lvlOverride>
   </w:num>
   <w:num w:numId="29" w16cid:durableId="177089258">
-    <w:abstractNumId w:val="35"/>
+    <w:abstractNumId w:val="37"/>
     <w:lvlOverride w:ilvl="0">
       <w:startOverride w:val="1"/>
     </w:lvlOverride>
@@ -39845,7 +40297,7 @@
     </w:lvlOverride>
   </w:num>
   <w:num w:numId="30" w16cid:durableId="922379220">
-    <w:abstractNumId w:val="32"/>
+    <w:abstractNumId w:val="33"/>
     <w:lvlOverride w:ilvl="0">
       <w:startOverride w:val="1"/>
     </w:lvlOverride>
@@ -39871,7 +40323,7 @@
     </w:lvlOverride>
   </w:num>
   <w:num w:numId="31" w16cid:durableId="1773014894">
-    <w:abstractNumId w:val="40"/>
+    <w:abstractNumId w:val="42"/>
   </w:num>
   <w:num w:numId="32" w16cid:durableId="741953376">
     <w:abstractNumId w:val="8"/>
@@ -39904,7 +40356,7 @@
     </w:lvlOverride>
   </w:num>
   <w:num w:numId="33" w16cid:durableId="8071133">
-    <w:abstractNumId w:val="20"/>
+    <w:abstractNumId w:val="21"/>
     <w:lvlOverride w:ilvl="0">
       <w:startOverride w:val="1"/>
     </w:lvlOverride>
@@ -39934,7 +40386,7 @@
     </w:lvlOverride>
   </w:num>
   <w:num w:numId="34" w16cid:durableId="1985307431">
-    <w:abstractNumId w:val="18"/>
+    <w:abstractNumId w:val="19"/>
   </w:num>
   <w:num w:numId="35" w16cid:durableId="170485587">
     <w:abstractNumId w:val="0"/>
@@ -39943,18 +40395,24 @@
     <w:abstractNumId w:val="6"/>
   </w:num>
   <w:num w:numId="37" w16cid:durableId="521356235">
-    <w:abstractNumId w:val="17"/>
+    <w:abstractNumId w:val="18"/>
   </w:num>
   <w:num w:numId="38" w16cid:durableId="207911403">
     <w:abstractNumId w:val="4"/>
   </w:num>
   <w:num w:numId="39" w16cid:durableId="300505243">
-    <w:abstractNumId w:val="30"/>
+    <w:abstractNumId w:val="31"/>
   </w:num>
   <w:num w:numId="40" w16cid:durableId="611400692">
-    <w:abstractNumId w:val="34"/>
+    <w:abstractNumId w:val="35"/>
   </w:num>
   <w:num w:numId="41" w16cid:durableId="1990866103">
+    <w:abstractNumId w:val="38"/>
+  </w:num>
+  <w:num w:numId="42" w16cid:durableId="1501585244">
+    <w:abstractNumId w:val="12"/>
+  </w:num>
+  <w:num w:numId="43" w16cid:durableId="1942370726">
     <w:abstractNumId w:val="36"/>
   </w:num>
   <w:numIdMacAtCleanup w:val="40"/>
@@ -40484,6 +40942,7 @@
   <w:style w:type="character" w:default="1" w:styleId="DefaultParagraphFont">
     <w:name w:val="Default Paragraph Font"/>
     <w:uiPriority w:val="1"/>
+    <w:semiHidden/>
     <w:unhideWhenUsed/>
   </w:style>
   <w:style w:type="table" w:default="1" w:styleId="TableNormal">
@@ -42574,15 +43033,20 @@
     <w:rsidRoot w:val="003F4644"/>
     <w:rsid w:val="00041EC6"/>
     <w:rsid w:val="002400ED"/>
+    <w:rsid w:val="002A6461"/>
+    <w:rsid w:val="003868C3"/>
+    <w:rsid w:val="003A1884"/>
     <w:rsid w:val="003F4644"/>
     <w:rsid w:val="00474035"/>
     <w:rsid w:val="004805F8"/>
     <w:rsid w:val="00685BA4"/>
+    <w:rsid w:val="008C44C2"/>
     <w:rsid w:val="00994716"/>
     <w:rsid w:val="00A77CE4"/>
     <w:rsid w:val="00B96677"/>
     <w:rsid w:val="00C02992"/>
     <w:rsid w:val="00C07005"/>
+    <w:rsid w:val="00DA0F0E"/>
     <w:rsid w:val="00DE6AFD"/>
     <w:rsid w:val="00E1053A"/>
     <w:rsid w:val="00E2212B"/>

</xml_diff>

<commit_message>
add file ICT week4
</commit_message>
<xml_diff>
--- a/javascript/Assessment Two/Javascript_Portfolio(LV)_V1.docx
+++ b/javascript/Assessment Two/Javascript_Portfolio(LV)_V1.docx
@@ -1,6 +1,6 @@
 
 <file path=word/document.xml><?xml version="1.0" encoding="utf-8"?>
-<w:document xmlns:wpc="http://schemas.microsoft.com/office/word/2010/wordprocessingCanvas" xmlns:cx="http://schemas.microsoft.com/office/drawing/2014/chartex" xmlns:cx1="http://schemas.microsoft.com/office/drawing/2015/9/8/chartex" xmlns:cx2="http://schemas.microsoft.com/office/drawing/2015/10/21/chartex" xmlns:cx3="http://schemas.microsoft.com/office/drawing/2016/5/9/chartex" xmlns:cx4="http://schemas.microsoft.com/office/drawing/2016/5/10/chartex" xmlns:cx5="http://schemas.microsoft.com/office/drawing/2016/5/11/chartex" xmlns:cx6="http://schemas.microsoft.com/office/drawing/2016/5/12/chartex" xmlns:cx7="http://schemas.microsoft.com/office/drawing/2016/5/13/chartex" xmlns:cx8="http://schemas.microsoft.com/office/drawing/2016/5/14/chartex" xmlns:mc="http://schemas.openxmlformats.org/markup-compatibility/2006" xmlns:aink="http://schemas.microsoft.com/office/drawing/2016/ink" xmlns:am3d="http://schemas.microsoft.com/office/drawing/2017/model3d" xmlns:o="urn:schemas-microsoft-com:office:office" xmlns:oel="http://schemas.microsoft.com/office/2019/extlst" xmlns:r="http://schemas.openxmlformats.org/officeDocument/2006/relationships" xmlns:m="http://schemas.openxmlformats.org/officeDocument/2006/math" xmlns:v="urn:schemas-microsoft-com:vml" xmlns:wp14="http://schemas.microsoft.com/office/word/2010/wordprocessingDrawing" xmlns:wp="http://schemas.openxmlformats.org/drawingml/2006/wordprocessingDrawing" xmlns:w10="urn:schemas-microsoft-com:office:word" xmlns:w="http://schemas.openxmlformats.org/wordprocessingml/2006/main" xmlns:w14="http://schemas.microsoft.com/office/word/2010/wordml" xmlns:w15="http://schemas.microsoft.com/office/word/2012/wordml" xmlns:w16cex="http://schemas.microsoft.com/office/word/2018/wordml/cex" xmlns:w16cid="http://schemas.microsoft.com/office/word/2016/wordml/cid" xmlns:w16="http://schemas.microsoft.com/office/word/2018/wordml" xmlns:w16du="http://schemas.microsoft.com/office/word/2023/wordml/word16du" xmlns:w16sdtdh="http://schemas.microsoft.com/office/word/2020/wordml/sdtdatahash" xmlns:w16sdtfl="http://schemas.microsoft.com/office/word/2024/wordml/sdtformatlock" xmlns:w16se="http://schemas.microsoft.com/office/word/2015/wordml/symex" xmlns:wpg="http://schemas.microsoft.com/office/word/2010/wordprocessingGroup" xmlns:wpi="http://schemas.microsoft.com/office/word/2010/wordprocessingInk" xmlns:wne="http://schemas.microsoft.com/office/word/2006/wordml" xmlns:wps="http://schemas.microsoft.com/office/word/2010/wordprocessingShape" mc:Ignorable="w14 w15 w16se w16cid w16 w16cex w16sdtdh w16sdtfl w16du wp14">
+<w:document xmlns:wpc="http://schemas.microsoft.com/office/word/2010/wordprocessingCanvas" xmlns:cx="http://schemas.microsoft.com/office/drawing/2014/chartex" xmlns:cx1="http://schemas.microsoft.com/office/drawing/2015/9/8/chartex" xmlns:cx2="http://schemas.microsoft.com/office/drawing/2015/10/21/chartex" xmlns:cx3="http://schemas.microsoft.com/office/drawing/2016/5/9/chartex" xmlns:cx4="http://schemas.microsoft.com/office/drawing/2016/5/10/chartex" xmlns:cx5="http://schemas.microsoft.com/office/drawing/2016/5/11/chartex" xmlns:cx6="http://schemas.microsoft.com/office/drawing/2016/5/12/chartex" xmlns:cx7="http://schemas.microsoft.com/office/drawing/2016/5/13/chartex" xmlns:cx8="http://schemas.microsoft.com/office/drawing/2016/5/14/chartex" xmlns:mc="http://schemas.openxmlformats.org/markup-compatibility/2006" xmlns:aink="http://schemas.microsoft.com/office/drawing/2016/ink" xmlns:am3d="http://schemas.microsoft.com/office/drawing/2017/model3d" xmlns:o="urn:schemas-microsoft-com:office:office" xmlns:r="http://schemas.openxmlformats.org/officeDocument/2006/relationships" xmlns:m="http://schemas.openxmlformats.org/officeDocument/2006/math" xmlns:v="urn:schemas-microsoft-com:vml" xmlns:wp14="http://schemas.microsoft.com/office/word/2010/wordprocessingDrawing" xmlns:wp="http://schemas.openxmlformats.org/drawingml/2006/wordprocessingDrawing" xmlns:w10="urn:schemas-microsoft-com:office:word" xmlns:w="http://schemas.openxmlformats.org/wordprocessingml/2006/main" xmlns:w14="http://schemas.microsoft.com/office/word/2010/wordml" xmlns:w15="http://schemas.microsoft.com/office/word/2012/wordml" xmlns:w16cid="http://schemas.microsoft.com/office/word/2016/wordml/cid" xmlns:w16se="http://schemas.microsoft.com/office/word/2015/wordml/symex" xmlns:wpg="http://schemas.microsoft.com/office/word/2010/wordprocessingGroup" xmlns:wpi="http://schemas.microsoft.com/office/word/2010/wordprocessingInk" xmlns:wne="http://schemas.microsoft.com/office/word/2006/wordml" xmlns:wps="http://schemas.microsoft.com/office/word/2010/wordprocessingShape" mc:Ignorable="w14 w15 w16se w16cid wp14">
   <w:body>
     <w:p>
       <w:pPr>
@@ -640,6 +640,7 @@
           <w:p>
             <w:pPr>
               <w:pStyle w:val="Heading3"/>
+              <w:outlineLvl w:val="2"/>
             </w:pPr>
             <w:r>
               <w:t>Learner</w:t>
@@ -761,6 +762,7 @@
           <w:p>
             <w:pPr>
               <w:pStyle w:val="Heading3"/>
+              <w:outlineLvl w:val="2"/>
             </w:pPr>
             <w:r>
               <w:t xml:space="preserve">Section A – </w:t>
@@ -887,7 +889,23 @@
                 <w:rStyle w:val="Strong"/>
                 <w:lang w:val="fr-FR"/>
               </w:rPr>
-              <w:t xml:space="preserve">Unit code: </w:t>
+              <w:t xml:space="preserve">Unit </w:t>
+            </w:r>
+            <w:proofErr w:type="gramStart"/>
+            <w:r>
+              <w:rPr>
+                <w:rStyle w:val="Strong"/>
+                <w:lang w:val="fr-FR"/>
+              </w:rPr>
+              <w:t>code:</w:t>
+            </w:r>
+            <w:proofErr w:type="gramEnd"/>
+            <w:r>
+              <w:rPr>
+                <w:rStyle w:val="Strong"/>
+                <w:lang w:val="fr-FR"/>
+              </w:rPr>
+              <w:t xml:space="preserve"> </w:t>
             </w:r>
           </w:p>
           <w:p>
@@ -1164,6 +1182,7 @@
           <w:p>
             <w:pPr>
               <w:pStyle w:val="Heading3"/>
+              <w:outlineLvl w:val="2"/>
             </w:pPr>
             <w:r>
               <w:t>Section B – Assessment task details</w:t>
@@ -1483,6 +1502,7 @@
           <w:p>
             <w:pPr>
               <w:pStyle w:val="Heading3"/>
+              <w:outlineLvl w:val="2"/>
             </w:pPr>
             <w:r>
               <w:t>Section C</w:t>
@@ -2182,6 +2202,7 @@
           <w:p>
             <w:pPr>
               <w:pStyle w:val="Heading3"/>
+              <w:outlineLvl w:val="2"/>
             </w:pPr>
             <w:r>
               <w:t>Section D</w:t>
@@ -2551,6 +2572,7 @@
           <w:p>
             <w:pPr>
               <w:pStyle w:val="Heading4"/>
+              <w:outlineLvl w:val="3"/>
             </w:pPr>
             <w:r>
               <w:t xml:space="preserve">Equipment/resources </w:t>
@@ -2573,6 +2595,7 @@
           <w:p>
             <w:pPr>
               <w:pStyle w:val="Heading4"/>
+              <w:outlineLvl w:val="3"/>
             </w:pPr>
             <w:r>
               <w:t>Equipment/resources to be provided by the RTO:</w:t>
@@ -2744,7 +2767,23 @@
               <w:ind w:left="-21"/>
             </w:pPr>
             <w:r>
-              <w:t>Applications are available through Holmesglen MyHorizon and some have free licences which can be downloaded via url below:</w:t>
+              <w:t xml:space="preserve">Applications are available through Holmesglen </w:t>
+            </w:r>
+            <w:proofErr w:type="spellStart"/>
+            <w:r>
+              <w:t>MyHorizon</w:t>
+            </w:r>
+            <w:proofErr w:type="spellEnd"/>
+            <w:r>
+              <w:t xml:space="preserve"> and some have free licences which can be downloaded via </w:t>
+            </w:r>
+            <w:proofErr w:type="spellStart"/>
+            <w:r>
+              <w:t>url</w:t>
+            </w:r>
+            <w:proofErr w:type="spellEnd"/>
+            <w:r>
+              <w:t xml:space="preserve"> below:</w:t>
             </w:r>
           </w:p>
           <w:p>
@@ -2768,7 +2807,15 @@
               <w:ind w:left="-21"/>
             </w:pPr>
             <w:r>
-              <w:t>•      MyHorizon - https://myHorizon.holmesglen.edu.au - free to download</w:t>
+              <w:t xml:space="preserve">•      </w:t>
+            </w:r>
+            <w:proofErr w:type="spellStart"/>
+            <w:r>
+              <w:t>MyHorizon</w:t>
+            </w:r>
+            <w:proofErr w:type="spellEnd"/>
+            <w:r>
+              <w:t xml:space="preserve"> - https://myHorizon.holmesglen.edu.au - free to download</w:t>
             </w:r>
           </w:p>
           <w:p>
@@ -2780,7 +2827,15 @@
               <w:ind w:left="-21"/>
             </w:pPr>
             <w:r>
-              <w:t>•      365 Microsoft office suite also can be downloaded via https://portal.office.com - free for all Holmesglen students</w:t>
+              <w:t xml:space="preserve">•      365 Microsoft office </w:t>
+            </w:r>
+            <w:proofErr w:type="gramStart"/>
+            <w:r>
+              <w:t>suite</w:t>
+            </w:r>
+            <w:proofErr w:type="gramEnd"/>
+            <w:r>
+              <w:t xml:space="preserve"> also can be downloaded via https://portal.office.com - free for all Holmesglen students</w:t>
             </w:r>
           </w:p>
           <w:p>
@@ -2864,7 +2919,15 @@
               <w:ind w:left="-21"/>
             </w:pPr>
             <w:r>
-              <w:t>•      ZBrush – https://pixologic.com/</w:t>
+              <w:t xml:space="preserve">•      </w:t>
+            </w:r>
+            <w:proofErr w:type="spellStart"/>
+            <w:r>
+              <w:t>ZBrush</w:t>
+            </w:r>
+            <w:proofErr w:type="spellEnd"/>
+            <w:r>
+              <w:t xml:space="preserve"> – https://pixologic.com/</w:t>
             </w:r>
           </w:p>
           <w:p>
@@ -2920,11 +2983,16 @@
               <w:pStyle w:val="BodyContentIndent1"/>
             </w:pPr>
             <w:r>
-              <w:t>•      OneDrive - https://www.microsoft.com/en-ww/microsoft-365/onedrive/online-cloud-storage - free to download</w:t>
+              <w:t xml:space="preserve">•      OneDrive - https://www.microsoft.com/en-ww/microsoft-365/onedrive/online-cloud-storage - free to </w:t>
+            </w:r>
+            <w:proofErr w:type="spellStart"/>
+            <w:r>
+              <w:t>download</w:t>
             </w:r>
             <w:r>
               <w:t>e</w:t>
             </w:r>
+            <w:proofErr w:type="spellEnd"/>
           </w:p>
         </w:tc>
         <w:tc>
@@ -3061,7 +3129,23 @@
             </w:pPr>
             <w:r>
               <w:lastRenderedPageBreak/>
-              <w:t>Applications available at ZENworks and Holmesglen MyHorizon and free to download via url below:</w:t>
+              <w:t xml:space="preserve">Applications available at ZENworks and Holmesglen </w:t>
+            </w:r>
+            <w:proofErr w:type="spellStart"/>
+            <w:r>
+              <w:t>MyHorizon</w:t>
+            </w:r>
+            <w:proofErr w:type="spellEnd"/>
+            <w:r>
+              <w:t xml:space="preserve"> and free to download via </w:t>
+            </w:r>
+            <w:proofErr w:type="spellStart"/>
+            <w:r>
+              <w:t>url</w:t>
+            </w:r>
+            <w:proofErr w:type="spellEnd"/>
+            <w:r>
+              <w:t xml:space="preserve"> below:</w:t>
             </w:r>
           </w:p>
           <w:p>
@@ -3077,7 +3161,15 @@
               <w:pStyle w:val="BodyContentIndent1"/>
             </w:pPr>
             <w:r>
-              <w:t>•      365 Microsoft office suite also can be downloaded via https://portal.office.com - free to Holmesglen students</w:t>
+              <w:t xml:space="preserve">•      365 Microsoft office </w:t>
+            </w:r>
+            <w:proofErr w:type="gramStart"/>
+            <w:r>
+              <w:t>suite</w:t>
+            </w:r>
+            <w:proofErr w:type="gramEnd"/>
+            <w:r>
+              <w:t xml:space="preserve"> also can be downloaded via https://portal.office.com - free to Holmesglen students</w:t>
             </w:r>
           </w:p>
           <w:p>
@@ -3101,8 +3193,13 @@
               <w:pStyle w:val="BodyContentIndent1"/>
             </w:pPr>
             <w:r>
-              <w:t>•      Unity - https://unity.com/ - student license free to donwload</w:t>
-            </w:r>
+              <w:t xml:space="preserve">•      Unity - https://unity.com/ - student license free to </w:t>
+            </w:r>
+            <w:proofErr w:type="spellStart"/>
+            <w:r>
+              <w:t>donwload</w:t>
+            </w:r>
+            <w:proofErr w:type="spellEnd"/>
           </w:p>
           <w:p>
             <w:pPr>
@@ -3133,7 +3230,15 @@
               <w:pStyle w:val="BodyContentIndent1"/>
             </w:pPr>
             <w:r>
-              <w:t>•      ZBrush – https://pixologic.com/</w:t>
+              <w:t xml:space="preserve">•      </w:t>
+            </w:r>
+            <w:proofErr w:type="spellStart"/>
+            <w:r>
+              <w:t>ZBrush</w:t>
+            </w:r>
+            <w:proofErr w:type="spellEnd"/>
+            <w:r>
+              <w:t xml:space="preserve"> – https://pixologic.com/</w:t>
             </w:r>
           </w:p>
           <w:p>
@@ -3213,6 +3318,7 @@
           <w:p>
             <w:pPr>
               <w:pStyle w:val="Heading3"/>
+              <w:outlineLvl w:val="2"/>
             </w:pPr>
             <w:r>
               <w:t>Section E</w:t>
@@ -3393,7 +3499,23 @@
                 <w:rStyle w:val="Strong"/>
                 <w:lang w:val="fr-FR"/>
               </w:rPr>
-              <w:t xml:space="preserve">Unit code: </w:t>
+              <w:t xml:space="preserve">Unit </w:t>
+            </w:r>
+            <w:proofErr w:type="gramStart"/>
+            <w:r>
+              <w:rPr>
+                <w:rStyle w:val="Strong"/>
+                <w:lang w:val="fr-FR"/>
+              </w:rPr>
+              <w:t>code:</w:t>
+            </w:r>
+            <w:proofErr w:type="gramEnd"/>
+            <w:r>
+              <w:rPr>
+                <w:rStyle w:val="Strong"/>
+                <w:lang w:val="fr-FR"/>
+              </w:rPr>
+              <w:t xml:space="preserve"> </w:t>
             </w:r>
           </w:p>
           <w:p>
@@ -5820,6 +5942,8 @@
               </w:rPr>
               <w:t>The repository structure should be well-organized, clear, and easy to understand.</w:t>
             </w:r>
+            <w:bookmarkStart w:id="0" w:name="_GoBack"/>
+            <w:bookmarkEnd w:id="0"/>
           </w:p>
           <w:p>
             <w:pPr>
@@ -5842,6 +5966,7 @@
               </w:rPr>
               <w:t xml:space="preserve">Use a </w:t>
             </w:r>
+            <w:proofErr w:type="gramStart"/>
             <w:r>
               <w:rPr>
                 <w:b w:val="0"/>
@@ -5858,8 +5983,21 @@
                 <w:iCs w:val="0"/>
                 <w:lang w:val="en-US"/>
               </w:rPr>
-              <w:t>.gitignore</w:t>
-            </w:r>
+              <w:t>.</w:t>
+            </w:r>
+            <w:proofErr w:type="spellStart"/>
+            <w:r>
+              <w:rPr>
+                <w:b w:val="0"/>
+                <w:bCs/>
+                <w:i/>
+                <w:iCs w:val="0"/>
+                <w:lang w:val="en-US"/>
+              </w:rPr>
+              <w:t>gitignore</w:t>
+            </w:r>
+            <w:proofErr w:type="spellEnd"/>
+            <w:proofErr w:type="gramEnd"/>
             <w:r>
               <w:rPr>
                 <w:b w:val="0"/>
@@ -6280,6 +6418,293 @@
           </w:p>
           <w:p>
             <w:pPr>
+              <w:pStyle w:val="Answer"/>
+              <w:rPr>
+                <w:b w:val="0"/>
+              </w:rPr>
+            </w:pPr>
+            <w:r>
+              <w:rPr>
+                <w:b w:val="0"/>
+              </w:rPr>
+              <w:t xml:space="preserve">1. Use </w:t>
+            </w:r>
+            <w:r>
+              <w:rPr>
+                <w:b w:val="0"/>
+              </w:rPr>
+              <w:t xml:space="preserve">a </w:t>
+            </w:r>
+            <w:r>
+              <w:rPr>
+                <w:b w:val="0"/>
+              </w:rPr>
+              <w:t xml:space="preserve">Distributed version control system </w:t>
+            </w:r>
+            <w:r>
+              <w:rPr>
+                <w:b w:val="0"/>
+              </w:rPr>
+              <w:t>such as Git, GitHub, GitLab.</w:t>
+            </w:r>
+          </w:p>
+          <w:p>
+            <w:pPr>
+              <w:pStyle w:val="Answer"/>
+              <w:rPr>
+                <w:b w:val="0"/>
+              </w:rPr>
+            </w:pPr>
+            <w:r>
+              <w:rPr>
+                <w:b w:val="0"/>
+              </w:rPr>
+              <w:t>- Each developer has complete copy of the repository.</w:t>
+            </w:r>
+          </w:p>
+          <w:p>
+            <w:pPr>
+              <w:pStyle w:val="Answer"/>
+              <w:rPr>
+                <w:b w:val="0"/>
+              </w:rPr>
+            </w:pPr>
+            <w:r>
+              <w:rPr>
+                <w:b w:val="0"/>
+              </w:rPr>
+              <w:t>- It allows offline work and improves the ability collaborate and restore data.</w:t>
+            </w:r>
+          </w:p>
+          <w:p>
+            <w:pPr>
+              <w:pStyle w:val="QuestionLearnerResponse"/>
+            </w:pPr>
+            <w:r>
+              <w:t>2. Branching strategy.</w:t>
+            </w:r>
+          </w:p>
+          <w:p>
+            <w:pPr>
+              <w:pStyle w:val="QuestionLearnerResponse"/>
+            </w:pPr>
+            <w:r>
+              <w:t xml:space="preserve">- </w:t>
+            </w:r>
+            <w:r>
+              <w:t>Create a branch for each new feature or bug fix, and ensure the work is done on a single branch.</w:t>
+            </w:r>
+          </w:p>
+          <w:p>
+            <w:pPr>
+              <w:pStyle w:val="QuestionLearnerResponse"/>
+            </w:pPr>
+            <w:r>
+              <w:t xml:space="preserve">- </w:t>
+            </w:r>
+            <w:r>
+              <w:t>Branch names should be clear and meaningful.</w:t>
+            </w:r>
+          </w:p>
+          <w:p>
+            <w:pPr>
+              <w:pStyle w:val="QuestionLearnerResponse"/>
+            </w:pPr>
+            <w:r>
+              <w:t xml:space="preserve">3. </w:t>
+            </w:r>
+            <w:r>
+              <w:t>Commit Practices</w:t>
+            </w:r>
+          </w:p>
+          <w:p>
+            <w:pPr>
+              <w:pStyle w:val="QuestionLearnerResponse"/>
+            </w:pPr>
+            <w:r>
+              <w:t xml:space="preserve">- </w:t>
+            </w:r>
+            <w:r>
+              <w:t>Commit code frequently to track development progress.</w:t>
+            </w:r>
+          </w:p>
+          <w:p>
+            <w:pPr>
+              <w:pStyle w:val="QuestionLearnerResponse"/>
+            </w:pPr>
+            <w:r>
+              <w:t xml:space="preserve">- </w:t>
+            </w:r>
+            <w:r>
+              <w:t>Commit messages should be clear and meaningful, explaining the changes made.</w:t>
+            </w:r>
+          </w:p>
+          <w:p>
+            <w:pPr>
+              <w:pStyle w:val="QuestionLearnerResponse"/>
+            </w:pPr>
+            <w:r>
+              <w:t>4. Code Reviews</w:t>
+            </w:r>
+            <w:r>
+              <w:t>.</w:t>
+            </w:r>
+          </w:p>
+          <w:p>
+            <w:pPr>
+              <w:pStyle w:val="QuestionLearnerResponse"/>
+            </w:pPr>
+            <w:r>
+              <w:t>Use pull requests to facilitate code reviews before merging changes into the main branch.</w:t>
+            </w:r>
+          </w:p>
+          <w:p>
+            <w:pPr>
+              <w:pStyle w:val="QuestionLearnerResponse"/>
+            </w:pPr>
+            <w:r>
+              <w:t>Automated Testing: Integrate automated testing to catch issues early in the development process.</w:t>
+            </w:r>
+          </w:p>
+          <w:p>
+            <w:pPr>
+              <w:pStyle w:val="QuestionLearnerResponse"/>
+            </w:pPr>
+          </w:p>
+          <w:p>
+            <w:pPr>
+              <w:pStyle w:val="QuestionLearnerResponse"/>
+            </w:pPr>
+            <w:r>
+              <w:t>5. Documentation</w:t>
+            </w:r>
+          </w:p>
+          <w:p>
+            <w:pPr>
+              <w:pStyle w:val="QuestionLearnerResponse"/>
+            </w:pPr>
+            <w:r>
+              <w:t>README Files: Maintain a comprehensive README file that explains the project's purpose, setup instructions, and usage guidelines.</w:t>
+            </w:r>
+          </w:p>
+          <w:p>
+            <w:pPr>
+              <w:pStyle w:val="QuestionLearnerResponse"/>
+            </w:pPr>
+          </w:p>
+          <w:p>
+            <w:pPr>
+              <w:pStyle w:val="QuestionLearnerResponse"/>
+            </w:pPr>
+            <w:r>
+              <w:t>Documentation of Processes: Document the version control workflow and guidelines for contributing to the repository.</w:t>
+            </w:r>
+          </w:p>
+          <w:p>
+            <w:pPr>
+              <w:pStyle w:val="QuestionLearnerResponse"/>
+            </w:pPr>
+          </w:p>
+          <w:p>
+            <w:pPr>
+              <w:pStyle w:val="QuestionLearnerResponse"/>
+            </w:pPr>
+            <w:r>
+              <w:t>6. Backup and Recovery</w:t>
+            </w:r>
+          </w:p>
+          <w:p>
+            <w:pPr>
+              <w:pStyle w:val="QuestionLearnerResponse"/>
+            </w:pPr>
+            <w:r>
+              <w:t>Regular Backups: Regularly back up repositories to avoid data loss.</w:t>
+            </w:r>
+          </w:p>
+          <w:p>
+            <w:pPr>
+              <w:pStyle w:val="QuestionLearnerResponse"/>
+            </w:pPr>
+          </w:p>
+          <w:p>
+            <w:pPr>
+              <w:pStyle w:val="QuestionLearnerResponse"/>
+            </w:pPr>
+            <w:r>
+              <w:t>Disaster Recovery Plan: Have a plan in place for recovering from data loss or corruption.</w:t>
+            </w:r>
+          </w:p>
+          <w:p>
+            <w:pPr>
+              <w:pStyle w:val="QuestionLearnerResponse"/>
+            </w:pPr>
+          </w:p>
+          <w:p>
+            <w:pPr>
+              <w:pStyle w:val="QuestionLearnerResponse"/>
+            </w:pPr>
+            <w:r>
+              <w:t>7. Access Control</w:t>
+            </w:r>
+          </w:p>
+          <w:p>
+            <w:pPr>
+              <w:pStyle w:val="QuestionLearnerResponse"/>
+            </w:pPr>
+            <w:r>
+              <w:t>Permissions: Set up proper access controls to ensure only authorized contributors can make changes to the repository.</w:t>
+            </w:r>
+          </w:p>
+          <w:p>
+            <w:pPr>
+              <w:pStyle w:val="QuestionLearnerResponse"/>
+            </w:pPr>
+          </w:p>
+          <w:p>
+            <w:pPr>
+              <w:pStyle w:val="QuestionLearnerResponse"/>
+            </w:pPr>
+            <w:r>
+              <w:lastRenderedPageBreak/>
+              <w:t>Audit Logs: Maintain logs of who made changes and when.</w:t>
+            </w:r>
+          </w:p>
+          <w:p>
+            <w:pPr>
+              <w:pStyle w:val="QuestionLearnerResponse"/>
+            </w:pPr>
+          </w:p>
+          <w:p>
+            <w:pPr>
+              <w:pStyle w:val="QuestionLearnerResponse"/>
+            </w:pPr>
+            <w:r>
+              <w:t>8. Consistent Workflow</w:t>
+            </w:r>
+          </w:p>
+          <w:p>
+            <w:pPr>
+              <w:pStyle w:val="QuestionLearnerResponse"/>
+            </w:pPr>
+            <w:r>
+              <w:t>Defined Processes: Establish and follow a consistent workflow for branching, merging, and releasing code.</w:t>
+            </w:r>
+          </w:p>
+          <w:p>
+            <w:pPr>
+              <w:pStyle w:val="QuestionLearnerResponse"/>
+            </w:pPr>
+          </w:p>
+          <w:p>
+            <w:pPr>
+              <w:pStyle w:val="QuestionLearnerResponse"/>
+            </w:pPr>
+            <w:r>
+              <w:t>Agile Practices: Incorporate agile practices, such as iterative development and continuous integration.</w:t>
+            </w:r>
+          </w:p>
+          <w:p>
+            <w:pPr>
               <w:pStyle w:val="QuestionLearnerResponse"/>
             </w:pPr>
           </w:p>
@@ -6296,6 +6721,7 @@
               <w:pStyle w:val="Answer"/>
             </w:pPr>
             <w:r>
+              <w:lastRenderedPageBreak/>
               <w:t>Comment:</w:t>
             </w:r>
           </w:p>
@@ -7223,7 +7649,6 @@
                       <w:rFonts w:cs="Arial"/>
                       <w:color w:val="000000"/>
                     </w:rPr>
-                    <w:lastRenderedPageBreak/>
                     <w:t>Set colour using RGB values and HEX values</w:t>
                   </w:r>
                 </w:p>
@@ -7273,7 +7698,6 @@
               <w:pStyle w:val="Answer"/>
             </w:pPr>
             <w:r>
-              <w:lastRenderedPageBreak/>
               <w:t>Comment:</w:t>
             </w:r>
           </w:p>
@@ -7316,6 +7740,7 @@
               <w:rPr>
                 <w:color w:val="FEFFFF" w:themeColor="background1"/>
               </w:rPr>
+              <w:lastRenderedPageBreak/>
               <w:t xml:space="preserve">Question </w:t>
             </w:r>
             <w:r>
@@ -8483,7 +8908,6 @@
               <w:rPr>
                 <w:color w:val="FEFFFF" w:themeColor="background1"/>
               </w:rPr>
-              <w:lastRenderedPageBreak/>
               <w:t xml:space="preserve">Question </w:t>
             </w:r>
             <w:r>
@@ -8820,6 +9244,7 @@
               <w:pStyle w:val="Answer"/>
             </w:pPr>
             <w:r>
+              <w:lastRenderedPageBreak/>
               <w:t>Comment:</w:t>
             </w:r>
           </w:p>
@@ -9887,7 +10312,6 @@
                       <w:bCs/>
                       <w:color w:val="000000"/>
                     </w:rPr>
-                    <w:lastRenderedPageBreak/>
                     <w:t>Language</w:t>
                   </w:r>
                 </w:p>
@@ -10115,7 +10539,6 @@
               <w:pStyle w:val="Answer"/>
             </w:pPr>
             <w:r>
-              <w:lastRenderedPageBreak/>
               <w:t>Comment:</w:t>
             </w:r>
           </w:p>
@@ -10158,6 +10581,7 @@
               <w:rPr>
                 <w:color w:val="FEFFFF" w:themeColor="background1"/>
               </w:rPr>
+              <w:lastRenderedPageBreak/>
               <w:t xml:space="preserve">Question </w:t>
             </w:r>
             <w:r>
@@ -11474,7 +11898,6 @@
               <w:rPr>
                 <w:color w:val="FEFFFF" w:themeColor="background1"/>
               </w:rPr>
-              <w:lastRenderedPageBreak/>
               <w:t xml:space="preserve">Question </w:t>
             </w:r>
             <w:r>
@@ -11884,6 +12307,7 @@
                       <w:rFonts w:cs="Arial"/>
                       <w:color w:val="000000"/>
                     </w:rPr>
+                    <w:lastRenderedPageBreak/>
                     <w:t>Using data structures</w:t>
                   </w:r>
                 </w:p>
@@ -11933,6 +12357,7 @@
               <w:pStyle w:val="Answer"/>
             </w:pPr>
             <w:r>
+              <w:lastRenderedPageBreak/>
               <w:t>Comment:</w:t>
             </w:r>
           </w:p>
@@ -12948,7 +13373,6 @@
               <w:jc w:val="center"/>
             </w:pPr>
             <w:r>
-              <w:lastRenderedPageBreak/>
               <w:t xml:space="preserve">Yes </w:t>
             </w:r>
             <w:sdt>
@@ -13076,6 +13500,7 @@
               <w:pStyle w:val="QuestionLearnerResponse"/>
             </w:pPr>
             <w:r>
+              <w:lastRenderedPageBreak/>
               <w:t>Variables:</w:t>
             </w:r>
           </w:p>
@@ -13097,6 +13522,7 @@
               <w:pStyle w:val="Answer"/>
             </w:pPr>
             <w:r>
+              <w:lastRenderedPageBreak/>
               <w:t>Comment:</w:t>
             </w:r>
           </w:p>
@@ -14057,6 +14483,7 @@
           <w:p>
             <w:pPr>
               <w:pStyle w:val="Heading4"/>
+              <w:outlineLvl w:val="3"/>
             </w:pPr>
             <w:r>
               <w:t>Criteria for assessment</w:t>
@@ -14071,6 +14498,7 @@
             <w:pPr>
               <w:pStyle w:val="Heading4"/>
               <w:spacing w:after="40"/>
+              <w:outlineLvl w:val="3"/>
             </w:pPr>
             <w:r>
               <w:t>Satisfactory</w:t>
@@ -14079,6 +14507,7 @@
           <w:p>
             <w:pPr>
               <w:pStyle w:val="Heading4"/>
+              <w:outlineLvl w:val="3"/>
             </w:pPr>
             <w:r>
               <w:t>Yes</w:t>
@@ -14096,6 +14525,7 @@
           <w:p>
             <w:pPr>
               <w:pStyle w:val="Heading4"/>
+              <w:outlineLvl w:val="3"/>
             </w:pPr>
             <w:r>
               <w:t>Comment</w:t>
@@ -14645,6 +15075,7 @@
               <w:ind w:left="567" w:hanging="567"/>
             </w:pPr>
             <w:r>
+              <w:lastRenderedPageBreak/>
               <w:t>1.3 Learner has inserted the required numbers into the array and kept the array in ascending order</w:t>
             </w:r>
           </w:p>
@@ -16810,7 +17241,15 @@
               <w:ind w:left="567" w:hanging="567"/>
             </w:pPr>
             <w:r>
-              <w:t>3.2 Learner has used length and charAt to get the required information</w:t>
+              <w:t xml:space="preserve">3.2 Learner has used length and </w:t>
+            </w:r>
+            <w:proofErr w:type="spellStart"/>
+            <w:r>
+              <w:t>charAt</w:t>
+            </w:r>
+            <w:proofErr w:type="spellEnd"/>
+            <w:r>
+              <w:t xml:space="preserve"> to get the required information</w:t>
             </w:r>
           </w:p>
         </w:tc>
@@ -17050,8 +17489,21 @@
               <w:ind w:left="567" w:hanging="567"/>
             </w:pPr>
             <w:r>
-              <w:t>3.4 Learner has used toUpperCase and toLowerCase</w:t>
-            </w:r>
+              <w:t xml:space="preserve">3.4 Learner has used </w:t>
+            </w:r>
+            <w:proofErr w:type="spellStart"/>
+            <w:r>
+              <w:t>toUpperCase</w:t>
+            </w:r>
+            <w:proofErr w:type="spellEnd"/>
+            <w:r>
+              <w:t xml:space="preserve"> and </w:t>
+            </w:r>
+            <w:proofErr w:type="spellStart"/>
+            <w:r>
+              <w:t>toLowerCase</w:t>
+            </w:r>
+            <w:proofErr w:type="spellEnd"/>
           </w:p>
         </w:tc>
         <w:tc>
@@ -17170,7 +17622,15 @@
               <w:ind w:left="567" w:hanging="567"/>
             </w:pPr>
             <w:r>
-              <w:t>3.5 Learner has used concat, trim, replace and split as required</w:t>
+              <w:t xml:space="preserve">3.5 Learner has used </w:t>
+            </w:r>
+            <w:proofErr w:type="spellStart"/>
+            <w:r>
+              <w:t>concat</w:t>
+            </w:r>
+            <w:proofErr w:type="spellEnd"/>
+            <w:r>
+              <w:t>, trim, replace and split as required</w:t>
             </w:r>
           </w:p>
         </w:tc>
@@ -17530,7 +17990,6 @@
               <w:ind w:left="567" w:hanging="567"/>
             </w:pPr>
             <w:r>
-              <w:lastRenderedPageBreak/>
               <w:t>3.8 Learner has read text from a text file</w:t>
             </w:r>
           </w:p>
@@ -18137,6 +18596,7 @@
               <w:ind w:left="567" w:hanging="567"/>
             </w:pPr>
             <w:r>
+              <w:lastRenderedPageBreak/>
               <w:t>4.3 Learner has sorted the array by Movie ID</w:t>
             </w:r>
           </w:p>
@@ -18257,7 +18717,15 @@
               <w:ind w:left="567" w:hanging="567"/>
             </w:pPr>
             <w:r>
-              <w:t>4.4 Learner has implement either sequential or binary search algorithm</w:t>
+              <w:t xml:space="preserve">4.4 Learner has </w:t>
+            </w:r>
+            <w:proofErr w:type="gramStart"/>
+            <w:r>
+              <w:t>implement</w:t>
+            </w:r>
+            <w:proofErr w:type="gramEnd"/>
+            <w:r>
+              <w:t xml:space="preserve"> either sequential or binary search algorithm</w:t>
             </w:r>
           </w:p>
         </w:tc>
@@ -18743,7 +19211,15 @@
               <w:ind w:left="567" w:hanging="567"/>
             </w:pPr>
             <w:r>
-              <w:t>5.3 Learner has listed the HTML guidelines the are following and described them</w:t>
+              <w:t xml:space="preserve">5.3 Learner has listed the HTML guidelines </w:t>
+            </w:r>
+            <w:proofErr w:type="spellStart"/>
+            <w:r>
+              <w:t>the</w:t>
+            </w:r>
+            <w:proofErr w:type="spellEnd"/>
+            <w:r>
+              <w:t xml:space="preserve"> are following and described them</w:t>
             </w:r>
           </w:p>
         </w:tc>
@@ -20428,7 +20904,6 @@
               <w:ind w:left="567" w:hanging="567"/>
             </w:pPr>
             <w:r>
-              <w:lastRenderedPageBreak/>
               <w:t>6.1 Learner has created the GitHub account and communicated any difficulties or disruptions while completing this task</w:t>
             </w:r>
           </w:p>
@@ -20668,6 +21143,7 @@
               <w:ind w:left="567" w:hanging="567"/>
             </w:pPr>
             <w:r>
+              <w:lastRenderedPageBreak/>
               <w:t>6.3 The Learner has received and recorded feedback from the teacher about their page.</w:t>
             </w:r>
           </w:p>
@@ -21153,6 +21629,7 @@
           <w:p>
             <w:pPr>
               <w:pStyle w:val="Heading3"/>
+              <w:outlineLvl w:val="2"/>
             </w:pPr>
             <w:r>
               <w:t>Section F – Feedback to Learner</w:t>
@@ -21586,6 +22063,7 @@
           <w:p>
             <w:pPr>
               <w:pStyle w:val="Heading3"/>
+              <w:outlineLvl w:val="2"/>
             </w:pPr>
             <w:r>
               <w:t>Learner acknowledgement:</w:t>
@@ -21875,7 +22353,15 @@
               </w:numPr>
             </w:pPr>
             <w:r>
-              <w:t>Create a JavaScript function called “sequentialSearch”</w:t>
+              <w:t>Create a JavaScript function called “</w:t>
+            </w:r>
+            <w:proofErr w:type="spellStart"/>
+            <w:r>
+              <w:t>sequentialSearch</w:t>
+            </w:r>
+            <w:proofErr w:type="spellEnd"/>
+            <w:r>
+              <w:t>”</w:t>
             </w:r>
           </w:p>
           <w:p>
@@ -21930,7 +22416,15 @@
               </w:numPr>
             </w:pPr>
             <w:r>
-              <w:t>Create a JavaScript function called “binarySearch”</w:t>
+              <w:t>Create a JavaScript function called “</w:t>
+            </w:r>
+            <w:proofErr w:type="spellStart"/>
+            <w:r>
+              <w:t>binarySearch</w:t>
+            </w:r>
+            <w:proofErr w:type="spellEnd"/>
+            <w:r>
+              <w:t>”</w:t>
             </w:r>
           </w:p>
           <w:p>
@@ -22251,7 +22745,23 @@
               </w:numPr>
             </w:pPr>
             <w:r>
-              <w:t>The test case shall have a full coverage of function “sequentialSearch” and “binarySearch”</w:t>
+              <w:t>The test case shall have a full coverage of function “</w:t>
+            </w:r>
+            <w:proofErr w:type="spellStart"/>
+            <w:r>
+              <w:t>sequentialSearch</w:t>
+            </w:r>
+            <w:proofErr w:type="spellEnd"/>
+            <w:r>
+              <w:t>” and “</w:t>
+            </w:r>
+            <w:proofErr w:type="spellStart"/>
+            <w:r>
+              <w:t>binarySearch</w:t>
+            </w:r>
+            <w:proofErr w:type="spellEnd"/>
+            <w:r>
+              <w:t>”</w:t>
             </w:r>
           </w:p>
           <w:p>
@@ -22417,7 +22927,7 @@
                 <w:bCs/>
               </w:rPr>
             </w:pPr>
-            <w:bookmarkStart w:id="0" w:name="_Hlk189033027"/>
+            <w:bookmarkStart w:id="1" w:name="_Hlk189033027"/>
             <w:r>
               <w:rPr>
                 <w:b/>
@@ -22429,7 +22939,7 @@
           </w:p>
         </w:tc>
       </w:tr>
-      <w:bookmarkEnd w:id="0"/>
+      <w:bookmarkEnd w:id="1"/>
       <w:tr>
         <w:tc>
           <w:tcPr>
@@ -22984,7 +23494,23 @@
                 <w:b/>
                 <w:bCs/>
               </w:rPr>
-              <w:t>Implement the function “seqentialSearch” as per part 5 of the task description</w:t>
+              <w:t>Implement the function “</w:t>
+            </w:r>
+            <w:proofErr w:type="spellStart"/>
+            <w:r>
+              <w:rPr>
+                <w:b/>
+                <w:bCs/>
+              </w:rPr>
+              <w:t>seqentialSearch</w:t>
+            </w:r>
+            <w:proofErr w:type="spellEnd"/>
+            <w:r>
+              <w:rPr>
+                <w:b/>
+                <w:bCs/>
+              </w:rPr>
+              <w:t>” as per part 5 of the task description</w:t>
             </w:r>
           </w:p>
           <w:p/>
@@ -22998,7 +23524,15 @@
           </w:tcPr>
           <w:p>
             <w:r>
-              <w:t>&lt;Insert a screenshot of the JavaScript code of the function “sequentialSearch”&gt;</w:t>
+              <w:t>&lt;Insert a screenshot of the JavaScript code of the function “</w:t>
+            </w:r>
+            <w:proofErr w:type="spellStart"/>
+            <w:r>
+              <w:t>sequentialSearch</w:t>
+            </w:r>
+            <w:proofErr w:type="spellEnd"/>
+            <w:r>
+              <w:t>”&gt;</w:t>
             </w:r>
           </w:p>
           <w:p/>
@@ -23117,6 +23651,7 @@
               </w:rPr>
               <w:t>“</w:t>
             </w:r>
+            <w:proofErr w:type="spellStart"/>
             <w:r>
               <w:rPr>
                 <w:b/>
@@ -23124,6 +23659,7 @@
               </w:rPr>
               <w:t>binarySearch</w:t>
             </w:r>
+            <w:proofErr w:type="spellEnd"/>
             <w:r>
               <w:rPr>
                 <w:b/>
@@ -23150,7 +23686,15 @@
           </w:tcPr>
           <w:p>
             <w:r>
-              <w:t>&lt;Insert a screenshot of the JavaScript code of the function “binarySearch”&gt;</w:t>
+              <w:t>&lt;Insert a screenshot of the JavaScript code of the function “</w:t>
+            </w:r>
+            <w:proofErr w:type="spellStart"/>
+            <w:r>
+              <w:t>binarySearch</w:t>
+            </w:r>
+            <w:proofErr w:type="spellEnd"/>
+            <w:r>
+              <w:t>”&gt;</w:t>
             </w:r>
           </w:p>
           <w:p/>
@@ -23240,7 +23784,39 @@
                 <w:b/>
                 <w:bCs/>
               </w:rPr>
-              <w:t>You are required to develop a test plan that covers the functions “sequentialSearch” and “binarySearch” The test plan should be in the submission for review.</w:t>
+              <w:t>You are required to develop a test plan that covers the functions “</w:t>
+            </w:r>
+            <w:proofErr w:type="spellStart"/>
+            <w:r>
+              <w:rPr>
+                <w:b/>
+                <w:bCs/>
+              </w:rPr>
+              <w:t>sequentialSearch</w:t>
+            </w:r>
+            <w:proofErr w:type="spellEnd"/>
+            <w:r>
+              <w:rPr>
+                <w:b/>
+                <w:bCs/>
+              </w:rPr>
+              <w:t>” and “</w:t>
+            </w:r>
+            <w:proofErr w:type="spellStart"/>
+            <w:r>
+              <w:rPr>
+                <w:b/>
+                <w:bCs/>
+              </w:rPr>
+              <w:t>binarySearch</w:t>
+            </w:r>
+            <w:proofErr w:type="spellEnd"/>
+            <w:r>
+              <w:rPr>
+                <w:b/>
+                <w:bCs/>
+              </w:rPr>
+              <w:t>” The test plan should be in the submission for review.</w:t>
             </w:r>
           </w:p>
         </w:tc>
@@ -23620,7 +24196,7 @@
             <w:tcW w:w="1555" w:type="dxa"/>
           </w:tcPr>
           <w:p>
-            <w:bookmarkStart w:id="1" w:name="_Hlk189033611"/>
+            <w:bookmarkStart w:id="2" w:name="_Hlk189033611"/>
             <w:r>
               <w:t>Branch name</w:t>
             </w:r>
@@ -23649,7 +24225,7 @@
           <w:p/>
         </w:tc>
       </w:tr>
-      <w:bookmarkEnd w:id="1"/>
+      <w:bookmarkEnd w:id="2"/>
     </w:tbl>
     <w:p/>
     <w:tbl>
@@ -23680,7 +24256,7 @@
                 <w:bCs/>
               </w:rPr>
             </w:pPr>
-            <w:bookmarkStart w:id="2" w:name="_Hlk189034118"/>
+            <w:bookmarkStart w:id="3" w:name="_Hlk189034118"/>
             <w:r>
               <w:rPr>
                 <w:b/>
@@ -23691,7 +24267,7 @@
           </w:p>
         </w:tc>
       </w:tr>
-      <w:bookmarkEnd w:id="2"/>
+      <w:bookmarkEnd w:id="3"/>
       <w:tr>
         <w:tc>
           <w:tcPr>
@@ -23743,7 +24319,15 @@
               <w:t xml:space="preserve"> </w:t>
             </w:r>
             <w:r>
-              <w:t xml:space="preserve">called “myMovie” </w:t>
+              <w:t>called “</w:t>
+            </w:r>
+            <w:proofErr w:type="spellStart"/>
+            <w:r>
+              <w:t>myMovie</w:t>
+            </w:r>
+            <w:proofErr w:type="spellEnd"/>
+            <w:r>
+              <w:t xml:space="preserve">” </w:t>
             </w:r>
             <w:r>
               <w:t xml:space="preserve">with the following </w:t>
@@ -23862,8 +24446,8 @@
                 <w:bCs/>
               </w:rPr>
             </w:pPr>
-            <w:bookmarkStart w:id="3" w:name="_Hlk189033504"/>
-            <w:bookmarkStart w:id="4" w:name="_Hlk189034715"/>
+            <w:bookmarkStart w:id="4" w:name="_Hlk189033504"/>
+            <w:bookmarkStart w:id="5" w:name="_Hlk189034715"/>
             <w:r>
               <w:rPr>
                 <w:b/>
@@ -23890,7 +24474,7 @@
           </w:p>
         </w:tc>
       </w:tr>
-      <w:bookmarkEnd w:id="3"/>
+      <w:bookmarkEnd w:id="4"/>
       <w:tr>
         <w:tc>
           <w:tcPr>
@@ -23961,8 +24545,8 @@
                 <w:bCs/>
               </w:rPr>
             </w:pPr>
-            <w:bookmarkStart w:id="5" w:name="_Hlk189034851"/>
-            <w:bookmarkEnd w:id="4"/>
+            <w:bookmarkStart w:id="6" w:name="_Hlk189034851"/>
+            <w:bookmarkEnd w:id="5"/>
             <w:r>
               <w:rPr>
                 <w:b/>
@@ -23975,7 +24559,23 @@
                 <w:b/>
                 <w:bCs/>
               </w:rPr>
-              <w:t>object called “myMovie”</w:t>
+              <w:t>object called “</w:t>
+            </w:r>
+            <w:proofErr w:type="spellStart"/>
+            <w:r>
+              <w:rPr>
+                <w:b/>
+                <w:bCs/>
+              </w:rPr>
+              <w:t>myMovie</w:t>
+            </w:r>
+            <w:proofErr w:type="spellEnd"/>
+            <w:r>
+              <w:rPr>
+                <w:b/>
+                <w:bCs/>
+              </w:rPr>
+              <w:t>”</w:t>
             </w:r>
             <w:r>
               <w:rPr>
@@ -24102,7 +24702,7 @@
           <w:p/>
         </w:tc>
       </w:tr>
-      <w:bookmarkEnd w:id="5"/>
+      <w:bookmarkEnd w:id="6"/>
       <w:tr>
         <w:tc>
           <w:tcPr>
@@ -24137,7 +24737,23 @@
                 <w:b/>
                 <w:bCs/>
               </w:rPr>
-              <w:t xml:space="preserve"> Add the following properties and data to the “myMovie” object:</w:t>
+              <w:t xml:space="preserve"> Add the following properties and data to the “</w:t>
+            </w:r>
+            <w:proofErr w:type="spellStart"/>
+            <w:r>
+              <w:rPr>
+                <w:b/>
+                <w:bCs/>
+              </w:rPr>
+              <w:t>myMovie</w:t>
+            </w:r>
+            <w:proofErr w:type="spellEnd"/>
+            <w:r>
+              <w:rPr>
+                <w:b/>
+                <w:bCs/>
+              </w:rPr>
+              <w:t>” object:</w:t>
             </w:r>
           </w:p>
           <w:p>
@@ -24442,7 +25058,7 @@
                 <w:bCs/>
               </w:rPr>
             </w:pPr>
-            <w:bookmarkStart w:id="6" w:name="_Hlk189035027"/>
+            <w:bookmarkStart w:id="7" w:name="_Hlk189035027"/>
             <w:r>
               <w:rPr>
                 <w:b/>
@@ -24469,7 +25085,23 @@
                 <w:b/>
                 <w:bCs/>
               </w:rPr>
-              <w:t>Remove the summary property from “myMovie”</w:t>
+              <w:t>Remove the summary property from “</w:t>
+            </w:r>
+            <w:proofErr w:type="spellStart"/>
+            <w:r>
+              <w:rPr>
+                <w:b/>
+                <w:bCs/>
+              </w:rPr>
+              <w:t>myMovie</w:t>
+            </w:r>
+            <w:proofErr w:type="spellEnd"/>
+            <w:r>
+              <w:rPr>
+                <w:b/>
+                <w:bCs/>
+              </w:rPr>
+              <w:t>”</w:t>
             </w:r>
             <w:r>
               <w:rPr>
@@ -24594,7 +25226,7 @@
           <w:p/>
         </w:tc>
       </w:tr>
-      <w:bookmarkEnd w:id="6"/>
+      <w:bookmarkEnd w:id="7"/>
       <w:tr>
         <w:tc>
           <w:tcPr>
@@ -24753,8 +25385,13 @@
               </w:numPr>
               <w:spacing w:after="160" w:line="259" w:lineRule="auto"/>
             </w:pPr>
-            <w:r>
-              <w:t>myString = “This is a string”</w:t>
+            <w:proofErr w:type="spellStart"/>
+            <w:r>
+              <w:t>myString</w:t>
+            </w:r>
+            <w:proofErr w:type="spellEnd"/>
+            <w:r>
+              <w:t xml:space="preserve"> = “This is a string”</w:t>
             </w:r>
           </w:p>
           <w:p>
@@ -24765,8 +25402,21 @@
               </w:numPr>
               <w:spacing w:after="160" w:line="259" w:lineRule="auto"/>
             </w:pPr>
-            <w:r>
-              <w:t>anotherString = “   Another string” (note there are 3 blank spaces at the beginning)</w:t>
+            <w:proofErr w:type="spellStart"/>
+            <w:r>
+              <w:t>anotherString</w:t>
+            </w:r>
+            <w:proofErr w:type="spellEnd"/>
+            <w:r>
+              <w:t xml:space="preserve"> = </w:t>
+            </w:r>
+            <w:proofErr w:type="gramStart"/>
+            <w:r>
+              <w:t xml:space="preserve">“  </w:t>
+            </w:r>
+            <w:proofErr w:type="gramEnd"/>
+            <w:r>
+              <w:t xml:space="preserve"> Another string” (note there are 3 blank spaces at the beginning)</w:t>
             </w:r>
           </w:p>
           <w:p>
@@ -24789,8 +25439,13 @@
               </w:numPr>
               <w:spacing w:after="160" w:line="259" w:lineRule="auto"/>
             </w:pPr>
-            <w:r>
-              <w:t>myName = your first name</w:t>
+            <w:proofErr w:type="spellStart"/>
+            <w:r>
+              <w:t>myName</w:t>
+            </w:r>
+            <w:proofErr w:type="spellEnd"/>
+            <w:r>
+              <w:t xml:space="preserve"> = your first name</w:t>
             </w:r>
           </w:p>
           <w:p>
@@ -24816,8 +25471,13 @@
               <w:spacing w:after="160" w:line="259" w:lineRule="auto"/>
             </w:pPr>
             <w:r>
-              <w:t>Find out the length of myString</w:t>
-            </w:r>
+              <w:t xml:space="preserve">Find out the length of </w:t>
+            </w:r>
+            <w:proofErr w:type="spellStart"/>
+            <w:r>
+              <w:t>myString</w:t>
+            </w:r>
+            <w:proofErr w:type="spellEnd"/>
           </w:p>
           <w:p>
             <w:pPr>
@@ -24829,8 +25489,13 @@
               <w:spacing w:after="160" w:line="259" w:lineRule="auto"/>
             </w:pPr>
             <w:r>
-              <w:t>Find out the first character of myString</w:t>
-            </w:r>
+              <w:t xml:space="preserve">Find out the first character of </w:t>
+            </w:r>
+            <w:proofErr w:type="spellStart"/>
+            <w:r>
+              <w:t>myString</w:t>
+            </w:r>
+            <w:proofErr w:type="spellEnd"/>
           </w:p>
           <w:p>
             <w:pPr>
@@ -24851,8 +25516,13 @@
               <w:t>th</w:t>
             </w:r>
             <w:r>
-              <w:t xml:space="preserve"> character of myString</w:t>
-            </w:r>
+              <w:t xml:space="preserve"> character of </w:t>
+            </w:r>
+            <w:proofErr w:type="spellStart"/>
+            <w:r>
+              <w:t>myString</w:t>
+            </w:r>
+            <w:proofErr w:type="spellEnd"/>
           </w:p>
           <w:p>
             <w:pPr>
@@ -24875,8 +25545,13 @@
               <w:spacing w:after="160" w:line="259" w:lineRule="auto"/>
             </w:pPr>
             <w:r>
-              <w:t>Slice “is a” from myString</w:t>
-            </w:r>
+              <w:t xml:space="preserve">Slice “is a” from </w:t>
+            </w:r>
+            <w:proofErr w:type="spellStart"/>
+            <w:r>
+              <w:t>myString</w:t>
+            </w:r>
+            <w:proofErr w:type="spellEnd"/>
           </w:p>
           <w:p>
             <w:pPr>
@@ -24887,8 +25562,13 @@
               <w:spacing w:after="160" w:line="259" w:lineRule="auto"/>
             </w:pPr>
             <w:r>
-              <w:t>Use substring to get “the” from anotherString</w:t>
-            </w:r>
+              <w:t xml:space="preserve">Use substring to get “the” from </w:t>
+            </w:r>
+            <w:proofErr w:type="spellStart"/>
+            <w:r>
+              <w:t>anotherString</w:t>
+            </w:r>
+            <w:proofErr w:type="spellEnd"/>
           </w:p>
           <w:p>
             <w:pPr>
@@ -24899,7 +25579,15 @@
               <w:spacing w:after="160" w:line="259" w:lineRule="auto"/>
             </w:pPr>
             <w:r>
-              <w:t>Change the case of the myName string</w:t>
+              <w:t xml:space="preserve">Change the case of the </w:t>
+            </w:r>
+            <w:proofErr w:type="spellStart"/>
+            <w:r>
+              <w:t>myName</w:t>
+            </w:r>
+            <w:proofErr w:type="spellEnd"/>
+            <w:r>
+              <w:t xml:space="preserve"> string</w:t>
             </w:r>
           </w:p>
           <w:p>
@@ -24911,7 +25599,15 @@
               <w:spacing w:after="160" w:line="259" w:lineRule="auto"/>
             </w:pPr>
             <w:r>
-              <w:t>Print out the myName string in all upper case</w:t>
+              <w:t xml:space="preserve">Print out the </w:t>
+            </w:r>
+            <w:proofErr w:type="spellStart"/>
+            <w:r>
+              <w:t>myName</w:t>
+            </w:r>
+            <w:proofErr w:type="spellEnd"/>
+            <w:r>
+              <w:t xml:space="preserve"> string in all upper case</w:t>
             </w:r>
           </w:p>
           <w:p>
@@ -24923,7 +25619,15 @@
               <w:spacing w:after="160" w:line="259" w:lineRule="auto"/>
             </w:pPr>
             <w:r>
-              <w:t>Print out the myName string in all lower case</w:t>
+              <w:t xml:space="preserve">Print out the </w:t>
+            </w:r>
+            <w:proofErr w:type="spellStart"/>
+            <w:r>
+              <w:t>myName</w:t>
+            </w:r>
+            <w:proofErr w:type="spellEnd"/>
+            <w:r>
+              <w:t xml:space="preserve"> string in all lower case</w:t>
             </w:r>
           </w:p>
           <w:p>
@@ -24940,7 +25644,15 @@
               <w:spacing w:after="160" w:line="259" w:lineRule="auto"/>
             </w:pPr>
             <w:r>
-              <w:t xml:space="preserve">Use concat, trim, replace and split to create new strings </w:t>
+              <w:t xml:space="preserve">Use </w:t>
+            </w:r>
+            <w:proofErr w:type="spellStart"/>
+            <w:r>
+              <w:t>concat</w:t>
+            </w:r>
+            <w:proofErr w:type="spellEnd"/>
+            <w:r>
+              <w:t xml:space="preserve">, trim, replace and split to create new strings </w:t>
             </w:r>
           </w:p>
           <w:p>
@@ -24951,8 +25663,21 @@
               </w:numPr>
               <w:spacing w:after="160" w:line="259" w:lineRule="auto"/>
             </w:pPr>
-            <w:r>
-              <w:t>Concat hello and myName together</w:t>
+            <w:proofErr w:type="spellStart"/>
+            <w:r>
+              <w:t>Concat</w:t>
+            </w:r>
+            <w:proofErr w:type="spellEnd"/>
+            <w:r>
+              <w:t xml:space="preserve"> hello and </w:t>
+            </w:r>
+            <w:proofErr w:type="spellStart"/>
+            <w:r>
+              <w:t>myName</w:t>
+            </w:r>
+            <w:proofErr w:type="spellEnd"/>
+            <w:r>
+              <w:t xml:space="preserve"> together</w:t>
             </w:r>
           </w:p>
           <w:p>
@@ -24964,8 +25689,13 @@
               <w:spacing w:after="160" w:line="259" w:lineRule="auto"/>
             </w:pPr>
             <w:r>
-              <w:t>Use the trim function to remove the spaces in anotherString</w:t>
-            </w:r>
+              <w:t xml:space="preserve">Use the trim function to remove the spaces in </w:t>
+            </w:r>
+            <w:proofErr w:type="spellStart"/>
+            <w:r>
+              <w:t>anotherString</w:t>
+            </w:r>
+            <w:proofErr w:type="spellEnd"/>
           </w:p>
           <w:p>
             <w:pPr>
@@ -24976,8 +25706,13 @@
               <w:spacing w:after="160" w:line="259" w:lineRule="auto"/>
             </w:pPr>
             <w:r>
-              <w:t>Use the replace function to change “is a” to an empty space in myString</w:t>
-            </w:r>
+              <w:t xml:space="preserve">Use the replace function to change “is a” to an empty space in </w:t>
+            </w:r>
+            <w:proofErr w:type="spellStart"/>
+            <w:r>
+              <w:t>myString</w:t>
+            </w:r>
+            <w:proofErr w:type="spellEnd"/>
           </w:p>
           <w:p>
             <w:pPr>
@@ -24988,7 +25723,15 @@
               <w:spacing w:after="160" w:line="259" w:lineRule="auto"/>
             </w:pPr>
             <w:r>
-              <w:t>Split myString on the spaces.</w:t>
+              <w:t xml:space="preserve">Split </w:t>
+            </w:r>
+            <w:proofErr w:type="spellStart"/>
+            <w:r>
+              <w:t>myString</w:t>
+            </w:r>
+            <w:proofErr w:type="spellEnd"/>
+            <w:r>
+              <w:t xml:space="preserve"> on the spaces.</w:t>
             </w:r>
           </w:p>
           <w:p>
@@ -25000,7 +25743,7 @@
               </w:numPr>
               <w:spacing w:after="160" w:line="259" w:lineRule="auto"/>
             </w:pPr>
-            <w:bookmarkStart w:id="7" w:name="_Hlk189036656"/>
+            <w:bookmarkStart w:id="8" w:name="_Hlk189036656"/>
             <w:r>
               <w:t xml:space="preserve">Create algorithms </w:t>
             </w:r>
@@ -25031,7 +25774,7 @@
               <w:t>Create algorithm for reading in the text file</w:t>
             </w:r>
           </w:p>
-          <w:bookmarkEnd w:id="7"/>
+          <w:bookmarkEnd w:id="8"/>
           <w:p>
             <w:pPr>
               <w:pStyle w:val="ListParagraph"/>
@@ -25140,8 +25883,13 @@
               </w:numPr>
               <w:spacing w:after="160" w:line="259" w:lineRule="auto"/>
             </w:pPr>
-            <w:r>
-              <w:t>Prin the text that was read in, to the screen.</w:t>
+            <w:proofErr w:type="spellStart"/>
+            <w:r>
+              <w:t>Prin</w:t>
+            </w:r>
+            <w:proofErr w:type="spellEnd"/>
+            <w:r>
+              <w:t xml:space="preserve"> the text that was read in, to the screen.</w:t>
             </w:r>
           </w:p>
           <w:p>
@@ -25292,7 +26040,7 @@
                 <w:bCs/>
               </w:rPr>
             </w:pPr>
-            <w:bookmarkStart w:id="8" w:name="_Hlk189035121"/>
+            <w:bookmarkStart w:id="9" w:name="_Hlk189035121"/>
             <w:r>
               <w:rPr>
                 <w:b/>
@@ -25356,12 +26104,21 @@
                 <w:bCs/>
               </w:rPr>
             </w:pPr>
-            <w:r>
-              <w:rPr>
-                <w:b/>
-                <w:bCs/>
-              </w:rPr>
-              <w:t>myString = “This is a string”</w:t>
+            <w:proofErr w:type="spellStart"/>
+            <w:r>
+              <w:rPr>
+                <w:b/>
+                <w:bCs/>
+              </w:rPr>
+              <w:t>myString</w:t>
+            </w:r>
+            <w:proofErr w:type="spellEnd"/>
+            <w:r>
+              <w:rPr>
+                <w:b/>
+                <w:bCs/>
+              </w:rPr>
+              <w:t xml:space="preserve"> = “This is a string”</w:t>
             </w:r>
           </w:p>
           <w:p>
@@ -25377,12 +26134,37 @@
                 <w:bCs/>
               </w:rPr>
             </w:pPr>
-            <w:r>
-              <w:rPr>
-                <w:b/>
-                <w:bCs/>
-              </w:rPr>
-              <w:t>anotherString = “   Another string” (note there are 3 blank spaces at the beginning)</w:t>
+            <w:proofErr w:type="spellStart"/>
+            <w:r>
+              <w:rPr>
+                <w:b/>
+                <w:bCs/>
+              </w:rPr>
+              <w:t>anotherString</w:t>
+            </w:r>
+            <w:proofErr w:type="spellEnd"/>
+            <w:r>
+              <w:rPr>
+                <w:b/>
+                <w:bCs/>
+              </w:rPr>
+              <w:t xml:space="preserve"> = </w:t>
+            </w:r>
+            <w:proofErr w:type="gramStart"/>
+            <w:r>
+              <w:rPr>
+                <w:b/>
+                <w:bCs/>
+              </w:rPr>
+              <w:t xml:space="preserve">“  </w:t>
+            </w:r>
+            <w:proofErr w:type="gramEnd"/>
+            <w:r>
+              <w:rPr>
+                <w:b/>
+                <w:bCs/>
+              </w:rPr>
+              <w:t xml:space="preserve"> Another string” (note there are 3 blank spaces at the beginning)</w:t>
             </w:r>
           </w:p>
           <w:p>
@@ -25419,12 +26201,21 @@
                 <w:bCs/>
               </w:rPr>
             </w:pPr>
-            <w:r>
-              <w:rPr>
-                <w:b/>
-                <w:bCs/>
-              </w:rPr>
-              <w:t>myName = your first name</w:t>
+            <w:proofErr w:type="spellStart"/>
+            <w:r>
+              <w:rPr>
+                <w:b/>
+                <w:bCs/>
+              </w:rPr>
+              <w:t>myName</w:t>
+            </w:r>
+            <w:proofErr w:type="spellEnd"/>
+            <w:r>
+              <w:rPr>
+                <w:b/>
+                <w:bCs/>
+              </w:rPr>
+              <w:t xml:space="preserve"> = your first name</w:t>
             </w:r>
           </w:p>
         </w:tc>
@@ -25515,8 +26306,8 @@
                 <w:bCs/>
               </w:rPr>
             </w:pPr>
-            <w:bookmarkStart w:id="9" w:name="_Hlk189035303"/>
-            <w:bookmarkEnd w:id="8"/>
+            <w:bookmarkStart w:id="10" w:name="_Hlk189035303"/>
+            <w:bookmarkEnd w:id="9"/>
             <w:r>
               <w:rPr>
                 <w:b/>
@@ -25578,8 +26369,17 @@
                 <w:b/>
                 <w:bCs/>
               </w:rPr>
-              <w:t>Find out the length of myString</w:t>
-            </w:r>
+              <w:t xml:space="preserve">Find out the length of </w:t>
+            </w:r>
+            <w:proofErr w:type="spellStart"/>
+            <w:r>
+              <w:rPr>
+                <w:b/>
+                <w:bCs/>
+              </w:rPr>
+              <w:t>myString</w:t>
+            </w:r>
+            <w:proofErr w:type="spellEnd"/>
           </w:p>
           <w:p>
             <w:pPr>
@@ -25599,8 +26399,17 @@
                 <w:b/>
                 <w:bCs/>
               </w:rPr>
-              <w:t>Find out the first character of myString</w:t>
-            </w:r>
+              <w:t xml:space="preserve">Find out the first character of </w:t>
+            </w:r>
+            <w:proofErr w:type="spellStart"/>
+            <w:r>
+              <w:rPr>
+                <w:b/>
+                <w:bCs/>
+              </w:rPr>
+              <w:t>myString</w:t>
+            </w:r>
+            <w:proofErr w:type="spellEnd"/>
           </w:p>
           <w:p>
             <w:pPr>
@@ -25635,8 +26444,17 @@
                 <w:b/>
                 <w:bCs/>
               </w:rPr>
-              <w:t xml:space="preserve"> character of myString</w:t>
-            </w:r>
+              <w:t xml:space="preserve"> character of </w:t>
+            </w:r>
+            <w:proofErr w:type="spellStart"/>
+            <w:r>
+              <w:rPr>
+                <w:b/>
+                <w:bCs/>
+              </w:rPr>
+              <w:t>myString</w:t>
+            </w:r>
+            <w:proofErr w:type="spellEnd"/>
           </w:p>
         </w:tc>
       </w:tr>
@@ -25766,8 +26584,8 @@
                 <w:bCs/>
               </w:rPr>
             </w:pPr>
-            <w:bookmarkStart w:id="10" w:name="_Hlk189035552"/>
-            <w:bookmarkEnd w:id="9"/>
+            <w:bookmarkStart w:id="11" w:name="_Hlk189035552"/>
+            <w:bookmarkEnd w:id="10"/>
             <w:r>
               <w:rPr>
                 <w:b/>
@@ -25836,8 +26654,17 @@
                 <w:b/>
                 <w:bCs/>
               </w:rPr>
-              <w:t>Slice “is a” from myString</w:t>
-            </w:r>
+              <w:t xml:space="preserve">Slice “is a” from </w:t>
+            </w:r>
+            <w:proofErr w:type="spellStart"/>
+            <w:r>
+              <w:rPr>
+                <w:b/>
+                <w:bCs/>
+              </w:rPr>
+              <w:t>myString</w:t>
+            </w:r>
+            <w:proofErr w:type="spellEnd"/>
           </w:p>
           <w:p>
             <w:pPr>
@@ -25857,8 +26684,17 @@
                 <w:b/>
                 <w:bCs/>
               </w:rPr>
-              <w:t>Use substring to get “the” from “notherString</w:t>
-            </w:r>
+              <w:t>Use substring to get “the” from “</w:t>
+            </w:r>
+            <w:proofErr w:type="spellStart"/>
+            <w:r>
+              <w:rPr>
+                <w:b/>
+                <w:bCs/>
+              </w:rPr>
+              <w:t>notherString</w:t>
+            </w:r>
+            <w:proofErr w:type="spellEnd"/>
           </w:p>
         </w:tc>
       </w:tr>
@@ -25949,7 +26785,7 @@
           <w:p/>
         </w:tc>
       </w:tr>
-      <w:bookmarkEnd w:id="10"/>
+      <w:bookmarkEnd w:id="11"/>
       <w:tr>
         <w:tc>
           <w:tcPr>
@@ -26005,7 +26841,23 @@
                 <w:b/>
                 <w:bCs/>
               </w:rPr>
-              <w:t>Change the case of the myName string</w:t>
+              <w:t xml:space="preserve">Change the case of the </w:t>
+            </w:r>
+            <w:proofErr w:type="spellStart"/>
+            <w:r>
+              <w:rPr>
+                <w:b/>
+                <w:bCs/>
+              </w:rPr>
+              <w:t>myName</w:t>
+            </w:r>
+            <w:proofErr w:type="spellEnd"/>
+            <w:r>
+              <w:rPr>
+                <w:b/>
+                <w:bCs/>
+              </w:rPr>
+              <w:t xml:space="preserve"> string</w:t>
             </w:r>
           </w:p>
           <w:p>
@@ -26026,7 +26878,23 @@
                 <w:b/>
                 <w:bCs/>
               </w:rPr>
-              <w:t>Change myName string to upper case</w:t>
+              <w:t xml:space="preserve">Change </w:t>
+            </w:r>
+            <w:proofErr w:type="spellStart"/>
+            <w:r>
+              <w:rPr>
+                <w:b/>
+                <w:bCs/>
+              </w:rPr>
+              <w:t>myName</w:t>
+            </w:r>
+            <w:proofErr w:type="spellEnd"/>
+            <w:r>
+              <w:rPr>
+                <w:b/>
+                <w:bCs/>
+              </w:rPr>
+              <w:t xml:space="preserve"> string to upper case</w:t>
             </w:r>
           </w:p>
           <w:p>
@@ -26047,7 +26915,23 @@
                 <w:b/>
                 <w:bCs/>
               </w:rPr>
-              <w:t>Change myName string to lower case</w:t>
+              <w:t xml:space="preserve">Change </w:t>
+            </w:r>
+            <w:proofErr w:type="spellStart"/>
+            <w:r>
+              <w:rPr>
+                <w:b/>
+                <w:bCs/>
+              </w:rPr>
+              <w:t>myName</w:t>
+            </w:r>
+            <w:proofErr w:type="spellEnd"/>
+            <w:r>
+              <w:rPr>
+                <w:b/>
+                <w:bCs/>
+              </w:rPr>
+              <w:t xml:space="preserve"> string to lower case</w:t>
             </w:r>
           </w:p>
         </w:tc>
@@ -26068,7 +26952,15 @@
           <w:p/>
           <w:p>
             <w:r>
-              <w:t>&lt;Insert a screenshot of the console showing myName in upper case and in lower case&gt;</w:t>
+              <w:t xml:space="preserve">&lt;Insert a screenshot of the console showing </w:t>
+            </w:r>
+            <w:proofErr w:type="spellStart"/>
+            <w:r>
+              <w:t>myName</w:t>
+            </w:r>
+            <w:proofErr w:type="spellEnd"/>
+            <w:r>
+              <w:t xml:space="preserve"> in upper case and in lower case&gt;</w:t>
             </w:r>
           </w:p>
           <w:p/>
@@ -26200,7 +27092,39 @@
                 <w:b/>
                 <w:bCs/>
               </w:rPr>
-              <w:t>Use the concat method to join the hello string and myName string</w:t>
+              <w:t xml:space="preserve">Use the </w:t>
+            </w:r>
+            <w:proofErr w:type="spellStart"/>
+            <w:r>
+              <w:rPr>
+                <w:b/>
+                <w:bCs/>
+              </w:rPr>
+              <w:t>concat</w:t>
+            </w:r>
+            <w:proofErr w:type="spellEnd"/>
+            <w:r>
+              <w:rPr>
+                <w:b/>
+                <w:bCs/>
+              </w:rPr>
+              <w:t xml:space="preserve"> method to join the hello string and </w:t>
+            </w:r>
+            <w:proofErr w:type="spellStart"/>
+            <w:r>
+              <w:rPr>
+                <w:b/>
+                <w:bCs/>
+              </w:rPr>
+              <w:t>myName</w:t>
+            </w:r>
+            <w:proofErr w:type="spellEnd"/>
+            <w:r>
+              <w:rPr>
+                <w:b/>
+                <w:bCs/>
+              </w:rPr>
+              <w:t xml:space="preserve"> string</w:t>
             </w:r>
           </w:p>
           <w:p>
@@ -26221,8 +27145,17 @@
                 <w:b/>
                 <w:bCs/>
               </w:rPr>
-              <w:t>Use the trim method to remove the spaces in anotherString</w:t>
-            </w:r>
+              <w:t xml:space="preserve">Use the trim method to remove the spaces in </w:t>
+            </w:r>
+            <w:proofErr w:type="spellStart"/>
+            <w:r>
+              <w:rPr>
+                <w:b/>
+                <w:bCs/>
+              </w:rPr>
+              <w:t>anotherString</w:t>
+            </w:r>
+            <w:proofErr w:type="spellEnd"/>
           </w:p>
           <w:p>
             <w:pPr>
@@ -26242,8 +27175,17 @@
                 <w:b/>
                 <w:bCs/>
               </w:rPr>
-              <w:t>Use the replace method to change “is a” to an empty space in myString</w:t>
-            </w:r>
+              <w:t xml:space="preserve">Use the replace method to change “is a” to an empty space in </w:t>
+            </w:r>
+            <w:proofErr w:type="spellStart"/>
+            <w:r>
+              <w:rPr>
+                <w:b/>
+                <w:bCs/>
+              </w:rPr>
+              <w:t>myString</w:t>
+            </w:r>
+            <w:proofErr w:type="spellEnd"/>
           </w:p>
           <w:p>
             <w:pPr>
@@ -26263,7 +27205,23 @@
                 <w:b/>
                 <w:bCs/>
               </w:rPr>
-              <w:t>Use the split method on myString using the spaces to break the string</w:t>
+              <w:t xml:space="preserve">Use the split method on </w:t>
+            </w:r>
+            <w:proofErr w:type="spellStart"/>
+            <w:r>
+              <w:rPr>
+                <w:b/>
+                <w:bCs/>
+              </w:rPr>
+              <w:t>myString</w:t>
+            </w:r>
+            <w:proofErr w:type="spellEnd"/>
+            <w:r>
+              <w:rPr>
+                <w:b/>
+                <w:bCs/>
+              </w:rPr>
+              <w:t xml:space="preserve"> using the spaces to break the string</w:t>
             </w:r>
           </w:p>
         </w:tc>
@@ -26288,7 +27246,15 @@
           </w:p>
           <w:p>
             <w:r>
-              <w:t>&lt;concat&gt;</w:t>
+              <w:t>&lt;</w:t>
+            </w:r>
+            <w:proofErr w:type="spellStart"/>
+            <w:r>
+              <w:t>concat</w:t>
+            </w:r>
+            <w:proofErr w:type="spellEnd"/>
+            <w:r>
+              <w:t>&gt;</w:t>
             </w:r>
           </w:p>
           <w:p/>
@@ -26920,7 +27886,7 @@
             <w:tcW w:w="1555" w:type="dxa"/>
           </w:tcPr>
           <w:p>
-            <w:bookmarkStart w:id="11" w:name="_Hlk189048890"/>
+            <w:bookmarkStart w:id="12" w:name="_Hlk189048890"/>
             <w:r>
               <w:t>Branch name</w:t>
             </w:r>
@@ -26949,7 +27915,7 @@
           <w:p/>
         </w:tc>
       </w:tr>
-      <w:bookmarkEnd w:id="11"/>
+      <w:bookmarkEnd w:id="12"/>
     </w:tbl>
     <w:p/>
     <w:tbl>
@@ -27048,7 +28014,15 @@
           <w:p/>
           <w:p>
             <w:r>
-              <w:t>You will be required to create a GitHub repository for this part. As per the previous parts, branch names an commit numbers can be recorded in each question below.</w:t>
+              <w:t xml:space="preserve">You will be required to create a GitHub repository for this part. As per the previous parts, branch names </w:t>
+            </w:r>
+            <w:proofErr w:type="gramStart"/>
+            <w:r>
+              <w:t>an</w:t>
+            </w:r>
+            <w:proofErr w:type="gramEnd"/>
+            <w:r>
+              <w:t xml:space="preserve"> commit numbers can be recorded in each question below.</w:t>
             </w:r>
           </w:p>
           <w:p/>
@@ -28855,8 +29829,13 @@
                 <w:tab w:val="left" w:pos="510"/>
               </w:tabs>
             </w:pPr>
-            <w:r>
-              <w:t xml:space="preserve">Mockaroo: </w:t>
+            <w:proofErr w:type="spellStart"/>
+            <w:r>
+              <w:t>Mockaroo</w:t>
+            </w:r>
+            <w:proofErr w:type="spellEnd"/>
+            <w:r>
+              <w:t xml:space="preserve">: </w:t>
             </w:r>
             <w:hyperlink r:id="rId23" w:history="1">
               <w:r>
@@ -28932,7 +29911,15 @@
               </w:numPr>
             </w:pPr>
             <w:r>
-              <w:t>Wireframes in .png or .jpg format</w:t>
+              <w:t>Wireframes in .</w:t>
+            </w:r>
+            <w:proofErr w:type="spellStart"/>
+            <w:r>
+              <w:t>png</w:t>
+            </w:r>
+            <w:proofErr w:type="spellEnd"/>
+            <w:r>
+              <w:t xml:space="preserve"> or .jpg format</w:t>
             </w:r>
           </w:p>
           <w:p/>
@@ -29530,7 +30517,7 @@
                 <w:bCs/>
               </w:rPr>
             </w:pPr>
-            <w:bookmarkStart w:id="12" w:name="_Hlk189054098"/>
+            <w:bookmarkStart w:id="13" w:name="_Hlk189054098"/>
             <w:r>
               <w:rPr>
                 <w:b/>
@@ -29554,7 +30541,7 @@
             <w:vMerge w:val="restart"/>
           </w:tcPr>
           <w:p>
-            <w:bookmarkStart w:id="13" w:name="_Hlk189051323"/>
+            <w:bookmarkStart w:id="14" w:name="_Hlk189051323"/>
             <w:r>
               <w:rPr>
                 <w:b/>
@@ -29654,7 +30641,7 @@
           <w:p/>
         </w:tc>
       </w:tr>
-      <w:bookmarkEnd w:id="13"/>
+      <w:bookmarkEnd w:id="14"/>
       <w:tr>
         <w:trPr>
           <w:gridAfter w:val="1"/>
@@ -30200,13 +31187,31 @@
                 <w:szCs w:val="20"/>
               </w:rPr>
             </w:pPr>
+            <w:proofErr w:type="spellStart"/>
             <w:r>
               <w:rPr>
                 <w:i/>
                 <w:color w:val="7F7F7F" w:themeColor="text1" w:themeTint="80"/>
               </w:rPr>
-              <w:t>Amberle Seidl</w:t>
-            </w:r>
+              <w:t>Amberle</w:t>
+            </w:r>
+            <w:proofErr w:type="spellEnd"/>
+            <w:r>
+              <w:rPr>
+                <w:i/>
+                <w:color w:val="7F7F7F" w:themeColor="text1" w:themeTint="80"/>
+              </w:rPr>
+              <w:t xml:space="preserve"> </w:t>
+            </w:r>
+            <w:proofErr w:type="spellStart"/>
+            <w:r>
+              <w:rPr>
+                <w:i/>
+                <w:color w:val="7F7F7F" w:themeColor="text1" w:themeTint="80"/>
+              </w:rPr>
+              <w:t>Seidl</w:t>
+            </w:r>
+            <w:proofErr w:type="spellEnd"/>
           </w:p>
         </w:tc>
         <w:tc>
@@ -30338,7 +31343,7 @@
           </w:p>
         </w:tc>
       </w:tr>
-      <w:bookmarkEnd w:id="12"/>
+      <w:bookmarkEnd w:id="13"/>
       <w:tr>
         <w:trPr>
           <w:gridAfter w:val="1"/>
@@ -31344,13 +32349,31 @@
                 <w:bCs/>
               </w:rPr>
             </w:pPr>
+            <w:proofErr w:type="spellStart"/>
             <w:r>
               <w:rPr>
                 <w:i/>
                 <w:color w:val="7F7F7F" w:themeColor="text1" w:themeTint="80"/>
               </w:rPr>
-              <w:t>Amberle Seidl</w:t>
-            </w:r>
+              <w:t>Amberle</w:t>
+            </w:r>
+            <w:proofErr w:type="spellEnd"/>
+            <w:r>
+              <w:rPr>
+                <w:i/>
+                <w:color w:val="7F7F7F" w:themeColor="text1" w:themeTint="80"/>
+              </w:rPr>
+              <w:t xml:space="preserve"> </w:t>
+            </w:r>
+            <w:proofErr w:type="spellStart"/>
+            <w:r>
+              <w:rPr>
+                <w:i/>
+                <w:color w:val="7F7F7F" w:themeColor="text1" w:themeTint="80"/>
+              </w:rPr>
+              <w:t>Seidl</w:t>
+            </w:r>
+            <w:proofErr w:type="spellEnd"/>
           </w:p>
         </w:tc>
         <w:tc>
@@ -31902,7 +32925,15 @@
                 </w:p>
                 <w:p>
                   <w:r>
-                    <w:t>Action 2: list view area display all movies</w:t>
+                    <w:t xml:space="preserve">Action 2: list view area </w:t>
+                  </w:r>
+                  <w:proofErr w:type="gramStart"/>
+                  <w:r>
+                    <w:t>display</w:t>
+                  </w:r>
+                  <w:proofErr w:type="gramEnd"/>
+                  <w:r>
+                    <w:t xml:space="preserve"> all movies</w:t>
                   </w:r>
                 </w:p>
               </w:tc>
@@ -33468,13 +34499,31 @@
                 <w:szCs w:val="20"/>
               </w:rPr>
             </w:pPr>
+            <w:proofErr w:type="spellStart"/>
             <w:r>
               <w:rPr>
                 <w:i/>
                 <w:color w:val="7F7F7F" w:themeColor="text1" w:themeTint="80"/>
               </w:rPr>
-              <w:t>Amberle Seidl</w:t>
-            </w:r>
+              <w:t>Amberle</w:t>
+            </w:r>
+            <w:proofErr w:type="spellEnd"/>
+            <w:r>
+              <w:rPr>
+                <w:i/>
+                <w:color w:val="7F7F7F" w:themeColor="text1" w:themeTint="80"/>
+              </w:rPr>
+              <w:t xml:space="preserve"> </w:t>
+            </w:r>
+            <w:proofErr w:type="spellStart"/>
+            <w:r>
+              <w:rPr>
+                <w:i/>
+                <w:color w:val="7F7F7F" w:themeColor="text1" w:themeTint="80"/>
+              </w:rPr>
+              <w:t>Seidl</w:t>
+            </w:r>
+            <w:proofErr w:type="spellEnd"/>
           </w:p>
         </w:tc>
         <w:tc>
@@ -33725,7 +34774,15 @@
           <w:p/>
           <w:p>
             <w:r>
-              <w:t>Each grid in the home page links to the page of a team member. The link has been defined in the home page (e.g., /team/amberle/index.html), but the member’s page has not been created yet. You need to join the team to get your page created, tested locally and then merge your changes to the project.</w:t>
+              <w:t>Each grid in the home page links to the page of a team member. The link has been defined in the home page (e.g., /team/</w:t>
+            </w:r>
+            <w:proofErr w:type="spellStart"/>
+            <w:r>
+              <w:t>amberle</w:t>
+            </w:r>
+            <w:proofErr w:type="spellEnd"/>
+            <w:r>
+              <w:t>/index.html), but the member’s page has not been created yet. You need to join the team to get your page created, tested locally and then merge your changes to the project.</w:t>
             </w:r>
           </w:p>
           <w:p>
@@ -33737,7 +34794,31 @@
               <w:spacing w:after="160" w:line="259" w:lineRule="auto"/>
             </w:pPr>
             <w:r>
-              <w:t>Your teacher’s page (Amberle Seidl) has been created. Click on Amberle’s name to check the detail.</w:t>
+              <w:t>Your teacher’s page (</w:t>
+            </w:r>
+            <w:proofErr w:type="spellStart"/>
+            <w:r>
+              <w:t>Amberle</w:t>
+            </w:r>
+            <w:proofErr w:type="spellEnd"/>
+            <w:r>
+              <w:t xml:space="preserve"> </w:t>
+            </w:r>
+            <w:proofErr w:type="spellStart"/>
+            <w:r>
+              <w:t>Seidl</w:t>
+            </w:r>
+            <w:proofErr w:type="spellEnd"/>
+            <w:r>
+              <w:t xml:space="preserve">) has been created. Click on </w:t>
+            </w:r>
+            <w:proofErr w:type="spellStart"/>
+            <w:r>
+              <w:t>Amberle’s</w:t>
+            </w:r>
+            <w:proofErr w:type="spellEnd"/>
+            <w:r>
+              <w:t xml:space="preserve"> name to check the detail.</w:t>
             </w:r>
           </w:p>
           <w:p>
@@ -33771,7 +34852,15 @@
           </w:p>
           <w:p>
             <w:r>
-              <w:t>You shall create a sub-folder, the name of which is made of first name, under the “team” folder. In this folder, you shall create a file called “index.html”. Refer to Amberle’s page as an example.</w:t>
+              <w:t xml:space="preserve">You shall create a sub-folder, the name of which is made of first name, under the “team” folder. In this folder, you shall create a file called “index.html”. Refer to </w:t>
+            </w:r>
+            <w:proofErr w:type="spellStart"/>
+            <w:r>
+              <w:t>Amberle’s</w:t>
+            </w:r>
+            <w:proofErr w:type="spellEnd"/>
+            <w:r>
+              <w:t xml:space="preserve"> page as an example.</w:t>
             </w:r>
           </w:p>
           <w:p>
@@ -33942,13 +35031,41 @@
                 <w:rPr>
                   <w:rStyle w:val="Hyperlink"/>
                 </w:rPr>
-                <w:t>https://github.com/Amberside/the-programming-team-202510</w:t>
+                <w:t>https://github.com/Amb</w:t>
+              </w:r>
+              <w:r>
+                <w:rPr>
+                  <w:rStyle w:val="Hyperlink"/>
+                </w:rPr>
+                <w:t>e</w:t>
+              </w:r>
+              <w:r>
+                <w:rPr>
+                  <w:rStyle w:val="Hyperlink"/>
+                </w:rPr>
+                <w:t>rside/the-programming-team-202510</w:t>
               </w:r>
             </w:hyperlink>
           </w:p>
           <w:p>
             <w:r>
-              <w:t>Step 2. Click on Amberle’s name (the first grid) to view Amberle’s page (page can be viewed)</w:t>
+              <w:t xml:space="preserve">Step 2. Click on </w:t>
+            </w:r>
+            <w:proofErr w:type="spellStart"/>
+            <w:r>
+              <w:t>Amberle’s</w:t>
+            </w:r>
+            <w:proofErr w:type="spellEnd"/>
+            <w:r>
+              <w:t xml:space="preserve"> name (the first grid) to view </w:t>
+            </w:r>
+            <w:proofErr w:type="spellStart"/>
+            <w:r>
+              <w:t>Amberle’s</w:t>
+            </w:r>
+            <w:proofErr w:type="spellEnd"/>
+            <w:r>
+              <w:t xml:space="preserve"> page (page can be viewed)</w:t>
             </w:r>
           </w:p>
           <w:p>
@@ -34062,8 +35179,17 @@
                 <w:b/>
                 <w:bCs/>
               </w:rPr>
-              <w:t>5, Upload your pages and this document to Brightpspace</w:t>
-            </w:r>
+              <w:t xml:space="preserve">5, Upload your pages and this document to </w:t>
+            </w:r>
+            <w:proofErr w:type="spellStart"/>
+            <w:r>
+              <w:rPr>
+                <w:b/>
+                <w:bCs/>
+              </w:rPr>
+              <w:t>Brightpspace</w:t>
+            </w:r>
+            <w:proofErr w:type="spellEnd"/>
           </w:p>
           <w:p/>
         </w:tc>
@@ -34717,13 +35843,31 @@
                 <w:szCs w:val="20"/>
               </w:rPr>
             </w:pPr>
+            <w:proofErr w:type="spellStart"/>
             <w:r>
               <w:rPr>
                 <w:i/>
                 <w:color w:val="7F7F7F" w:themeColor="text1" w:themeTint="80"/>
               </w:rPr>
-              <w:t>Amberle Seidl</w:t>
-            </w:r>
+              <w:t>Amberle</w:t>
+            </w:r>
+            <w:proofErr w:type="spellEnd"/>
+            <w:r>
+              <w:rPr>
+                <w:i/>
+                <w:color w:val="7F7F7F" w:themeColor="text1" w:themeTint="80"/>
+              </w:rPr>
+              <w:t xml:space="preserve"> </w:t>
+            </w:r>
+            <w:proofErr w:type="spellStart"/>
+            <w:r>
+              <w:rPr>
+                <w:i/>
+                <w:color w:val="7F7F7F" w:themeColor="text1" w:themeTint="80"/>
+              </w:rPr>
+              <w:t>Seidl</w:t>
+            </w:r>
+            <w:proofErr w:type="spellEnd"/>
           </w:p>
         </w:tc>
         <w:tc>
@@ -34887,7 +36031,7 @@
 </file>
 
 <file path=word/endnotes.xml><?xml version="1.0" encoding="utf-8"?>
-<w:endnotes xmlns:wpc="http://schemas.microsoft.com/office/word/2010/wordprocessingCanvas" xmlns:cx="http://schemas.microsoft.com/office/drawing/2014/chartex" xmlns:cx1="http://schemas.microsoft.com/office/drawing/2015/9/8/chartex" xmlns:cx2="http://schemas.microsoft.com/office/drawing/2015/10/21/chartex" xmlns:cx3="http://schemas.microsoft.com/office/drawing/2016/5/9/chartex" xmlns:cx4="http://schemas.microsoft.com/office/drawing/2016/5/10/chartex" xmlns:cx5="http://schemas.microsoft.com/office/drawing/2016/5/11/chartex" xmlns:cx6="http://schemas.microsoft.com/office/drawing/2016/5/12/chartex" xmlns:cx7="http://schemas.microsoft.com/office/drawing/2016/5/13/chartex" xmlns:cx8="http://schemas.microsoft.com/office/drawing/2016/5/14/chartex" xmlns:mc="http://schemas.openxmlformats.org/markup-compatibility/2006" xmlns:aink="http://schemas.microsoft.com/office/drawing/2016/ink" xmlns:am3d="http://schemas.microsoft.com/office/drawing/2017/model3d" xmlns:o="urn:schemas-microsoft-com:office:office" xmlns:oel="http://schemas.microsoft.com/office/2019/extlst" xmlns:r="http://schemas.openxmlformats.org/officeDocument/2006/relationships" xmlns:m="http://schemas.openxmlformats.org/officeDocument/2006/math" xmlns:v="urn:schemas-microsoft-com:vml" xmlns:wp14="http://schemas.microsoft.com/office/word/2010/wordprocessingDrawing" xmlns:wp="http://schemas.openxmlformats.org/drawingml/2006/wordprocessingDrawing" xmlns:w10="urn:schemas-microsoft-com:office:word" xmlns:w="http://schemas.openxmlformats.org/wordprocessingml/2006/main" xmlns:w14="http://schemas.microsoft.com/office/word/2010/wordml" xmlns:w15="http://schemas.microsoft.com/office/word/2012/wordml" xmlns:w16cex="http://schemas.microsoft.com/office/word/2018/wordml/cex" xmlns:w16cid="http://schemas.microsoft.com/office/word/2016/wordml/cid" xmlns:w16="http://schemas.microsoft.com/office/word/2018/wordml" xmlns:w16du="http://schemas.microsoft.com/office/word/2023/wordml/word16du" xmlns:w16sdtdh="http://schemas.microsoft.com/office/word/2020/wordml/sdtdatahash" xmlns:w16sdtfl="http://schemas.microsoft.com/office/word/2024/wordml/sdtformatlock" xmlns:w16se="http://schemas.microsoft.com/office/word/2015/wordml/symex" xmlns:wpg="http://schemas.microsoft.com/office/word/2010/wordprocessingGroup" xmlns:wpi="http://schemas.microsoft.com/office/word/2010/wordprocessingInk" xmlns:wne="http://schemas.microsoft.com/office/word/2006/wordml" xmlns:wps="http://schemas.microsoft.com/office/word/2010/wordprocessingShape" mc:Ignorable="w14 w15 w16se w16cid w16 w16cex w16sdtdh w16sdtfl w16du wp14">
+<w:endnotes xmlns:wpc="http://schemas.microsoft.com/office/word/2010/wordprocessingCanvas" xmlns:cx="http://schemas.microsoft.com/office/drawing/2014/chartex" xmlns:cx1="http://schemas.microsoft.com/office/drawing/2015/9/8/chartex" xmlns:cx2="http://schemas.microsoft.com/office/drawing/2015/10/21/chartex" xmlns:cx3="http://schemas.microsoft.com/office/drawing/2016/5/9/chartex" xmlns:cx4="http://schemas.microsoft.com/office/drawing/2016/5/10/chartex" xmlns:cx5="http://schemas.microsoft.com/office/drawing/2016/5/11/chartex" xmlns:cx6="http://schemas.microsoft.com/office/drawing/2016/5/12/chartex" xmlns:cx7="http://schemas.microsoft.com/office/drawing/2016/5/13/chartex" xmlns:cx8="http://schemas.microsoft.com/office/drawing/2016/5/14/chartex" xmlns:mc="http://schemas.openxmlformats.org/markup-compatibility/2006" xmlns:aink="http://schemas.microsoft.com/office/drawing/2016/ink" xmlns:am3d="http://schemas.microsoft.com/office/drawing/2017/model3d" xmlns:o="urn:schemas-microsoft-com:office:office" xmlns:r="http://schemas.openxmlformats.org/officeDocument/2006/relationships" xmlns:m="http://schemas.openxmlformats.org/officeDocument/2006/math" xmlns:v="urn:schemas-microsoft-com:vml" xmlns:wp14="http://schemas.microsoft.com/office/word/2010/wordprocessingDrawing" xmlns:wp="http://schemas.openxmlformats.org/drawingml/2006/wordprocessingDrawing" xmlns:w10="urn:schemas-microsoft-com:office:word" xmlns:w="http://schemas.openxmlformats.org/wordprocessingml/2006/main" xmlns:w14="http://schemas.microsoft.com/office/word/2010/wordml" xmlns:w15="http://schemas.microsoft.com/office/word/2012/wordml" xmlns:w16cid="http://schemas.microsoft.com/office/word/2016/wordml/cid" xmlns:w16se="http://schemas.microsoft.com/office/word/2015/wordml/symex" xmlns:wpg="http://schemas.microsoft.com/office/word/2010/wordprocessingGroup" xmlns:wpi="http://schemas.microsoft.com/office/word/2010/wordprocessingInk" xmlns:wne="http://schemas.microsoft.com/office/word/2006/wordml" xmlns:wps="http://schemas.microsoft.com/office/word/2010/wordprocessingShape" mc:Ignorable="w14 w15 w16se w16cid wp14">
   <w:endnote w:type="separator" w:id="-1">
     <w:p>
       <w:r>
@@ -34908,7 +36052,7 @@
 </file>
 
 <file path=word/footer1.xml><?xml version="1.0" encoding="utf-8"?>
-<w:ftr xmlns:wpc="http://schemas.microsoft.com/office/word/2010/wordprocessingCanvas" xmlns:cx="http://schemas.microsoft.com/office/drawing/2014/chartex" xmlns:cx1="http://schemas.microsoft.com/office/drawing/2015/9/8/chartex" xmlns:cx2="http://schemas.microsoft.com/office/drawing/2015/10/21/chartex" xmlns:cx3="http://schemas.microsoft.com/office/drawing/2016/5/9/chartex" xmlns:cx4="http://schemas.microsoft.com/office/drawing/2016/5/10/chartex" xmlns:cx5="http://schemas.microsoft.com/office/drawing/2016/5/11/chartex" xmlns:cx6="http://schemas.microsoft.com/office/drawing/2016/5/12/chartex" xmlns:cx7="http://schemas.microsoft.com/office/drawing/2016/5/13/chartex" xmlns:cx8="http://schemas.microsoft.com/office/drawing/2016/5/14/chartex" xmlns:mc="http://schemas.openxmlformats.org/markup-compatibility/2006" xmlns:aink="http://schemas.microsoft.com/office/drawing/2016/ink" xmlns:am3d="http://schemas.microsoft.com/office/drawing/2017/model3d" xmlns:o="urn:schemas-microsoft-com:office:office" xmlns:oel="http://schemas.microsoft.com/office/2019/extlst" xmlns:r="http://schemas.openxmlformats.org/officeDocument/2006/relationships" xmlns:m="http://schemas.openxmlformats.org/officeDocument/2006/math" xmlns:v="urn:schemas-microsoft-com:vml" xmlns:wp14="http://schemas.microsoft.com/office/word/2010/wordprocessingDrawing" xmlns:wp="http://schemas.openxmlformats.org/drawingml/2006/wordprocessingDrawing" xmlns:w10="urn:schemas-microsoft-com:office:word" xmlns:w="http://schemas.openxmlformats.org/wordprocessingml/2006/main" xmlns:w14="http://schemas.microsoft.com/office/word/2010/wordml" xmlns:w15="http://schemas.microsoft.com/office/word/2012/wordml" xmlns:w16cex="http://schemas.microsoft.com/office/word/2018/wordml/cex" xmlns:w16cid="http://schemas.microsoft.com/office/word/2016/wordml/cid" xmlns:w16="http://schemas.microsoft.com/office/word/2018/wordml" xmlns:w16du="http://schemas.microsoft.com/office/word/2023/wordml/word16du" xmlns:w16sdtdh="http://schemas.microsoft.com/office/word/2020/wordml/sdtdatahash" xmlns:w16sdtfl="http://schemas.microsoft.com/office/word/2024/wordml/sdtformatlock" xmlns:w16se="http://schemas.microsoft.com/office/word/2015/wordml/symex" xmlns:wpg="http://schemas.microsoft.com/office/word/2010/wordprocessingGroup" xmlns:wpi="http://schemas.microsoft.com/office/word/2010/wordprocessingInk" xmlns:wne="http://schemas.microsoft.com/office/word/2006/wordml" xmlns:wps="http://schemas.microsoft.com/office/word/2010/wordprocessingShape" mc:Ignorable="w14 w15 w16se w16cid w16 w16cex w16sdtdh w16sdtfl w16du wp14">
+<w:ftr xmlns:wpc="http://schemas.microsoft.com/office/word/2010/wordprocessingCanvas" xmlns:cx="http://schemas.microsoft.com/office/drawing/2014/chartex" xmlns:cx1="http://schemas.microsoft.com/office/drawing/2015/9/8/chartex" xmlns:cx2="http://schemas.microsoft.com/office/drawing/2015/10/21/chartex" xmlns:cx3="http://schemas.microsoft.com/office/drawing/2016/5/9/chartex" xmlns:cx4="http://schemas.microsoft.com/office/drawing/2016/5/10/chartex" xmlns:cx5="http://schemas.microsoft.com/office/drawing/2016/5/11/chartex" xmlns:cx6="http://schemas.microsoft.com/office/drawing/2016/5/12/chartex" xmlns:cx7="http://schemas.microsoft.com/office/drawing/2016/5/13/chartex" xmlns:cx8="http://schemas.microsoft.com/office/drawing/2016/5/14/chartex" xmlns:mc="http://schemas.openxmlformats.org/markup-compatibility/2006" xmlns:aink="http://schemas.microsoft.com/office/drawing/2016/ink" xmlns:am3d="http://schemas.microsoft.com/office/drawing/2017/model3d" xmlns:o="urn:schemas-microsoft-com:office:office" xmlns:r="http://schemas.openxmlformats.org/officeDocument/2006/relationships" xmlns:m="http://schemas.openxmlformats.org/officeDocument/2006/math" xmlns:v="urn:schemas-microsoft-com:vml" xmlns:wp14="http://schemas.microsoft.com/office/word/2010/wordprocessingDrawing" xmlns:wp="http://schemas.openxmlformats.org/drawingml/2006/wordprocessingDrawing" xmlns:w10="urn:schemas-microsoft-com:office:word" xmlns:w="http://schemas.openxmlformats.org/wordprocessingml/2006/main" xmlns:w14="http://schemas.microsoft.com/office/word/2010/wordml" xmlns:w15="http://schemas.microsoft.com/office/word/2012/wordml" xmlns:w16cid="http://schemas.microsoft.com/office/word/2016/wordml/cid" xmlns:w16se="http://schemas.microsoft.com/office/word/2015/wordml/symex" xmlns:wpg="http://schemas.microsoft.com/office/word/2010/wordprocessingGroup" xmlns:wpi="http://schemas.microsoft.com/office/word/2010/wordprocessingInk" xmlns:wne="http://schemas.microsoft.com/office/word/2006/wordml" xmlns:wps="http://schemas.microsoft.com/office/word/2010/wordprocessingShape" mc:Ignorable="w14 w15 w16se w16cid wp14">
   <w:p>
     <w:pPr>
       <w:pStyle w:val="Footer"/>
@@ -34937,7 +36081,7 @@
                     <adec:decorative xmlns:adec="http://schemas.microsoft.com/office/drawing/2017/decorative" val="1"/>
                   </a:ext>
                   <a:ext uri="{5AE41FA2-C0FF-4470-9BD4-5FADCA87CBE2}">
-                    <aclsh:classification xmlns:aclsh="http://schemas.microsoft.com/office/drawing/2020/classificationShape" classificationOutcomeType="ftr"/>
+                    <aclsh:classification xmlns:aclsh="http://schemas.microsoft.com/office/drawing/2020/classificationShape" xmlns:w16sdtfl="http://schemas.microsoft.com/office/word/2024/wordml/sdtformatlock" xmlns:w16sdtdh="http://schemas.microsoft.com/office/word/2020/wordml/sdtdatahash" xmlns:w16du="http://schemas.microsoft.com/office/word/2023/wordml/word16du" xmlns:w16="http://schemas.microsoft.com/office/word/2018/wordml" xmlns:w16cex="http://schemas.microsoft.com/office/word/2018/wordml/cex" xmlns:w="http://schemas.openxmlformats.org/wordprocessingml/2006/main" xmlns:w10="urn:schemas-microsoft-com:office:word" xmlns:v="urn:schemas-microsoft-com:vml" xmlns:oel="http://schemas.microsoft.com/office/2019/extlst" xmlns:o="urn:schemas-microsoft-com:office:office" xmlns="" classificationOutcomeType="ftr"/>
                   </a:ext>
                 </a:extLst>
               </wp:docPr>
@@ -35000,7 +36144,7 @@
               <v:stroke joinstyle="miter"/>
               <v:path gradientshapeok="t" o:connecttype="rect"/>
             </v:shapetype>
-            <v:shape id="Text Box 3" o:spid="_x0000_s1026" type="#_x0000_t202" alt="&quot;&quot;" style="position:absolute;margin-left:0;margin-top:0;width:34.95pt;height:34.95pt;z-index:251659264;visibility:visible;mso-wrap-style:none;mso-wrap-distance-left:0;mso-wrap-distance-top:0;mso-wrap-distance-right:0;mso-wrap-distance-bottom:0;mso-position-horizontal:center;mso-position-horizontal-relative:page;mso-position-vertical:bottom;mso-position-vertical-relative:page;v-text-anchor:bottom" o:gfxdata="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" filled="f" stroked="f">
+            <v:shape id="Text Box 3" o:spid="_x0000_s1026" type="#_x0000_t202" style="position:absolute;margin-left:0;margin-top:0;width:34.95pt;height:34.95pt;z-index:251659264;visibility:visible;mso-wrap-style:none;mso-wrap-distance-left:0;mso-wrap-distance-top:0;mso-wrap-distance-right:0;mso-wrap-distance-bottom:0;mso-position-horizontal:center;mso-position-horizontal-relative:page;mso-position-vertical:bottom;mso-position-vertical-relative:page;v-text-anchor:bottom" o:gfxdata="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" filled="f" stroked="f">
               <v:textbox style="mso-fit-shape-to-text:t" inset="0,0,0,15pt">
                 <w:txbxContent>
                   <w:p>
@@ -35035,7 +36179,7 @@
 </file>
 
 <file path=word/footer2.xml><?xml version="1.0" encoding="utf-8"?>
-<w:ftr xmlns:wpc="http://schemas.microsoft.com/office/word/2010/wordprocessingCanvas" xmlns:cx="http://schemas.microsoft.com/office/drawing/2014/chartex" xmlns:cx1="http://schemas.microsoft.com/office/drawing/2015/9/8/chartex" xmlns:cx2="http://schemas.microsoft.com/office/drawing/2015/10/21/chartex" xmlns:cx3="http://schemas.microsoft.com/office/drawing/2016/5/9/chartex" xmlns:cx4="http://schemas.microsoft.com/office/drawing/2016/5/10/chartex" xmlns:cx5="http://schemas.microsoft.com/office/drawing/2016/5/11/chartex" xmlns:cx6="http://schemas.microsoft.com/office/drawing/2016/5/12/chartex" xmlns:cx7="http://schemas.microsoft.com/office/drawing/2016/5/13/chartex" xmlns:cx8="http://schemas.microsoft.com/office/drawing/2016/5/14/chartex" xmlns:mc="http://schemas.openxmlformats.org/markup-compatibility/2006" xmlns:aink="http://schemas.microsoft.com/office/drawing/2016/ink" xmlns:am3d="http://schemas.microsoft.com/office/drawing/2017/model3d" xmlns:o="urn:schemas-microsoft-com:office:office" xmlns:oel="http://schemas.microsoft.com/office/2019/extlst" xmlns:r="http://schemas.openxmlformats.org/officeDocument/2006/relationships" xmlns:m="http://schemas.openxmlformats.org/officeDocument/2006/math" xmlns:v="urn:schemas-microsoft-com:vml" xmlns:wp14="http://schemas.microsoft.com/office/word/2010/wordprocessingDrawing" xmlns:wp="http://schemas.openxmlformats.org/drawingml/2006/wordprocessingDrawing" xmlns:w10="urn:schemas-microsoft-com:office:word" xmlns:w="http://schemas.openxmlformats.org/wordprocessingml/2006/main" xmlns:w14="http://schemas.microsoft.com/office/word/2010/wordml" xmlns:w15="http://schemas.microsoft.com/office/word/2012/wordml" xmlns:w16cex="http://schemas.microsoft.com/office/word/2018/wordml/cex" xmlns:w16cid="http://schemas.microsoft.com/office/word/2016/wordml/cid" xmlns:w16="http://schemas.microsoft.com/office/word/2018/wordml" xmlns:w16du="http://schemas.microsoft.com/office/word/2023/wordml/word16du" xmlns:w16sdtdh="http://schemas.microsoft.com/office/word/2020/wordml/sdtdatahash" xmlns:w16sdtfl="http://schemas.microsoft.com/office/word/2024/wordml/sdtformatlock" xmlns:w16se="http://schemas.microsoft.com/office/word/2015/wordml/symex" xmlns:wpg="http://schemas.microsoft.com/office/word/2010/wordprocessingGroup" xmlns:wpi="http://schemas.microsoft.com/office/word/2010/wordprocessingInk" xmlns:wne="http://schemas.microsoft.com/office/word/2006/wordml" xmlns:wps="http://schemas.microsoft.com/office/word/2010/wordprocessingShape" mc:Ignorable="w14 w15 w16se w16cid w16 w16cex w16sdtdh w16sdtfl w16du wp14">
+<w:ftr xmlns:wpc="http://schemas.microsoft.com/office/word/2010/wordprocessingCanvas" xmlns:cx="http://schemas.microsoft.com/office/drawing/2014/chartex" xmlns:cx1="http://schemas.microsoft.com/office/drawing/2015/9/8/chartex" xmlns:cx2="http://schemas.microsoft.com/office/drawing/2015/10/21/chartex" xmlns:cx3="http://schemas.microsoft.com/office/drawing/2016/5/9/chartex" xmlns:cx4="http://schemas.microsoft.com/office/drawing/2016/5/10/chartex" xmlns:cx5="http://schemas.microsoft.com/office/drawing/2016/5/11/chartex" xmlns:cx6="http://schemas.microsoft.com/office/drawing/2016/5/12/chartex" xmlns:cx7="http://schemas.microsoft.com/office/drawing/2016/5/13/chartex" xmlns:cx8="http://schemas.microsoft.com/office/drawing/2016/5/14/chartex" xmlns:mc="http://schemas.openxmlformats.org/markup-compatibility/2006" xmlns:aink="http://schemas.microsoft.com/office/drawing/2016/ink" xmlns:am3d="http://schemas.microsoft.com/office/drawing/2017/model3d" xmlns:o="urn:schemas-microsoft-com:office:office" xmlns:r="http://schemas.openxmlformats.org/officeDocument/2006/relationships" xmlns:m="http://schemas.openxmlformats.org/officeDocument/2006/math" xmlns:v="urn:schemas-microsoft-com:vml" xmlns:wp14="http://schemas.microsoft.com/office/word/2010/wordprocessingDrawing" xmlns:wp="http://schemas.openxmlformats.org/drawingml/2006/wordprocessingDrawing" xmlns:w10="urn:schemas-microsoft-com:office:word" xmlns:w="http://schemas.openxmlformats.org/wordprocessingml/2006/main" xmlns:w14="http://schemas.microsoft.com/office/word/2010/wordml" xmlns:w15="http://schemas.microsoft.com/office/word/2012/wordml" xmlns:w16cid="http://schemas.microsoft.com/office/word/2016/wordml/cid" xmlns:w16se="http://schemas.microsoft.com/office/word/2015/wordml/symex" xmlns:wpg="http://schemas.microsoft.com/office/word/2010/wordprocessingGroup" xmlns:wpi="http://schemas.microsoft.com/office/word/2010/wordprocessingInk" xmlns:wne="http://schemas.microsoft.com/office/word/2006/wordml" xmlns:wps="http://schemas.microsoft.com/office/word/2010/wordprocessingShape" mc:Ignorable="w14 w15 w16se w16cid wp14">
   <w:p>
     <w:pPr>
       <w:pStyle w:val="Footer"/>
@@ -35214,7 +36358,7 @@
 </file>
 
 <file path=word/footer3.xml><?xml version="1.0" encoding="utf-8"?>
-<w:ftr xmlns:wpc="http://schemas.microsoft.com/office/word/2010/wordprocessingCanvas" xmlns:cx="http://schemas.microsoft.com/office/drawing/2014/chartex" xmlns:cx1="http://schemas.microsoft.com/office/drawing/2015/9/8/chartex" xmlns:cx2="http://schemas.microsoft.com/office/drawing/2015/10/21/chartex" xmlns:cx3="http://schemas.microsoft.com/office/drawing/2016/5/9/chartex" xmlns:cx4="http://schemas.microsoft.com/office/drawing/2016/5/10/chartex" xmlns:cx5="http://schemas.microsoft.com/office/drawing/2016/5/11/chartex" xmlns:cx6="http://schemas.microsoft.com/office/drawing/2016/5/12/chartex" xmlns:cx7="http://schemas.microsoft.com/office/drawing/2016/5/13/chartex" xmlns:cx8="http://schemas.microsoft.com/office/drawing/2016/5/14/chartex" xmlns:mc="http://schemas.openxmlformats.org/markup-compatibility/2006" xmlns:aink="http://schemas.microsoft.com/office/drawing/2016/ink" xmlns:am3d="http://schemas.microsoft.com/office/drawing/2017/model3d" xmlns:o="urn:schemas-microsoft-com:office:office" xmlns:oel="http://schemas.microsoft.com/office/2019/extlst" xmlns:r="http://schemas.openxmlformats.org/officeDocument/2006/relationships" xmlns:m="http://schemas.openxmlformats.org/officeDocument/2006/math" xmlns:v="urn:schemas-microsoft-com:vml" xmlns:wp14="http://schemas.microsoft.com/office/word/2010/wordprocessingDrawing" xmlns:wp="http://schemas.openxmlformats.org/drawingml/2006/wordprocessingDrawing" xmlns:w10="urn:schemas-microsoft-com:office:word" xmlns:w="http://schemas.openxmlformats.org/wordprocessingml/2006/main" xmlns:w14="http://schemas.microsoft.com/office/word/2010/wordml" xmlns:w15="http://schemas.microsoft.com/office/word/2012/wordml" xmlns:w16cex="http://schemas.microsoft.com/office/word/2018/wordml/cex" xmlns:w16cid="http://schemas.microsoft.com/office/word/2016/wordml/cid" xmlns:w16="http://schemas.microsoft.com/office/word/2018/wordml" xmlns:w16du="http://schemas.microsoft.com/office/word/2023/wordml/word16du" xmlns:w16sdtdh="http://schemas.microsoft.com/office/word/2020/wordml/sdtdatahash" xmlns:w16sdtfl="http://schemas.microsoft.com/office/word/2024/wordml/sdtformatlock" xmlns:w16se="http://schemas.microsoft.com/office/word/2015/wordml/symex" xmlns:wpg="http://schemas.microsoft.com/office/word/2010/wordprocessingGroup" xmlns:wpi="http://schemas.microsoft.com/office/word/2010/wordprocessingInk" xmlns:wne="http://schemas.microsoft.com/office/word/2006/wordml" xmlns:wps="http://schemas.microsoft.com/office/word/2010/wordprocessingShape" mc:Ignorable="w14 w15 w16se w16cid w16 w16cex w16sdtdh w16sdtfl w16du wp14">
+<w:ftr xmlns:wpc="http://schemas.microsoft.com/office/word/2010/wordprocessingCanvas" xmlns:cx="http://schemas.microsoft.com/office/drawing/2014/chartex" xmlns:cx1="http://schemas.microsoft.com/office/drawing/2015/9/8/chartex" xmlns:cx2="http://schemas.microsoft.com/office/drawing/2015/10/21/chartex" xmlns:cx3="http://schemas.microsoft.com/office/drawing/2016/5/9/chartex" xmlns:cx4="http://schemas.microsoft.com/office/drawing/2016/5/10/chartex" xmlns:cx5="http://schemas.microsoft.com/office/drawing/2016/5/11/chartex" xmlns:cx6="http://schemas.microsoft.com/office/drawing/2016/5/12/chartex" xmlns:cx7="http://schemas.microsoft.com/office/drawing/2016/5/13/chartex" xmlns:cx8="http://schemas.microsoft.com/office/drawing/2016/5/14/chartex" xmlns:mc="http://schemas.openxmlformats.org/markup-compatibility/2006" xmlns:aink="http://schemas.microsoft.com/office/drawing/2016/ink" xmlns:am3d="http://schemas.microsoft.com/office/drawing/2017/model3d" xmlns:o="urn:schemas-microsoft-com:office:office" xmlns:r="http://schemas.openxmlformats.org/officeDocument/2006/relationships" xmlns:m="http://schemas.openxmlformats.org/officeDocument/2006/math" xmlns:v="urn:schemas-microsoft-com:vml" xmlns:wp14="http://schemas.microsoft.com/office/word/2010/wordprocessingDrawing" xmlns:wp="http://schemas.openxmlformats.org/drawingml/2006/wordprocessingDrawing" xmlns:w10="urn:schemas-microsoft-com:office:word" xmlns:w="http://schemas.openxmlformats.org/wordprocessingml/2006/main" xmlns:w14="http://schemas.microsoft.com/office/word/2010/wordml" xmlns:w15="http://schemas.microsoft.com/office/word/2012/wordml" xmlns:w16cid="http://schemas.microsoft.com/office/word/2016/wordml/cid" xmlns:w16se="http://schemas.microsoft.com/office/word/2015/wordml/symex" xmlns:wpg="http://schemas.microsoft.com/office/word/2010/wordprocessingGroup" xmlns:wpi="http://schemas.microsoft.com/office/word/2010/wordprocessingInk" xmlns:wne="http://schemas.microsoft.com/office/word/2006/wordml" xmlns:wps="http://schemas.microsoft.com/office/word/2010/wordprocessingShape" mc:Ignorable="w14 w15 w16se w16cid wp14">
   <w:p>
     <w:pPr>
       <w:pStyle w:val="Footer"/>
@@ -35243,7 +36387,7 @@
                     <adec:decorative xmlns:adec="http://schemas.microsoft.com/office/drawing/2017/decorative" val="1"/>
                   </a:ext>
                   <a:ext uri="{5AE41FA2-C0FF-4470-9BD4-5FADCA87CBE2}">
-                    <aclsh:classification xmlns:aclsh="http://schemas.microsoft.com/office/drawing/2020/classificationShape" classificationOutcomeType="ftr"/>
+                    <aclsh:classification xmlns:aclsh="http://schemas.microsoft.com/office/drawing/2020/classificationShape" xmlns:w16sdtfl="http://schemas.microsoft.com/office/word/2024/wordml/sdtformatlock" xmlns:w16sdtdh="http://schemas.microsoft.com/office/word/2020/wordml/sdtdatahash" xmlns:w16du="http://schemas.microsoft.com/office/word/2023/wordml/word16du" xmlns:w16="http://schemas.microsoft.com/office/word/2018/wordml" xmlns:w16cex="http://schemas.microsoft.com/office/word/2018/wordml/cex" xmlns:w="http://schemas.openxmlformats.org/wordprocessingml/2006/main" xmlns:w10="urn:schemas-microsoft-com:office:word" xmlns:v="urn:schemas-microsoft-com:vml" xmlns:oel="http://schemas.microsoft.com/office/2019/extlst" xmlns:o="urn:schemas-microsoft-com:office:office" xmlns="" classificationOutcomeType="ftr"/>
                   </a:ext>
                 </a:extLst>
               </wp:docPr>
@@ -35306,7 +36450,7 @@
               <v:stroke joinstyle="miter"/>
               <v:path gradientshapeok="t" o:connecttype="rect"/>
             </v:shapetype>
-            <v:shape id="Text Box 2" o:spid="_x0000_s1027" type="#_x0000_t202" alt="&quot;&quot;" style="position:absolute;margin-left:0;margin-top:0;width:34.95pt;height:34.95pt;z-index:251658240;visibility:visible;mso-wrap-style:none;mso-wrap-distance-left:0;mso-wrap-distance-top:0;mso-wrap-distance-right:0;mso-wrap-distance-bottom:0;mso-position-horizontal:center;mso-position-horizontal-relative:page;mso-position-vertical:bottom;mso-position-vertical-relative:page;v-text-anchor:bottom" o:gfxdata="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" filled="f" stroked="f">
+            <v:shape id="Text Box 2" o:spid="_x0000_s1027" type="#_x0000_t202" style="position:absolute;margin-left:0;margin-top:0;width:34.95pt;height:34.95pt;z-index:251658240;visibility:visible;mso-wrap-style:none;mso-wrap-distance-left:0;mso-wrap-distance-top:0;mso-wrap-distance-right:0;mso-wrap-distance-bottom:0;mso-position-horizontal:center;mso-position-horizontal-relative:page;mso-position-vertical:bottom;mso-position-vertical-relative:page;v-text-anchor:bottom" o:gfxdata="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" filled="f" stroked="f">
               <v:textbox style="mso-fit-shape-to-text:t" inset="0,0,0,15pt">
                 <w:txbxContent>
                   <w:p>
@@ -35376,7 +36520,7 @@
 </file>
 
 <file path=word/footer4.xml><?xml version="1.0" encoding="utf-8"?>
-<w:ftr xmlns:wpc="http://schemas.microsoft.com/office/word/2010/wordprocessingCanvas" xmlns:cx="http://schemas.microsoft.com/office/drawing/2014/chartex" xmlns:cx1="http://schemas.microsoft.com/office/drawing/2015/9/8/chartex" xmlns:cx2="http://schemas.microsoft.com/office/drawing/2015/10/21/chartex" xmlns:cx3="http://schemas.microsoft.com/office/drawing/2016/5/9/chartex" xmlns:cx4="http://schemas.microsoft.com/office/drawing/2016/5/10/chartex" xmlns:cx5="http://schemas.microsoft.com/office/drawing/2016/5/11/chartex" xmlns:cx6="http://schemas.microsoft.com/office/drawing/2016/5/12/chartex" xmlns:cx7="http://schemas.microsoft.com/office/drawing/2016/5/13/chartex" xmlns:cx8="http://schemas.microsoft.com/office/drawing/2016/5/14/chartex" xmlns:mc="http://schemas.openxmlformats.org/markup-compatibility/2006" xmlns:aink="http://schemas.microsoft.com/office/drawing/2016/ink" xmlns:am3d="http://schemas.microsoft.com/office/drawing/2017/model3d" xmlns:o="urn:schemas-microsoft-com:office:office" xmlns:oel="http://schemas.microsoft.com/office/2019/extlst" xmlns:r="http://schemas.openxmlformats.org/officeDocument/2006/relationships" xmlns:m="http://schemas.openxmlformats.org/officeDocument/2006/math" xmlns:v="urn:schemas-microsoft-com:vml" xmlns:wp14="http://schemas.microsoft.com/office/word/2010/wordprocessingDrawing" xmlns:wp="http://schemas.openxmlformats.org/drawingml/2006/wordprocessingDrawing" xmlns:w10="urn:schemas-microsoft-com:office:word" xmlns:w="http://schemas.openxmlformats.org/wordprocessingml/2006/main" xmlns:w14="http://schemas.microsoft.com/office/word/2010/wordml" xmlns:w15="http://schemas.microsoft.com/office/word/2012/wordml" xmlns:w16cex="http://schemas.microsoft.com/office/word/2018/wordml/cex" xmlns:w16cid="http://schemas.microsoft.com/office/word/2016/wordml/cid" xmlns:w16="http://schemas.microsoft.com/office/word/2018/wordml" xmlns:w16du="http://schemas.microsoft.com/office/word/2023/wordml/word16du" xmlns:w16sdtdh="http://schemas.microsoft.com/office/word/2020/wordml/sdtdatahash" xmlns:w16sdtfl="http://schemas.microsoft.com/office/word/2024/wordml/sdtformatlock" xmlns:w16se="http://schemas.microsoft.com/office/word/2015/wordml/symex" xmlns:wpg="http://schemas.microsoft.com/office/word/2010/wordprocessingGroup" xmlns:wpi="http://schemas.microsoft.com/office/word/2010/wordprocessingInk" xmlns:wne="http://schemas.microsoft.com/office/word/2006/wordml" xmlns:wps="http://schemas.microsoft.com/office/word/2010/wordprocessingShape" mc:Ignorable="w14 w15 w16se w16cid w16 w16cex w16sdtdh w16sdtfl w16du wp14">
+<w:ftr xmlns:wpc="http://schemas.microsoft.com/office/word/2010/wordprocessingCanvas" xmlns:cx="http://schemas.microsoft.com/office/drawing/2014/chartex" xmlns:cx1="http://schemas.microsoft.com/office/drawing/2015/9/8/chartex" xmlns:cx2="http://schemas.microsoft.com/office/drawing/2015/10/21/chartex" xmlns:cx3="http://schemas.microsoft.com/office/drawing/2016/5/9/chartex" xmlns:cx4="http://schemas.microsoft.com/office/drawing/2016/5/10/chartex" xmlns:cx5="http://schemas.microsoft.com/office/drawing/2016/5/11/chartex" xmlns:cx6="http://schemas.microsoft.com/office/drawing/2016/5/12/chartex" xmlns:cx7="http://schemas.microsoft.com/office/drawing/2016/5/13/chartex" xmlns:cx8="http://schemas.microsoft.com/office/drawing/2016/5/14/chartex" xmlns:mc="http://schemas.openxmlformats.org/markup-compatibility/2006" xmlns:aink="http://schemas.microsoft.com/office/drawing/2016/ink" xmlns:am3d="http://schemas.microsoft.com/office/drawing/2017/model3d" xmlns:o="urn:schemas-microsoft-com:office:office" xmlns:r="http://schemas.openxmlformats.org/officeDocument/2006/relationships" xmlns:m="http://schemas.openxmlformats.org/officeDocument/2006/math" xmlns:v="urn:schemas-microsoft-com:vml" xmlns:wp14="http://schemas.microsoft.com/office/word/2010/wordprocessingDrawing" xmlns:wp="http://schemas.openxmlformats.org/drawingml/2006/wordprocessingDrawing" xmlns:w10="urn:schemas-microsoft-com:office:word" xmlns:w="http://schemas.openxmlformats.org/wordprocessingml/2006/main" xmlns:w14="http://schemas.microsoft.com/office/word/2010/wordml" xmlns:w15="http://schemas.microsoft.com/office/word/2012/wordml" xmlns:w16cid="http://schemas.microsoft.com/office/word/2016/wordml/cid" xmlns:w16se="http://schemas.microsoft.com/office/word/2015/wordml/symex" xmlns:wpg="http://schemas.microsoft.com/office/word/2010/wordprocessingGroup" xmlns:wpi="http://schemas.microsoft.com/office/word/2010/wordprocessingInk" xmlns:wne="http://schemas.microsoft.com/office/word/2006/wordml" xmlns:wps="http://schemas.microsoft.com/office/word/2010/wordprocessingShape" mc:Ignorable="w14 w15 w16se w16cid wp14">
   <w:p>
     <w:pPr>
       <w:pStyle w:val="Footer"/>
@@ -35527,7 +36671,7 @@
 </file>
 
 <file path=word/footnotes.xml><?xml version="1.0" encoding="utf-8"?>
-<w:footnotes xmlns:wpc="http://schemas.microsoft.com/office/word/2010/wordprocessingCanvas" xmlns:cx="http://schemas.microsoft.com/office/drawing/2014/chartex" xmlns:cx1="http://schemas.microsoft.com/office/drawing/2015/9/8/chartex" xmlns:cx2="http://schemas.microsoft.com/office/drawing/2015/10/21/chartex" xmlns:cx3="http://schemas.microsoft.com/office/drawing/2016/5/9/chartex" xmlns:cx4="http://schemas.microsoft.com/office/drawing/2016/5/10/chartex" xmlns:cx5="http://schemas.microsoft.com/office/drawing/2016/5/11/chartex" xmlns:cx6="http://schemas.microsoft.com/office/drawing/2016/5/12/chartex" xmlns:cx7="http://schemas.microsoft.com/office/drawing/2016/5/13/chartex" xmlns:cx8="http://schemas.microsoft.com/office/drawing/2016/5/14/chartex" xmlns:mc="http://schemas.openxmlformats.org/markup-compatibility/2006" xmlns:aink="http://schemas.microsoft.com/office/drawing/2016/ink" xmlns:am3d="http://schemas.microsoft.com/office/drawing/2017/model3d" xmlns:o="urn:schemas-microsoft-com:office:office" xmlns:oel="http://schemas.microsoft.com/office/2019/extlst" xmlns:r="http://schemas.openxmlformats.org/officeDocument/2006/relationships" xmlns:m="http://schemas.openxmlformats.org/officeDocument/2006/math" xmlns:v="urn:schemas-microsoft-com:vml" xmlns:wp14="http://schemas.microsoft.com/office/word/2010/wordprocessingDrawing" xmlns:wp="http://schemas.openxmlformats.org/drawingml/2006/wordprocessingDrawing" xmlns:w10="urn:schemas-microsoft-com:office:word" xmlns:w="http://schemas.openxmlformats.org/wordprocessingml/2006/main" xmlns:w14="http://schemas.microsoft.com/office/word/2010/wordml" xmlns:w15="http://schemas.microsoft.com/office/word/2012/wordml" xmlns:w16cex="http://schemas.microsoft.com/office/word/2018/wordml/cex" xmlns:w16cid="http://schemas.microsoft.com/office/word/2016/wordml/cid" xmlns:w16="http://schemas.microsoft.com/office/word/2018/wordml" xmlns:w16du="http://schemas.microsoft.com/office/word/2023/wordml/word16du" xmlns:w16sdtdh="http://schemas.microsoft.com/office/word/2020/wordml/sdtdatahash" xmlns:w16sdtfl="http://schemas.microsoft.com/office/word/2024/wordml/sdtformatlock" xmlns:w16se="http://schemas.microsoft.com/office/word/2015/wordml/symex" xmlns:wpg="http://schemas.microsoft.com/office/word/2010/wordprocessingGroup" xmlns:wpi="http://schemas.microsoft.com/office/word/2010/wordprocessingInk" xmlns:wne="http://schemas.microsoft.com/office/word/2006/wordml" xmlns:wps="http://schemas.microsoft.com/office/word/2010/wordprocessingShape" mc:Ignorable="w14 w15 w16se w16cid w16 w16cex w16sdtdh w16sdtfl w16du wp14">
+<w:footnotes xmlns:wpc="http://schemas.microsoft.com/office/word/2010/wordprocessingCanvas" xmlns:cx="http://schemas.microsoft.com/office/drawing/2014/chartex" xmlns:cx1="http://schemas.microsoft.com/office/drawing/2015/9/8/chartex" xmlns:cx2="http://schemas.microsoft.com/office/drawing/2015/10/21/chartex" xmlns:cx3="http://schemas.microsoft.com/office/drawing/2016/5/9/chartex" xmlns:cx4="http://schemas.microsoft.com/office/drawing/2016/5/10/chartex" xmlns:cx5="http://schemas.microsoft.com/office/drawing/2016/5/11/chartex" xmlns:cx6="http://schemas.microsoft.com/office/drawing/2016/5/12/chartex" xmlns:cx7="http://schemas.microsoft.com/office/drawing/2016/5/13/chartex" xmlns:cx8="http://schemas.microsoft.com/office/drawing/2016/5/14/chartex" xmlns:mc="http://schemas.openxmlformats.org/markup-compatibility/2006" xmlns:aink="http://schemas.microsoft.com/office/drawing/2016/ink" xmlns:am3d="http://schemas.microsoft.com/office/drawing/2017/model3d" xmlns:o="urn:schemas-microsoft-com:office:office" xmlns:r="http://schemas.openxmlformats.org/officeDocument/2006/relationships" xmlns:m="http://schemas.openxmlformats.org/officeDocument/2006/math" xmlns:v="urn:schemas-microsoft-com:vml" xmlns:wp14="http://schemas.microsoft.com/office/word/2010/wordprocessingDrawing" xmlns:wp="http://schemas.openxmlformats.org/drawingml/2006/wordprocessingDrawing" xmlns:w10="urn:schemas-microsoft-com:office:word" xmlns:w="http://schemas.openxmlformats.org/wordprocessingml/2006/main" xmlns:w14="http://schemas.microsoft.com/office/word/2010/wordml" xmlns:w15="http://schemas.microsoft.com/office/word/2012/wordml" xmlns:w16cid="http://schemas.microsoft.com/office/word/2016/wordml/cid" xmlns:w16se="http://schemas.microsoft.com/office/word/2015/wordml/symex" xmlns:wpg="http://schemas.microsoft.com/office/word/2010/wordprocessingGroup" xmlns:wpi="http://schemas.microsoft.com/office/word/2010/wordprocessingInk" xmlns:wne="http://schemas.microsoft.com/office/word/2006/wordml" xmlns:wps="http://schemas.microsoft.com/office/word/2010/wordprocessingShape" mc:Ignorable="w14 w15 w16se w16cid wp14">
   <w:footnote w:type="separator" w:id="-1">
     <w:p>
       <w:r>
@@ -35548,7 +36692,7 @@
 </file>
 
 <file path=word/header1.xml><?xml version="1.0" encoding="utf-8"?>
-<w:hdr xmlns:wpc="http://schemas.microsoft.com/office/word/2010/wordprocessingCanvas" xmlns:cx="http://schemas.microsoft.com/office/drawing/2014/chartex" xmlns:cx1="http://schemas.microsoft.com/office/drawing/2015/9/8/chartex" xmlns:cx2="http://schemas.microsoft.com/office/drawing/2015/10/21/chartex" xmlns:cx3="http://schemas.microsoft.com/office/drawing/2016/5/9/chartex" xmlns:cx4="http://schemas.microsoft.com/office/drawing/2016/5/10/chartex" xmlns:cx5="http://schemas.microsoft.com/office/drawing/2016/5/11/chartex" xmlns:cx6="http://schemas.microsoft.com/office/drawing/2016/5/12/chartex" xmlns:cx7="http://schemas.microsoft.com/office/drawing/2016/5/13/chartex" xmlns:cx8="http://schemas.microsoft.com/office/drawing/2016/5/14/chartex" xmlns:mc="http://schemas.openxmlformats.org/markup-compatibility/2006" xmlns:aink="http://schemas.microsoft.com/office/drawing/2016/ink" xmlns:am3d="http://schemas.microsoft.com/office/drawing/2017/model3d" xmlns:o="urn:schemas-microsoft-com:office:office" xmlns:oel="http://schemas.microsoft.com/office/2019/extlst" xmlns:r="http://schemas.openxmlformats.org/officeDocument/2006/relationships" xmlns:m="http://schemas.openxmlformats.org/officeDocument/2006/math" xmlns:v="urn:schemas-microsoft-com:vml" xmlns:wp14="http://schemas.microsoft.com/office/word/2010/wordprocessingDrawing" xmlns:wp="http://schemas.openxmlformats.org/drawingml/2006/wordprocessingDrawing" xmlns:w10="urn:schemas-microsoft-com:office:word" xmlns:w="http://schemas.openxmlformats.org/wordprocessingml/2006/main" xmlns:w14="http://schemas.microsoft.com/office/word/2010/wordml" xmlns:w15="http://schemas.microsoft.com/office/word/2012/wordml" xmlns:w16cex="http://schemas.microsoft.com/office/word/2018/wordml/cex" xmlns:w16cid="http://schemas.microsoft.com/office/word/2016/wordml/cid" xmlns:w16="http://schemas.microsoft.com/office/word/2018/wordml" xmlns:w16du="http://schemas.microsoft.com/office/word/2023/wordml/word16du" xmlns:w16sdtdh="http://schemas.microsoft.com/office/word/2020/wordml/sdtdatahash" xmlns:w16sdtfl="http://schemas.microsoft.com/office/word/2024/wordml/sdtformatlock" xmlns:w16se="http://schemas.microsoft.com/office/word/2015/wordml/symex" xmlns:wpg="http://schemas.microsoft.com/office/word/2010/wordprocessingGroup" xmlns:wpi="http://schemas.microsoft.com/office/word/2010/wordprocessingInk" xmlns:wne="http://schemas.microsoft.com/office/word/2006/wordml" xmlns:wps="http://schemas.microsoft.com/office/word/2010/wordprocessingShape" mc:Ignorable="w14 w15 w16se w16cid w16 w16cex w16sdtdh w16sdtfl w16du wp14">
+<w:hdr xmlns:wpc="http://schemas.microsoft.com/office/word/2010/wordprocessingCanvas" xmlns:cx="http://schemas.microsoft.com/office/drawing/2014/chartex" xmlns:cx1="http://schemas.microsoft.com/office/drawing/2015/9/8/chartex" xmlns:cx2="http://schemas.microsoft.com/office/drawing/2015/10/21/chartex" xmlns:cx3="http://schemas.microsoft.com/office/drawing/2016/5/9/chartex" xmlns:cx4="http://schemas.microsoft.com/office/drawing/2016/5/10/chartex" xmlns:cx5="http://schemas.microsoft.com/office/drawing/2016/5/11/chartex" xmlns:cx6="http://schemas.microsoft.com/office/drawing/2016/5/12/chartex" xmlns:cx7="http://schemas.microsoft.com/office/drawing/2016/5/13/chartex" xmlns:cx8="http://schemas.microsoft.com/office/drawing/2016/5/14/chartex" xmlns:mc="http://schemas.openxmlformats.org/markup-compatibility/2006" xmlns:aink="http://schemas.microsoft.com/office/drawing/2016/ink" xmlns:am3d="http://schemas.microsoft.com/office/drawing/2017/model3d" xmlns:o="urn:schemas-microsoft-com:office:office" xmlns:r="http://schemas.openxmlformats.org/officeDocument/2006/relationships" xmlns:m="http://schemas.openxmlformats.org/officeDocument/2006/math" xmlns:v="urn:schemas-microsoft-com:vml" xmlns:wp14="http://schemas.microsoft.com/office/word/2010/wordprocessingDrawing" xmlns:wp="http://schemas.openxmlformats.org/drawingml/2006/wordprocessingDrawing" xmlns:w10="urn:schemas-microsoft-com:office:word" xmlns:w="http://schemas.openxmlformats.org/wordprocessingml/2006/main" xmlns:w14="http://schemas.microsoft.com/office/word/2010/wordml" xmlns:w15="http://schemas.microsoft.com/office/word/2012/wordml" xmlns:w16cid="http://schemas.microsoft.com/office/word/2016/wordml/cid" xmlns:w16se="http://schemas.microsoft.com/office/word/2015/wordml/symex" xmlns:wpg="http://schemas.microsoft.com/office/word/2010/wordprocessingGroup" xmlns:wpi="http://schemas.microsoft.com/office/word/2010/wordprocessingInk" xmlns:wne="http://schemas.microsoft.com/office/word/2006/wordml" xmlns:wps="http://schemas.microsoft.com/office/word/2010/wordprocessingShape" mc:Ignorable="w14 w15 w16se w16cid wp14">
   <w:p>
     <w:pPr>
       <w:pStyle w:val="Supportingdocument"/>
@@ -35577,7 +36721,7 @@
 </file>
 
 <file path=word/header2.xml><?xml version="1.0" encoding="utf-8"?>
-<w:hdr xmlns:wpc="http://schemas.microsoft.com/office/word/2010/wordprocessingCanvas" xmlns:cx="http://schemas.microsoft.com/office/drawing/2014/chartex" xmlns:cx1="http://schemas.microsoft.com/office/drawing/2015/9/8/chartex" xmlns:cx2="http://schemas.microsoft.com/office/drawing/2015/10/21/chartex" xmlns:cx3="http://schemas.microsoft.com/office/drawing/2016/5/9/chartex" xmlns:cx4="http://schemas.microsoft.com/office/drawing/2016/5/10/chartex" xmlns:cx5="http://schemas.microsoft.com/office/drawing/2016/5/11/chartex" xmlns:cx6="http://schemas.microsoft.com/office/drawing/2016/5/12/chartex" xmlns:cx7="http://schemas.microsoft.com/office/drawing/2016/5/13/chartex" xmlns:cx8="http://schemas.microsoft.com/office/drawing/2016/5/14/chartex" xmlns:mc="http://schemas.openxmlformats.org/markup-compatibility/2006" xmlns:aink="http://schemas.microsoft.com/office/drawing/2016/ink" xmlns:am3d="http://schemas.microsoft.com/office/drawing/2017/model3d" xmlns:o="urn:schemas-microsoft-com:office:office" xmlns:oel="http://schemas.microsoft.com/office/2019/extlst" xmlns:r="http://schemas.openxmlformats.org/officeDocument/2006/relationships" xmlns:m="http://schemas.openxmlformats.org/officeDocument/2006/math" xmlns:v="urn:schemas-microsoft-com:vml" xmlns:wp14="http://schemas.microsoft.com/office/word/2010/wordprocessingDrawing" xmlns:wp="http://schemas.openxmlformats.org/drawingml/2006/wordprocessingDrawing" xmlns:w10="urn:schemas-microsoft-com:office:word" xmlns:w="http://schemas.openxmlformats.org/wordprocessingml/2006/main" xmlns:w14="http://schemas.microsoft.com/office/word/2010/wordml" xmlns:w15="http://schemas.microsoft.com/office/word/2012/wordml" xmlns:w16cex="http://schemas.microsoft.com/office/word/2018/wordml/cex" xmlns:w16cid="http://schemas.microsoft.com/office/word/2016/wordml/cid" xmlns:w16="http://schemas.microsoft.com/office/word/2018/wordml" xmlns:w16du="http://schemas.microsoft.com/office/word/2023/wordml/word16du" xmlns:w16sdtdh="http://schemas.microsoft.com/office/word/2020/wordml/sdtdatahash" xmlns:w16sdtfl="http://schemas.microsoft.com/office/word/2024/wordml/sdtformatlock" xmlns:w16se="http://schemas.microsoft.com/office/word/2015/wordml/symex" xmlns:wpg="http://schemas.microsoft.com/office/word/2010/wordprocessingGroup" xmlns:wpi="http://schemas.microsoft.com/office/word/2010/wordprocessingInk" xmlns:wne="http://schemas.microsoft.com/office/word/2006/wordml" xmlns:wps="http://schemas.microsoft.com/office/word/2010/wordprocessingShape" mc:Ignorable="w14 w15 w16se w16cid w16 w16cex w16sdtdh w16sdtfl w16du wp14">
+<w:hdr xmlns:wpc="http://schemas.microsoft.com/office/word/2010/wordprocessingCanvas" xmlns:cx="http://schemas.microsoft.com/office/drawing/2014/chartex" xmlns:cx1="http://schemas.microsoft.com/office/drawing/2015/9/8/chartex" xmlns:cx2="http://schemas.microsoft.com/office/drawing/2015/10/21/chartex" xmlns:cx3="http://schemas.microsoft.com/office/drawing/2016/5/9/chartex" xmlns:cx4="http://schemas.microsoft.com/office/drawing/2016/5/10/chartex" xmlns:cx5="http://schemas.microsoft.com/office/drawing/2016/5/11/chartex" xmlns:cx6="http://schemas.microsoft.com/office/drawing/2016/5/12/chartex" xmlns:cx7="http://schemas.microsoft.com/office/drawing/2016/5/13/chartex" xmlns:cx8="http://schemas.microsoft.com/office/drawing/2016/5/14/chartex" xmlns:mc="http://schemas.openxmlformats.org/markup-compatibility/2006" xmlns:aink="http://schemas.microsoft.com/office/drawing/2016/ink" xmlns:am3d="http://schemas.microsoft.com/office/drawing/2017/model3d" xmlns:o="urn:schemas-microsoft-com:office:office" xmlns:r="http://schemas.openxmlformats.org/officeDocument/2006/relationships" xmlns:m="http://schemas.openxmlformats.org/officeDocument/2006/math" xmlns:v="urn:schemas-microsoft-com:vml" xmlns:wp14="http://schemas.microsoft.com/office/word/2010/wordprocessingDrawing" xmlns:wp="http://schemas.openxmlformats.org/drawingml/2006/wordprocessingDrawing" xmlns:w10="urn:schemas-microsoft-com:office:word" xmlns:w="http://schemas.openxmlformats.org/wordprocessingml/2006/main" xmlns:w14="http://schemas.microsoft.com/office/word/2010/wordml" xmlns:w15="http://schemas.microsoft.com/office/word/2012/wordml" xmlns:w16cid="http://schemas.microsoft.com/office/word/2016/wordml/cid" xmlns:w16se="http://schemas.microsoft.com/office/word/2015/wordml/symex" xmlns:wpg="http://schemas.microsoft.com/office/word/2010/wordprocessingGroup" xmlns:wpi="http://schemas.microsoft.com/office/word/2010/wordprocessingInk" xmlns:wne="http://schemas.microsoft.com/office/word/2006/wordml" xmlns:wps="http://schemas.microsoft.com/office/word/2010/wordprocessingShape" mc:Ignorable="w14 w15 w16se w16cid wp14">
   <w:p>
     <w:pPr>
       <w:pStyle w:val="Supportingdocument"/>
@@ -35606,7 +36750,7 @@
 </file>
 
 <file path=word/numbering.xml><?xml version="1.0" encoding="utf-8"?>
-<w:numbering xmlns:wpc="http://schemas.microsoft.com/office/word/2010/wordprocessingCanvas" xmlns:cx="http://schemas.microsoft.com/office/drawing/2014/chartex" xmlns:cx1="http://schemas.microsoft.com/office/drawing/2015/9/8/chartex" xmlns:cx2="http://schemas.microsoft.com/office/drawing/2015/10/21/chartex" xmlns:cx3="http://schemas.microsoft.com/office/drawing/2016/5/9/chartex" xmlns:cx4="http://schemas.microsoft.com/office/drawing/2016/5/10/chartex" xmlns:cx5="http://schemas.microsoft.com/office/drawing/2016/5/11/chartex" xmlns:cx6="http://schemas.microsoft.com/office/drawing/2016/5/12/chartex" xmlns:cx7="http://schemas.microsoft.com/office/drawing/2016/5/13/chartex" xmlns:cx8="http://schemas.microsoft.com/office/drawing/2016/5/14/chartex" xmlns:mc="http://schemas.openxmlformats.org/markup-compatibility/2006" xmlns:aink="http://schemas.microsoft.com/office/drawing/2016/ink" xmlns:am3d="http://schemas.microsoft.com/office/drawing/2017/model3d" xmlns:o="urn:schemas-microsoft-com:office:office" xmlns:oel="http://schemas.microsoft.com/office/2019/extlst" xmlns:r="http://schemas.openxmlformats.org/officeDocument/2006/relationships" xmlns:m="http://schemas.openxmlformats.org/officeDocument/2006/math" xmlns:v="urn:schemas-microsoft-com:vml" xmlns:wp14="http://schemas.microsoft.com/office/word/2010/wordprocessingDrawing" xmlns:wp="http://schemas.openxmlformats.org/drawingml/2006/wordprocessingDrawing" xmlns:w10="urn:schemas-microsoft-com:office:word" xmlns:w="http://schemas.openxmlformats.org/wordprocessingml/2006/main" xmlns:w14="http://schemas.microsoft.com/office/word/2010/wordml" xmlns:w15="http://schemas.microsoft.com/office/word/2012/wordml" xmlns:w16cex="http://schemas.microsoft.com/office/word/2018/wordml/cex" xmlns:w16cid="http://schemas.microsoft.com/office/word/2016/wordml/cid" xmlns:w16="http://schemas.microsoft.com/office/word/2018/wordml" xmlns:w16du="http://schemas.microsoft.com/office/word/2023/wordml/word16du" xmlns:w16sdtdh="http://schemas.microsoft.com/office/word/2020/wordml/sdtdatahash" xmlns:w16sdtfl="http://schemas.microsoft.com/office/word/2024/wordml/sdtformatlock" xmlns:w16se="http://schemas.microsoft.com/office/word/2015/wordml/symex" xmlns:wpg="http://schemas.microsoft.com/office/word/2010/wordprocessingGroup" xmlns:wpi="http://schemas.microsoft.com/office/word/2010/wordprocessingInk" xmlns:wne="http://schemas.microsoft.com/office/word/2006/wordml" xmlns:wps="http://schemas.microsoft.com/office/word/2010/wordprocessingShape" mc:Ignorable="w14 w15 w16se w16cid w16 w16cex w16sdtdh w16sdtfl w16du wp14">
+<w:numbering xmlns:wpc="http://schemas.microsoft.com/office/word/2010/wordprocessingCanvas" xmlns:cx="http://schemas.microsoft.com/office/drawing/2014/chartex" xmlns:cx1="http://schemas.microsoft.com/office/drawing/2015/9/8/chartex" xmlns:cx2="http://schemas.microsoft.com/office/drawing/2015/10/21/chartex" xmlns:cx3="http://schemas.microsoft.com/office/drawing/2016/5/9/chartex" xmlns:cx4="http://schemas.microsoft.com/office/drawing/2016/5/10/chartex" xmlns:cx5="http://schemas.microsoft.com/office/drawing/2016/5/11/chartex" xmlns:cx6="http://schemas.microsoft.com/office/drawing/2016/5/12/chartex" xmlns:cx7="http://schemas.microsoft.com/office/drawing/2016/5/13/chartex" xmlns:cx8="http://schemas.microsoft.com/office/drawing/2016/5/14/chartex" xmlns:mc="http://schemas.openxmlformats.org/markup-compatibility/2006" xmlns:aink="http://schemas.microsoft.com/office/drawing/2016/ink" xmlns:am3d="http://schemas.microsoft.com/office/drawing/2017/model3d" xmlns:o="urn:schemas-microsoft-com:office:office" xmlns:r="http://schemas.openxmlformats.org/officeDocument/2006/relationships" xmlns:m="http://schemas.openxmlformats.org/officeDocument/2006/math" xmlns:v="urn:schemas-microsoft-com:vml" xmlns:wp14="http://schemas.microsoft.com/office/word/2010/wordprocessingDrawing" xmlns:wp="http://schemas.openxmlformats.org/drawingml/2006/wordprocessingDrawing" xmlns:w10="urn:schemas-microsoft-com:office:word" xmlns:w="http://schemas.openxmlformats.org/wordprocessingml/2006/main" xmlns:w14="http://schemas.microsoft.com/office/word/2010/wordml" xmlns:w15="http://schemas.microsoft.com/office/word/2012/wordml" xmlns:w16cid="http://schemas.microsoft.com/office/word/2016/wordml/cid" xmlns:w16se="http://schemas.microsoft.com/office/word/2015/wordml/symex" xmlns:wpg="http://schemas.microsoft.com/office/word/2010/wordprocessingGroup" xmlns:wpi="http://schemas.microsoft.com/office/word/2010/wordprocessingInk" xmlns:wne="http://schemas.microsoft.com/office/word/2006/wordml" xmlns:wps="http://schemas.microsoft.com/office/word/2010/wordprocessingShape" mc:Ignorable="w14 w15 w16se w16cid wp14">
   <w:abstractNum w:abstractNumId="0" w15:restartNumberingAfterBreak="0">
     <w:nsid w:val="0262213B"/>
     <w:multiLevelType w:val="hybridMultilevel"/>
@@ -40051,67 +41195,67 @@
       </w:rPr>
     </w:lvl>
   </w:abstractNum>
-  <w:num w:numId="1" w16cid:durableId="1076393960">
+  <w:num w:numId="1">
     <w:abstractNumId w:val="29"/>
   </w:num>
-  <w:num w:numId="2" w16cid:durableId="977803242">
+  <w:num w:numId="2">
     <w:abstractNumId w:val="10"/>
   </w:num>
-  <w:num w:numId="3" w16cid:durableId="1375697105">
+  <w:num w:numId="3">
     <w:abstractNumId w:val="2"/>
   </w:num>
-  <w:num w:numId="4" w16cid:durableId="2044206134">
+  <w:num w:numId="4">
     <w:abstractNumId w:val="23"/>
   </w:num>
-  <w:num w:numId="5" w16cid:durableId="330333225">
+  <w:num w:numId="5">
     <w:abstractNumId w:val="17"/>
   </w:num>
-  <w:num w:numId="6" w16cid:durableId="1908806452">
+  <w:num w:numId="6">
     <w:abstractNumId w:val="13"/>
   </w:num>
-  <w:num w:numId="7" w16cid:durableId="1939022375">
+  <w:num w:numId="7">
     <w:abstractNumId w:val="32"/>
   </w:num>
-  <w:num w:numId="8" w16cid:durableId="1852403491">
+  <w:num w:numId="8">
     <w:abstractNumId w:val="15"/>
   </w:num>
-  <w:num w:numId="9" w16cid:durableId="1986858048">
+  <w:num w:numId="9">
     <w:abstractNumId w:val="22"/>
   </w:num>
-  <w:num w:numId="10" w16cid:durableId="2141340919">
+  <w:num w:numId="10">
     <w:abstractNumId w:val="34"/>
   </w:num>
-  <w:num w:numId="11" w16cid:durableId="1968733629">
+  <w:num w:numId="11">
     <w:abstractNumId w:val="9"/>
   </w:num>
-  <w:num w:numId="12" w16cid:durableId="70003015">
+  <w:num w:numId="12">
     <w:abstractNumId w:val="28"/>
   </w:num>
-  <w:num w:numId="13" w16cid:durableId="1874923666">
+  <w:num w:numId="13">
     <w:abstractNumId w:val="11"/>
   </w:num>
-  <w:num w:numId="14" w16cid:durableId="965887608">
+  <w:num w:numId="14">
     <w:abstractNumId w:val="3"/>
   </w:num>
-  <w:num w:numId="15" w16cid:durableId="2043168596">
+  <w:num w:numId="15">
     <w:abstractNumId w:val="26"/>
   </w:num>
-  <w:num w:numId="16" w16cid:durableId="1648240745">
+  <w:num w:numId="16">
     <w:abstractNumId w:val="7"/>
   </w:num>
-  <w:num w:numId="17" w16cid:durableId="212159220">
+  <w:num w:numId="17">
     <w:abstractNumId w:val="39"/>
   </w:num>
-  <w:num w:numId="18" w16cid:durableId="1459955084">
+  <w:num w:numId="18">
     <w:abstractNumId w:val="20"/>
   </w:num>
-  <w:num w:numId="19" w16cid:durableId="1394353681">
+  <w:num w:numId="19">
     <w:abstractNumId w:val="25"/>
   </w:num>
-  <w:num w:numId="20" w16cid:durableId="1284775186">
+  <w:num w:numId="20">
     <w:abstractNumId w:val="41"/>
   </w:num>
-  <w:num w:numId="21" w16cid:durableId="515772644">
+  <w:num w:numId="21">
     <w:abstractNumId w:val="5"/>
     <w:lvlOverride w:ilvl="0">
       <w:startOverride w:val="1"/>
@@ -40139,7 +41283,7 @@
       <w:startOverride w:val="1"/>
     </w:lvlOverride>
   </w:num>
-  <w:num w:numId="22" w16cid:durableId="1010835371">
+  <w:num w:numId="22">
     <w:abstractNumId w:val="40"/>
     <w:lvlOverride w:ilvl="0">
       <w:startOverride w:val="1"/>
@@ -40169,7 +41313,7 @@
       <w:startOverride w:val="1"/>
     </w:lvlOverride>
   </w:num>
-  <w:num w:numId="23" w16cid:durableId="460541466">
+  <w:num w:numId="23">
     <w:abstractNumId w:val="1"/>
     <w:lvlOverride w:ilvl="0">
       <w:startOverride w:val="1"/>
@@ -40199,13 +41343,13 @@
       <w:startOverride w:val="1"/>
     </w:lvlOverride>
   </w:num>
-  <w:num w:numId="24" w16cid:durableId="1140810588">
+  <w:num w:numId="24">
     <w:abstractNumId w:val="30"/>
   </w:num>
-  <w:num w:numId="25" w16cid:durableId="2138142620">
+  <w:num w:numId="25">
     <w:abstractNumId w:val="14"/>
   </w:num>
-  <w:num w:numId="26" w16cid:durableId="958804603">
+  <w:num w:numId="26">
     <w:abstractNumId w:val="16"/>
     <w:lvlOverride w:ilvl="0">
       <w:startOverride w:val="1"/>
@@ -40235,10 +41379,10 @@
       <w:startOverride w:val="1"/>
     </w:lvlOverride>
   </w:num>
-  <w:num w:numId="27" w16cid:durableId="2052806217">
+  <w:num w:numId="27">
     <w:abstractNumId w:val="27"/>
   </w:num>
-  <w:num w:numId="28" w16cid:durableId="1913586717">
+  <w:num w:numId="28">
     <w:abstractNumId w:val="24"/>
     <w:lvlOverride w:ilvl="0">
       <w:startOverride w:val="1"/>
@@ -40266,7 +41410,7 @@
       <w:startOverride w:val="1"/>
     </w:lvlOverride>
   </w:num>
-  <w:num w:numId="29" w16cid:durableId="177089258">
+  <w:num w:numId="29">
     <w:abstractNumId w:val="37"/>
     <w:lvlOverride w:ilvl="0">
       <w:startOverride w:val="1"/>
@@ -40296,7 +41440,7 @@
       <w:startOverride w:val="1"/>
     </w:lvlOverride>
   </w:num>
-  <w:num w:numId="30" w16cid:durableId="922379220">
+  <w:num w:numId="30">
     <w:abstractNumId w:val="33"/>
     <w:lvlOverride w:ilvl="0">
       <w:startOverride w:val="1"/>
@@ -40322,10 +41466,10 @@
       <w:startOverride w:val="1"/>
     </w:lvlOverride>
   </w:num>
-  <w:num w:numId="31" w16cid:durableId="1773014894">
+  <w:num w:numId="31">
     <w:abstractNumId w:val="42"/>
   </w:num>
-  <w:num w:numId="32" w16cid:durableId="741953376">
+  <w:num w:numId="32">
     <w:abstractNumId w:val="8"/>
     <w:lvlOverride w:ilvl="0">
       <w:startOverride w:val="1"/>
@@ -40355,7 +41499,7 @@
       <w:startOverride w:val="1"/>
     </w:lvlOverride>
   </w:num>
-  <w:num w:numId="33" w16cid:durableId="8071133">
+  <w:num w:numId="33">
     <w:abstractNumId w:val="21"/>
     <w:lvlOverride w:ilvl="0">
       <w:startOverride w:val="1"/>
@@ -40385,34 +41529,34 @@
       <w:startOverride w:val="1"/>
     </w:lvlOverride>
   </w:num>
-  <w:num w:numId="34" w16cid:durableId="1985307431">
+  <w:num w:numId="34">
     <w:abstractNumId w:val="19"/>
   </w:num>
-  <w:num w:numId="35" w16cid:durableId="170485587">
+  <w:num w:numId="35">
     <w:abstractNumId w:val="0"/>
   </w:num>
-  <w:num w:numId="36" w16cid:durableId="2038189287">
+  <w:num w:numId="36">
     <w:abstractNumId w:val="6"/>
   </w:num>
-  <w:num w:numId="37" w16cid:durableId="521356235">
+  <w:num w:numId="37">
     <w:abstractNumId w:val="18"/>
   </w:num>
-  <w:num w:numId="38" w16cid:durableId="207911403">
+  <w:num w:numId="38">
     <w:abstractNumId w:val="4"/>
   </w:num>
-  <w:num w:numId="39" w16cid:durableId="300505243">
+  <w:num w:numId="39">
     <w:abstractNumId w:val="31"/>
   </w:num>
-  <w:num w:numId="40" w16cid:durableId="611400692">
+  <w:num w:numId="40">
     <w:abstractNumId w:val="35"/>
   </w:num>
-  <w:num w:numId="41" w16cid:durableId="1990866103">
+  <w:num w:numId="41">
     <w:abstractNumId w:val="38"/>
   </w:num>
-  <w:num w:numId="42" w16cid:durableId="1501585244">
+  <w:num w:numId="42">
     <w:abstractNumId w:val="12"/>
   </w:num>
-  <w:num w:numId="43" w16cid:durableId="1942370726">
+  <w:num w:numId="43">
     <w:abstractNumId w:val="36"/>
   </w:num>
   <w:numIdMacAtCleanup w:val="40"/>
@@ -40420,7 +41564,7 @@
 </file>
 
 <file path=word/styles.xml><?xml version="1.0" encoding="utf-8"?>
-<w:styles xmlns:mc="http://schemas.openxmlformats.org/markup-compatibility/2006" xmlns:r="http://schemas.openxmlformats.org/officeDocument/2006/relationships" xmlns:w="http://schemas.openxmlformats.org/wordprocessingml/2006/main" xmlns:w14="http://schemas.microsoft.com/office/word/2010/wordml" xmlns:w15="http://schemas.microsoft.com/office/word/2012/wordml" xmlns:w16cex="http://schemas.microsoft.com/office/word/2018/wordml/cex" xmlns:w16cid="http://schemas.microsoft.com/office/word/2016/wordml/cid" xmlns:w16="http://schemas.microsoft.com/office/word/2018/wordml" xmlns:w16du="http://schemas.microsoft.com/office/word/2023/wordml/word16du" xmlns:w16sdtdh="http://schemas.microsoft.com/office/word/2020/wordml/sdtdatahash" xmlns:w16sdtfl="http://schemas.microsoft.com/office/word/2024/wordml/sdtformatlock" xmlns:w16se="http://schemas.microsoft.com/office/word/2015/wordml/symex" mc:Ignorable="w14 w15 w16se w16cid w16 w16cex w16sdtdh w16sdtfl w16du">
+<w:styles xmlns:mc="http://schemas.openxmlformats.org/markup-compatibility/2006" xmlns:r="http://schemas.openxmlformats.org/officeDocument/2006/relationships" xmlns:w="http://schemas.openxmlformats.org/wordprocessingml/2006/main" xmlns:w14="http://schemas.microsoft.com/office/word/2010/wordml" xmlns:w15="http://schemas.microsoft.com/office/word/2012/wordml" xmlns:w16cid="http://schemas.microsoft.com/office/word/2016/wordml/cid" xmlns:w16se="http://schemas.microsoft.com/office/word/2015/wordml/symex" mc:Ignorable="w14 w15 w16se w16cid">
   <w:docDefaults>
     <w:rPrDefault>
       <w:rPr>
@@ -40430,7 +41574,7 @@
     </w:rPrDefault>
     <w:pPrDefault/>
   </w:docDefaults>
-  <w:latentStyles w:defLockedState="0" w:defUIPriority="99" w:defSemiHidden="0" w:defUnhideWhenUsed="0" w:defQFormat="0" w:count="376">
+  <w:latentStyles w:defLockedState="0" w:defUIPriority="99" w:defSemiHidden="0" w:defUnhideWhenUsed="0" w:defQFormat="0" w:count="375">
     <w:lsdException w:name="Normal" w:uiPriority="0" w:qFormat="1"/>
     <w:lsdException w:name="heading 1" w:uiPriority="9" w:qFormat="1"/>
     <w:lsdException w:name="heading 2" w:uiPriority="9" w:qFormat="1"/>
@@ -40806,7 +41950,6 @@
     <w:lsdException w:name="Smart Hyperlink" w:semiHidden="1" w:unhideWhenUsed="1"/>
     <w:lsdException w:name="Hashtag" w:semiHidden="1" w:unhideWhenUsed="1"/>
     <w:lsdException w:name="Unresolved Mention" w:semiHidden="1" w:unhideWhenUsed="1"/>
-    <w:lsdException w:name="Smart Link" w:semiHidden="1" w:unhideWhenUsed="1"/>
   </w:latentStyles>
   <w:style w:type="paragraph" w:default="1" w:styleId="Normal">
     <w:name w:val="Normal"/>
@@ -42686,7 +43829,7 @@
 </file>
 
 <file path=word/glossary/document.xml><?xml version="1.0" encoding="utf-8"?>
-<w:glossaryDocument xmlns:wpc="http://schemas.microsoft.com/office/word/2010/wordprocessingCanvas" xmlns:cx="http://schemas.microsoft.com/office/drawing/2014/chartex" xmlns:cx1="http://schemas.microsoft.com/office/drawing/2015/9/8/chartex" xmlns:cx2="http://schemas.microsoft.com/office/drawing/2015/10/21/chartex" xmlns:cx3="http://schemas.microsoft.com/office/drawing/2016/5/9/chartex" xmlns:cx4="http://schemas.microsoft.com/office/drawing/2016/5/10/chartex" xmlns:cx5="http://schemas.microsoft.com/office/drawing/2016/5/11/chartex" xmlns:cx6="http://schemas.microsoft.com/office/drawing/2016/5/12/chartex" xmlns:cx7="http://schemas.microsoft.com/office/drawing/2016/5/13/chartex" xmlns:cx8="http://schemas.microsoft.com/office/drawing/2016/5/14/chartex" xmlns:mc="http://schemas.openxmlformats.org/markup-compatibility/2006" xmlns:aink="http://schemas.microsoft.com/office/drawing/2016/ink" xmlns:am3d="http://schemas.microsoft.com/office/drawing/2017/model3d" xmlns:o="urn:schemas-microsoft-com:office:office" xmlns:oel="http://schemas.microsoft.com/office/2019/extlst" xmlns:r="http://schemas.openxmlformats.org/officeDocument/2006/relationships" xmlns:m="http://schemas.openxmlformats.org/officeDocument/2006/math" xmlns:v="urn:schemas-microsoft-com:vml" xmlns:wp14="http://schemas.microsoft.com/office/word/2010/wordprocessingDrawing" xmlns:wp="http://schemas.openxmlformats.org/drawingml/2006/wordprocessingDrawing" xmlns:w10="urn:schemas-microsoft-com:office:word" xmlns:w="http://schemas.openxmlformats.org/wordprocessingml/2006/main" xmlns:w14="http://schemas.microsoft.com/office/word/2010/wordml" xmlns:w15="http://schemas.microsoft.com/office/word/2012/wordml" xmlns:w16cex="http://schemas.microsoft.com/office/word/2018/wordml/cex" xmlns:w16cid="http://schemas.microsoft.com/office/word/2016/wordml/cid" xmlns:w16="http://schemas.microsoft.com/office/word/2018/wordml" xmlns:w16du="http://schemas.microsoft.com/office/word/2023/wordml/word16du" xmlns:w16sdtdh="http://schemas.microsoft.com/office/word/2020/wordml/sdtdatahash" xmlns:w16sdtfl="http://schemas.microsoft.com/office/word/2024/wordml/sdtformatlock" xmlns:w16se="http://schemas.microsoft.com/office/word/2015/wordml/symex" xmlns:wpg="http://schemas.microsoft.com/office/word/2010/wordprocessingGroup" xmlns:wpi="http://schemas.microsoft.com/office/word/2010/wordprocessingInk" xmlns:wne="http://schemas.microsoft.com/office/word/2006/wordml" xmlns:wps="http://schemas.microsoft.com/office/word/2010/wordprocessingShape" mc:Ignorable="w14 w15 w16se w16cid w16 w16cex w16sdtdh w16sdtfl w16du wp14">
+<w:glossaryDocument xmlns:wpc="http://schemas.microsoft.com/office/word/2010/wordprocessingCanvas" xmlns:cx="http://schemas.microsoft.com/office/drawing/2014/chartex" xmlns:cx1="http://schemas.microsoft.com/office/drawing/2015/9/8/chartex" xmlns:cx2="http://schemas.microsoft.com/office/drawing/2015/10/21/chartex" xmlns:cx3="http://schemas.microsoft.com/office/drawing/2016/5/9/chartex" xmlns:cx4="http://schemas.microsoft.com/office/drawing/2016/5/10/chartex" xmlns:cx5="http://schemas.microsoft.com/office/drawing/2016/5/11/chartex" xmlns:cx6="http://schemas.microsoft.com/office/drawing/2016/5/12/chartex" xmlns:cx7="http://schemas.microsoft.com/office/drawing/2016/5/13/chartex" xmlns:cx8="http://schemas.microsoft.com/office/drawing/2016/5/14/chartex" xmlns:mc="http://schemas.openxmlformats.org/markup-compatibility/2006" xmlns:aink="http://schemas.microsoft.com/office/drawing/2016/ink" xmlns:am3d="http://schemas.microsoft.com/office/drawing/2017/model3d" xmlns:o="urn:schemas-microsoft-com:office:office" xmlns:r="http://schemas.openxmlformats.org/officeDocument/2006/relationships" xmlns:m="http://schemas.openxmlformats.org/officeDocument/2006/math" xmlns:v="urn:schemas-microsoft-com:vml" xmlns:wp14="http://schemas.microsoft.com/office/word/2010/wordprocessingDrawing" xmlns:wp="http://schemas.openxmlformats.org/drawingml/2006/wordprocessingDrawing" xmlns:w10="urn:schemas-microsoft-com:office:word" xmlns:w="http://schemas.openxmlformats.org/wordprocessingml/2006/main" xmlns:w14="http://schemas.microsoft.com/office/word/2010/wordml" xmlns:w15="http://schemas.microsoft.com/office/word/2012/wordml" xmlns:w16cid="http://schemas.microsoft.com/office/word/2016/wordml/cid" xmlns:w16se="http://schemas.microsoft.com/office/word/2015/wordml/symex" xmlns:wpg="http://schemas.microsoft.com/office/word/2010/wordprocessingGroup" xmlns:wpi="http://schemas.microsoft.com/office/word/2010/wordprocessingInk" xmlns:wne="http://schemas.microsoft.com/office/word/2006/wordml" xmlns:wps="http://schemas.microsoft.com/office/word/2010/wordprocessingShape" mc:Ignorable="w14 w15 w16se w16cid wp14">
   <w:docParts>
     <w:docPart>
       <w:docPartPr>
@@ -42919,7 +44062,7 @@
 </file>
 
 <file path=word/glossary/fontTable.xml><?xml version="1.0" encoding="utf-8"?>
-<w:fonts xmlns:mc="http://schemas.openxmlformats.org/markup-compatibility/2006" xmlns:r="http://schemas.openxmlformats.org/officeDocument/2006/relationships" xmlns:w="http://schemas.openxmlformats.org/wordprocessingml/2006/main" xmlns:w14="http://schemas.microsoft.com/office/word/2010/wordml" xmlns:w15="http://schemas.microsoft.com/office/word/2012/wordml" xmlns:w16cex="http://schemas.microsoft.com/office/word/2018/wordml/cex" xmlns:w16cid="http://schemas.microsoft.com/office/word/2016/wordml/cid" xmlns:w16="http://schemas.microsoft.com/office/word/2018/wordml" xmlns:w16du="http://schemas.microsoft.com/office/word/2023/wordml/word16du" xmlns:w16sdtdh="http://schemas.microsoft.com/office/word/2020/wordml/sdtdatahash" xmlns:w16sdtfl="http://schemas.microsoft.com/office/word/2024/wordml/sdtformatlock" xmlns:w16se="http://schemas.microsoft.com/office/word/2015/wordml/symex" mc:Ignorable="w14 w15 w16se w16cid w16 w16cex w16sdtdh w16sdtfl w16du">
+<w:fonts xmlns:mc="http://schemas.openxmlformats.org/markup-compatibility/2006" xmlns:r="http://schemas.openxmlformats.org/officeDocument/2006/relationships" xmlns:w="http://schemas.openxmlformats.org/wordprocessingml/2006/main" xmlns:w14="http://schemas.microsoft.com/office/word/2010/wordml" xmlns:w15="http://schemas.microsoft.com/office/word/2012/wordml" xmlns:w16cid="http://schemas.microsoft.com/office/word/2016/wordml/cid" xmlns:w16se="http://schemas.microsoft.com/office/word/2015/wordml/symex" mc:Ignorable="w14 w15 w16se w16cid">
   <w:font w:name="Symbol">
     <w:panose1 w:val="05050102010706020507"/>
     <w:charset w:val="02"/>
@@ -42929,14 +44072,14 @@
   </w:font>
   <w:font w:name="Times New Roman">
     <w:panose1 w:val="02020603050405020304"/>
-    <w:charset w:val="A3"/>
+    <w:charset w:val="00"/>
     <w:family w:val="roman"/>
     <w:pitch w:val="variable"/>
     <w:sig w:usb0="E0002EFF" w:usb1="C000785B" w:usb2="00000009" w:usb3="00000000" w:csb0="000001FF" w:csb1="00000000"/>
   </w:font>
   <w:font w:name="Courier New">
     <w:panose1 w:val="02070309020205020404"/>
-    <w:charset w:val="A3"/>
+    <w:charset w:val="00"/>
     <w:family w:val="modern"/>
     <w:pitch w:val="fixed"/>
     <w:sig w:usb0="E0002EFF" w:usb1="C0007843" w:usb2="00000009" w:usb3="00000000" w:csb0="000001FF" w:csb1="00000000"/>
@@ -42950,14 +44093,14 @@
   </w:font>
   <w:font w:name="Arial">
     <w:panose1 w:val="020B0604020202020204"/>
-    <w:charset w:val="A3"/>
+    <w:charset w:val="00"/>
     <w:family w:val="swiss"/>
     <w:pitch w:val="variable"/>
     <w:sig w:usb0="E0002EFF" w:usb1="C000785B" w:usb2="00000009" w:usb3="00000000" w:csb0="000001FF" w:csb1="00000000"/>
   </w:font>
   <w:font w:name="Calibri">
     <w:panose1 w:val="020F0502020204030204"/>
-    <w:charset w:val="A3"/>
+    <w:charset w:val="00"/>
     <w:family w:val="swiss"/>
     <w:pitch w:val="variable"/>
     <w:sig w:usb0="E4002EFF" w:usb1="C200247B" w:usb2="00000009" w:usb3="00000000" w:csb0="000001FF" w:csb1="00000000"/>
@@ -42973,14 +44116,14 @@
   </w:font>
   <w:font w:name="Cambria">
     <w:panose1 w:val="02040503050406030204"/>
-    <w:charset w:val="A3"/>
+    <w:charset w:val="00"/>
     <w:family w:val="roman"/>
     <w:pitch w:val="variable"/>
     <w:sig w:usb0="E00006FF" w:usb1="420024FF" w:usb2="02000000" w:usb3="00000000" w:csb0="0000019F" w:csb1="00000000"/>
   </w:font>
   <w:font w:name="Segoe UI">
     <w:panose1 w:val="020B0502040204020203"/>
-    <w:charset w:val="A3"/>
+    <w:charset w:val="00"/>
     <w:family w:val="swiss"/>
     <w:pitch w:val="variable"/>
     <w:sig w:usb0="E4002EFF" w:usb1="C000E47F" w:usb2="00000009" w:usb3="00000000" w:csb0="000001FF" w:csb1="00000000"/>
@@ -42995,28 +44138,23 @@
   </w:font>
   <w:font w:name="Palatino Linotype">
     <w:panose1 w:val="02040502050505030304"/>
-    <w:charset w:val="A3"/>
+    <w:charset w:val="00"/>
     <w:family w:val="roman"/>
     <w:pitch w:val="variable"/>
     <w:sig w:usb0="E0000287" w:usb1="40000013" w:usb2="00000000" w:usb3="00000000" w:csb0="0000019F" w:csb1="00000000"/>
   </w:font>
-  <w:font w:name="Aptos">
+  <w:font w:name="Calibri Light">
+    <w:panose1 w:val="020F0302020204030204"/>
     <w:charset w:val="00"/>
     <w:family w:val="swiss"/>
     <w:pitch w:val="variable"/>
-    <w:sig w:usb0="20000287" w:usb1="00000003" w:usb2="00000000" w:usb3="00000000" w:csb0="0000019F" w:csb1="00000000"/>
-  </w:font>
-  <w:font w:name="Aptos Display">
-    <w:charset w:val="00"/>
-    <w:family w:val="swiss"/>
-    <w:pitch w:val="variable"/>
-    <w:sig w:usb0="20000287" w:usb1="00000003" w:usb2="00000000" w:usb3="00000000" w:csb0="0000019F" w:csb1="00000000"/>
+    <w:sig w:usb0="E4002EFF" w:usb1="C200247B" w:usb2="00000009" w:usb3="00000000" w:csb0="000001FF" w:csb1="00000000"/>
   </w:font>
 </w:fonts>
 </file>
 
 <file path=word/glossary/settings.xml><?xml version="1.0" encoding="utf-8"?>
-<w:settings xmlns:mc="http://schemas.openxmlformats.org/markup-compatibility/2006" xmlns:o="urn:schemas-microsoft-com:office:office" xmlns:r="http://schemas.openxmlformats.org/officeDocument/2006/relationships" xmlns:m="http://schemas.openxmlformats.org/officeDocument/2006/math" xmlns:v="urn:schemas-microsoft-com:vml" xmlns:w10="urn:schemas-microsoft-com:office:word" xmlns:w="http://schemas.openxmlformats.org/wordprocessingml/2006/main" xmlns:w14="http://schemas.microsoft.com/office/word/2010/wordml" xmlns:w15="http://schemas.microsoft.com/office/word/2012/wordml" xmlns:w16cex="http://schemas.microsoft.com/office/word/2018/wordml/cex" xmlns:w16cid="http://schemas.microsoft.com/office/word/2016/wordml/cid" xmlns:w16="http://schemas.microsoft.com/office/word/2018/wordml" xmlns:w16du="http://schemas.microsoft.com/office/word/2023/wordml/word16du" xmlns:w16sdtdh="http://schemas.microsoft.com/office/word/2020/wordml/sdtdatahash" xmlns:w16sdtfl="http://schemas.microsoft.com/office/word/2024/wordml/sdtformatlock" xmlns:w16se="http://schemas.microsoft.com/office/word/2015/wordml/symex" xmlns:sl="http://schemas.openxmlformats.org/schemaLibrary/2006/main" mc:Ignorable="w14 w15 w16se w16cid w16 w16cex w16sdtdh w16sdtfl w16du">
+<w:settings xmlns:mc="http://schemas.openxmlformats.org/markup-compatibility/2006" xmlns:o="urn:schemas-microsoft-com:office:office" xmlns:r="http://schemas.openxmlformats.org/officeDocument/2006/relationships" xmlns:m="http://schemas.openxmlformats.org/officeDocument/2006/math" xmlns:v="urn:schemas-microsoft-com:vml" xmlns:w10="urn:schemas-microsoft-com:office:word" xmlns:w="http://schemas.openxmlformats.org/wordprocessingml/2006/main" xmlns:w14="http://schemas.microsoft.com/office/word/2010/wordml" xmlns:w15="http://schemas.microsoft.com/office/word/2012/wordml" xmlns:w16cid="http://schemas.microsoft.com/office/word/2016/wordml/cid" xmlns:w16se="http://schemas.microsoft.com/office/word/2015/wordml/symex" xmlns:sl="http://schemas.openxmlformats.org/schemaLibrary/2006/main" mc:Ignorable="w14 w15 w16se w16cid">
   <w:view w:val="normal"/>
   <w:defaultTabStop w:val="720"/>
   <w:characterSpacingControl w:val="doNotCompress"/>
@@ -43031,6 +44169,7 @@
   </w:compat>
   <w:rsids>
     <w:rsidRoot w:val="003F4644"/>
+    <w:rsid w:val="0003142F"/>
     <w:rsid w:val="00041EC6"/>
     <w:rsid w:val="002400ED"/>
     <w:rsid w:val="002A6461"/>
@@ -43074,7 +44213,7 @@
 </file>
 
 <file path=word/glossary/styles.xml><?xml version="1.0" encoding="utf-8"?>
-<w:styles xmlns:mc="http://schemas.openxmlformats.org/markup-compatibility/2006" xmlns:r="http://schemas.openxmlformats.org/officeDocument/2006/relationships" xmlns:w="http://schemas.openxmlformats.org/wordprocessingml/2006/main" xmlns:w14="http://schemas.microsoft.com/office/word/2010/wordml" xmlns:w15="http://schemas.microsoft.com/office/word/2012/wordml" xmlns:w16cex="http://schemas.microsoft.com/office/word/2018/wordml/cex" xmlns:w16cid="http://schemas.microsoft.com/office/word/2016/wordml/cid" xmlns:w16="http://schemas.microsoft.com/office/word/2018/wordml" xmlns:w16du="http://schemas.microsoft.com/office/word/2023/wordml/word16du" xmlns:w16sdtdh="http://schemas.microsoft.com/office/word/2020/wordml/sdtdatahash" xmlns:w16sdtfl="http://schemas.microsoft.com/office/word/2024/wordml/sdtformatlock" xmlns:w16se="http://schemas.microsoft.com/office/word/2015/wordml/symex" mc:Ignorable="w14 w15 w16se w16cid w16 w16cex w16sdtdh w16sdtfl w16du">
+<w:styles xmlns:mc="http://schemas.openxmlformats.org/markup-compatibility/2006" xmlns:r="http://schemas.openxmlformats.org/officeDocument/2006/relationships" xmlns:w="http://schemas.openxmlformats.org/wordprocessingml/2006/main" xmlns:w14="http://schemas.microsoft.com/office/word/2010/wordml" xmlns:w15="http://schemas.microsoft.com/office/word/2012/wordml" xmlns:w16cid="http://schemas.microsoft.com/office/word/2016/wordml/cid" xmlns:w16se="http://schemas.microsoft.com/office/word/2015/wordml/symex" mc:Ignorable="w14 w15 w16se w16cid">
   <w:docDefaults>
     <w:rPrDefault>
       <w:rPr>
@@ -43092,7 +44231,7 @@
       </w:pPr>
     </w:pPrDefault>
   </w:docDefaults>
-  <w:latentStyles w:defLockedState="0" w:defUIPriority="99" w:defSemiHidden="0" w:defUnhideWhenUsed="0" w:defQFormat="0" w:count="376">
+  <w:latentStyles w:defLockedState="0" w:defUIPriority="99" w:defSemiHidden="0" w:defUnhideWhenUsed="0" w:defQFormat="0" w:count="375">
     <w:lsdException w:name="Normal" w:uiPriority="0" w:qFormat="1"/>
     <w:lsdException w:name="heading 1" w:uiPriority="9" w:qFormat="1"/>
     <w:lsdException w:name="heading 2" w:semiHidden="1" w:uiPriority="9" w:unhideWhenUsed="1" w:qFormat="1"/>
@@ -43468,7 +44607,6 @@
     <w:lsdException w:name="Smart Hyperlink" w:semiHidden="1" w:unhideWhenUsed="1"/>
     <w:lsdException w:name="Hashtag" w:semiHidden="1" w:unhideWhenUsed="1"/>
     <w:lsdException w:name="Unresolved Mention" w:semiHidden="1" w:unhideWhenUsed="1"/>
-    <w:lsdException w:name="Smart Link" w:semiHidden="1" w:unhideWhenUsed="1"/>
   </w:latentStyles>
   <w:style w:type="paragraph" w:default="1" w:styleId="Normal">
     <w:name w:val="Normal"/>
@@ -43526,7 +44664,7 @@
 </file>
 
 <file path=word/glossary/webSettings.xml><?xml version="1.0" encoding="utf-8"?>
-<w:webSettings xmlns:mc="http://schemas.openxmlformats.org/markup-compatibility/2006" xmlns:r="http://schemas.openxmlformats.org/officeDocument/2006/relationships" xmlns:w="http://schemas.openxmlformats.org/wordprocessingml/2006/main" xmlns:w14="http://schemas.microsoft.com/office/word/2010/wordml" xmlns:w15="http://schemas.microsoft.com/office/word/2012/wordml" xmlns:w16cex="http://schemas.microsoft.com/office/word/2018/wordml/cex" xmlns:w16cid="http://schemas.microsoft.com/office/word/2016/wordml/cid" xmlns:w16="http://schemas.microsoft.com/office/word/2018/wordml" xmlns:w16du="http://schemas.microsoft.com/office/word/2023/wordml/word16du" xmlns:w16sdtdh="http://schemas.microsoft.com/office/word/2020/wordml/sdtdatahash" xmlns:w16sdtfl="http://schemas.microsoft.com/office/word/2024/wordml/sdtformatlock" xmlns:w16se="http://schemas.microsoft.com/office/word/2015/wordml/symex" mc:Ignorable="w14 w15 w16se w16cid w16 w16cex w16sdtdh w16sdtfl w16du">
+<w:webSettings xmlns:mc="http://schemas.openxmlformats.org/markup-compatibility/2006" xmlns:r="http://schemas.openxmlformats.org/officeDocument/2006/relationships" xmlns:w="http://schemas.openxmlformats.org/wordprocessingml/2006/main" xmlns:w14="http://schemas.microsoft.com/office/word/2010/wordml" xmlns:w15="http://schemas.microsoft.com/office/word/2012/wordml" xmlns:w16cid="http://schemas.microsoft.com/office/word/2016/wordml/cid" xmlns:w16se="http://schemas.microsoft.com/office/word/2015/wordml/symex" mc:Ignorable="w14 w15 w16se w16cid">
   <w:optimizeForBrowser/>
   <w:allowPNG/>
 </w:webSettings>
@@ -43818,6 +44956,14 @@
 </file>
 
 <file path=customXml/item1.xml><?xml version="1.0" encoding="utf-8"?>
+<p:properties xmlns:p="http://schemas.microsoft.com/office/2006/metadata/properties" xmlns:xsi="http://www.w3.org/2001/XMLSchema-instance" xmlns:pc="http://schemas.microsoft.com/office/infopath/2007/PartnerControls">
+  <documentManagement>
+    <_activity xmlns="fc400f29-8ae2-4f02-aa36-8354319d8dd0" xsi:nil="true"/>
+  </documentManagement>
+</p:properties>
+</file>
+
+<file path=customXml/item2.xml><?xml version="1.0" encoding="utf-8"?>
 <?mso-contentType ?>
 <FormTemplates xmlns="http://schemas.microsoft.com/sharepoint/v3/contenttype/forms">
   <Display>DocumentLibraryForm</Display>
@@ -43826,19 +44972,7 @@
 </FormTemplates>
 </file>
 
-<file path=customXml/item2.xml><?xml version="1.0" encoding="utf-8"?>
-<b:Sources xmlns:b="http://schemas.openxmlformats.org/officeDocument/2006/bibliography" xmlns="http://schemas.openxmlformats.org/officeDocument/2006/bibliography" SelectedStyle="\APASixthEditionOfficeOnline.xsl" StyleName="APA" Version="6"/>
-</file>
-
 <file path=customXml/item3.xml><?xml version="1.0" encoding="utf-8"?>
-<p:properties xmlns:p="http://schemas.microsoft.com/office/2006/metadata/properties" xmlns:xsi="http://www.w3.org/2001/XMLSchema-instance" xmlns:pc="http://schemas.microsoft.com/office/infopath/2007/PartnerControls">
-  <documentManagement>
-    <_activity xmlns="fc400f29-8ae2-4f02-aa36-8354319d8dd0" xsi:nil="true"/>
-  </documentManagement>
-</p:properties>
-</file>
-
-<file path=customXml/item4.xml><?xml version="1.0" encoding="utf-8"?>
 <ct:contentTypeSchema xmlns:ct="http://schemas.microsoft.com/office/2006/metadata/contentType" xmlns:ma="http://schemas.microsoft.com/office/2006/metadata/properties/metaAttributes" ct:_="" ma:_="" ma:contentTypeName="Document" ma:contentTypeID="0x0101002FED5117B94A0C43BE657CFE95077C6E" ma:contentTypeVersion="17" ma:contentTypeDescription="Create a new document." ma:contentTypeScope="" ma:versionID="1b61ef74c0cf3f1787575cceeb5049c4">
   <xsd:schema xmlns:xsd="http://www.w3.org/2001/XMLSchema" xmlns:xs="http://www.w3.org/2001/XMLSchema" xmlns:p="http://schemas.microsoft.com/office/2006/metadata/properties" xmlns:ns3="fc400f29-8ae2-4f02-aa36-8354319d8dd0" xmlns:ns4="a53e46f7-009c-4700-bfb1-03be8983c549" targetNamespace="http://schemas.microsoft.com/office/2006/metadata/properties" ma:root="true" ma:fieldsID="a097de4b958cf184ce63d565c2177212" ns3:_="" ns4:_="">
     <xsd:import namespace="fc400f29-8ae2-4f02-aa36-8354319d8dd0"/>
@@ -44085,23 +45219,11 @@
 </ct:contentTypeSchema>
 </file>
 
-<file path=customXml/itemProps1.xml><?xml version="1.0" encoding="utf-8"?>
-<ds:datastoreItem xmlns:ds="http://schemas.openxmlformats.org/officeDocument/2006/customXml" ds:itemID="{E3499DD3-E433-4477-A8FE-2A9B10275570}">
-  <ds:schemaRefs>
-    <ds:schemaRef ds:uri="http://schemas.microsoft.com/sharepoint/v3/contenttype/forms"/>
-  </ds:schemaRefs>
-</ds:datastoreItem>
+<file path=customXml/item4.xml><?xml version="1.0" encoding="utf-8"?>
+<b:Sources xmlns:b="http://schemas.openxmlformats.org/officeDocument/2006/bibliography" xmlns="http://schemas.openxmlformats.org/officeDocument/2006/bibliography" SelectedStyle="\APASixthEditionOfficeOnline.xsl" StyleName="APA" Version="6"/>
 </file>
 
-<file path=customXml/itemProps2.xml><?xml version="1.0" encoding="utf-8"?>
-<ds:datastoreItem xmlns:ds="http://schemas.openxmlformats.org/officeDocument/2006/customXml" ds:itemID="{9679E33D-CEC4-4AA5-B8D2-DA1D33852BED}">
-  <ds:schemaRefs>
-    <ds:schemaRef ds:uri="http://schemas.openxmlformats.org/officeDocument/2006/bibliography"/>
-  </ds:schemaRefs>
-</ds:datastoreItem>
-</file>
-
-<file path=customXml/itemProps3.xml><?xml version="1.0" encoding="utf-8"?>
+<file path=customXml/itemProps1.xml><?xml version="1.0" encoding="utf-8"?>
 <ds:datastoreItem xmlns:ds="http://schemas.openxmlformats.org/officeDocument/2006/customXml" ds:itemID="{3A0AC818-964C-4D39-B25F-D98F3F83829C}">
   <ds:schemaRefs>
     <ds:schemaRef ds:uri="http://schemas.microsoft.com/office/2006/metadata/properties"/>
@@ -44111,7 +45233,15 @@
 </ds:datastoreItem>
 </file>
 
-<file path=customXml/itemProps4.xml><?xml version="1.0" encoding="utf-8"?>
+<file path=customXml/itemProps2.xml><?xml version="1.0" encoding="utf-8"?>
+<ds:datastoreItem xmlns:ds="http://schemas.openxmlformats.org/officeDocument/2006/customXml" ds:itemID="{E3499DD3-E433-4477-A8FE-2A9B10275570}">
+  <ds:schemaRefs>
+    <ds:schemaRef ds:uri="http://schemas.microsoft.com/sharepoint/v3/contenttype/forms"/>
+  </ds:schemaRefs>
+</ds:datastoreItem>
+</file>
+
+<file path=customXml/itemProps3.xml><?xml version="1.0" encoding="utf-8"?>
 <ds:datastoreItem xmlns:ds="http://schemas.openxmlformats.org/officeDocument/2006/customXml" ds:itemID="{B6942B79-D663-4AEC-A309-D8E420D7B2CD}">
   <ds:schemaRefs>
     <ds:schemaRef ds:uri="http://schemas.microsoft.com/office/2006/metadata/contentType"/>
@@ -44128,4 +45258,12 @@
     <ds:schemaRef ds:uri="http://schemas.microsoft.com/internal/obd"/>
   </ds:schemaRefs>
 </ds:datastoreItem>
+</file>
+
+<file path=customXml/itemProps4.xml><?xml version="1.0" encoding="utf-8"?>
+<ds:datastoreItem xmlns:ds="http://schemas.openxmlformats.org/officeDocument/2006/customXml" ds:itemID="{A3BEC2E9-9268-433C-8272-4C79EA6BCB1F}">
+  <ds:schemaRefs>
+    <ds:schemaRef ds:uri="http://schemas.openxmlformats.org/officeDocument/2006/bibliography"/>
+  </ds:schemaRefs>
+</ds:datastoreItem>
 </file>
</xml_diff>

<commit_message>
add file C# week 4
</commit_message>
<xml_diff>
--- a/javascript/Assessment Two/Javascript_Portfolio(LV)_V1.docx
+++ b/javascript/Assessment Two/Javascript_Portfolio(LV)_V1.docx
@@ -5408,6 +5408,8 @@
               <w:tab/>
               <w:t xml:space="preserve">merging and merge tools </w:t>
             </w:r>
+            <w:bookmarkStart w:id="0" w:name="_GoBack"/>
+            <w:bookmarkEnd w:id="0"/>
           </w:p>
           <w:p>
             <w:pPr>
@@ -5942,8 +5944,6 @@
               </w:rPr>
               <w:t>The repository structure should be well-organized, clear, and easy to understand.</w:t>
             </w:r>
-            <w:bookmarkStart w:id="0" w:name="_GoBack"/>
-            <w:bookmarkEnd w:id="0"/>
           </w:p>
           <w:p>
             <w:pPr>
@@ -6445,7 +6445,7 @@
               <w:rPr>
                 <w:b w:val="0"/>
               </w:rPr>
-              <w:t>such as Git, GitHub, GitLab.</w:t>
+              <w:t>such as Git</w:t>
             </w:r>
           </w:p>
           <w:p>
@@ -6489,10 +6489,7 @@
               <w:pStyle w:val="QuestionLearnerResponse"/>
             </w:pPr>
             <w:r>
-              <w:t xml:space="preserve">- </w:t>
-            </w:r>
-            <w:r>
-              <w:t>Create a branch for each new feature or bug fix, and ensure the work is done on a single branch.</w:t>
+              <w:t>- Create a branch for each new feature or bug fix, and ensure the work is done on a single branch.</w:t>
             </w:r>
           </w:p>
           <w:p>
@@ -6500,10 +6497,7 @@
               <w:pStyle w:val="QuestionLearnerResponse"/>
             </w:pPr>
             <w:r>
-              <w:t xml:space="preserve">- </w:t>
-            </w:r>
-            <w:r>
-              <w:t>Branch names should be clear and meaningful.</w:t>
+              <w:t>- Branch names should be clear and meaningful.</w:t>
             </w:r>
           </w:p>
           <w:p>
@@ -6511,10 +6505,7 @@
               <w:pStyle w:val="QuestionLearnerResponse"/>
             </w:pPr>
             <w:r>
-              <w:t xml:space="preserve">3. </w:t>
-            </w:r>
-            <w:r>
-              <w:t>Commit Practices</w:t>
+              <w:t>3. Commit Practices</w:t>
             </w:r>
           </w:p>
           <w:p>
@@ -6522,10 +6513,7 @@
               <w:pStyle w:val="QuestionLearnerResponse"/>
             </w:pPr>
             <w:r>
-              <w:t xml:space="preserve">- </w:t>
-            </w:r>
-            <w:r>
-              <w:t>Commit code frequently to track development progress.</w:t>
+              <w:t>- Commit code frequently to track development progress.</w:t>
             </w:r>
           </w:p>
           <w:p>
@@ -6533,10 +6521,7 @@
               <w:pStyle w:val="QuestionLearnerResponse"/>
             </w:pPr>
             <w:r>
-              <w:t xml:space="preserve">- </w:t>
-            </w:r>
-            <w:r>
-              <w:t>Commit messages should be clear and meaningful, explaining the changes made.</w:t>
+              <w:t>- Commit messages should be clear and meaningful, explaining the changes made.</w:t>
             </w:r>
           </w:p>
           <w:p>
@@ -6544,10 +6529,7 @@
               <w:pStyle w:val="QuestionLearnerResponse"/>
             </w:pPr>
             <w:r>
-              <w:t>4. Code Reviews</w:t>
-            </w:r>
-            <w:r>
-              <w:t>.</w:t>
+              <w:t>4. Code Reviews.</w:t>
             </w:r>
           </w:p>
           <w:p>
@@ -35031,19 +35013,7 @@
                 <w:rPr>
                   <w:rStyle w:val="Hyperlink"/>
                 </w:rPr>
-                <w:t>https://github.com/Amb</w:t>
-              </w:r>
-              <w:r>
-                <w:rPr>
-                  <w:rStyle w:val="Hyperlink"/>
-                </w:rPr>
-                <w:t>e</w:t>
-              </w:r>
-              <w:r>
-                <w:rPr>
-                  <w:rStyle w:val="Hyperlink"/>
-                </w:rPr>
-                <w:t>rside/the-programming-team-202510</w:t>
+                <w:t>https://github.com/Amberside/the-programming-team-202510</w:t>
               </w:r>
             </w:hyperlink>
           </w:p>
@@ -36081,7 +36051,7 @@
                     <adec:decorative xmlns:adec="http://schemas.microsoft.com/office/drawing/2017/decorative" val="1"/>
                   </a:ext>
                   <a:ext uri="{5AE41FA2-C0FF-4470-9BD4-5FADCA87CBE2}">
-                    <aclsh:classification xmlns:aclsh="http://schemas.microsoft.com/office/drawing/2020/classificationShape" xmlns:w16sdtfl="http://schemas.microsoft.com/office/word/2024/wordml/sdtformatlock" xmlns:w16sdtdh="http://schemas.microsoft.com/office/word/2020/wordml/sdtdatahash" xmlns:w16du="http://schemas.microsoft.com/office/word/2023/wordml/word16du" xmlns:w16="http://schemas.microsoft.com/office/word/2018/wordml" xmlns:w16cex="http://schemas.microsoft.com/office/word/2018/wordml/cex" xmlns:w="http://schemas.openxmlformats.org/wordprocessingml/2006/main" xmlns:w10="urn:schemas-microsoft-com:office:word" xmlns:v="urn:schemas-microsoft-com:vml" xmlns:oel="http://schemas.microsoft.com/office/2019/extlst" xmlns:o="urn:schemas-microsoft-com:office:office" xmlns="" classificationOutcomeType="ftr"/>
+                    <aclsh:classification xmlns="" xmlns:o="urn:schemas-microsoft-com:office:office" xmlns:oel="http://schemas.microsoft.com/office/2019/extlst" xmlns:v="urn:schemas-microsoft-com:vml" xmlns:w10="urn:schemas-microsoft-com:office:word" xmlns:w="http://schemas.openxmlformats.org/wordprocessingml/2006/main" xmlns:w16cex="http://schemas.microsoft.com/office/word/2018/wordml/cex" xmlns:w16="http://schemas.microsoft.com/office/word/2018/wordml" xmlns:w16du="http://schemas.microsoft.com/office/word/2023/wordml/word16du" xmlns:w16sdtdh="http://schemas.microsoft.com/office/word/2020/wordml/sdtdatahash" xmlns:w16sdtfl="http://schemas.microsoft.com/office/word/2024/wordml/sdtformatlock" xmlns:aclsh="http://schemas.microsoft.com/office/drawing/2020/classificationShape" classificationOutcomeType="ftr"/>
                   </a:ext>
                 </a:extLst>
               </wp:docPr>
@@ -36387,7 +36357,7 @@
                     <adec:decorative xmlns:adec="http://schemas.microsoft.com/office/drawing/2017/decorative" val="1"/>
                   </a:ext>
                   <a:ext uri="{5AE41FA2-C0FF-4470-9BD4-5FADCA87CBE2}">
-                    <aclsh:classification xmlns:aclsh="http://schemas.microsoft.com/office/drawing/2020/classificationShape" xmlns:w16sdtfl="http://schemas.microsoft.com/office/word/2024/wordml/sdtformatlock" xmlns:w16sdtdh="http://schemas.microsoft.com/office/word/2020/wordml/sdtdatahash" xmlns:w16du="http://schemas.microsoft.com/office/word/2023/wordml/word16du" xmlns:w16="http://schemas.microsoft.com/office/word/2018/wordml" xmlns:w16cex="http://schemas.microsoft.com/office/word/2018/wordml/cex" xmlns:w="http://schemas.openxmlformats.org/wordprocessingml/2006/main" xmlns:w10="urn:schemas-microsoft-com:office:word" xmlns:v="urn:schemas-microsoft-com:vml" xmlns:oel="http://schemas.microsoft.com/office/2019/extlst" xmlns:o="urn:schemas-microsoft-com:office:office" xmlns="" classificationOutcomeType="ftr"/>
+                    <aclsh:classification xmlns="" xmlns:o="urn:schemas-microsoft-com:office:office" xmlns:oel="http://schemas.microsoft.com/office/2019/extlst" xmlns:v="urn:schemas-microsoft-com:vml" xmlns:w10="urn:schemas-microsoft-com:office:word" xmlns:w="http://schemas.openxmlformats.org/wordprocessingml/2006/main" xmlns:w16cex="http://schemas.microsoft.com/office/word/2018/wordml/cex" xmlns:w16="http://schemas.microsoft.com/office/word/2018/wordml" xmlns:w16du="http://schemas.microsoft.com/office/word/2023/wordml/word16du" xmlns:w16sdtdh="http://schemas.microsoft.com/office/word/2020/wordml/sdtdatahash" xmlns:w16sdtfl="http://schemas.microsoft.com/office/word/2024/wordml/sdtformatlock" xmlns:aclsh="http://schemas.microsoft.com/office/drawing/2020/classificationShape" classificationOutcomeType="ftr"/>
                   </a:ext>
                 </a:extLst>
               </wp:docPr>
@@ -44185,6 +44155,7 @@
     <w:rsid w:val="00B96677"/>
     <w:rsid w:val="00C02992"/>
     <w:rsid w:val="00C07005"/>
+    <w:rsid w:val="00C1490F"/>
     <w:rsid w:val="00DA0F0E"/>
     <w:rsid w:val="00DE6AFD"/>
     <w:rsid w:val="00E1053A"/>
@@ -44956,23 +44927,6 @@
 </file>
 
 <file path=customXml/item1.xml><?xml version="1.0" encoding="utf-8"?>
-<p:properties xmlns:p="http://schemas.microsoft.com/office/2006/metadata/properties" xmlns:xsi="http://www.w3.org/2001/XMLSchema-instance" xmlns:pc="http://schemas.microsoft.com/office/infopath/2007/PartnerControls">
-  <documentManagement>
-    <_activity xmlns="fc400f29-8ae2-4f02-aa36-8354319d8dd0" xsi:nil="true"/>
-  </documentManagement>
-</p:properties>
-</file>
-
-<file path=customXml/item2.xml><?xml version="1.0" encoding="utf-8"?>
-<?mso-contentType ?>
-<FormTemplates xmlns="http://schemas.microsoft.com/sharepoint/v3/contenttype/forms">
-  <Display>DocumentLibraryForm</Display>
-  <Edit>DocumentLibraryForm</Edit>
-  <New>DocumentLibraryForm</New>
-</FormTemplates>
-</file>
-
-<file path=customXml/item3.xml><?xml version="1.0" encoding="utf-8"?>
 <ct:contentTypeSchema xmlns:ct="http://schemas.microsoft.com/office/2006/metadata/contentType" xmlns:ma="http://schemas.microsoft.com/office/2006/metadata/properties/metaAttributes" ct:_="" ma:_="" ma:contentTypeName="Document" ma:contentTypeID="0x0101002FED5117B94A0C43BE657CFE95077C6E" ma:contentTypeVersion="17" ma:contentTypeDescription="Create a new document." ma:contentTypeScope="" ma:versionID="1b61ef74c0cf3f1787575cceeb5049c4">
   <xsd:schema xmlns:xsd="http://www.w3.org/2001/XMLSchema" xmlns:xs="http://www.w3.org/2001/XMLSchema" xmlns:p="http://schemas.microsoft.com/office/2006/metadata/properties" xmlns:ns3="fc400f29-8ae2-4f02-aa36-8354319d8dd0" xmlns:ns4="a53e46f7-009c-4700-bfb1-03be8983c549" targetNamespace="http://schemas.microsoft.com/office/2006/metadata/properties" ma:root="true" ma:fieldsID="a097de4b958cf184ce63d565c2177212" ns3:_="" ns4:_="">
     <xsd:import namespace="fc400f29-8ae2-4f02-aa36-8354319d8dd0"/>
@@ -45219,29 +45173,28 @@
 </ct:contentTypeSchema>
 </file>
 
+<file path=customXml/item2.xml><?xml version="1.0" encoding="utf-8"?>
+<?mso-contentType ?>
+<FormTemplates xmlns="http://schemas.microsoft.com/sharepoint/v3/contenttype/forms">
+  <Display>DocumentLibraryForm</Display>
+  <Edit>DocumentLibraryForm</Edit>
+  <New>DocumentLibraryForm</New>
+</FormTemplates>
+</file>
+
+<file path=customXml/item3.xml><?xml version="1.0" encoding="utf-8"?>
+<p:properties xmlns:p="http://schemas.microsoft.com/office/2006/metadata/properties" xmlns:xsi="http://www.w3.org/2001/XMLSchema-instance" xmlns:pc="http://schemas.microsoft.com/office/infopath/2007/PartnerControls">
+  <documentManagement>
+    <_activity xmlns="fc400f29-8ae2-4f02-aa36-8354319d8dd0" xsi:nil="true"/>
+  </documentManagement>
+</p:properties>
+</file>
+
 <file path=customXml/item4.xml><?xml version="1.0" encoding="utf-8"?>
 <b:Sources xmlns:b="http://schemas.openxmlformats.org/officeDocument/2006/bibliography" xmlns="http://schemas.openxmlformats.org/officeDocument/2006/bibliography" SelectedStyle="\APASixthEditionOfficeOnline.xsl" StyleName="APA" Version="6"/>
 </file>
 
 <file path=customXml/itemProps1.xml><?xml version="1.0" encoding="utf-8"?>
-<ds:datastoreItem xmlns:ds="http://schemas.openxmlformats.org/officeDocument/2006/customXml" ds:itemID="{3A0AC818-964C-4D39-B25F-D98F3F83829C}">
-  <ds:schemaRefs>
-    <ds:schemaRef ds:uri="http://schemas.microsoft.com/office/2006/metadata/properties"/>
-    <ds:schemaRef ds:uri="http://schemas.microsoft.com/office/infopath/2007/PartnerControls"/>
-    <ds:schemaRef ds:uri="fc400f29-8ae2-4f02-aa36-8354319d8dd0"/>
-  </ds:schemaRefs>
-</ds:datastoreItem>
-</file>
-
-<file path=customXml/itemProps2.xml><?xml version="1.0" encoding="utf-8"?>
-<ds:datastoreItem xmlns:ds="http://schemas.openxmlformats.org/officeDocument/2006/customXml" ds:itemID="{E3499DD3-E433-4477-A8FE-2A9B10275570}">
-  <ds:schemaRefs>
-    <ds:schemaRef ds:uri="http://schemas.microsoft.com/sharepoint/v3/contenttype/forms"/>
-  </ds:schemaRefs>
-</ds:datastoreItem>
-</file>
-
-<file path=customXml/itemProps3.xml><?xml version="1.0" encoding="utf-8"?>
 <ds:datastoreItem xmlns:ds="http://schemas.openxmlformats.org/officeDocument/2006/customXml" ds:itemID="{B6942B79-D663-4AEC-A309-D8E420D7B2CD}">
   <ds:schemaRefs>
     <ds:schemaRef ds:uri="http://schemas.microsoft.com/office/2006/metadata/contentType"/>
@@ -45260,8 +45213,26 @@
 </ds:datastoreItem>
 </file>
 
+<file path=customXml/itemProps2.xml><?xml version="1.0" encoding="utf-8"?>
+<ds:datastoreItem xmlns:ds="http://schemas.openxmlformats.org/officeDocument/2006/customXml" ds:itemID="{E3499DD3-E433-4477-A8FE-2A9B10275570}">
+  <ds:schemaRefs>
+    <ds:schemaRef ds:uri="http://schemas.microsoft.com/sharepoint/v3/contenttype/forms"/>
+  </ds:schemaRefs>
+</ds:datastoreItem>
+</file>
+
+<file path=customXml/itemProps3.xml><?xml version="1.0" encoding="utf-8"?>
+<ds:datastoreItem xmlns:ds="http://schemas.openxmlformats.org/officeDocument/2006/customXml" ds:itemID="{3A0AC818-964C-4D39-B25F-D98F3F83829C}">
+  <ds:schemaRefs>
+    <ds:schemaRef ds:uri="http://schemas.microsoft.com/office/2006/metadata/properties"/>
+    <ds:schemaRef ds:uri="http://schemas.microsoft.com/office/infopath/2007/PartnerControls"/>
+    <ds:schemaRef ds:uri="fc400f29-8ae2-4f02-aa36-8354319d8dd0"/>
+  </ds:schemaRefs>
+</ds:datastoreItem>
+</file>
+
 <file path=customXml/itemProps4.xml><?xml version="1.0" encoding="utf-8"?>
-<ds:datastoreItem xmlns:ds="http://schemas.openxmlformats.org/officeDocument/2006/customXml" ds:itemID="{A3BEC2E9-9268-433C-8272-4C79EA6BCB1F}">
+<ds:datastoreItem xmlns:ds="http://schemas.openxmlformats.org/officeDocument/2006/customXml" ds:itemID="{19BD0735-121B-426B-B41D-F103CA6590C8}">
   <ds:schemaRefs>
     <ds:schemaRef ds:uri="http://schemas.openxmlformats.org/officeDocument/2006/bibliography"/>
   </ds:schemaRefs>

</xml_diff>

<commit_message>
Modify assessment HTML and CSS
</commit_message>
<xml_diff>
--- a/javascript/Assessment Two/Javascript_Portfolio(LV)_V1.docx
+++ b/javascript/Assessment Two/Javascript_Portfolio(LV)_V1.docx
@@ -887,7 +887,23 @@
                 <w:rStyle w:val="Strong"/>
                 <w:lang w:val="fr-FR"/>
               </w:rPr>
-              <w:t xml:space="preserve">Unit code: </w:t>
+              <w:t xml:space="preserve">Unit </w:t>
+            </w:r>
+            <w:proofErr w:type="gramStart"/>
+            <w:r>
+              <w:rPr>
+                <w:rStyle w:val="Strong"/>
+                <w:lang w:val="fr-FR"/>
+              </w:rPr>
+              <w:t>code:</w:t>
+            </w:r>
+            <w:proofErr w:type="gramEnd"/>
+            <w:r>
+              <w:rPr>
+                <w:rStyle w:val="Strong"/>
+                <w:lang w:val="fr-FR"/>
+              </w:rPr>
+              <w:t xml:space="preserve"> </w:t>
             </w:r>
           </w:p>
           <w:p>
@@ -2744,23 +2760,7 @@
               <w:ind w:left="-21"/>
             </w:pPr>
             <w:r>
-              <w:t xml:space="preserve">Applications are available through Holmesglen </w:t>
-            </w:r>
-            <w:proofErr w:type="spellStart"/>
-            <w:r>
-              <w:t>MyHorizon</w:t>
-            </w:r>
-            <w:proofErr w:type="spellEnd"/>
-            <w:r>
-              <w:t xml:space="preserve"> and some have free licences which can be downloaded via </w:t>
-            </w:r>
-            <w:proofErr w:type="spellStart"/>
-            <w:r>
-              <w:t>url</w:t>
-            </w:r>
-            <w:proofErr w:type="spellEnd"/>
-            <w:r>
-              <w:t xml:space="preserve"> below:</w:t>
+              <w:t>Applications are available through Holmesglen MyHorizon and some have free licences which can be downloaded via url below:</w:t>
             </w:r>
           </w:p>
           <w:p>
@@ -2784,15 +2784,7 @@
               <w:ind w:left="-21"/>
             </w:pPr>
             <w:r>
-              <w:t xml:space="preserve">•      </w:t>
-            </w:r>
-            <w:proofErr w:type="spellStart"/>
-            <w:r>
-              <w:t>MyHorizon</w:t>
-            </w:r>
-            <w:proofErr w:type="spellEnd"/>
-            <w:r>
-              <w:t xml:space="preserve"> - https://myHorizon.holmesglen.edu.au - free to download</w:t>
+              <w:t>•      MyHorizon - https://myHorizon.holmesglen.edu.au - free to download</w:t>
             </w:r>
           </w:p>
           <w:p>
@@ -2828,15 +2820,7 @@
               <w:ind w:left="-21"/>
             </w:pPr>
             <w:r>
-              <w:t xml:space="preserve">•      </w:t>
-            </w:r>
-            <w:proofErr w:type="spellStart"/>
-            <w:r>
-              <w:t>WebEx</w:t>
-            </w:r>
-            <w:proofErr w:type="spellEnd"/>
-            <w:r>
-              <w:t xml:space="preserve"> - https://holmesglen.webex.com/ - free to download</w:t>
+              <w:t>•      WebEx - https://holmesglen.webex.com/ - free to download</w:t>
             </w:r>
           </w:p>
           <w:p>
@@ -2896,15 +2880,7 @@
               <w:ind w:left="-21"/>
             </w:pPr>
             <w:r>
-              <w:t xml:space="preserve">•      </w:t>
-            </w:r>
-            <w:proofErr w:type="spellStart"/>
-            <w:r>
-              <w:t>ZBrush</w:t>
-            </w:r>
-            <w:proofErr w:type="spellEnd"/>
-            <w:r>
-              <w:t xml:space="preserve"> – https://pixologic.com/</w:t>
+              <w:t>•      ZBrush – https://pixologic.com/</w:t>
             </w:r>
           </w:p>
           <w:p>
@@ -2960,16 +2936,11 @@
               <w:pStyle w:val="BodyContentIndent1"/>
             </w:pPr>
             <w:r>
-              <w:t xml:space="preserve">•      OneDrive - https://www.microsoft.com/en-ww/microsoft-365/onedrive/online-cloud-storage - free to </w:t>
-            </w:r>
-            <w:proofErr w:type="spellStart"/>
-            <w:r>
-              <w:t>download</w:t>
+              <w:t>•      OneDrive - https://www.microsoft.com/en-ww/microsoft-365/onedrive/online-cloud-storage - free to download</w:t>
             </w:r>
             <w:r>
               <w:t>e</w:t>
             </w:r>
-            <w:proofErr w:type="spellEnd"/>
           </w:p>
         </w:tc>
         <w:tc>
@@ -3106,23 +3077,7 @@
             </w:pPr>
             <w:r>
               <w:lastRenderedPageBreak/>
-              <w:t xml:space="preserve">Applications available at ZENworks and Holmesglen </w:t>
-            </w:r>
-            <w:proofErr w:type="spellStart"/>
-            <w:r>
-              <w:t>MyHorizon</w:t>
-            </w:r>
-            <w:proofErr w:type="spellEnd"/>
-            <w:r>
-              <w:t xml:space="preserve"> and free to download via </w:t>
-            </w:r>
-            <w:proofErr w:type="spellStart"/>
-            <w:r>
-              <w:t>url</w:t>
-            </w:r>
-            <w:proofErr w:type="spellEnd"/>
-            <w:r>
-              <w:t xml:space="preserve"> below:</w:t>
+              <w:t>Applications available at ZENworks and Holmesglen MyHorizon and free to download via url below:</w:t>
             </w:r>
           </w:p>
           <w:p>
@@ -3154,15 +3109,7 @@
               <w:pStyle w:val="BodyContentIndent1"/>
             </w:pPr>
             <w:r>
-              <w:t xml:space="preserve">•      </w:t>
-            </w:r>
-            <w:proofErr w:type="spellStart"/>
-            <w:r>
-              <w:t>WebEx</w:t>
-            </w:r>
-            <w:proofErr w:type="spellEnd"/>
-            <w:r>
-              <w:t xml:space="preserve"> - https://holmesglen.webex.com/ - free to download</w:t>
+              <w:t>•      WebEx - https://holmesglen.webex.com/ - free to download</w:t>
             </w:r>
           </w:p>
           <w:p>
@@ -3170,13 +3117,8 @@
               <w:pStyle w:val="BodyContentIndent1"/>
             </w:pPr>
             <w:r>
-              <w:t xml:space="preserve">•      Unity - https://unity.com/ - student license free to </w:t>
-            </w:r>
-            <w:proofErr w:type="spellStart"/>
-            <w:r>
-              <w:t>donwload</w:t>
-            </w:r>
-            <w:proofErr w:type="spellEnd"/>
+              <w:t>•      Unity - https://unity.com/ - student license free to donwload</w:t>
+            </w:r>
           </w:p>
           <w:p>
             <w:pPr>
@@ -3207,15 +3149,7 @@
               <w:pStyle w:val="BodyContentIndent1"/>
             </w:pPr>
             <w:r>
-              <w:t xml:space="preserve">•      </w:t>
-            </w:r>
-            <w:proofErr w:type="spellStart"/>
-            <w:r>
-              <w:t>ZBrush</w:t>
-            </w:r>
-            <w:proofErr w:type="spellEnd"/>
-            <w:r>
-              <w:t xml:space="preserve"> – https://pixologic.com/</w:t>
+              <w:t>•      ZBrush – https://pixologic.com/</w:t>
             </w:r>
           </w:p>
           <w:p>
@@ -3475,7 +3409,23 @@
                 <w:rStyle w:val="Strong"/>
                 <w:lang w:val="fr-FR"/>
               </w:rPr>
-              <w:t xml:space="preserve">Unit code: </w:t>
+              <w:t xml:space="preserve">Unit </w:t>
+            </w:r>
+            <w:proofErr w:type="gramStart"/>
+            <w:r>
+              <w:rPr>
+                <w:rStyle w:val="Strong"/>
+                <w:lang w:val="fr-FR"/>
+              </w:rPr>
+              <w:t>code:</w:t>
+            </w:r>
+            <w:proofErr w:type="gramEnd"/>
+            <w:r>
+              <w:rPr>
+                <w:rStyle w:val="Strong"/>
+                <w:lang w:val="fr-FR"/>
+              </w:rPr>
+              <w:t xml:space="preserve"> </w:t>
             </w:r>
           </w:p>
           <w:p>
@@ -5340,10 +5290,7 @@
               </w:rPr>
             </w:pPr>
             <w:r>
-              <w:t>Distributed Version Control System</w:t>
-            </w:r>
-            <w:r>
-              <w:t>s</w:t>
+              <w:t>Distributed Version Control Systems</w:t>
             </w:r>
             <w:r>
               <w:rPr>
@@ -5427,10 +5374,7 @@
               </w:rPr>
             </w:pPr>
             <w:r>
-              <w:t>Centralized Version Control System</w:t>
-            </w:r>
-            <w:r>
-              <w:t>s</w:t>
+              <w:t>Centralized Version Control Systems</w:t>
             </w:r>
             <w:r>
               <w:rPr>
@@ -5787,7 +5731,27 @@
                       <w:szCs w:val="20"/>
                       <w:lang w:val="en-US"/>
                     </w:rPr>
-                    <w:t>Less efficient. Branches are server-side copies, making them heavier. Merging can be complex and conflict-prone.</w:t>
+                    <w:t xml:space="preserve">Less efficient. Branches are server-side copies, making them heavier. Merging can be complex and </w:t>
+                  </w:r>
+                  <w:proofErr w:type="gramStart"/>
+                  <w:r>
+                    <w:rPr>
+                      <w:rFonts w:eastAsia="Times New Roman" w:cs="Arial"/>
+                      <w:sz w:val="20"/>
+                      <w:szCs w:val="20"/>
+                      <w:lang w:val="en-US"/>
+                    </w:rPr>
+                    <w:t>conflict-prone</w:t>
+                  </w:r>
+                  <w:proofErr w:type="gramEnd"/>
+                  <w:r>
+                    <w:rPr>
+                      <w:rFonts w:eastAsia="Times New Roman" w:cs="Arial"/>
+                      <w:sz w:val="20"/>
+                      <w:szCs w:val="20"/>
+                      <w:lang w:val="en-US"/>
+                    </w:rPr>
+                    <w:t>.</w:t>
                   </w:r>
                 </w:p>
               </w:tc>
@@ -6093,7 +6057,27 @@
                       <w:szCs w:val="20"/>
                       <w:lang w:val="en-US"/>
                     </w:rPr>
-                    <w:t>Scales well with a large number of users and repositories due to its distributed nature</w:t>
+                    <w:t xml:space="preserve">Scales well with </w:t>
+                  </w:r>
+                  <w:proofErr w:type="gramStart"/>
+                  <w:r>
+                    <w:rPr>
+                      <w:rFonts w:eastAsia="Times New Roman" w:cs="Arial"/>
+                      <w:sz w:val="20"/>
+                      <w:szCs w:val="20"/>
+                      <w:lang w:val="en-US"/>
+                    </w:rPr>
+                    <w:t>a large number of</w:t>
+                  </w:r>
+                  <w:proofErr w:type="gramEnd"/>
+                  <w:r>
+                    <w:rPr>
+                      <w:rFonts w:eastAsia="Times New Roman" w:cs="Arial"/>
+                      <w:sz w:val="20"/>
+                      <w:szCs w:val="20"/>
+                      <w:lang w:val="en-US"/>
+                    </w:rPr>
+                    <w:t xml:space="preserve"> users and repositories due to its distributed nature</w:t>
                   </w:r>
                 </w:p>
               </w:tc>
@@ -6119,7 +6103,27 @@
                       <w:szCs w:val="20"/>
                       <w:lang w:val="en-US"/>
                     </w:rPr>
-                    <w:t>Can become a bottleneck with a large number of users</w:t>
+                    <w:t xml:space="preserve">Can become a bottleneck with </w:t>
+                  </w:r>
+                  <w:proofErr w:type="gramStart"/>
+                  <w:r>
+                    <w:rPr>
+                      <w:rFonts w:eastAsia="Times New Roman" w:cs="Arial"/>
+                      <w:sz w:val="20"/>
+                      <w:szCs w:val="20"/>
+                      <w:lang w:val="en-US"/>
+                    </w:rPr>
+                    <w:t>a large number of</w:t>
+                  </w:r>
+                  <w:proofErr w:type="gramEnd"/>
+                  <w:r>
+                    <w:rPr>
+                      <w:rFonts w:eastAsia="Times New Roman" w:cs="Arial"/>
+                      <w:sz w:val="20"/>
+                      <w:szCs w:val="20"/>
+                      <w:lang w:val="en-US"/>
+                    </w:rPr>
+                    <w:t xml:space="preserve"> users</w:t>
                   </w:r>
                 </w:p>
               </w:tc>
@@ -6504,6 +6508,46 @@
               <w:t>resolving conflict and backout changes</w:t>
             </w:r>
           </w:p>
+          <w:p>
+            <w:pPr>
+              <w:rPr>
+                <w:b/>
+                <w:bCs/>
+              </w:rPr>
+            </w:pPr>
+          </w:p>
+          <w:p>
+            <w:pPr>
+              <w:rPr>
+                <w:b/>
+                <w:bCs/>
+              </w:rPr>
+            </w:pPr>
+          </w:p>
+          <w:p>
+            <w:pPr>
+              <w:rPr>
+                <w:b/>
+                <w:bCs/>
+              </w:rPr>
+            </w:pPr>
+          </w:p>
+          <w:p>
+            <w:pPr>
+              <w:rPr>
+                <w:b/>
+                <w:bCs/>
+              </w:rPr>
+            </w:pPr>
+          </w:p>
+          <w:p>
+            <w:pPr>
+              <w:rPr>
+                <w:b/>
+                <w:bCs/>
+              </w:rPr>
+            </w:pPr>
+          </w:p>
         </w:tc>
         <w:tc>
           <w:tcPr>
@@ -6595,6 +6639,7 @@
               <w:pStyle w:val="Answer"/>
             </w:pPr>
             <w:r>
+              <w:lastRenderedPageBreak/>
               <w:t>Answer:</w:t>
             </w:r>
           </w:p>
@@ -6744,7 +6789,6 @@
                       <w:szCs w:val="20"/>
                       <w:lang w:val="en-US"/>
                     </w:rPr>
-                    <w:lastRenderedPageBreak/>
                     <w:t>Working Copy</w:t>
                   </w:r>
                 </w:p>
@@ -7176,7 +7220,6 @@
               <w:pStyle w:val="Answer"/>
             </w:pPr>
             <w:r>
-              <w:lastRenderedPageBreak/>
               <w:t>Comment:</w:t>
             </w:r>
           </w:p>
@@ -7668,6 +7711,7 @@
                       <w:lang w:val="en-US"/>
                     </w:rPr>
                   </w:pPr>
+                  <w:proofErr w:type="gramStart"/>
                   <w:r>
                     <w:rPr>
                       <w:rFonts w:eastAsia="Times New Roman" w:cs="Arial"/>
@@ -7686,6 +7730,7 @@
                     </w:rPr>
                     <w:t xml:space="preserve"> single repository</w:t>
                   </w:r>
+                  <w:proofErr w:type="gramEnd"/>
                   <w:r>
                     <w:rPr>
                       <w:rFonts w:eastAsia="Times New Roman" w:cs="Arial"/>
@@ -7777,17 +7822,51 @@
                       <w:szCs w:val="20"/>
                       <w:lang w:val="en-US"/>
                     </w:rPr>
-                    <w:t>C</w:t>
+                    <w:t>Creates the repository and manages access.</w:t>
                   </w:r>
+                </w:p>
+              </w:tc>
+            </w:tr>
+            <w:tr>
+              <w:trPr>
+                <w:trHeight w:val="315"/>
+              </w:trPr>
+              <w:tc>
+                <w:tcPr>
+                  <w:tcW w:w="2325" w:type="dxa"/>
+                  <w:vAlign w:val="center"/>
+                </w:tcPr>
+                <w:p>
+                  <w:pPr>
+                    <w:rPr>
+                      <w:rFonts w:eastAsia="Times New Roman" w:cs="Arial"/>
+                      <w:szCs w:val="20"/>
+                      <w:lang w:val="en-US"/>
+                    </w:rPr>
+                  </w:pPr>
                   <w:r>
                     <w:rPr>
                       <w:rFonts w:eastAsia="Times New Roman" w:cs="Arial"/>
-                      <w:sz w:val="20"/>
                       <w:szCs w:val="20"/>
                       <w:lang w:val="en-US"/>
                     </w:rPr>
-                    <w:t>reates the repository and manages access.</w:t>
+                    <w:t>ê</w:t>
                   </w:r>
+                </w:p>
+              </w:tc>
+              <w:tc>
+                <w:tcPr>
+                  <w:tcW w:w="5407" w:type="dxa"/>
+                  <w:vAlign w:val="center"/>
+                </w:tcPr>
+                <w:p>
+                  <w:pPr>
+                    <w:rPr>
+                      <w:rFonts w:eastAsia="Times New Roman" w:cs="Arial"/>
+                      <w:szCs w:val="20"/>
+                      <w:lang w:val="en-US"/>
+                    </w:rPr>
+                  </w:pPr>
                 </w:p>
               </w:tc>
             </w:tr>
@@ -7916,7 +7995,27 @@
                       <w:szCs w:val="20"/>
                       <w:lang w:val="en-US"/>
                     </w:rPr>
-                    <w:t>Primarily uses feature branches and a main branch.</w:t>
+                    <w:t xml:space="preserve">Primarily uses feature branches and </w:t>
+                  </w:r>
+                  <w:proofErr w:type="gramStart"/>
+                  <w:r>
+                    <w:rPr>
+                      <w:rFonts w:eastAsia="Times New Roman" w:cs="Arial"/>
+                      <w:sz w:val="20"/>
+                      <w:szCs w:val="20"/>
+                      <w:lang w:val="en-US"/>
+                    </w:rPr>
+                    <w:t>a main</w:t>
+                  </w:r>
+                  <w:proofErr w:type="gramEnd"/>
+                  <w:r>
+                    <w:rPr>
+                      <w:rFonts w:eastAsia="Times New Roman" w:cs="Arial"/>
+                      <w:sz w:val="20"/>
+                      <w:szCs w:val="20"/>
+                      <w:lang w:val="en-US"/>
+                    </w:rPr>
+                    <w:t xml:space="preserve"> branch.</w:t>
                   </w:r>
                 </w:p>
               </w:tc>
@@ -8287,6 +8386,7 @@
                       <w:lang w:val="en-US"/>
                     </w:rPr>
                   </w:pPr>
+                  <w:proofErr w:type="gramStart"/>
                   <w:r>
                     <w:rPr>
                       <w:rFonts w:eastAsia="Times New Roman" w:cs="Arial"/>
@@ -8294,7 +8394,17 @@
                       <w:szCs w:val="20"/>
                       <w:lang w:val="en-US"/>
                     </w:rPr>
-                    <w:t>Teacher merges approved branches into the main branch.</w:t>
+                    <w:t>Teacher</w:t>
+                  </w:r>
+                  <w:proofErr w:type="gramEnd"/>
+                  <w:r>
+                    <w:rPr>
+                      <w:rFonts w:eastAsia="Times New Roman" w:cs="Arial"/>
+                      <w:sz w:val="20"/>
+                      <w:szCs w:val="20"/>
+                      <w:lang w:val="en-US"/>
+                    </w:rPr>
+                    <w:t xml:space="preserve"> merges approved branches into the main branch.</w:t>
                   </w:r>
                 </w:p>
               </w:tc>
@@ -8437,6 +8547,7 @@
                       <w:lang w:val="en-US"/>
                     </w:rPr>
                   </w:pPr>
+                  <w:proofErr w:type="gramStart"/>
                   <w:r>
                     <w:rPr>
                       <w:rFonts w:eastAsia="Times New Roman" w:cs="Arial"/>
@@ -8444,7 +8555,17 @@
                       <w:szCs w:val="20"/>
                       <w:lang w:val="en-US"/>
                     </w:rPr>
-                    <w:t>Ensures quality assurance.</w:t>
+                    <w:t>Ensures</w:t>
+                  </w:r>
+                  <w:proofErr w:type="gramEnd"/>
+                  <w:r>
+                    <w:rPr>
+                      <w:rFonts w:eastAsia="Times New Roman" w:cs="Arial"/>
+                      <w:sz w:val="20"/>
+                      <w:szCs w:val="20"/>
+                      <w:lang w:val="en-US"/>
+                    </w:rPr>
+                    <w:t xml:space="preserve"> quality assurance.</w:t>
                   </w:r>
                 </w:p>
               </w:tc>
@@ -8515,6 +8636,7 @@
               <w:rPr>
                 <w:color w:val="FEFFFF" w:themeColor="background1"/>
               </w:rPr>
+              <w:lastRenderedPageBreak/>
               <w:t xml:space="preserve">Question </w:t>
             </w:r>
             <w:r>
@@ -8708,7 +8830,6 @@
               <w:rPr>
                 <w:b w:val="0"/>
               </w:rPr>
-              <w:lastRenderedPageBreak/>
               <w:t>- Each developer has complete copy of the repository.</w:t>
             </w:r>
           </w:p>
@@ -8787,7 +8908,15 @@
               <w:pStyle w:val="QuestionLearnerResponse"/>
             </w:pPr>
             <w:r>
-              <w:t>Use pull requests to facilitate code reviews before merging changes into the main branch.</w:t>
+              <w:t xml:space="preserve">Use </w:t>
+            </w:r>
+            <w:proofErr w:type="gramStart"/>
+            <w:r>
+              <w:t>pull</w:t>
+            </w:r>
+            <w:proofErr w:type="gramEnd"/>
+            <w:r>
+              <w:t xml:space="preserve"> requests to facilitate code reviews before merging changes into the main branch.</w:t>
             </w:r>
           </w:p>
           <w:p>
@@ -8952,7 +9081,6 @@
               <w:pStyle w:val="Answer"/>
             </w:pPr>
             <w:r>
-              <w:lastRenderedPageBreak/>
               <w:t>Comment:</w:t>
             </w:r>
           </w:p>
@@ -8995,6 +9123,7 @@
               <w:rPr>
                 <w:color w:val="FEFFFF" w:themeColor="background1"/>
               </w:rPr>
+              <w:lastRenderedPageBreak/>
               <w:t xml:space="preserve">Question </w:t>
             </w:r>
             <w:r>
@@ -9680,23 +9809,7 @@
                       <w:rFonts w:cs="Arial"/>
                       <w:color w:val="000000"/>
                     </w:rPr>
-                    <w:t xml:space="preserve">Introduce a 20 </w:t>
-                  </w:r>
-                  <w:proofErr w:type="spellStart"/>
-                  <w:r>
-                    <w:rPr>
-                      <w:rFonts w:cs="Arial"/>
-                      <w:color w:val="000000"/>
-                    </w:rPr>
-                    <w:t>px</w:t>
-                  </w:r>
-                  <w:proofErr w:type="spellEnd"/>
-                  <w:r>
-                    <w:rPr>
-                      <w:rFonts w:cs="Arial"/>
-                      <w:color w:val="000000"/>
-                    </w:rPr>
-                    <w:t xml:space="preserve"> gap between two vertically aligned element.</w:t>
+                    <w:t>Introduce a 20 px gap between two vertically aligned element.</w:t>
                   </w:r>
                 </w:p>
               </w:tc>
@@ -10226,6 +10339,7 @@
               <w:rPr>
                 <w:color w:val="FEFFFF" w:themeColor="background1"/>
               </w:rPr>
+              <w:lastRenderedPageBreak/>
               <w:t xml:space="preserve">Question </w:t>
             </w:r>
             <w:r>
@@ -10385,7 +10499,6 @@
               <w:pStyle w:val="Answer"/>
             </w:pPr>
             <w:r>
-              <w:lastRenderedPageBreak/>
               <w:t>Answer:</w:t>
             </w:r>
           </w:p>
@@ -11694,6 +11807,7 @@
               <w:rPr>
                 <w:bCs/>
               </w:rPr>
+              <w:lastRenderedPageBreak/>
               <w:t>What is UI style guide?</w:t>
             </w:r>
           </w:p>
@@ -15997,6 +16111,7 @@
               <w:pStyle w:val="QuestionLearnerResponse"/>
             </w:pPr>
             <w:r>
+              <w:lastRenderedPageBreak/>
               <w:t>Copy here.</w:t>
             </w:r>
           </w:p>
@@ -16013,6 +16128,7 @@
               <w:pStyle w:val="Answer"/>
             </w:pPr>
             <w:r>
+              <w:lastRenderedPageBreak/>
               <w:t>Comment:</w:t>
             </w:r>
           </w:p>
@@ -16055,7 +16171,6 @@
               <w:rPr>
                 <w:color w:val="FEFFFF" w:themeColor="background1"/>
               </w:rPr>
-              <w:lastRenderedPageBreak/>
               <w:t xml:space="preserve">Question </w:t>
             </w:r>
             <w:r>
@@ -17908,6 +18023,7 @@
               <w:ind w:left="567" w:hanging="567"/>
             </w:pPr>
             <w:r>
+              <w:lastRenderedPageBreak/>
               <w:t>1.8 Learner has conducted and recorded the results of the tests created in 1.7</w:t>
             </w:r>
           </w:p>
@@ -18140,7 +18256,6 @@
               <w:ind w:left="567" w:hanging="567"/>
             </w:pPr>
             <w:r>
-              <w:lastRenderedPageBreak/>
               <w:t>1.10 Learner has used debugging tools to set a break point, step through code and look at variable contents</w:t>
             </w:r>
           </w:p>
@@ -19482,15 +19597,7 @@
               <w:ind w:left="567" w:hanging="567"/>
             </w:pPr>
             <w:r>
-              <w:t xml:space="preserve">3.2 Learner has used length and </w:t>
-            </w:r>
-            <w:proofErr w:type="spellStart"/>
-            <w:r>
-              <w:t>charAt</w:t>
-            </w:r>
-            <w:proofErr w:type="spellEnd"/>
-            <w:r>
-              <w:t xml:space="preserve"> to get the required information</w:t>
+              <w:t>3.2 Learner has used length and charAt to get the required information</w:t>
             </w:r>
           </w:p>
         </w:tc>
@@ -19730,21 +19837,8 @@
               <w:ind w:left="567" w:hanging="567"/>
             </w:pPr>
             <w:r>
-              <w:t xml:space="preserve">3.4 Learner has used </w:t>
-            </w:r>
-            <w:proofErr w:type="spellStart"/>
-            <w:r>
-              <w:t>toUpperCase</w:t>
-            </w:r>
-            <w:proofErr w:type="spellEnd"/>
-            <w:r>
-              <w:t xml:space="preserve"> and </w:t>
-            </w:r>
-            <w:proofErr w:type="spellStart"/>
-            <w:r>
-              <w:t>toLowerCase</w:t>
-            </w:r>
-            <w:proofErr w:type="spellEnd"/>
+              <w:t>3.4 Learner has used toUpperCase and toLowerCase</w:t>
+            </w:r>
           </w:p>
         </w:tc>
         <w:tc>
@@ -19863,15 +19957,7 @@
               <w:ind w:left="567" w:hanging="567"/>
             </w:pPr>
             <w:r>
-              <w:t xml:space="preserve">3.5 Learner has used </w:t>
-            </w:r>
-            <w:proofErr w:type="spellStart"/>
-            <w:r>
-              <w:t>concat</w:t>
-            </w:r>
-            <w:proofErr w:type="spellEnd"/>
-            <w:r>
-              <w:t>, trim, replace and split as required</w:t>
+              <w:t>3.5 Learner has used concat, trim, replace and split as required</w:t>
             </w:r>
           </w:p>
         </w:tc>
@@ -20957,7 +21043,15 @@
               <w:ind w:left="567" w:hanging="567"/>
             </w:pPr>
             <w:r>
-              <w:t>4.4 Learner has implement either sequential or binary search algorithm</w:t>
+              <w:t xml:space="preserve">4.4 Learner has </w:t>
+            </w:r>
+            <w:proofErr w:type="gramStart"/>
+            <w:r>
+              <w:t>implement</w:t>
+            </w:r>
+            <w:proofErr w:type="gramEnd"/>
+            <w:r>
+              <w:t xml:space="preserve"> either sequential or binary search algorithm</w:t>
             </w:r>
           </w:p>
         </w:tc>
@@ -21443,15 +21537,8 @@
               <w:ind w:left="567" w:hanging="567"/>
             </w:pPr>
             <w:r>
-              <w:t xml:space="preserve">5.3 Learner has listed the HTML guidelines </w:t>
-            </w:r>
-            <w:proofErr w:type="spellStart"/>
-            <w:r>
-              <w:t>the</w:t>
-            </w:r>
-            <w:proofErr w:type="spellEnd"/>
-            <w:r>
-              <w:t xml:space="preserve"> are following and described them</w:t>
+              <w:lastRenderedPageBreak/>
+              <w:t>5.3 Learner has listed the HTML guidelines the are following and described them</w:t>
             </w:r>
           </w:p>
         </w:tc>
@@ -21691,7 +21778,6 @@
               <w:ind w:left="567" w:hanging="567"/>
             </w:pPr>
             <w:r>
-              <w:lastRenderedPageBreak/>
               <w:t>5.5 Learner has created the UI wireframe using the tools listed in 5.4</w:t>
             </w:r>
           </w:p>
@@ -23863,6 +23949,7 @@
               <w:pStyle w:val="Heading3"/>
             </w:pPr>
             <w:r>
+              <w:lastRenderedPageBreak/>
               <w:t>Section F – Feedback to Learner</w:t>
             </w:r>
           </w:p>
@@ -23986,7 +24073,6 @@
               <w:rPr>
                 <w:rStyle w:val="Strong"/>
               </w:rPr>
-              <w:lastRenderedPageBreak/>
               <w:t>Assessor feedback (as appropriate)</w:t>
             </w:r>
             <w:r>
@@ -24584,15 +24670,7 @@
               </w:numPr>
             </w:pPr>
             <w:r>
-              <w:t>Create a JavaScript function called “</w:t>
-            </w:r>
-            <w:proofErr w:type="spellStart"/>
-            <w:r>
-              <w:t>sequentialSearch</w:t>
-            </w:r>
-            <w:proofErr w:type="spellEnd"/>
-            <w:r>
-              <w:t>”</w:t>
+              <w:t>Create a JavaScript function called “sequentialSearch”</w:t>
             </w:r>
           </w:p>
           <w:p>
@@ -24647,15 +24725,7 @@
               </w:numPr>
             </w:pPr>
             <w:r>
-              <w:t>Create a JavaScript function called “</w:t>
-            </w:r>
-            <w:proofErr w:type="spellStart"/>
-            <w:r>
-              <w:t>binarySearch</w:t>
-            </w:r>
-            <w:proofErr w:type="spellEnd"/>
-            <w:r>
-              <w:t>”</w:t>
+              <w:t>Create a JavaScript function called “binarySearch”</w:t>
             </w:r>
           </w:p>
           <w:p>
@@ -24976,23 +25046,7 @@
               </w:numPr>
             </w:pPr>
             <w:r>
-              <w:t>The test case shall have a full coverage of function “</w:t>
-            </w:r>
-            <w:proofErr w:type="spellStart"/>
-            <w:r>
-              <w:t>sequentialSearch</w:t>
-            </w:r>
-            <w:proofErr w:type="spellEnd"/>
-            <w:r>
-              <w:t>” and “</w:t>
-            </w:r>
-            <w:proofErr w:type="spellStart"/>
-            <w:r>
-              <w:t>binarySearch</w:t>
-            </w:r>
-            <w:proofErr w:type="spellEnd"/>
-            <w:r>
-              <w:t>”</w:t>
+              <w:t>The test case shall have a full coverage of function “sequentialSearch” and “binarySearch”</w:t>
             </w:r>
           </w:p>
           <w:p>
@@ -25164,6 +25218,7 @@
                 <w:b/>
                 <w:bCs/>
               </w:rPr>
+              <w:lastRenderedPageBreak/>
               <w:t>Q1A Record GitHub repository details for this part:</w:t>
             </w:r>
           </w:p>
@@ -25282,7 +25337,15 @@
           </w:p>
           <w:p>
             <w:r>
-              <w:t>(If No, fix your code and correct the result)</w:t>
+              <w:t xml:space="preserve">(If </w:t>
+            </w:r>
+            <w:proofErr w:type="gramStart"/>
+            <w:r>
+              <w:t>No</w:t>
+            </w:r>
+            <w:proofErr w:type="gramEnd"/>
+            <w:r>
+              <w:t>, fix your code and correct the result)</w:t>
             </w:r>
           </w:p>
           <w:p/>
@@ -25400,7 +25463,15 @@
           </w:p>
           <w:p>
             <w:r>
-              <w:t>(If No, fix your code and correct the result)</w:t>
+              <w:t xml:space="preserve">(If </w:t>
+            </w:r>
+            <w:proofErr w:type="gramStart"/>
+            <w:r>
+              <w:t>No</w:t>
+            </w:r>
+            <w:proofErr w:type="gramEnd"/>
+            <w:r>
+              <w:t>, fix your code and correct the result)</w:t>
             </w:r>
           </w:p>
         </w:tc>
@@ -25522,7 +25593,15 @@
           </w:p>
           <w:p>
             <w:r>
-              <w:t>(If No, fix your code and correct the result)</w:t>
+              <w:t xml:space="preserve">(If </w:t>
+            </w:r>
+            <w:proofErr w:type="gramStart"/>
+            <w:r>
+              <w:t>No</w:t>
+            </w:r>
+            <w:proofErr w:type="gramEnd"/>
+            <w:r>
+              <w:t>, fix your code and correct the result)</w:t>
             </w:r>
           </w:p>
         </w:tc>
@@ -25645,7 +25724,15 @@
           </w:p>
           <w:p>
             <w:r>
-              <w:t>(If No, fix your code and correct the result)</w:t>
+              <w:t xml:space="preserve">(If </w:t>
+            </w:r>
+            <w:proofErr w:type="gramStart"/>
+            <w:r>
+              <w:t>No</w:t>
+            </w:r>
+            <w:proofErr w:type="gramEnd"/>
+            <w:r>
+              <w:t>, fix your code and correct the result)</w:t>
             </w:r>
           </w:p>
         </w:tc>
@@ -25724,23 +25811,7 @@
                 <w:b/>
                 <w:bCs/>
               </w:rPr>
-              <w:t>Implement the function “</w:t>
-            </w:r>
-            <w:proofErr w:type="spellStart"/>
-            <w:r>
-              <w:rPr>
-                <w:b/>
-                <w:bCs/>
-              </w:rPr>
-              <w:t>seqentialSearch</w:t>
-            </w:r>
-            <w:proofErr w:type="spellEnd"/>
-            <w:r>
-              <w:rPr>
-                <w:b/>
-                <w:bCs/>
-              </w:rPr>
-              <w:t>” as per part 5 of the task description</w:t>
+              <w:t>Implement the function “seqentialSearch” as per part 5 of the task description</w:t>
             </w:r>
           </w:p>
           <w:p/>
@@ -25754,15 +25825,7 @@
           </w:tcPr>
           <w:p>
             <w:r>
-              <w:t>&lt;Insert a screenshot of the JavaScript code of the function “</w:t>
-            </w:r>
-            <w:proofErr w:type="spellStart"/>
-            <w:r>
-              <w:t>sequentialSearch</w:t>
-            </w:r>
-            <w:proofErr w:type="spellEnd"/>
-            <w:r>
-              <w:t>”&gt;</w:t>
+              <w:t>&lt;Insert a screenshot of the JavaScript code of the function “sequentialSearch”&gt;</w:t>
             </w:r>
           </w:p>
           <w:p/>
@@ -25793,7 +25856,15 @@
           </w:p>
           <w:p>
             <w:r>
-              <w:t>(If No, fix your code and correct the result)</w:t>
+              <w:t xml:space="preserve">(If </w:t>
+            </w:r>
+            <w:proofErr w:type="gramStart"/>
+            <w:r>
+              <w:t>No</w:t>
+            </w:r>
+            <w:proofErr w:type="gramEnd"/>
+            <w:r>
+              <w:t>, fix your code and correct the result)</w:t>
             </w:r>
           </w:p>
         </w:tc>
@@ -25881,7 +25952,6 @@
               </w:rPr>
               <w:t>“</w:t>
             </w:r>
-            <w:proofErr w:type="spellStart"/>
             <w:r>
               <w:rPr>
                 <w:b/>
@@ -25889,7 +25959,6 @@
               </w:rPr>
               <w:t>binarySearch</w:t>
             </w:r>
-            <w:proofErr w:type="spellEnd"/>
             <w:r>
               <w:rPr>
                 <w:b/>
@@ -25916,15 +25985,7 @@
           </w:tcPr>
           <w:p>
             <w:r>
-              <w:t>&lt;Insert a screenshot of the JavaScript code of the function “</w:t>
-            </w:r>
-            <w:proofErr w:type="spellStart"/>
-            <w:r>
-              <w:t>binarySearch</w:t>
-            </w:r>
-            <w:proofErr w:type="spellEnd"/>
-            <w:r>
-              <w:t>”&gt;</w:t>
+              <w:t>&lt;Insert a screenshot of the JavaScript code of the function “binarySearch”&gt;</w:t>
             </w:r>
           </w:p>
           <w:p/>
@@ -25955,7 +26016,15 @@
           </w:p>
           <w:p>
             <w:r>
-              <w:t>(If No, fix your code and correct the result)</w:t>
+              <w:t xml:space="preserve">(If </w:t>
+            </w:r>
+            <w:proofErr w:type="gramStart"/>
+            <w:r>
+              <w:t>No</w:t>
+            </w:r>
+            <w:proofErr w:type="gramEnd"/>
+            <w:r>
+              <w:t>, fix your code and correct the result)</w:t>
             </w:r>
           </w:p>
         </w:tc>
@@ -26014,39 +26083,7 @@
                 <w:b/>
                 <w:bCs/>
               </w:rPr>
-              <w:t>You are required to develop a test plan that covers the functions “</w:t>
-            </w:r>
-            <w:proofErr w:type="spellStart"/>
-            <w:r>
-              <w:rPr>
-                <w:b/>
-                <w:bCs/>
-              </w:rPr>
-              <w:t>sequentialSearch</w:t>
-            </w:r>
-            <w:proofErr w:type="spellEnd"/>
-            <w:r>
-              <w:rPr>
-                <w:b/>
-                <w:bCs/>
-              </w:rPr>
-              <w:t>” and “</w:t>
-            </w:r>
-            <w:proofErr w:type="spellStart"/>
-            <w:r>
-              <w:rPr>
-                <w:b/>
-                <w:bCs/>
-              </w:rPr>
-              <w:t>binarySearch</w:t>
-            </w:r>
-            <w:proofErr w:type="spellEnd"/>
-            <w:r>
-              <w:rPr>
-                <w:b/>
-                <w:bCs/>
-              </w:rPr>
-              <w:t>” The test plan should be in the submission for review.</w:t>
+              <w:t>You are required to develop a test plan that covers the functions “sequentialSearch” and “binarySearch” The test plan should be in the submission for review.</w:t>
             </w:r>
           </w:p>
         </w:tc>
@@ -26549,15 +26586,7 @@
               <w:t xml:space="preserve"> </w:t>
             </w:r>
             <w:r>
-              <w:t>called “</w:t>
-            </w:r>
-            <w:proofErr w:type="spellStart"/>
-            <w:r>
-              <w:t>myMovie</w:t>
-            </w:r>
-            <w:proofErr w:type="spellEnd"/>
-            <w:r>
-              <w:t xml:space="preserve">” </w:t>
+              <w:t xml:space="preserve">called “myMovie” </w:t>
             </w:r>
             <w:r>
               <w:t xml:space="preserve">with the following </w:t>
@@ -26789,23 +26818,7 @@
                 <w:b/>
                 <w:bCs/>
               </w:rPr>
-              <w:t>object called “</w:t>
-            </w:r>
-            <w:proofErr w:type="spellStart"/>
-            <w:r>
-              <w:rPr>
-                <w:b/>
-                <w:bCs/>
-              </w:rPr>
-              <w:t>myMovie</w:t>
-            </w:r>
-            <w:proofErr w:type="spellEnd"/>
-            <w:r>
-              <w:rPr>
-                <w:b/>
-                <w:bCs/>
-              </w:rPr>
-              <w:t>”</w:t>
+              <w:t>object called “myMovie”</w:t>
             </w:r>
             <w:r>
               <w:rPr>
@@ -26868,6 +26881,7 @@
           </w:tcPr>
           <w:p>
             <w:r>
+              <w:lastRenderedPageBreak/>
               <w:t>&lt;Insert the screenshot JavaScript code that built the object&gt;</w:t>
             </w:r>
           </w:p>
@@ -26966,23 +26980,7 @@
                 <w:b/>
                 <w:bCs/>
               </w:rPr>
-              <w:t xml:space="preserve"> Add the following properties and data to the “</w:t>
-            </w:r>
-            <w:proofErr w:type="spellStart"/>
-            <w:r>
-              <w:rPr>
-                <w:b/>
-                <w:bCs/>
-              </w:rPr>
-              <w:t>myMovie</w:t>
-            </w:r>
-            <w:proofErr w:type="spellEnd"/>
-            <w:r>
-              <w:rPr>
-                <w:b/>
-                <w:bCs/>
-              </w:rPr>
-              <w:t>” object:</w:t>
+              <w:t xml:space="preserve"> Add the following properties and data to the “myMovie” object:</w:t>
             </w:r>
           </w:p>
           <w:p>
@@ -27314,23 +27312,7 @@
                 <w:b/>
                 <w:bCs/>
               </w:rPr>
-              <w:t>Remove the summary property from “</w:t>
-            </w:r>
-            <w:proofErr w:type="spellStart"/>
-            <w:r>
-              <w:rPr>
-                <w:b/>
-                <w:bCs/>
-              </w:rPr>
-              <w:t>myMovie</w:t>
-            </w:r>
-            <w:proofErr w:type="spellEnd"/>
-            <w:r>
-              <w:rPr>
-                <w:b/>
-                <w:bCs/>
-              </w:rPr>
-              <w:t>”</w:t>
+              <w:t>Remove the summary property from “myMovie”</w:t>
             </w:r>
             <w:r>
               <w:rPr>
@@ -27614,13 +27596,8 @@
               </w:numPr>
               <w:spacing w:after="160" w:line="259" w:lineRule="auto"/>
             </w:pPr>
-            <w:proofErr w:type="spellStart"/>
-            <w:r>
-              <w:t>myString</w:t>
-            </w:r>
-            <w:proofErr w:type="spellEnd"/>
-            <w:r>
-              <w:t xml:space="preserve"> = “This is a string”</w:t>
+            <w:r>
+              <w:t>myString = “This is a string”</w:t>
             </w:r>
           </w:p>
           <w:p>
@@ -27631,13 +27608,16 @@
               </w:numPr>
               <w:spacing w:after="160" w:line="259" w:lineRule="auto"/>
             </w:pPr>
-            <w:proofErr w:type="spellStart"/>
-            <w:r>
-              <w:t>anotherString</w:t>
-            </w:r>
-            <w:proofErr w:type="spellEnd"/>
-            <w:r>
-              <w:t xml:space="preserve"> = “   Another string” (note there are 3 blank spaces at the beginning)</w:t>
+            <w:r>
+              <w:t xml:space="preserve">anotherString = </w:t>
+            </w:r>
+            <w:proofErr w:type="gramStart"/>
+            <w:r>
+              <w:t xml:space="preserve">“  </w:t>
+            </w:r>
+            <w:proofErr w:type="gramEnd"/>
+            <w:r>
+              <w:t xml:space="preserve"> Another string” (note there are 3 blank spaces at the beginning)</w:t>
             </w:r>
           </w:p>
           <w:p>
@@ -27660,13 +27640,8 @@
               </w:numPr>
               <w:spacing w:after="160" w:line="259" w:lineRule="auto"/>
             </w:pPr>
-            <w:proofErr w:type="spellStart"/>
-            <w:r>
-              <w:t>myName</w:t>
-            </w:r>
-            <w:proofErr w:type="spellEnd"/>
-            <w:r>
-              <w:t xml:space="preserve"> = your first name</w:t>
+            <w:r>
+              <w:t>myName = your first name</w:t>
             </w:r>
           </w:p>
           <w:p>
@@ -27692,13 +27667,8 @@
               <w:spacing w:after="160" w:line="259" w:lineRule="auto"/>
             </w:pPr>
             <w:r>
-              <w:t xml:space="preserve">Find out the length of </w:t>
-            </w:r>
-            <w:proofErr w:type="spellStart"/>
-            <w:r>
-              <w:t>myString</w:t>
-            </w:r>
-            <w:proofErr w:type="spellEnd"/>
+              <w:t>Find out the length of myString</w:t>
+            </w:r>
           </w:p>
           <w:p>
             <w:pPr>
@@ -27710,13 +27680,8 @@
               <w:spacing w:after="160" w:line="259" w:lineRule="auto"/>
             </w:pPr>
             <w:r>
-              <w:t xml:space="preserve">Find out the first character of </w:t>
-            </w:r>
-            <w:proofErr w:type="spellStart"/>
-            <w:r>
-              <w:t>myString</w:t>
-            </w:r>
-            <w:proofErr w:type="spellEnd"/>
+              <w:t>Find out the first character of myString</w:t>
+            </w:r>
           </w:p>
           <w:p>
             <w:pPr>
@@ -27737,13 +27702,8 @@
               <w:t>th</w:t>
             </w:r>
             <w:r>
-              <w:t xml:space="preserve"> character of </w:t>
-            </w:r>
-            <w:proofErr w:type="spellStart"/>
-            <w:r>
-              <w:t>myString</w:t>
-            </w:r>
-            <w:proofErr w:type="spellEnd"/>
+              <w:t xml:space="preserve"> character of myString</w:t>
+            </w:r>
           </w:p>
           <w:p>
             <w:pPr>
@@ -27766,13 +27726,8 @@
               <w:spacing w:after="160" w:line="259" w:lineRule="auto"/>
             </w:pPr>
             <w:r>
-              <w:t xml:space="preserve">Slice “is a” from </w:t>
-            </w:r>
-            <w:proofErr w:type="spellStart"/>
-            <w:r>
-              <w:t>myString</w:t>
-            </w:r>
-            <w:proofErr w:type="spellEnd"/>
+              <w:t>Slice “is a” from myString</w:t>
+            </w:r>
           </w:p>
           <w:p>
             <w:pPr>
@@ -27783,13 +27738,8 @@
               <w:spacing w:after="160" w:line="259" w:lineRule="auto"/>
             </w:pPr>
             <w:r>
-              <w:t xml:space="preserve">Use substring to get “the” from </w:t>
-            </w:r>
-            <w:proofErr w:type="spellStart"/>
-            <w:r>
-              <w:t>anotherString</w:t>
-            </w:r>
-            <w:proofErr w:type="spellEnd"/>
+              <w:t>Use substring to get “the” from anotherString</w:t>
+            </w:r>
           </w:p>
           <w:p>
             <w:pPr>
@@ -27800,15 +27750,7 @@
               <w:spacing w:after="160" w:line="259" w:lineRule="auto"/>
             </w:pPr>
             <w:r>
-              <w:t xml:space="preserve">Change the case of the </w:t>
-            </w:r>
-            <w:proofErr w:type="spellStart"/>
-            <w:r>
-              <w:t>myName</w:t>
-            </w:r>
-            <w:proofErr w:type="spellEnd"/>
-            <w:r>
-              <w:t xml:space="preserve"> string</w:t>
+              <w:t>Change the case of the myName string</w:t>
             </w:r>
           </w:p>
           <w:p>
@@ -27820,15 +27762,7 @@
               <w:spacing w:after="160" w:line="259" w:lineRule="auto"/>
             </w:pPr>
             <w:r>
-              <w:t xml:space="preserve">Print out the </w:t>
-            </w:r>
-            <w:proofErr w:type="spellStart"/>
-            <w:r>
-              <w:t>myName</w:t>
-            </w:r>
-            <w:proofErr w:type="spellEnd"/>
-            <w:r>
-              <w:t xml:space="preserve"> string in all upper case</w:t>
+              <w:t>Print out the myName string in all upper case</w:t>
             </w:r>
           </w:p>
           <w:p>
@@ -27840,15 +27774,7 @@
               <w:spacing w:after="160" w:line="259" w:lineRule="auto"/>
             </w:pPr>
             <w:r>
-              <w:t xml:space="preserve">Print out the </w:t>
-            </w:r>
-            <w:proofErr w:type="spellStart"/>
-            <w:r>
-              <w:t>myName</w:t>
-            </w:r>
-            <w:proofErr w:type="spellEnd"/>
-            <w:r>
-              <w:t xml:space="preserve"> string in all lower case</w:t>
+              <w:t>Print out the myName string in all lower case</w:t>
             </w:r>
           </w:p>
           <w:p>
@@ -27865,15 +27791,7 @@
               <w:spacing w:after="160" w:line="259" w:lineRule="auto"/>
             </w:pPr>
             <w:r>
-              <w:t xml:space="preserve">Use </w:t>
-            </w:r>
-            <w:proofErr w:type="spellStart"/>
-            <w:r>
-              <w:t>concat</w:t>
-            </w:r>
-            <w:proofErr w:type="spellEnd"/>
-            <w:r>
-              <w:t xml:space="preserve">, trim, replace and split to create new strings </w:t>
+              <w:t xml:space="preserve">Use concat, trim, replace and split to create new strings </w:t>
             </w:r>
           </w:p>
           <w:p>
@@ -27884,21 +27802,8 @@
               </w:numPr>
               <w:spacing w:after="160" w:line="259" w:lineRule="auto"/>
             </w:pPr>
-            <w:proofErr w:type="spellStart"/>
-            <w:r>
-              <w:t>Concat</w:t>
-            </w:r>
-            <w:proofErr w:type="spellEnd"/>
-            <w:r>
-              <w:t xml:space="preserve"> hello and </w:t>
-            </w:r>
-            <w:proofErr w:type="spellStart"/>
-            <w:r>
-              <w:t>myName</w:t>
-            </w:r>
-            <w:proofErr w:type="spellEnd"/>
-            <w:r>
-              <w:t xml:space="preserve"> together</w:t>
+            <w:r>
+              <w:t>Concat hello and myName together</w:t>
             </w:r>
           </w:p>
           <w:p>
@@ -27910,13 +27815,8 @@
               <w:spacing w:after="160" w:line="259" w:lineRule="auto"/>
             </w:pPr>
             <w:r>
-              <w:t xml:space="preserve">Use the trim function to remove the spaces in </w:t>
-            </w:r>
-            <w:proofErr w:type="spellStart"/>
-            <w:r>
-              <w:t>anotherString</w:t>
-            </w:r>
-            <w:proofErr w:type="spellEnd"/>
+              <w:t>Use the trim function to remove the spaces in anotherString</w:t>
+            </w:r>
           </w:p>
           <w:p>
             <w:pPr>
@@ -27927,13 +27827,8 @@
               <w:spacing w:after="160" w:line="259" w:lineRule="auto"/>
             </w:pPr>
             <w:r>
-              <w:t xml:space="preserve">Use the replace function to change “is a” to an empty space in </w:t>
-            </w:r>
-            <w:proofErr w:type="spellStart"/>
-            <w:r>
-              <w:t>myString</w:t>
-            </w:r>
-            <w:proofErr w:type="spellEnd"/>
+              <w:t>Use the replace function to change “is a” to an empty space in myString</w:t>
+            </w:r>
           </w:p>
           <w:p>
             <w:pPr>
@@ -27944,15 +27839,7 @@
               <w:spacing w:after="160" w:line="259" w:lineRule="auto"/>
             </w:pPr>
             <w:r>
-              <w:t xml:space="preserve">Split </w:t>
-            </w:r>
-            <w:proofErr w:type="spellStart"/>
-            <w:r>
-              <w:t>myString</w:t>
-            </w:r>
-            <w:proofErr w:type="spellEnd"/>
-            <w:r>
-              <w:t xml:space="preserve"> on the spaces.</w:t>
+              <w:t>Split myString on the spaces.</w:t>
             </w:r>
           </w:p>
           <w:p>
@@ -28180,6 +28067,7 @@
                 <w:b/>
                 <w:bCs/>
               </w:rPr>
+              <w:lastRenderedPageBreak/>
               <w:t>Q3A Record GitHub repository details for this part:</w:t>
             </w:r>
           </w:p>
@@ -28319,21 +28207,12 @@
                 <w:bCs/>
               </w:rPr>
             </w:pPr>
-            <w:proofErr w:type="spellStart"/>
-            <w:r>
-              <w:rPr>
-                <w:b/>
-                <w:bCs/>
-              </w:rPr>
-              <w:t>myString</w:t>
-            </w:r>
-            <w:proofErr w:type="spellEnd"/>
-            <w:r>
-              <w:rPr>
-                <w:b/>
-                <w:bCs/>
-              </w:rPr>
-              <w:t xml:space="preserve"> = “This is a string”</w:t>
+            <w:r>
+              <w:rPr>
+                <w:b/>
+                <w:bCs/>
+              </w:rPr>
+              <w:t>myString = “This is a string”</w:t>
             </w:r>
           </w:p>
           <w:p>
@@ -28349,21 +28228,28 @@
                 <w:bCs/>
               </w:rPr>
             </w:pPr>
-            <w:proofErr w:type="spellStart"/>
-            <w:r>
-              <w:rPr>
-                <w:b/>
-                <w:bCs/>
-              </w:rPr>
-              <w:t>anotherString</w:t>
-            </w:r>
-            <w:proofErr w:type="spellEnd"/>
-            <w:r>
-              <w:rPr>
-                <w:b/>
-                <w:bCs/>
-              </w:rPr>
-              <w:t xml:space="preserve"> = “   Another string” (note there are 3 blank spaces at the beginning)</w:t>
+            <w:r>
+              <w:rPr>
+                <w:b/>
+                <w:bCs/>
+              </w:rPr>
+              <w:t xml:space="preserve">anotherString = </w:t>
+            </w:r>
+            <w:proofErr w:type="gramStart"/>
+            <w:r>
+              <w:rPr>
+                <w:b/>
+                <w:bCs/>
+              </w:rPr>
+              <w:t xml:space="preserve">“  </w:t>
+            </w:r>
+            <w:proofErr w:type="gramEnd"/>
+            <w:r>
+              <w:rPr>
+                <w:b/>
+                <w:bCs/>
+              </w:rPr>
+              <w:t xml:space="preserve"> Another string” (note there are 3 blank spaces at the beginning)</w:t>
             </w:r>
           </w:p>
           <w:p>
@@ -28400,21 +28286,12 @@
                 <w:bCs/>
               </w:rPr>
             </w:pPr>
-            <w:proofErr w:type="spellStart"/>
-            <w:r>
-              <w:rPr>
-                <w:b/>
-                <w:bCs/>
-              </w:rPr>
-              <w:t>myName</w:t>
-            </w:r>
-            <w:proofErr w:type="spellEnd"/>
-            <w:r>
-              <w:rPr>
-                <w:b/>
-                <w:bCs/>
-              </w:rPr>
-              <w:t xml:space="preserve"> = your first name</w:t>
+            <w:r>
+              <w:rPr>
+                <w:b/>
+                <w:bCs/>
+              </w:rPr>
+              <w:t>myName = your first name</w:t>
             </w:r>
           </w:p>
         </w:tc>
@@ -28568,17 +28445,8 @@
                 <w:b/>
                 <w:bCs/>
               </w:rPr>
-              <w:t xml:space="preserve">Find out the length of </w:t>
-            </w:r>
-            <w:proofErr w:type="spellStart"/>
-            <w:r>
-              <w:rPr>
-                <w:b/>
-                <w:bCs/>
-              </w:rPr>
-              <w:t>myString</w:t>
-            </w:r>
-            <w:proofErr w:type="spellEnd"/>
+              <w:t>Find out the length of myString</w:t>
+            </w:r>
           </w:p>
           <w:p>
             <w:pPr>
@@ -28598,17 +28466,8 @@
                 <w:b/>
                 <w:bCs/>
               </w:rPr>
-              <w:t xml:space="preserve">Find out the first character of </w:t>
-            </w:r>
-            <w:proofErr w:type="spellStart"/>
-            <w:r>
-              <w:rPr>
-                <w:b/>
-                <w:bCs/>
-              </w:rPr>
-              <w:t>myString</w:t>
-            </w:r>
-            <w:proofErr w:type="spellEnd"/>
+              <w:t>Find out the first character of myString</w:t>
+            </w:r>
           </w:p>
           <w:p>
             <w:pPr>
@@ -28643,17 +28502,8 @@
                 <w:b/>
                 <w:bCs/>
               </w:rPr>
-              <w:t xml:space="preserve"> character of </w:t>
-            </w:r>
-            <w:proofErr w:type="spellStart"/>
-            <w:r>
-              <w:rPr>
-                <w:b/>
-                <w:bCs/>
-              </w:rPr>
-              <w:t>myString</w:t>
-            </w:r>
-            <w:proofErr w:type="spellEnd"/>
+              <w:t xml:space="preserve"> character of myString</w:t>
+            </w:r>
           </w:p>
         </w:tc>
       </w:tr>
@@ -28740,6 +28590,7 @@
           </w:tcPr>
           <w:p>
             <w:r>
+              <w:lastRenderedPageBreak/>
               <w:t>Branch name</w:t>
             </w:r>
           </w:p>
@@ -28852,17 +28703,8 @@
                 <w:b/>
                 <w:bCs/>
               </w:rPr>
-              <w:t xml:space="preserve">Slice “is a” from </w:t>
-            </w:r>
-            <w:proofErr w:type="spellStart"/>
-            <w:r>
-              <w:rPr>
-                <w:b/>
-                <w:bCs/>
-              </w:rPr>
-              <w:t>myString</w:t>
-            </w:r>
-            <w:proofErr w:type="spellEnd"/>
+              <w:t>Slice “is a” from myString</w:t>
+            </w:r>
           </w:p>
           <w:p>
             <w:pPr>
@@ -28882,17 +28724,8 @@
                 <w:b/>
                 <w:bCs/>
               </w:rPr>
-              <w:t>Use substring to get “the” from “</w:t>
-            </w:r>
-            <w:proofErr w:type="spellStart"/>
-            <w:r>
-              <w:rPr>
-                <w:b/>
-                <w:bCs/>
-              </w:rPr>
-              <w:t>notherString</w:t>
-            </w:r>
-            <w:proofErr w:type="spellEnd"/>
+              <w:t>Use substring to get “the” from “notherString</w:t>
+            </w:r>
           </w:p>
         </w:tc>
       </w:tr>
@@ -29039,23 +28872,7 @@
                 <w:b/>
                 <w:bCs/>
               </w:rPr>
-              <w:t xml:space="preserve">Change the case of the </w:t>
-            </w:r>
-            <w:proofErr w:type="spellStart"/>
-            <w:r>
-              <w:rPr>
-                <w:b/>
-                <w:bCs/>
-              </w:rPr>
-              <w:t>myName</w:t>
-            </w:r>
-            <w:proofErr w:type="spellEnd"/>
-            <w:r>
-              <w:rPr>
-                <w:b/>
-                <w:bCs/>
-              </w:rPr>
-              <w:t xml:space="preserve"> string</w:t>
+              <w:t>Change the case of the myName string</w:t>
             </w:r>
           </w:p>
           <w:p>
@@ -29076,23 +28893,7 @@
                 <w:b/>
                 <w:bCs/>
               </w:rPr>
-              <w:t xml:space="preserve">Change </w:t>
-            </w:r>
-            <w:proofErr w:type="spellStart"/>
-            <w:r>
-              <w:rPr>
-                <w:b/>
-                <w:bCs/>
-              </w:rPr>
-              <w:t>myName</w:t>
-            </w:r>
-            <w:proofErr w:type="spellEnd"/>
-            <w:r>
-              <w:rPr>
-                <w:b/>
-                <w:bCs/>
-              </w:rPr>
-              <w:t xml:space="preserve"> string to upper case</w:t>
+              <w:t>Change myName string to upper case</w:t>
             </w:r>
           </w:p>
           <w:p>
@@ -29113,23 +28914,7 @@
                 <w:b/>
                 <w:bCs/>
               </w:rPr>
-              <w:t xml:space="preserve">Change </w:t>
-            </w:r>
-            <w:proofErr w:type="spellStart"/>
-            <w:r>
-              <w:rPr>
-                <w:b/>
-                <w:bCs/>
-              </w:rPr>
-              <w:t>myName</w:t>
-            </w:r>
-            <w:proofErr w:type="spellEnd"/>
-            <w:r>
-              <w:rPr>
-                <w:b/>
-                <w:bCs/>
-              </w:rPr>
-              <w:t xml:space="preserve"> string to lower case</w:t>
+              <w:t>Change myName string to lower case</w:t>
             </w:r>
           </w:p>
         </w:tc>
@@ -29150,15 +28935,7 @@
           <w:p/>
           <w:p>
             <w:r>
-              <w:t xml:space="preserve">&lt;Insert a screenshot of the console showing </w:t>
-            </w:r>
-            <w:proofErr w:type="spellStart"/>
-            <w:r>
-              <w:t>myName</w:t>
-            </w:r>
-            <w:proofErr w:type="spellEnd"/>
-            <w:r>
-              <w:t xml:space="preserve"> in upper case and in lower case&gt;</w:t>
+              <w:t>&lt;Insert a screenshot of the console showing myName in upper case and in lower case&gt;</w:t>
             </w:r>
           </w:p>
           <w:p/>
@@ -29290,39 +29067,7 @@
                 <w:b/>
                 <w:bCs/>
               </w:rPr>
-              <w:t xml:space="preserve">Use the </w:t>
-            </w:r>
-            <w:proofErr w:type="spellStart"/>
-            <w:r>
-              <w:rPr>
-                <w:b/>
-                <w:bCs/>
-              </w:rPr>
-              <w:t>concat</w:t>
-            </w:r>
-            <w:proofErr w:type="spellEnd"/>
-            <w:r>
-              <w:rPr>
-                <w:b/>
-                <w:bCs/>
-              </w:rPr>
-              <w:t xml:space="preserve"> method to join the hello string and </w:t>
-            </w:r>
-            <w:proofErr w:type="spellStart"/>
-            <w:r>
-              <w:rPr>
-                <w:b/>
-                <w:bCs/>
-              </w:rPr>
-              <w:t>myName</w:t>
-            </w:r>
-            <w:proofErr w:type="spellEnd"/>
-            <w:r>
-              <w:rPr>
-                <w:b/>
-                <w:bCs/>
-              </w:rPr>
-              <w:t xml:space="preserve"> string</w:t>
+              <w:t>Use the concat method to join the hello string and myName string</w:t>
             </w:r>
           </w:p>
           <w:p>
@@ -29343,17 +29088,8 @@
                 <w:b/>
                 <w:bCs/>
               </w:rPr>
-              <w:t xml:space="preserve">Use the trim method to remove the spaces in </w:t>
-            </w:r>
-            <w:proofErr w:type="spellStart"/>
-            <w:r>
-              <w:rPr>
-                <w:b/>
-                <w:bCs/>
-              </w:rPr>
-              <w:t>anotherString</w:t>
-            </w:r>
-            <w:proofErr w:type="spellEnd"/>
+              <w:t>Use the trim method to remove the spaces in anotherString</w:t>
+            </w:r>
           </w:p>
           <w:p>
             <w:pPr>
@@ -29373,17 +29109,8 @@
                 <w:b/>
                 <w:bCs/>
               </w:rPr>
-              <w:t xml:space="preserve">Use the replace method to change “is a” to an empty space in </w:t>
-            </w:r>
-            <w:proofErr w:type="spellStart"/>
-            <w:r>
-              <w:rPr>
-                <w:b/>
-                <w:bCs/>
-              </w:rPr>
-              <w:t>myString</w:t>
-            </w:r>
-            <w:proofErr w:type="spellEnd"/>
+              <w:t>Use the replace method to change “is a” to an empty space in myString</w:t>
+            </w:r>
           </w:p>
           <w:p>
             <w:pPr>
@@ -29403,23 +29130,7 @@
                 <w:b/>
                 <w:bCs/>
               </w:rPr>
-              <w:t xml:space="preserve">Use the split method on </w:t>
-            </w:r>
-            <w:proofErr w:type="spellStart"/>
-            <w:r>
-              <w:rPr>
-                <w:b/>
-                <w:bCs/>
-              </w:rPr>
-              <w:t>myString</w:t>
-            </w:r>
-            <w:proofErr w:type="spellEnd"/>
-            <w:r>
-              <w:rPr>
-                <w:b/>
-                <w:bCs/>
-              </w:rPr>
-              <w:t xml:space="preserve"> using the spaces to break the string</w:t>
+              <w:t>Use the split method on myString using the spaces to break the string</w:t>
             </w:r>
           </w:p>
         </w:tc>
@@ -29444,15 +29155,7 @@
           </w:p>
           <w:p>
             <w:r>
-              <w:t>&lt;</w:t>
-            </w:r>
-            <w:proofErr w:type="spellStart"/>
-            <w:r>
-              <w:t>concat</w:t>
-            </w:r>
-            <w:proofErr w:type="spellEnd"/>
-            <w:r>
-              <w:t>&gt;</w:t>
+              <w:t>&lt;concat&gt;</w:t>
             </w:r>
           </w:p>
           <w:p/>
@@ -29500,6 +29203,7 @@
           </w:tcPr>
           <w:p>
             <w:r>
+              <w:lastRenderedPageBreak/>
               <w:t>Branch name</w:t>
             </w:r>
           </w:p>
@@ -30211,7 +29915,15 @@
           <w:p/>
           <w:p>
             <w:r>
-              <w:t>You will be required to create a GitHub repository for this part. As per the previous parts, branch names an commit numbers can be recorded in each question below.</w:t>
+              <w:t xml:space="preserve">You will be required to create a GitHub repository for this part. As per the previous parts, branch names </w:t>
+            </w:r>
+            <w:proofErr w:type="gramStart"/>
+            <w:r>
+              <w:t>an</w:t>
+            </w:r>
+            <w:proofErr w:type="gramEnd"/>
+            <w:r>
+              <w:t xml:space="preserve"> commit numbers can be recorded in each question below.</w:t>
             </w:r>
           </w:p>
           <w:p/>
@@ -30676,6 +30388,7 @@
           </w:tcPr>
           <w:p>
             <w:r>
+              <w:lastRenderedPageBreak/>
               <w:t>Branch name</w:t>
             </w:r>
           </w:p>
@@ -32017,13 +31730,8 @@
                 <w:tab w:val="left" w:pos="510"/>
               </w:tabs>
             </w:pPr>
-            <w:proofErr w:type="spellStart"/>
-            <w:r>
-              <w:t>Mockaroo</w:t>
-            </w:r>
-            <w:proofErr w:type="spellEnd"/>
-            <w:r>
-              <w:t xml:space="preserve">: </w:t>
+            <w:r>
+              <w:t xml:space="preserve">Mockaroo: </w:t>
             </w:r>
             <w:hyperlink r:id="rId23" w:history="1">
               <w:r>
@@ -32099,15 +31807,7 @@
               </w:numPr>
             </w:pPr>
             <w:r>
-              <w:t>Wireframes in .</w:t>
-            </w:r>
-            <w:proofErr w:type="spellStart"/>
-            <w:r>
-              <w:t>png</w:t>
-            </w:r>
-            <w:proofErr w:type="spellEnd"/>
-            <w:r>
-              <w:t xml:space="preserve"> or .jpg format</w:t>
+              <w:t>Wireframes in .png or .jpg format</w:t>
             </w:r>
           </w:p>
           <w:p/>
@@ -34419,6 +34119,7 @@
           </w:tcPr>
           <w:p>
             <w:r>
+              <w:lastRenderedPageBreak/>
               <w:t>Branch name</w:t>
             </w:r>
           </w:p>
@@ -35076,7 +34777,15 @@
                 </w:p>
                 <w:p>
                   <w:r>
-                    <w:t>Action 2: list view area display all movies</w:t>
+                    <w:t xml:space="preserve">Action 2: list view area </w:t>
+                  </w:r>
+                  <w:proofErr w:type="gramStart"/>
+                  <w:r>
+                    <w:t>display</w:t>
+                  </w:r>
+                  <w:proofErr w:type="gramEnd"/>
+                  <w:r>
+                    <w:t xml:space="preserve"> all movies</w:t>
                   </w:r>
                 </w:p>
               </w:tc>
@@ -35659,6 +35368,7 @@
           </w:tcPr>
           <w:p>
             <w:r>
+              <w:lastRenderedPageBreak/>
               <w:t>Branch name</w:t>
             </w:r>
           </w:p>
@@ -36898,15 +36608,7 @@
           <w:p/>
           <w:p>
             <w:r>
-              <w:t>Each grid in the home page links to the page of a team member. The link has been defined in the home page (e.g., /team/</w:t>
-            </w:r>
-            <w:proofErr w:type="spellStart"/>
-            <w:r>
-              <w:t>amberle</w:t>
-            </w:r>
-            <w:proofErr w:type="spellEnd"/>
-            <w:r>
-              <w:t>/index.html), but the member’s page has not been created yet. You need to join the team to get your page created, tested locally and then merge your changes to the project.</w:t>
+              <w:t>Each grid in the home page links to the page of a team member. The link has been defined in the home page (e.g., /team/amberle/index.html), but the member’s page has not been created yet. You need to join the team to get your page created, tested locally and then merge your changes to the project.</w:t>
             </w:r>
           </w:p>
           <w:p>
@@ -37159,7 +36861,15 @@
           </w:p>
           <w:p>
             <w:r>
-              <w:t>Step 8. In folder “team”, create a sub-folder and name it using your</w:t>
+              <w:t xml:space="preserve">Step 8. In folder “team”, create a sub-folder and name it </w:t>
+            </w:r>
+            <w:proofErr w:type="gramStart"/>
+            <w:r>
+              <w:t>using</w:t>
+            </w:r>
+            <w:proofErr w:type="gramEnd"/>
+            <w:r>
+              <w:t xml:space="preserve"> your</w:t>
             </w:r>
             <w:r>
               <w:t xml:space="preserve"> first name</w:t>
@@ -37217,7 +36927,15 @@
           </w:p>
           <w:p>
             <w:r>
-              <w:t>Step 17. If your code is approved, your teacher will merge the code. Then you could view the website again to confirm the final result.</w:t>
+              <w:t xml:space="preserve">Step 17. If your code is approved, your teacher will merge the code. Then you could view the website again to confirm </w:t>
+            </w:r>
+            <w:proofErr w:type="gramStart"/>
+            <w:r>
+              <w:t>the final result</w:t>
+            </w:r>
+            <w:proofErr w:type="gramEnd"/>
+            <w:r>
+              <w:t>.</w:t>
             </w:r>
           </w:p>
           <w:p>
@@ -37243,17 +36961,8 @@
                 <w:b/>
                 <w:bCs/>
               </w:rPr>
-              <w:t xml:space="preserve">5, Upload your pages and this document to </w:t>
-            </w:r>
-            <w:proofErr w:type="spellStart"/>
-            <w:r>
-              <w:rPr>
-                <w:b/>
-                <w:bCs/>
-              </w:rPr>
-              <w:t>Brightpspace</w:t>
-            </w:r>
-            <w:proofErr w:type="spellEnd"/>
+              <w:t>5, Upload your pages and this document to Brightpspace</w:t>
+            </w:r>
           </w:p>
           <w:p/>
         </w:tc>
@@ -44339,6 +44048,7 @@
   <w:style w:type="character" w:default="1" w:styleId="DefaultParagraphFont">
     <w:name w:val="Default Paragraph Font"/>
     <w:uiPriority w:val="1"/>
+    <w:semiHidden/>
     <w:unhideWhenUsed/>
   </w:style>
   <w:style w:type="table" w:default="1" w:styleId="TableNormal">
@@ -46429,6 +46139,7 @@
     <w:rsidRoot w:val="003F4644"/>
     <w:rsid w:val="0003142F"/>
     <w:rsid w:val="00041EC6"/>
+    <w:rsid w:val="000C191C"/>
     <w:rsid w:val="001421E1"/>
     <w:rsid w:val="002400ED"/>
     <w:rsid w:val="002A6461"/>
@@ -46439,10 +46150,12 @@
     <w:rsid w:val="00474035"/>
     <w:rsid w:val="004805F8"/>
     <w:rsid w:val="00685BA4"/>
+    <w:rsid w:val="006B1C6D"/>
     <w:rsid w:val="00706F9E"/>
     <w:rsid w:val="008C44C2"/>
     <w:rsid w:val="00994716"/>
     <w:rsid w:val="00A77CE4"/>
+    <w:rsid w:val="00B21C30"/>
     <w:rsid w:val="00B96677"/>
     <w:rsid w:val="00C02992"/>
     <w:rsid w:val="00C07005"/>
@@ -47219,6 +46932,18 @@
 </file>
 
 <file path=customXml/item1.xml><?xml version="1.0" encoding="utf-8"?>
+<p:properties xmlns:p="http://schemas.microsoft.com/office/2006/metadata/properties" xmlns:xsi="http://www.w3.org/2001/XMLSchema-instance" xmlns:pc="http://schemas.microsoft.com/office/infopath/2007/PartnerControls">
+  <documentManagement>
+    <_activity xmlns="fc400f29-8ae2-4f02-aa36-8354319d8dd0" xsi:nil="true"/>
+  </documentManagement>
+</p:properties>
+</file>
+
+<file path=customXml/item2.xml><?xml version="1.0" encoding="utf-8"?>
+<b:Sources xmlns:b="http://schemas.openxmlformats.org/officeDocument/2006/bibliography" xmlns="http://schemas.openxmlformats.org/officeDocument/2006/bibliography" SelectedStyle="\APASixthEditionOfficeOnline.xsl" StyleName="APA" Version="6"/>
+</file>
+
+<file path=customXml/item3.xml><?xml version="1.0" encoding="utf-8"?>
 <ct:contentTypeSchema xmlns:ct="http://schemas.microsoft.com/office/2006/metadata/contentType" xmlns:ma="http://schemas.microsoft.com/office/2006/metadata/properties/metaAttributes" ct:_="" ma:_="" ma:contentTypeName="Document" ma:contentTypeID="0x0101002FED5117B94A0C43BE657CFE95077C6E" ma:contentTypeVersion="17" ma:contentTypeDescription="Create a new document." ma:contentTypeScope="" ma:versionID="1b61ef74c0cf3f1787575cceeb5049c4">
   <xsd:schema xmlns:xsd="http://www.w3.org/2001/XMLSchema" xmlns:xs="http://www.w3.org/2001/XMLSchema" xmlns:p="http://schemas.microsoft.com/office/2006/metadata/properties" xmlns:ns3="fc400f29-8ae2-4f02-aa36-8354319d8dd0" xmlns:ns4="a53e46f7-009c-4700-bfb1-03be8983c549" targetNamespace="http://schemas.microsoft.com/office/2006/metadata/properties" ma:root="true" ma:fieldsID="a097de4b958cf184ce63d565c2177212" ns3:_="" ns4:_="">
     <xsd:import namespace="fc400f29-8ae2-4f02-aa36-8354319d8dd0"/>
@@ -47465,18 +47190,6 @@
 </ct:contentTypeSchema>
 </file>
 
-<file path=customXml/item2.xml><?xml version="1.0" encoding="utf-8"?>
-<b:Sources xmlns:b="http://schemas.openxmlformats.org/officeDocument/2006/bibliography" xmlns="http://schemas.openxmlformats.org/officeDocument/2006/bibliography" SelectedStyle="\APASixthEditionOfficeOnline.xsl" StyleName="APA" Version="6"/>
-</file>
-
-<file path=customXml/item3.xml><?xml version="1.0" encoding="utf-8"?>
-<p:properties xmlns:p="http://schemas.microsoft.com/office/2006/metadata/properties" xmlns:xsi="http://www.w3.org/2001/XMLSchema-instance" xmlns:pc="http://schemas.microsoft.com/office/infopath/2007/PartnerControls">
-  <documentManagement>
-    <_activity xmlns="fc400f29-8ae2-4f02-aa36-8354319d8dd0" xsi:nil="true"/>
-  </documentManagement>
-</p:properties>
-</file>
-
 <file path=customXml/item4.xml><?xml version="1.0" encoding="utf-8"?>
 <?mso-contentType ?>
 <FormTemplates xmlns="http://schemas.microsoft.com/sharepoint/v3/contenttype/forms">
@@ -47487,6 +47200,24 @@
 </file>
 
 <file path=customXml/itemProps1.xml><?xml version="1.0" encoding="utf-8"?>
+<ds:datastoreItem xmlns:ds="http://schemas.openxmlformats.org/officeDocument/2006/customXml" ds:itemID="{3A0AC818-964C-4D39-B25F-D98F3F83829C}">
+  <ds:schemaRefs>
+    <ds:schemaRef ds:uri="http://schemas.microsoft.com/office/2006/metadata/properties"/>
+    <ds:schemaRef ds:uri="http://schemas.microsoft.com/office/infopath/2007/PartnerControls"/>
+    <ds:schemaRef ds:uri="fc400f29-8ae2-4f02-aa36-8354319d8dd0"/>
+  </ds:schemaRefs>
+</ds:datastoreItem>
+</file>
+
+<file path=customXml/itemProps2.xml><?xml version="1.0" encoding="utf-8"?>
+<ds:datastoreItem xmlns:ds="http://schemas.openxmlformats.org/officeDocument/2006/customXml" ds:itemID="{19BD0735-121B-426B-B41D-F103CA6590C8}">
+  <ds:schemaRefs>
+    <ds:schemaRef ds:uri="http://schemas.openxmlformats.org/officeDocument/2006/bibliography"/>
+  </ds:schemaRefs>
+</ds:datastoreItem>
+</file>
+
+<file path=customXml/itemProps3.xml><?xml version="1.0" encoding="utf-8"?>
 <ds:datastoreItem xmlns:ds="http://schemas.openxmlformats.org/officeDocument/2006/customXml" ds:itemID="{B6942B79-D663-4AEC-A309-D8E420D7B2CD}">
   <ds:schemaRefs>
     <ds:schemaRef ds:uri="http://schemas.microsoft.com/office/2006/metadata/contentType"/>
@@ -47505,24 +47236,6 @@
 </ds:datastoreItem>
 </file>
 
-<file path=customXml/itemProps2.xml><?xml version="1.0" encoding="utf-8"?>
-<ds:datastoreItem xmlns:ds="http://schemas.openxmlformats.org/officeDocument/2006/customXml" ds:itemID="{19BD0735-121B-426B-B41D-F103CA6590C8}">
-  <ds:schemaRefs>
-    <ds:schemaRef ds:uri="http://schemas.openxmlformats.org/officeDocument/2006/bibliography"/>
-  </ds:schemaRefs>
-</ds:datastoreItem>
-</file>
-
-<file path=customXml/itemProps3.xml><?xml version="1.0" encoding="utf-8"?>
-<ds:datastoreItem xmlns:ds="http://schemas.openxmlformats.org/officeDocument/2006/customXml" ds:itemID="{3A0AC818-964C-4D39-B25F-D98F3F83829C}">
-  <ds:schemaRefs>
-    <ds:schemaRef ds:uri="http://schemas.microsoft.com/office/2006/metadata/properties"/>
-    <ds:schemaRef ds:uri="http://schemas.microsoft.com/office/infopath/2007/PartnerControls"/>
-    <ds:schemaRef ds:uri="fc400f29-8ae2-4f02-aa36-8354319d8dd0"/>
-  </ds:schemaRefs>
-</ds:datastoreItem>
-</file>
-
 <file path=customXml/itemProps4.xml><?xml version="1.0" encoding="utf-8"?>
 <ds:datastoreItem xmlns:ds="http://schemas.openxmlformats.org/officeDocument/2006/customXml" ds:itemID="{E3499DD3-E433-4477-A8FE-2A9B10275570}">
   <ds:schemaRefs>

</xml_diff>